<commit_message>
Add Business Understanding chapter
</commit_message>
<xml_diff>
--- a/CA3-Capstone.docx
+++ b/CA3-Capstone.docx
@@ -237,6 +237,450 @@
         </w:rPr>
         <w:t>.</w:t>
       </w:r>
+    </w:p>
+    <w:p>
+      <w:pPr>
+        <w:rPr>
+          <w:rFonts w:ascii="Calibri" w:hAnsi="Calibri" w:cs="Calibri"/>
+          <w:b/>
+          <w:bCs/>
+          <w:sz w:val="32"/>
+          <w:szCs w:val="32"/>
+        </w:rPr>
+      </w:pPr>
+      <w:r>
+        <w:rPr>
+          <w:rFonts w:ascii="Calibri" w:hAnsi="Calibri" w:cs="Calibri"/>
+          <w:b/>
+          <w:bCs/>
+          <w:sz w:val="32"/>
+          <w:szCs w:val="32"/>
+        </w:rPr>
+        <w:t>2. Business Understanding</w:t>
+      </w:r>
+    </w:p>
+    <w:p>
+      <w:pPr>
+        <w:rPr>
+          <w:rFonts w:ascii="Calibri" w:hAnsi="Calibri" w:cs="Calibri"/>
+          <w:sz w:val="24"/>
+          <w:szCs w:val="24"/>
+        </w:rPr>
+      </w:pPr>
+      <w:r>
+        <w:rPr>
+          <w:rFonts w:ascii="Calibri" w:hAnsi="Calibri" w:cs="Calibri"/>
+          <w:sz w:val="24"/>
+          <w:szCs w:val="24"/>
+        </w:rPr>
+        <w:t>The main objective of this project is to develop a predictive framework that determines customers who are likely to make repeat purchases, allowing for more effective marketing and retention strategies. The analytical goal is to develop a supervised classification model that, using past transaction data, can effectively differentiate between one-time and repeat buyers (</w:t>
+      </w:r>
+      <w:proofErr w:type="spellStart"/>
+      <w:r>
+        <w:rPr>
+          <w:rFonts w:ascii="Calibri" w:hAnsi="Calibri" w:cs="Calibri"/>
+          <w:sz w:val="24"/>
+          <w:szCs w:val="24"/>
+        </w:rPr>
+        <w:t>Cirqueira</w:t>
+      </w:r>
+      <w:proofErr w:type="spellEnd"/>
+      <w:r>
+        <w:rPr>
+          <w:rFonts w:ascii="Calibri" w:hAnsi="Calibri" w:cs="Calibri"/>
+          <w:sz w:val="24"/>
+          <w:szCs w:val="24"/>
+        </w:rPr>
+        <w:t xml:space="preserve"> et al., 2021).</w:t>
+      </w:r>
+    </w:p>
+    <w:p>
+      <w:pPr>
+        <w:rPr>
+          <w:rFonts w:ascii="Calibri" w:hAnsi="Calibri" w:cs="Calibri"/>
+          <w:b/>
+          <w:bCs/>
+          <w:sz w:val="28"/>
+          <w:szCs w:val="28"/>
+        </w:rPr>
+      </w:pPr>
+      <w:r>
+        <w:rPr>
+          <w:rFonts w:ascii="Calibri" w:hAnsi="Calibri" w:cs="Calibri"/>
+          <w:b/>
+          <w:bCs/>
+          <w:sz w:val="28"/>
+          <w:szCs w:val="28"/>
+        </w:rPr>
+        <w:t>Research Questions</w:t>
+      </w:r>
+    </w:p>
+    <w:p>
+      <w:pPr>
+        <w:rPr>
+          <w:rFonts w:ascii="Calibri" w:hAnsi="Calibri" w:cs="Calibri"/>
+          <w:sz w:val="24"/>
+          <w:szCs w:val="24"/>
+        </w:rPr>
+      </w:pPr>
+      <w:r>
+        <w:rPr>
+          <w:rFonts w:ascii="Calibri" w:hAnsi="Calibri" w:cs="Calibri"/>
+          <w:sz w:val="24"/>
+          <w:szCs w:val="24"/>
+        </w:rPr>
+        <w:t>The following research questions have been developed in order to direct the analytical design and ensure relevance to business stakeholders:</w:t>
+      </w:r>
+    </w:p>
+    <w:p>
+      <w:pPr>
+        <w:rPr>
+          <w:rFonts w:ascii="Calibri" w:hAnsi="Calibri" w:cs="Calibri"/>
+          <w:sz w:val="24"/>
+          <w:szCs w:val="24"/>
+        </w:rPr>
+      </w:pPr>
+      <w:r>
+        <w:rPr>
+          <w:rFonts w:ascii="Calibri" w:hAnsi="Calibri" w:cs="Calibri"/>
+          <w:sz w:val="24"/>
+          <w:szCs w:val="24"/>
+        </w:rPr>
+        <w:t xml:space="preserve">1. </w:t>
+      </w:r>
+      <w:r>
+        <w:rPr>
+          <w:rFonts w:ascii="Calibri" w:hAnsi="Calibri" w:cs="Calibri"/>
+          <w:sz w:val="24"/>
+          <w:szCs w:val="24"/>
+        </w:rPr>
+        <w:t>Which customer-level behavioural features derived from transactional data are most predictive of repeat purchase behaviour in e-commerce?</w:t>
+      </w:r>
+    </w:p>
+    <w:p>
+      <w:pPr>
+        <w:rPr>
+          <w:rFonts w:ascii="Calibri" w:hAnsi="Calibri" w:cs="Calibri"/>
+          <w:sz w:val="24"/>
+          <w:szCs w:val="24"/>
+        </w:rPr>
+      </w:pPr>
+      <w:r>
+        <w:rPr>
+          <w:rFonts w:ascii="Calibri" w:hAnsi="Calibri" w:cs="Calibri"/>
+          <w:sz w:val="24"/>
+          <w:szCs w:val="24"/>
+        </w:rPr>
+        <w:lastRenderedPageBreak/>
+        <w:t xml:space="preserve">2. </w:t>
+      </w:r>
+      <w:r>
+        <w:rPr>
+          <w:rFonts w:ascii="Calibri" w:hAnsi="Calibri" w:cs="Calibri"/>
+          <w:sz w:val="24"/>
+          <w:szCs w:val="24"/>
+        </w:rPr>
+        <w:t>How do different classification models compare in terms of predictive performance and generalizability?</w:t>
+      </w:r>
+    </w:p>
+    <w:p>
+      <w:pPr>
+        <w:rPr>
+          <w:rFonts w:ascii="Calibri" w:hAnsi="Calibri" w:cs="Calibri"/>
+          <w:sz w:val="24"/>
+          <w:szCs w:val="24"/>
+        </w:rPr>
+      </w:pPr>
+      <w:r>
+        <w:rPr>
+          <w:rFonts w:ascii="Calibri" w:hAnsi="Calibri" w:cs="Calibri"/>
+          <w:sz w:val="24"/>
+          <w:szCs w:val="24"/>
+        </w:rPr>
+        <w:t xml:space="preserve">3. </w:t>
+      </w:r>
+      <w:r>
+        <w:rPr>
+          <w:rFonts w:ascii="Calibri" w:hAnsi="Calibri" w:cs="Calibri"/>
+          <w:sz w:val="24"/>
+          <w:szCs w:val="24"/>
+        </w:rPr>
+        <w:t>Can LIME explanations provide meaningful and actionable insights for marketing and CRM stakeholders?</w:t>
+      </w:r>
+    </w:p>
+    <w:p>
+      <w:pPr>
+        <w:rPr>
+          <w:rFonts w:ascii="Calibri" w:hAnsi="Calibri" w:cs="Calibri"/>
+          <w:b/>
+          <w:bCs/>
+          <w:sz w:val="24"/>
+          <w:szCs w:val="24"/>
+        </w:rPr>
+      </w:pPr>
+      <w:r>
+        <w:rPr>
+          <w:rFonts w:ascii="Calibri" w:hAnsi="Calibri" w:cs="Calibri"/>
+          <w:b/>
+          <w:bCs/>
+          <w:sz w:val="24"/>
+          <w:szCs w:val="24"/>
+        </w:rPr>
+        <w:t>Research Objectives</w:t>
+      </w:r>
+    </w:p>
+    <w:p>
+      <w:pPr>
+        <w:rPr>
+          <w:rFonts w:ascii="Calibri" w:hAnsi="Calibri" w:cs="Calibri"/>
+          <w:sz w:val="24"/>
+          <w:szCs w:val="24"/>
+        </w:rPr>
+      </w:pPr>
+      <w:r>
+        <w:rPr>
+          <w:rFonts w:ascii="Calibri" w:hAnsi="Calibri" w:cs="Calibri"/>
+          <w:sz w:val="24"/>
+          <w:szCs w:val="24"/>
+        </w:rPr>
+        <w:t>The project outlines the following research objectives in order to address these questions:</w:t>
+      </w:r>
+    </w:p>
+    <w:p>
+      <w:pPr>
+        <w:rPr>
+          <w:rFonts w:ascii="Calibri" w:hAnsi="Calibri" w:cs="Calibri"/>
+          <w:sz w:val="24"/>
+          <w:szCs w:val="24"/>
+        </w:rPr>
+      </w:pPr>
+      <w:r>
+        <w:rPr>
+          <w:rFonts w:ascii="Calibri" w:hAnsi="Calibri" w:cs="Calibri"/>
+          <w:sz w:val="24"/>
+          <w:szCs w:val="24"/>
+        </w:rPr>
+        <w:t xml:space="preserve">1. </w:t>
+      </w:r>
+      <w:r>
+        <w:rPr>
+          <w:rFonts w:ascii="Calibri" w:hAnsi="Calibri" w:cs="Calibri"/>
+          <w:sz w:val="24"/>
+          <w:szCs w:val="24"/>
+        </w:rPr>
+        <w:t xml:space="preserve">To develop a supervised machine learning model that predicts repeat purchase </w:t>
+      </w:r>
+      <w:proofErr w:type="spellStart"/>
+      <w:r>
+        <w:rPr>
+          <w:rFonts w:ascii="Calibri" w:hAnsi="Calibri" w:cs="Calibri"/>
+          <w:sz w:val="24"/>
+          <w:szCs w:val="24"/>
+        </w:rPr>
+        <w:t>behavior</w:t>
+      </w:r>
+      <w:proofErr w:type="spellEnd"/>
+      <w:r>
+        <w:rPr>
+          <w:rFonts w:ascii="Calibri" w:hAnsi="Calibri" w:cs="Calibri"/>
+          <w:sz w:val="24"/>
+          <w:szCs w:val="24"/>
+        </w:rPr>
+        <w:t xml:space="preserve"> using transactional features.</w:t>
+      </w:r>
+    </w:p>
+    <w:p>
+      <w:pPr>
+        <w:rPr>
+          <w:rFonts w:ascii="Calibri" w:hAnsi="Calibri" w:cs="Calibri"/>
+          <w:sz w:val="24"/>
+          <w:szCs w:val="24"/>
+        </w:rPr>
+      </w:pPr>
+      <w:r>
+        <w:rPr>
+          <w:rFonts w:ascii="Calibri" w:hAnsi="Calibri" w:cs="Calibri"/>
+          <w:sz w:val="24"/>
+          <w:szCs w:val="24"/>
+        </w:rPr>
+        <w:t xml:space="preserve">2. </w:t>
+      </w:r>
+      <w:r>
+        <w:rPr>
+          <w:rFonts w:ascii="Calibri" w:hAnsi="Calibri" w:cs="Calibri"/>
+          <w:sz w:val="24"/>
+          <w:szCs w:val="24"/>
+        </w:rPr>
+        <w:t xml:space="preserve">To evaluate and compare the performance of multiple classification algorithms (e.g., Random Forest, </w:t>
+      </w:r>
+      <w:proofErr w:type="spellStart"/>
+      <w:r>
+        <w:rPr>
+          <w:rFonts w:ascii="Calibri" w:hAnsi="Calibri" w:cs="Calibri"/>
+          <w:sz w:val="24"/>
+          <w:szCs w:val="24"/>
+        </w:rPr>
+        <w:t>XGBoost</w:t>
+      </w:r>
+      <w:proofErr w:type="spellEnd"/>
+      <w:r>
+        <w:rPr>
+          <w:rFonts w:ascii="Calibri" w:hAnsi="Calibri" w:cs="Calibri"/>
+          <w:sz w:val="24"/>
+          <w:szCs w:val="24"/>
+        </w:rPr>
+        <w:t>).</w:t>
+      </w:r>
+    </w:p>
+    <w:p>
+      <w:pPr>
+        <w:rPr>
+          <w:rFonts w:ascii="Calibri" w:hAnsi="Calibri" w:cs="Calibri"/>
+          <w:sz w:val="24"/>
+          <w:szCs w:val="24"/>
+        </w:rPr>
+      </w:pPr>
+      <w:r>
+        <w:rPr>
+          <w:rFonts w:ascii="Calibri" w:hAnsi="Calibri" w:cs="Calibri"/>
+          <w:sz w:val="24"/>
+          <w:szCs w:val="24"/>
+        </w:rPr>
+        <w:t xml:space="preserve">3. </w:t>
+      </w:r>
+      <w:r>
+        <w:rPr>
+          <w:rFonts w:ascii="Calibri" w:hAnsi="Calibri" w:cs="Calibri"/>
+          <w:sz w:val="24"/>
+          <w:szCs w:val="24"/>
+        </w:rPr>
+        <w:t>To apply LIME to generate interpretable explanations for individual predictions, supporting stakeholder trust and decision-making.</w:t>
+      </w:r>
+    </w:p>
+    <w:p>
+      <w:pPr>
+        <w:rPr>
+          <w:rFonts w:ascii="Calibri" w:hAnsi="Calibri" w:cs="Calibri"/>
+          <w:sz w:val="24"/>
+          <w:szCs w:val="24"/>
+        </w:rPr>
+      </w:pPr>
+      <w:r>
+        <w:rPr>
+          <w:rFonts w:ascii="Calibri" w:hAnsi="Calibri" w:cs="Calibri"/>
+          <w:sz w:val="24"/>
+          <w:szCs w:val="24"/>
+        </w:rPr>
+        <w:t>Success will be evaluated using key performance measures like as precision, recall, F1-score, and ROC-AUC, as well as the model's ability to generalise to unseen data.</w:t>
+      </w:r>
+      <w:r>
+        <w:rPr>
+          <w:rFonts w:ascii="Calibri" w:hAnsi="Calibri" w:cs="Calibri"/>
+          <w:sz w:val="24"/>
+          <w:szCs w:val="24"/>
+        </w:rPr>
+        <w:t xml:space="preserve"> </w:t>
+      </w:r>
+      <w:r>
+        <w:rPr>
+          <w:rFonts w:ascii="Calibri" w:hAnsi="Calibri" w:cs="Calibri"/>
+          <w:sz w:val="24"/>
+          <w:szCs w:val="24"/>
+        </w:rPr>
+        <w:t>Precision, recall, F1-score, and ROC-AUC are essential performance measures that will be used to gauge the model's success in generalising to new data. Precision is especially crucial given the business context because false positives (predicting a repeat purchase when none happens) could waste marketing budgets While false negatives could result in lost engagement opportunities (Harter et al., 2025).</w:t>
+      </w:r>
+    </w:p>
+    <w:p>
+      <w:pPr>
+        <w:rPr>
+          <w:rFonts w:ascii="Calibri" w:hAnsi="Calibri" w:cs="Calibri"/>
+          <w:sz w:val="24"/>
+          <w:szCs w:val="24"/>
+        </w:rPr>
+      </w:pPr>
+      <w:r>
+        <w:rPr>
+          <w:rFonts w:ascii="Calibri" w:hAnsi="Calibri" w:cs="Calibri"/>
+          <w:sz w:val="24"/>
+          <w:szCs w:val="24"/>
+        </w:rPr>
+        <w:t xml:space="preserve">CRM managers, marketing analysts, and product teams are examples of stakeholders who need not only accurate </w:t>
+      </w:r>
+      <w:r>
+        <w:rPr>
+          <w:rFonts w:ascii="Calibri" w:hAnsi="Calibri" w:cs="Calibri"/>
+          <w:sz w:val="24"/>
+          <w:szCs w:val="24"/>
+        </w:rPr>
+        <w:t>predictions</w:t>
+      </w:r>
+      <w:r>
+        <w:rPr>
+          <w:rFonts w:ascii="Calibri" w:hAnsi="Calibri" w:cs="Calibri"/>
+          <w:sz w:val="24"/>
+          <w:szCs w:val="24"/>
+        </w:rPr>
+        <w:t xml:space="preserve"> but also interpretable insights. This need is addressed by the project's integration of LIME to provide individual prediction explanations, promoting transparency and confidence in automated decision-making.</w:t>
+      </w:r>
+      <w:r>
+        <w:rPr>
+          <w:rFonts w:ascii="Calibri" w:hAnsi="Calibri" w:cs="Calibri"/>
+          <w:sz w:val="24"/>
+          <w:szCs w:val="24"/>
+        </w:rPr>
+        <w:t xml:space="preserve"> </w:t>
+      </w:r>
+      <w:r>
+        <w:rPr>
+          <w:rFonts w:ascii="Calibri" w:hAnsi="Calibri" w:cs="Calibri"/>
+          <w:sz w:val="24"/>
+          <w:szCs w:val="24"/>
+        </w:rPr>
+        <w:t>In contexts where model outputs drive customer-facing actions, this interpretability is particularly important (Henninger &amp; Strobl, 2024; Knab et al., 2025).</w:t>
+      </w:r>
+    </w:p>
+    <w:p>
+      <w:pPr>
+        <w:rPr>
+          <w:rFonts w:ascii="Calibri" w:hAnsi="Calibri" w:cs="Calibri"/>
+          <w:sz w:val="24"/>
+          <w:szCs w:val="24"/>
+        </w:rPr>
+      </w:pPr>
+      <w:r>
+        <w:rPr>
+          <w:rFonts w:ascii="Calibri" w:hAnsi="Calibri" w:cs="Calibri"/>
+          <w:sz w:val="24"/>
+          <w:szCs w:val="24"/>
+        </w:rPr>
+        <w:t>The project's scope is purposefully limited, focussing on interpretable, practical models rather than deep learning architectures and unsupervised segmentation. In accordance with data privacy standards, the dataset is publicly accessible and anonymised. Reliance on transaction history-derived behavioural features and limited demographic information are among the limitations.</w:t>
+      </w:r>
+    </w:p>
+    <w:p>
+      <w:pPr>
+        <w:rPr>
+          <w:rFonts w:ascii="Calibri" w:hAnsi="Calibri" w:cs="Calibri"/>
+          <w:sz w:val="24"/>
+          <w:szCs w:val="24"/>
+        </w:rPr>
+      </w:pPr>
+      <w:r>
+        <w:rPr>
+          <w:rFonts w:ascii="Calibri" w:hAnsi="Calibri" w:cs="Calibri"/>
+          <w:sz w:val="24"/>
+          <w:szCs w:val="24"/>
+        </w:rPr>
+        <w:t>Through the alignment of analytical techniques with business requirements, this project seeks to provide a scalable and convincing solution for e-commerce repeat purchase behaviour prediction.</w:t>
+      </w:r>
+    </w:p>
+    <w:p>
+      <w:pPr>
+        <w:rPr>
+          <w:rFonts w:ascii="Calibri" w:hAnsi="Calibri" w:cs="Calibri"/>
+          <w:sz w:val="24"/>
+          <w:szCs w:val="24"/>
+        </w:rPr>
+      </w:pPr>
     </w:p>
     <w:p/>
     <w:p/>
@@ -264,7 +708,6 @@
           <w:sz w:val="32"/>
           <w:szCs w:val="32"/>
         </w:rPr>
-        <w:lastRenderedPageBreak/>
         <w:t>References</w:t>
       </w:r>
     </w:p>
@@ -285,6 +728,7 @@
         <w:t xml:space="preserve">Fader, P.S. and Hardie, B.G.S. (2010). Customer-Base Valuation in a Contractual Setting: The Perils of Ignoring Heterogeneity. Marketing Science, 29(1), pp.85–93. </w:t>
       </w:r>
       <w:proofErr w:type="spellStart"/>
+      <w:proofErr w:type="gramStart"/>
       <w:r>
         <w:rPr>
           <w:rFonts w:ascii="Calibri" w:hAnsi="Calibri" w:cs="Calibri"/>
@@ -300,7 +744,16 @@
           <w:sz w:val="24"/>
           <w:szCs w:val="24"/>
         </w:rPr>
-        <w:t>://doi.org/10.1287/mksc.1080.0482.</w:t>
+        <w:t>://doi.org/10.1287/mksc.1080.0482</w:t>
+      </w:r>
+      <w:proofErr w:type="gramEnd"/>
+      <w:r>
+        <w:rPr>
+          <w:rFonts w:ascii="Calibri" w:hAnsi="Calibri" w:cs="Calibri"/>
+          <w:sz w:val="24"/>
+          <w:szCs w:val="24"/>
+        </w:rPr>
+        <w:t>.</w:t>
       </w:r>
     </w:p>
     <w:p>
@@ -348,6 +801,7 @@
         <w:t xml:space="preserve"> Prediction in E-commerce: A Conceptual Framework and Research Agenda. New Frontiers in Mining Complex Patterns, pp.119–136. </w:t>
       </w:r>
       <w:proofErr w:type="spellStart"/>
+      <w:proofErr w:type="gramStart"/>
       <w:r>
         <w:rPr>
           <w:rFonts w:ascii="Calibri" w:hAnsi="Calibri" w:cs="Calibri"/>
@@ -363,7 +817,16 @@
           <w:sz w:val="24"/>
           <w:szCs w:val="24"/>
         </w:rPr>
-        <w:t>://doi.org/10.1007/978-3-030-48861-1_8.</w:t>
+        <w:t>://doi.org/10.1007/978-3-030-48861-1_8</w:t>
+      </w:r>
+      <w:proofErr w:type="gramEnd"/>
+      <w:r>
+        <w:rPr>
+          <w:rFonts w:ascii="Calibri" w:hAnsi="Calibri" w:cs="Calibri"/>
+          <w:sz w:val="24"/>
+          <w:szCs w:val="24"/>
+        </w:rPr>
+        <w:t>.</w:t>
       </w:r>
     </w:p>
     <w:p>
@@ -383,6 +846,7 @@
         <w:t xml:space="preserve">Jeon, H.G., Kim, C., Lee, J. and Lee, K.C. (2021). Understanding E-Commerce Consumers’ Repeat Purchase Intention: The Role of Trust Transfer and the Moderating Effect of Neuroticism. Frontiers in Psychology, 12. </w:t>
       </w:r>
       <w:proofErr w:type="spellStart"/>
+      <w:proofErr w:type="gramStart"/>
       <w:r>
         <w:rPr>
           <w:rFonts w:ascii="Calibri" w:hAnsi="Calibri" w:cs="Calibri"/>
@@ -398,7 +862,16 @@
           <w:sz w:val="24"/>
           <w:szCs w:val="24"/>
         </w:rPr>
-        <w:t>://doi.org/10.3389/fpsyg.2021.690039.</w:t>
+        <w:t>://doi.org/10.3389/fpsyg.2021.690039</w:t>
+      </w:r>
+      <w:proofErr w:type="gramEnd"/>
+      <w:r>
+        <w:rPr>
+          <w:rFonts w:ascii="Calibri" w:hAnsi="Calibri" w:cs="Calibri"/>
+          <w:sz w:val="24"/>
+          <w:szCs w:val="24"/>
+        </w:rPr>
+        <w:t>.</w:t>
       </w:r>
     </w:p>
     <w:p>
@@ -436,6 +909,7 @@
         <w:t xml:space="preserve">, 52(1), pp.45–75. </w:t>
       </w:r>
       <w:proofErr w:type="spellStart"/>
+      <w:proofErr w:type="gramStart"/>
       <w:r>
         <w:rPr>
           <w:rFonts w:ascii="Calibri" w:hAnsi="Calibri" w:cs="Calibri"/>
@@ -451,7 +925,16 @@
           <w:sz w:val="24"/>
           <w:szCs w:val="24"/>
         </w:rPr>
-        <w:t>://doi.org/10.1007/s41237-024-00253-2.</w:t>
+        <w:t>://doi.org/10.1007/s41237-024-00253-2</w:t>
+      </w:r>
+      <w:proofErr w:type="gramEnd"/>
+      <w:r>
+        <w:rPr>
+          <w:rFonts w:ascii="Calibri" w:hAnsi="Calibri" w:cs="Calibri"/>
+          <w:sz w:val="24"/>
+          <w:szCs w:val="24"/>
+        </w:rPr>
+        <w:t>.</w:t>
       </w:r>
     </w:p>
     <w:p>

</xml_diff>

<commit_message>
Add project methodology chapter
</commit_message>
<xml_diff>
--- a/CA3-Capstone.docx
+++ b/CA3-Capstone.docx
@@ -1759,6 +1759,351 @@
           <w:szCs w:val="24"/>
         </w:rPr>
         <w:t>This study provides a practical, scalable solution to the challenge of customer retention in digital commerce by combining interpretability, stakeholder alignment, and predictive power.</w:t>
+      </w:r>
+    </w:p>
+    <w:p>
+      <w:pPr>
+        <w:rPr>
+          <w:rFonts w:ascii="Calibri" w:hAnsi="Calibri" w:cs="Calibri"/>
+          <w:b/>
+          <w:bCs/>
+          <w:sz w:val="32"/>
+          <w:szCs w:val="32"/>
+        </w:rPr>
+      </w:pPr>
+      <w:r>
+        <w:rPr>
+          <w:rFonts w:ascii="Calibri" w:hAnsi="Calibri" w:cs="Calibri"/>
+          <w:b/>
+          <w:bCs/>
+          <w:sz w:val="32"/>
+          <w:szCs w:val="32"/>
+        </w:rPr>
+        <w:t>5</w:t>
+      </w:r>
+      <w:r>
+        <w:rPr>
+          <w:rFonts w:ascii="Calibri" w:hAnsi="Calibri" w:cs="Calibri"/>
+          <w:b/>
+          <w:bCs/>
+          <w:sz w:val="32"/>
+          <w:szCs w:val="32"/>
+        </w:rPr>
+        <w:t>. Project Methodology and Milestones</w:t>
+      </w:r>
+    </w:p>
+    <w:p>
+      <w:pPr>
+        <w:rPr>
+          <w:rFonts w:ascii="Calibri" w:hAnsi="Calibri" w:cs="Calibri"/>
+          <w:sz w:val="24"/>
+          <w:szCs w:val="24"/>
+        </w:rPr>
+      </w:pPr>
+      <w:r>
+        <w:rPr>
+          <w:rFonts w:ascii="Calibri" w:hAnsi="Calibri" w:cs="Calibri"/>
+          <w:sz w:val="24"/>
+          <w:szCs w:val="24"/>
+        </w:rPr>
+        <w:t>The CRISP-DM (Cross-Industry Standard Process for Data Mining) framework, a well-known approach that facilitates organised, iterative, and business-aligned data science processes, was used in this study (Wirth and Hipp, 2000)</w:t>
+      </w:r>
+      <w:r>
+        <w:rPr>
+          <w:rFonts w:ascii="Calibri" w:hAnsi="Calibri" w:cs="Calibri"/>
+          <w:sz w:val="24"/>
+          <w:szCs w:val="24"/>
+        </w:rPr>
+        <w:t xml:space="preserve">. </w:t>
+      </w:r>
+      <w:r>
+        <w:rPr>
+          <w:rFonts w:ascii="Calibri" w:hAnsi="Calibri" w:cs="Calibri"/>
+          <w:sz w:val="24"/>
+          <w:szCs w:val="24"/>
+        </w:rPr>
+        <w:t>The six phases such as business understanding, data understanding, data preparation, modelling, evaluation, and deployment offered a foundation for managing deliverables, matching stakeholder requirements.</w:t>
+      </w:r>
+    </w:p>
+    <w:p>
+      <w:pPr>
+        <w:rPr>
+          <w:rFonts w:ascii="Calibri" w:hAnsi="Calibri" w:cs="Calibri"/>
+          <w:sz w:val="24"/>
+          <w:szCs w:val="24"/>
+        </w:rPr>
+      </w:pPr>
+      <w:r>
+        <w:rPr>
+          <w:rFonts w:ascii="Calibri" w:hAnsi="Calibri" w:cs="Calibri"/>
+          <w:sz w:val="24"/>
+          <w:szCs w:val="24"/>
+        </w:rPr>
+        <w:t>The approach started with the business understanding phase, which clarified the primary objective of the project: to use transactional data to predict repeat purchasing behaviour and to produce interpretable outputs for the marketing and CRM teams.</w:t>
+      </w:r>
+      <w:r>
+        <w:rPr>
+          <w:rFonts w:ascii="Calibri" w:hAnsi="Calibri" w:cs="Calibri"/>
+          <w:sz w:val="24"/>
+          <w:szCs w:val="24"/>
+        </w:rPr>
+        <w:t xml:space="preserve"> </w:t>
+      </w:r>
+      <w:r>
+        <w:rPr>
+          <w:rFonts w:ascii="Calibri" w:hAnsi="Calibri" w:cs="Calibri"/>
+          <w:sz w:val="24"/>
+          <w:szCs w:val="24"/>
+        </w:rPr>
+        <w:t>In order to keep the modelling pipeline in accordance with strategic objectives including finding behavioural predictors, choosing an interpretable model, and enabling stakeholder-relevant insights, this phase also established three research questions and their corresponding objectives.</w:t>
+      </w:r>
+    </w:p>
+    <w:p>
+      <w:pPr>
+        <w:rPr>
+          <w:rFonts w:ascii="Calibri" w:hAnsi="Calibri" w:cs="Calibri"/>
+          <w:sz w:val="24"/>
+          <w:szCs w:val="24"/>
+        </w:rPr>
+      </w:pPr>
+      <w:r>
+        <w:rPr>
+          <w:rFonts w:ascii="Calibri" w:hAnsi="Calibri" w:cs="Calibri"/>
+          <w:sz w:val="24"/>
+          <w:szCs w:val="24"/>
+        </w:rPr>
+        <w:t xml:space="preserve">Exploratory analysis of anonymised transactional records was carried out during the data understanding step. </w:t>
+      </w:r>
+      <w:proofErr w:type="spellStart"/>
+      <w:r>
+        <w:rPr>
+          <w:rFonts w:ascii="Calibri" w:hAnsi="Calibri" w:cs="Calibri"/>
+          <w:sz w:val="24"/>
+          <w:szCs w:val="24"/>
+        </w:rPr>
+        <w:t>Avg_days_between_purchases</w:t>
+      </w:r>
+      <w:proofErr w:type="spellEnd"/>
+      <w:r>
+        <w:rPr>
+          <w:rFonts w:ascii="Calibri" w:hAnsi="Calibri" w:cs="Calibri"/>
+          <w:sz w:val="24"/>
+          <w:szCs w:val="24"/>
+        </w:rPr>
+        <w:t xml:space="preserve">, </w:t>
+      </w:r>
+      <w:proofErr w:type="spellStart"/>
+      <w:r>
+        <w:rPr>
+          <w:rFonts w:ascii="Calibri" w:hAnsi="Calibri" w:cs="Calibri"/>
+          <w:sz w:val="24"/>
+          <w:szCs w:val="24"/>
+        </w:rPr>
+        <w:t>total_spend_per_customer</w:t>
+      </w:r>
+      <w:proofErr w:type="spellEnd"/>
+      <w:r>
+        <w:rPr>
+          <w:rFonts w:ascii="Calibri" w:hAnsi="Calibri" w:cs="Calibri"/>
+          <w:sz w:val="24"/>
+          <w:szCs w:val="24"/>
+        </w:rPr>
+        <w:t xml:space="preserve">, and </w:t>
+      </w:r>
+      <w:proofErr w:type="spellStart"/>
+      <w:r>
+        <w:rPr>
+          <w:rFonts w:ascii="Calibri" w:hAnsi="Calibri" w:cs="Calibri"/>
+          <w:sz w:val="24"/>
+          <w:szCs w:val="24"/>
+        </w:rPr>
+        <w:t>category_diversity</w:t>
+      </w:r>
+      <w:proofErr w:type="spellEnd"/>
+      <w:r>
+        <w:rPr>
+          <w:rFonts w:ascii="Calibri" w:hAnsi="Calibri" w:cs="Calibri"/>
+          <w:sz w:val="24"/>
+          <w:szCs w:val="24"/>
+        </w:rPr>
+        <w:t xml:space="preserve"> are important behavioural features that were found to be possibly predictive. To guide preprocessing choices, descriptive statistics, class imbalance, and missingness patterns were evaluated.</w:t>
+      </w:r>
+    </w:p>
+    <w:p>
+      <w:pPr>
+        <w:rPr>
+          <w:rFonts w:ascii="Calibri" w:hAnsi="Calibri" w:cs="Calibri"/>
+          <w:sz w:val="24"/>
+          <w:szCs w:val="24"/>
+        </w:rPr>
+      </w:pPr>
+      <w:r>
+        <w:rPr>
+          <w:rFonts w:ascii="Calibri" w:hAnsi="Calibri" w:cs="Calibri"/>
+          <w:sz w:val="24"/>
+          <w:szCs w:val="24"/>
+        </w:rPr>
+        <w:t>Engineering behavioural features, encoding categorical variables, and dividing the dataset into training and test sets were all part of the data preparation process.</w:t>
+      </w:r>
+      <w:r>
+        <w:rPr>
+          <w:rFonts w:ascii="Calibri" w:hAnsi="Calibri" w:cs="Calibri"/>
+          <w:sz w:val="24"/>
+          <w:szCs w:val="24"/>
+        </w:rPr>
+        <w:t xml:space="preserve"> </w:t>
+      </w:r>
+      <w:r>
+        <w:rPr>
+          <w:rFonts w:ascii="Calibri" w:hAnsi="Calibri" w:cs="Calibri"/>
+          <w:sz w:val="24"/>
+          <w:szCs w:val="24"/>
+        </w:rPr>
+        <w:t>Transparency and consistency were supported by version control and documentation of all transformations.</w:t>
+      </w:r>
+      <w:r>
+        <w:rPr>
+          <w:rFonts w:ascii="Calibri" w:hAnsi="Calibri" w:cs="Calibri"/>
+          <w:sz w:val="24"/>
+          <w:szCs w:val="24"/>
+        </w:rPr>
+        <w:t xml:space="preserve"> </w:t>
+      </w:r>
+      <w:r>
+        <w:rPr>
+          <w:rFonts w:ascii="Calibri" w:hAnsi="Calibri" w:cs="Calibri"/>
+          <w:sz w:val="24"/>
+          <w:szCs w:val="24"/>
+        </w:rPr>
+        <w:t>SMOTE was used to synthetically oversample the minority class in the training set in order to address class imbalance.</w:t>
+      </w:r>
+      <w:r>
+        <w:rPr>
+          <w:rFonts w:ascii="Calibri" w:hAnsi="Calibri" w:cs="Calibri"/>
+          <w:sz w:val="24"/>
+          <w:szCs w:val="24"/>
+        </w:rPr>
+        <w:t xml:space="preserve"> </w:t>
+      </w:r>
+      <w:r>
+        <w:rPr>
+          <w:rFonts w:ascii="Calibri" w:hAnsi="Calibri" w:cs="Calibri"/>
+          <w:sz w:val="24"/>
+          <w:szCs w:val="24"/>
+        </w:rPr>
+        <w:t>When appropriate, feature scaling was used</w:t>
+      </w:r>
+      <w:r>
+        <w:rPr>
+          <w:rFonts w:ascii="Calibri" w:hAnsi="Calibri" w:cs="Calibri"/>
+          <w:sz w:val="24"/>
+          <w:szCs w:val="24"/>
+        </w:rPr>
+        <w:t>.</w:t>
+      </w:r>
+    </w:p>
+    <w:p>
+      <w:pPr>
+        <w:rPr>
+          <w:rFonts w:ascii="Calibri" w:hAnsi="Calibri" w:cs="Calibri"/>
+          <w:sz w:val="24"/>
+          <w:szCs w:val="24"/>
+        </w:rPr>
+      </w:pPr>
+      <w:r>
+        <w:rPr>
+          <w:rFonts w:ascii="Calibri" w:hAnsi="Calibri" w:cs="Calibri"/>
+          <w:sz w:val="24"/>
+          <w:szCs w:val="24"/>
+        </w:rPr>
+        <w:lastRenderedPageBreak/>
+        <w:t xml:space="preserve">Four classifiers such as Logistic Regression, Decision Tree, Random Forest, and </w:t>
+      </w:r>
+      <w:proofErr w:type="spellStart"/>
+      <w:r>
+        <w:rPr>
+          <w:rFonts w:ascii="Calibri" w:hAnsi="Calibri" w:cs="Calibri"/>
+          <w:sz w:val="24"/>
+          <w:szCs w:val="24"/>
+        </w:rPr>
+        <w:t>XGBoost</w:t>
+      </w:r>
+      <w:proofErr w:type="spellEnd"/>
+      <w:r>
+        <w:rPr>
+          <w:rFonts w:ascii="Calibri" w:hAnsi="Calibri" w:cs="Calibri"/>
+          <w:sz w:val="24"/>
+          <w:szCs w:val="24"/>
+        </w:rPr>
+        <w:t xml:space="preserve"> were benchmarked throughout the modelling phase. </w:t>
+      </w:r>
+      <w:proofErr w:type="spellStart"/>
+      <w:r>
+        <w:rPr>
+          <w:rFonts w:ascii="Calibri" w:hAnsi="Calibri" w:cs="Calibri"/>
+          <w:sz w:val="24"/>
+          <w:szCs w:val="24"/>
+        </w:rPr>
+        <w:t>GridSearchCV</w:t>
+      </w:r>
+      <w:proofErr w:type="spellEnd"/>
+      <w:r>
+        <w:rPr>
+          <w:rFonts w:ascii="Calibri" w:hAnsi="Calibri" w:cs="Calibri"/>
+          <w:sz w:val="24"/>
+          <w:szCs w:val="24"/>
+        </w:rPr>
+        <w:t xml:space="preserve"> was applied to tune hyperparameters using F1-score as the main metric and 5-fold cross-validation. With an F1-score of 0.988 and ROC-AUC of 0.991, the Decision Tree was ultimately chosen for final implementation because it balanced performance and interpretability.</w:t>
+      </w:r>
+    </w:p>
+    <w:p>
+      <w:pPr>
+        <w:rPr>
+          <w:rFonts w:ascii="Calibri" w:hAnsi="Calibri" w:cs="Calibri"/>
+          <w:sz w:val="24"/>
+          <w:szCs w:val="24"/>
+        </w:rPr>
+      </w:pPr>
+      <w:r>
+        <w:rPr>
+          <w:rFonts w:ascii="Calibri" w:hAnsi="Calibri" w:cs="Calibri"/>
+          <w:sz w:val="24"/>
+          <w:szCs w:val="24"/>
+        </w:rPr>
+        <w:t>Both quantitative metrics and qualitative interpretability were used in the evaluation phase. SHAP was applied to create global and local explanations, ensuring that the model’s predictions could be understood and applied by non-technical stakeholders. To evaluate robustness and practical relevance, error analysis and edge-case testing were carried out.</w:t>
+      </w:r>
+    </w:p>
+    <w:p>
+      <w:pPr>
+        <w:rPr>
+          <w:rFonts w:ascii="Calibri" w:hAnsi="Calibri" w:cs="Calibri"/>
+          <w:sz w:val="24"/>
+          <w:szCs w:val="24"/>
+        </w:rPr>
+      </w:pPr>
+      <w:r>
+        <w:rPr>
+          <w:rFonts w:ascii="Calibri" w:hAnsi="Calibri" w:cs="Calibri"/>
+          <w:sz w:val="24"/>
+          <w:szCs w:val="24"/>
+        </w:rPr>
+        <w:t>Lastly, the model outputs were created for the business context during the interpretation stage.</w:t>
+      </w:r>
+      <w:r>
+        <w:rPr>
+          <w:rFonts w:ascii="Calibri" w:hAnsi="Calibri" w:cs="Calibri"/>
+          <w:sz w:val="24"/>
+          <w:szCs w:val="24"/>
+        </w:rPr>
+        <w:t xml:space="preserve"> </w:t>
+      </w:r>
+      <w:r>
+        <w:rPr>
+          <w:rFonts w:ascii="Calibri" w:hAnsi="Calibri" w:cs="Calibri"/>
+          <w:sz w:val="24"/>
+          <w:szCs w:val="24"/>
+        </w:rPr>
+        <w:t>The deliverables included SHAP plots and insights that can support with customer engagement planning and CRM strategy. This made sure that the project's results were both technically sound and flexible enough to inform more general marketing applications, such as cross-selling campaigns and targeted promotions.</w:t>
       </w:r>
     </w:p>
     <w:p/>
@@ -1807,6 +2152,7 @@
         <w:t xml:space="preserve">Fader, P.S. and Hardie, B.G.S. (2010). Customer-Base Valuation in a Contractual Setting: The Perils of Ignoring Heterogeneity. Marketing Science, 29(1), pp.85–93. </w:t>
       </w:r>
       <w:proofErr w:type="spellStart"/>
+      <w:proofErr w:type="gramStart"/>
       <w:r>
         <w:rPr>
           <w:rFonts w:ascii="Calibri" w:hAnsi="Calibri" w:cs="Calibri"/>
@@ -1822,7 +2168,16 @@
           <w:sz w:val="24"/>
           <w:szCs w:val="24"/>
         </w:rPr>
-        <w:t>://doi.org/10.1287/mksc.1080.0482.</w:t>
+        <w:t>://doi.org/10.1287/mksc.1080.0482</w:t>
+      </w:r>
+      <w:proofErr w:type="gramEnd"/>
+      <w:r>
+        <w:rPr>
+          <w:rFonts w:ascii="Calibri" w:hAnsi="Calibri" w:cs="Calibri"/>
+          <w:sz w:val="24"/>
+          <w:szCs w:val="24"/>
+        </w:rPr>
+        <w:t>.</w:t>
       </w:r>
     </w:p>
     <w:p>
@@ -1870,6 +2225,7 @@
         <w:t xml:space="preserve"> Prediction in E-commerce: A Conceptual Framework and Research Agenda. New Frontiers in Mining Complex Patterns, pp.119–136. </w:t>
       </w:r>
       <w:proofErr w:type="spellStart"/>
+      <w:proofErr w:type="gramStart"/>
       <w:r>
         <w:rPr>
           <w:rFonts w:ascii="Calibri" w:hAnsi="Calibri" w:cs="Calibri"/>
@@ -1885,7 +2241,16 @@
           <w:sz w:val="24"/>
           <w:szCs w:val="24"/>
         </w:rPr>
-        <w:t>://doi.org/10.1007/978-3-030-48861-1_8.</w:t>
+        <w:t>://doi.org/10.1007/978-3-030-48861-1_8</w:t>
+      </w:r>
+      <w:proofErr w:type="gramEnd"/>
+      <w:r>
+        <w:rPr>
+          <w:rFonts w:ascii="Calibri" w:hAnsi="Calibri" w:cs="Calibri"/>
+          <w:sz w:val="24"/>
+          <w:szCs w:val="24"/>
+        </w:rPr>
+        <w:t>.</w:t>
       </w:r>
     </w:p>
     <w:p>
@@ -1905,6 +2270,7 @@
         <w:t xml:space="preserve">Jeon, H.G., Kim, C., Lee, J. and Lee, K.C. (2021). Understanding E-Commerce Consumers’ Repeat Purchase Intention: The Role of Trust Transfer and the Moderating Effect of Neuroticism. Frontiers in Psychology, 12. </w:t>
       </w:r>
       <w:proofErr w:type="spellStart"/>
+      <w:proofErr w:type="gramStart"/>
       <w:r>
         <w:rPr>
           <w:rFonts w:ascii="Calibri" w:hAnsi="Calibri" w:cs="Calibri"/>
@@ -1920,7 +2286,16 @@
           <w:sz w:val="24"/>
           <w:szCs w:val="24"/>
         </w:rPr>
-        <w:t>://doi.org/10.3389/fpsyg.2021.690039.</w:t>
+        <w:t>://doi.org/10.3389/fpsyg.2021.690039</w:t>
+      </w:r>
+      <w:proofErr w:type="gramEnd"/>
+      <w:r>
+        <w:rPr>
+          <w:rFonts w:ascii="Calibri" w:hAnsi="Calibri" w:cs="Calibri"/>
+          <w:sz w:val="24"/>
+          <w:szCs w:val="24"/>
+        </w:rPr>
+        <w:t>.</w:t>
       </w:r>
     </w:p>
     <w:p>
@@ -1941,6 +2316,7 @@
         <w:t xml:space="preserve">Lundberg, S. and Lee, S.-I. (2017). A Unified Approach to Interpreting Model Predictions. [online] arXiv.org. </w:t>
       </w:r>
       <w:proofErr w:type="spellStart"/>
+      <w:proofErr w:type="gramStart"/>
       <w:r>
         <w:rPr>
           <w:rFonts w:ascii="Calibri" w:hAnsi="Calibri" w:cs="Calibri"/>
@@ -1956,7 +2332,16 @@
           <w:sz w:val="24"/>
           <w:szCs w:val="24"/>
         </w:rPr>
-        <w:t>://doi.org/10.48550/arXiv.1705.07874.</w:t>
+        <w:t>://doi.org/10.48550/arXiv.1705.07874</w:t>
+      </w:r>
+      <w:proofErr w:type="gramEnd"/>
+      <w:r>
+        <w:rPr>
+          <w:rFonts w:ascii="Calibri" w:hAnsi="Calibri" w:cs="Calibri"/>
+          <w:sz w:val="24"/>
+          <w:szCs w:val="24"/>
+        </w:rPr>
+        <w:t>.</w:t>
       </w:r>
     </w:p>
     <w:p>
@@ -2011,6 +2396,7 @@
         <w:t xml:space="preserve"> in Quick Commerce. Journal of Service Research, [online] 28(2). </w:t>
       </w:r>
       <w:proofErr w:type="spellStart"/>
+      <w:proofErr w:type="gramStart"/>
       <w:r>
         <w:rPr>
           <w:rFonts w:ascii="Calibri" w:hAnsi="Calibri" w:cs="Calibri"/>
@@ -2026,7 +2412,16 @@
           <w:sz w:val="24"/>
           <w:szCs w:val="24"/>
         </w:rPr>
-        <w:t>://doi.org/10.1177/10946705241236961.</w:t>
+        <w:t>://doi.org/10.1177/10946705241236961</w:t>
+      </w:r>
+      <w:proofErr w:type="gramEnd"/>
+      <w:r>
+        <w:rPr>
+          <w:rFonts w:ascii="Calibri" w:hAnsi="Calibri" w:cs="Calibri"/>
+          <w:sz w:val="24"/>
+          <w:szCs w:val="24"/>
+        </w:rPr>
+        <w:t>.</w:t>
       </w:r>
     </w:p>
     <w:p>
@@ -2064,6 +2459,7 @@
         <w:t xml:space="preserve">, 52(1), pp.45–75. </w:t>
       </w:r>
       <w:proofErr w:type="spellStart"/>
+      <w:proofErr w:type="gramStart"/>
       <w:r>
         <w:rPr>
           <w:rFonts w:ascii="Calibri" w:hAnsi="Calibri" w:cs="Calibri"/>
@@ -2079,7 +2475,49 @@
           <w:sz w:val="24"/>
           <w:szCs w:val="24"/>
         </w:rPr>
-        <w:t>://doi.org/10.1007/s41237-024-00253-2.</w:t>
+        <w:t>://doi.org/10.1007/s41237-024-00253-2</w:t>
+      </w:r>
+      <w:proofErr w:type="gramEnd"/>
+      <w:r>
+        <w:rPr>
+          <w:rFonts w:ascii="Calibri" w:hAnsi="Calibri" w:cs="Calibri"/>
+          <w:sz w:val="24"/>
+          <w:szCs w:val="24"/>
+        </w:rPr>
+        <w:t>.</w:t>
+      </w:r>
+    </w:p>
+    <w:p>
+      <w:pPr>
+        <w:rPr>
+          <w:rFonts w:ascii="Calibri" w:hAnsi="Calibri" w:cs="Calibri"/>
+          <w:sz w:val="24"/>
+          <w:szCs w:val="24"/>
+        </w:rPr>
+      </w:pPr>
+      <w:r>
+        <w:rPr>
+          <w:rFonts w:ascii="Calibri" w:hAnsi="Calibri" w:cs="Calibri"/>
+          <w:sz w:val="24"/>
+          <w:szCs w:val="24"/>
+        </w:rPr>
+        <w:t>Wirth, R. and Hipp, J. (2000). CRISP-DM: Towards a Standard Process Model for Data Mining. [online] Available at:</w:t>
+      </w:r>
+      <w:r>
+        <w:rPr>
+          <w:rFonts w:ascii="Calibri" w:hAnsi="Calibri" w:cs="Calibri"/>
+          <w:sz w:val="24"/>
+          <w:szCs w:val="24"/>
+        </w:rPr>
+        <w:t xml:space="preserve"> </w:t>
+      </w:r>
+      <w:r>
+        <w:rPr>
+          <w:rFonts w:ascii="Calibri" w:hAnsi="Calibri" w:cs="Calibri"/>
+          <w:sz w:val="24"/>
+          <w:szCs w:val="24"/>
+        </w:rPr>
+        <w:t>https://www.cs.unibo.it/~danilo.montesi/CBD/Beatriz/10.1.1.198.5133.pdf.</w:t>
       </w:r>
     </w:p>
     <w:p>

</xml_diff>

<commit_message>
Add Tools and Technologies chapter
</commit_message>
<xml_diff>
--- a/CA3-Capstone.docx
+++ b/CA3-Capstone.docx
@@ -79,25 +79,7 @@
           <w:sz w:val="24"/>
           <w:szCs w:val="24"/>
         </w:rPr>
-        <w:t xml:space="preserve">Retention has become a strategic priority in the quickly changing e-commerce industry, where customer acquisition costs are increasing and consumer expectations are changing. According to Fader and Hardie (2009) and </w:t>
-      </w:r>
-      <w:proofErr w:type="spellStart"/>
-      <w:r>
-        <w:rPr>
-          <w:rFonts w:ascii="Calibri" w:hAnsi="Calibri" w:cs="Calibri"/>
-          <w:sz w:val="24"/>
-          <w:szCs w:val="24"/>
-        </w:rPr>
-        <w:t>Cirqueira</w:t>
-      </w:r>
-      <w:proofErr w:type="spellEnd"/>
-      <w:r>
-        <w:rPr>
-          <w:rFonts w:ascii="Calibri" w:hAnsi="Calibri" w:cs="Calibri"/>
-          <w:sz w:val="24"/>
-          <w:szCs w:val="24"/>
-        </w:rPr>
-        <w:t xml:space="preserve"> et al. (2021), repeat customers are more likely to spend more, interact more frequently, and respond favourably to tailored marketing campaigns.</w:t>
+        <w:t>Retention has become a strategic priority in the quickly changing e-commerce industry, where customer acquisition costs are increasing and consumer expectations are changing. According to Fader and Hardie (2009) and Cirqueira et al. (2021), repeat customers are more likely to spend more, interact more frequently, and respond favourably to tailored marketing campaigns.</w:t>
       </w:r>
       <w:r>
         <w:rPr>
@@ -203,54 +185,8 @@
           <w:sz w:val="24"/>
           <w:szCs w:val="24"/>
         </w:rPr>
-        <w:t>To explain both global feature importance and local predictions, the project uses SHAP (</w:t>
-      </w:r>
-      <w:proofErr w:type="spellStart"/>
-      <w:r>
-        <w:rPr>
-          <w:rFonts w:ascii="Calibri" w:hAnsi="Calibri" w:cs="Calibri"/>
-          <w:sz w:val="24"/>
-          <w:szCs w:val="24"/>
-        </w:rPr>
-        <w:t>SHapley</w:t>
-      </w:r>
-      <w:proofErr w:type="spellEnd"/>
-      <w:r>
-        <w:rPr>
-          <w:rFonts w:ascii="Calibri" w:hAnsi="Calibri" w:cs="Calibri"/>
-          <w:sz w:val="24"/>
-          <w:szCs w:val="24"/>
-        </w:rPr>
-        <w:t xml:space="preserve"> Additive </w:t>
-      </w:r>
-      <w:proofErr w:type="spellStart"/>
-      <w:r>
-        <w:rPr>
-          <w:rFonts w:ascii="Calibri" w:hAnsi="Calibri" w:cs="Calibri"/>
-          <w:sz w:val="24"/>
-          <w:szCs w:val="24"/>
-        </w:rPr>
-        <w:t>exPlanations</w:t>
-      </w:r>
-      <w:proofErr w:type="spellEnd"/>
-      <w:r>
-        <w:rPr>
-          <w:rFonts w:ascii="Calibri" w:hAnsi="Calibri" w:cs="Calibri"/>
-          <w:sz w:val="24"/>
-          <w:szCs w:val="24"/>
-        </w:rPr>
-        <w:t xml:space="preserve">) in addition to high-performing algorithms including Logistic Regression, Decision Tree, Random Forest, and </w:t>
-      </w:r>
-      <w:proofErr w:type="spellStart"/>
-      <w:r>
-        <w:rPr>
-          <w:rFonts w:ascii="Calibri" w:hAnsi="Calibri" w:cs="Calibri"/>
-          <w:sz w:val="24"/>
-          <w:szCs w:val="24"/>
-        </w:rPr>
-        <w:t>XGBoost</w:t>
-      </w:r>
-      <w:proofErr w:type="spellEnd"/>
+        <w:t>To explain both global feature importance and local predictions, the project uses SHAP (SHapley Additive exPlanations) in addition to high-performing algorithms including Logistic Regression, Decision Tree, Random Forest, and XGBoost</w:t>
+      </w:r>
       <w:r>
         <w:rPr>
           <w:rFonts w:ascii="Calibri" w:hAnsi="Calibri" w:cs="Calibri"/>
@@ -338,25 +274,7 @@
           <w:sz w:val="24"/>
           <w:szCs w:val="24"/>
         </w:rPr>
-        <w:t>can effectively differentiate between one-time and repeat buyers (</w:t>
-      </w:r>
-      <w:proofErr w:type="spellStart"/>
-      <w:r>
-        <w:rPr>
-          <w:rFonts w:ascii="Calibri" w:hAnsi="Calibri" w:cs="Calibri"/>
-          <w:sz w:val="24"/>
-          <w:szCs w:val="24"/>
-        </w:rPr>
-        <w:t>Cirqueira</w:t>
-      </w:r>
-      <w:proofErr w:type="spellEnd"/>
-      <w:r>
-        <w:rPr>
-          <w:rFonts w:ascii="Calibri" w:hAnsi="Calibri" w:cs="Calibri"/>
-          <w:sz w:val="24"/>
-          <w:szCs w:val="24"/>
-        </w:rPr>
-        <w:t xml:space="preserve"> et al., 2021).</w:t>
+        <w:t>can effectively differentiate between one-time and repeat buyers (Cirqueira et al., 2021).</w:t>
       </w:r>
     </w:p>
     <w:p>
@@ -549,25 +467,7 @@
           <w:sz w:val="24"/>
           <w:szCs w:val="24"/>
         </w:rPr>
-        <w:t xml:space="preserve">To develop a supervised machine learning model that predicts repeat purchase </w:t>
-      </w:r>
-      <w:proofErr w:type="spellStart"/>
-      <w:r>
-        <w:rPr>
-          <w:rFonts w:ascii="Calibri" w:hAnsi="Calibri" w:cs="Calibri"/>
-          <w:sz w:val="24"/>
-          <w:szCs w:val="24"/>
-        </w:rPr>
-        <w:t>behavior</w:t>
-      </w:r>
-      <w:proofErr w:type="spellEnd"/>
-      <w:r>
-        <w:rPr>
-          <w:rFonts w:ascii="Calibri" w:hAnsi="Calibri" w:cs="Calibri"/>
-          <w:sz w:val="24"/>
-          <w:szCs w:val="24"/>
-        </w:rPr>
-        <w:t xml:space="preserve"> using transactional features.</w:t>
+        <w:t>To develop a supervised machine learning model that predicts repeat purchase behavior using transactional features.</w:t>
       </w:r>
     </w:p>
     <w:p>
@@ -592,25 +492,7 @@
           <w:sz w:val="24"/>
           <w:szCs w:val="24"/>
         </w:rPr>
-        <w:t xml:space="preserve">To evaluate and compare the performance of multiple classification algorithms (e.g., Random Forest, </w:t>
-      </w:r>
-      <w:proofErr w:type="spellStart"/>
-      <w:r>
-        <w:rPr>
-          <w:rFonts w:ascii="Calibri" w:hAnsi="Calibri" w:cs="Calibri"/>
-          <w:sz w:val="24"/>
-          <w:szCs w:val="24"/>
-        </w:rPr>
-        <w:t>XGBoost</w:t>
-      </w:r>
-      <w:proofErr w:type="spellEnd"/>
-      <w:r>
-        <w:rPr>
-          <w:rFonts w:ascii="Calibri" w:hAnsi="Calibri" w:cs="Calibri"/>
-          <w:sz w:val="24"/>
-          <w:szCs w:val="24"/>
-        </w:rPr>
-        <w:t>).</w:t>
+        <w:t>To evaluate and compare the performance of multiple classification algorithms (e.g., Random Forest, XGBoost).</w:t>
       </w:r>
     </w:p>
     <w:p>
@@ -837,7 +719,7 @@
           <w:sz w:val="32"/>
           <w:szCs w:val="32"/>
         </w:rPr>
-        <w:t>4</w:t>
+        <w:t>3</w:t>
       </w:r>
       <w:r>
         <w:rPr>
@@ -889,25 +771,7 @@
           <w:szCs w:val="24"/>
         </w:rPr>
         <w:lastRenderedPageBreak/>
-        <w:t>essential to customer-base valuation models because they are more predictable and cost-effective to serve, according to Fader and Hardie (2009). Businesses are focussing on individualized prediction instead of broad segmentation as acquisition costs increase and consumer behaviour becomes more fragmented (</w:t>
-      </w:r>
-      <w:proofErr w:type="spellStart"/>
-      <w:r>
-        <w:rPr>
-          <w:rFonts w:ascii="Calibri" w:hAnsi="Calibri" w:cs="Calibri"/>
-          <w:sz w:val="24"/>
-          <w:szCs w:val="24"/>
-        </w:rPr>
-        <w:t>Cirqueira</w:t>
-      </w:r>
-      <w:proofErr w:type="spellEnd"/>
-      <w:r>
-        <w:rPr>
-          <w:rFonts w:ascii="Calibri" w:hAnsi="Calibri" w:cs="Calibri"/>
-          <w:sz w:val="24"/>
-          <w:szCs w:val="24"/>
-        </w:rPr>
-        <w:t xml:space="preserve"> et al., 2021).</w:t>
+        <w:t>essential to customer-base valuation models because they are more predictable and cost-effective to serve, according to Fader and Hardie (2009). Businesses are focussing on individualized prediction instead of broad segmentation as acquisition costs increase and consumer behaviour becomes more fragmented (Cirqueira et al., 2021).</w:t>
       </w:r>
     </w:p>
     <w:p>
@@ -973,25 +837,7 @@
           <w:sz w:val="24"/>
           <w:szCs w:val="24"/>
         </w:rPr>
-        <w:t xml:space="preserve">A scalable alternative is provided by predictive analytics. Using transactional data like frequency, recency, and monetary value, supervised machine learning models can predict the likelihood of repeat purchases. In order to accommodate the data limitations of numerous e-commerce platforms, </w:t>
-      </w:r>
-      <w:proofErr w:type="spellStart"/>
-      <w:r>
-        <w:rPr>
-          <w:rFonts w:ascii="Calibri" w:hAnsi="Calibri" w:cs="Calibri"/>
-          <w:sz w:val="24"/>
-          <w:szCs w:val="24"/>
-        </w:rPr>
-        <w:t>Cirqueira</w:t>
-      </w:r>
-      <w:proofErr w:type="spellEnd"/>
-      <w:r>
-        <w:rPr>
-          <w:rFonts w:ascii="Calibri" w:hAnsi="Calibri" w:cs="Calibri"/>
-          <w:sz w:val="24"/>
-          <w:szCs w:val="24"/>
-        </w:rPr>
-        <w:t xml:space="preserve"> et al. (2021) offer a conceptual framework for predicting purchase behaviour that prioritises behavioural features over demographic ones. A larger trend in data-driven customer strategy is seen in this move from descriptive segmentation to predictive modelling.</w:t>
+        <w:t>A scalable alternative is provided by predictive analytics. Using transactional data like frequency, recency, and monetary value, supervised machine learning models can predict the likelihood of repeat purchases. In order to accommodate the data limitations of numerous e-commerce platforms, Cirqueira et al. (2021) offer a conceptual framework for predicting purchase behaviour that prioritises behavioural features over demographic ones. A larger trend in data-driven customer strategy is seen in this move from descriptive segmentation to predictive modelling.</w:t>
       </w:r>
     </w:p>
     <w:p>
@@ -1067,25 +913,7 @@
           <w:sz w:val="24"/>
           <w:szCs w:val="24"/>
         </w:rPr>
-        <w:t>Building on this basis, SHAP (</w:t>
-      </w:r>
-      <w:proofErr w:type="spellStart"/>
-      <w:r>
-        <w:rPr>
-          <w:rFonts w:ascii="Calibri" w:hAnsi="Calibri" w:cs="Calibri"/>
-          <w:sz w:val="24"/>
-          <w:szCs w:val="24"/>
-        </w:rPr>
-        <w:t>SHapley</w:t>
-      </w:r>
-      <w:proofErr w:type="spellEnd"/>
-      <w:r>
-        <w:rPr>
-          <w:rFonts w:ascii="Calibri" w:hAnsi="Calibri" w:cs="Calibri"/>
-          <w:sz w:val="24"/>
-          <w:szCs w:val="24"/>
-        </w:rPr>
-        <w:t xml:space="preserve"> Additive reasons) provides a more theoretically grounded method that delivers both local explanations for specific predictions and global insights into feature importance (Lundberg and Lee, 2017; Molnar, 2022). In contrast to LIME, SHAP is based on cooperative game theory, which ensures consistency and fairness in the computation of feature contributions (Lundberg and Lee, 2017).</w:t>
+        <w:t>Building on this basis, SHAP (SHapley Additive reasons) provides a more theoretically grounded method that delivers both local explanations for specific predictions and global insights into feature importance (Lundberg and Lee, 2017; Molnar, 2022). In contrast to LIME, SHAP is based on cooperative game theory, which ensures consistency and fairness in the computation of feature contributions (Lundberg and Lee, 2017).</w:t>
       </w:r>
     </w:p>
     <w:p>
@@ -1165,7 +993,7 @@
           <w:sz w:val="28"/>
           <w:szCs w:val="28"/>
         </w:rPr>
-        <w:t xml:space="preserve">4.1 </w:t>
+        <w:t>3</w:t>
       </w:r>
       <w:r>
         <w:rPr>
@@ -1175,327 +1003,9 @@
           <w:sz w:val="28"/>
           <w:szCs w:val="28"/>
         </w:rPr>
-        <w:t>Identified Gaps in the Literature</w:t>
-      </w:r>
-    </w:p>
-    <w:p>
-      <w:pPr>
-        <w:rPr>
-          <w:rFonts w:ascii="Calibri" w:hAnsi="Calibri" w:cs="Calibri"/>
-          <w:sz w:val="24"/>
-          <w:szCs w:val="24"/>
-        </w:rPr>
-      </w:pPr>
-      <w:r>
-        <w:rPr>
-          <w:rFonts w:ascii="Calibri" w:hAnsi="Calibri" w:cs="Calibri"/>
-          <w:sz w:val="24"/>
-          <w:szCs w:val="24"/>
-        </w:rPr>
-        <w:t xml:space="preserve">There are still a number of gaps in the current body of study despite these contributions. Many studies still use segmentation methods like rule-based classification or demographic clustering, which are either static or overly simplistic (Jeon et al., 2021; </w:t>
-      </w:r>
-      <w:proofErr w:type="spellStart"/>
-      <w:r>
-        <w:rPr>
-          <w:rFonts w:ascii="Calibri" w:hAnsi="Calibri" w:cs="Calibri"/>
-          <w:sz w:val="24"/>
-          <w:szCs w:val="24"/>
-        </w:rPr>
-        <w:t>Cirqueira</w:t>
-      </w:r>
-      <w:proofErr w:type="spellEnd"/>
-      <w:r>
-        <w:rPr>
-          <w:rFonts w:ascii="Calibri" w:hAnsi="Calibri" w:cs="Calibri"/>
-          <w:sz w:val="24"/>
-          <w:szCs w:val="24"/>
-        </w:rPr>
-        <w:t xml:space="preserve"> et al., 2021). The temporal and behavioural complexity of online buying, where consumer preferences and engagement patterns change quickly, is frequently missed by these methods. Such segmentation may result in misclassification and </w:t>
-      </w:r>
-      <w:r>
-        <w:rPr>
-          <w:rFonts w:ascii="Calibri" w:hAnsi="Calibri" w:cs="Calibri"/>
-          <w:sz w:val="24"/>
-          <w:szCs w:val="24"/>
-        </w:rPr>
-        <w:t xml:space="preserve">missed </w:t>
-      </w:r>
-      <w:proofErr w:type="spellStart"/>
-      <w:r>
-        <w:rPr>
-          <w:rFonts w:ascii="Calibri" w:hAnsi="Calibri" w:cs="Calibri"/>
-          <w:sz w:val="24"/>
-          <w:szCs w:val="24"/>
-        </w:rPr>
-        <w:t>oppertunities</w:t>
-      </w:r>
-      <w:proofErr w:type="spellEnd"/>
-      <w:r>
-        <w:rPr>
-          <w:rFonts w:ascii="Calibri" w:hAnsi="Calibri" w:cs="Calibri"/>
-          <w:sz w:val="24"/>
-          <w:szCs w:val="24"/>
-        </w:rPr>
-        <w:t xml:space="preserve"> for targeted retention in high-volume e-commerce settings.</w:t>
-      </w:r>
-    </w:p>
-    <w:p>
-      <w:pPr>
-        <w:rPr>
-          <w:rFonts w:ascii="Calibri" w:hAnsi="Calibri" w:cs="Calibri"/>
-          <w:sz w:val="24"/>
-          <w:szCs w:val="24"/>
-        </w:rPr>
-      </w:pPr>
-      <w:r>
-        <w:rPr>
-          <w:rFonts w:ascii="Calibri" w:hAnsi="Calibri" w:cs="Calibri"/>
-          <w:sz w:val="24"/>
-          <w:szCs w:val="24"/>
-        </w:rPr>
-        <w:t xml:space="preserve">Despite the popularity of predictive modelling, a large portion of the literature places more emphasis on accuracy than interpretability. </w:t>
-      </w:r>
-      <w:r>
-        <w:rPr>
-          <w:rFonts w:ascii="Calibri" w:hAnsi="Calibri" w:cs="Calibri"/>
-          <w:sz w:val="24"/>
-          <w:szCs w:val="24"/>
-        </w:rPr>
-        <w:t xml:space="preserve">Neural networks and </w:t>
-      </w:r>
-      <w:proofErr w:type="spellStart"/>
-      <w:r>
-        <w:rPr>
-          <w:rFonts w:ascii="Calibri" w:hAnsi="Calibri" w:cs="Calibri"/>
-          <w:sz w:val="24"/>
-          <w:szCs w:val="24"/>
-        </w:rPr>
-        <w:t>XGBoost</w:t>
-      </w:r>
-      <w:proofErr w:type="spellEnd"/>
-      <w:r>
-        <w:rPr>
-          <w:rFonts w:ascii="Calibri" w:hAnsi="Calibri" w:cs="Calibri"/>
-          <w:sz w:val="24"/>
-          <w:szCs w:val="24"/>
-        </w:rPr>
-        <w:t xml:space="preserve"> are examples of black-box models that are commonly used without giving enough thought to how non-technical stakeholders might comprehend and use their outputs (Henninger &amp; Strobl, 2024).</w:t>
-      </w:r>
-      <w:r>
-        <w:rPr>
-          <w:rFonts w:ascii="Calibri" w:hAnsi="Calibri" w:cs="Calibri"/>
-          <w:sz w:val="24"/>
-          <w:szCs w:val="24"/>
-        </w:rPr>
-        <w:t xml:space="preserve"> </w:t>
-      </w:r>
-      <w:r>
-        <w:rPr>
-          <w:rFonts w:ascii="Calibri" w:hAnsi="Calibri" w:cs="Calibri"/>
-          <w:sz w:val="24"/>
-          <w:szCs w:val="24"/>
-        </w:rPr>
-        <w:t>This causes a disconnect between business activity and analytical insight, especially in areas like marketing and CRM where decisions need to be justified and relevant to customers.</w:t>
-      </w:r>
-    </w:p>
-    <w:p>
-      <w:pPr>
-        <w:rPr>
-          <w:rFonts w:ascii="Calibri" w:hAnsi="Calibri" w:cs="Calibri"/>
-          <w:sz w:val="24"/>
-          <w:szCs w:val="24"/>
-        </w:rPr>
-      </w:pPr>
-      <w:r>
-        <w:rPr>
-          <w:rFonts w:ascii="Calibri" w:hAnsi="Calibri" w:cs="Calibri"/>
-          <w:sz w:val="24"/>
-          <w:szCs w:val="24"/>
-        </w:rPr>
-        <w:t xml:space="preserve">Despite the introduction of SHAP to address interpretability, their use in transactional prediction tasks is still not well explored. The majority of studies concentrate on classifying images or text, which leaves a gap in knowledge on how well </w:t>
-      </w:r>
-      <w:r>
-        <w:rPr>
-          <w:rFonts w:ascii="Calibri" w:hAnsi="Calibri" w:cs="Calibri"/>
-          <w:sz w:val="24"/>
-          <w:szCs w:val="24"/>
-        </w:rPr>
-        <w:t>SHAP</w:t>
-      </w:r>
-      <w:r>
-        <w:rPr>
-          <w:rFonts w:ascii="Calibri" w:hAnsi="Calibri" w:cs="Calibri"/>
-          <w:sz w:val="24"/>
-          <w:szCs w:val="24"/>
-        </w:rPr>
-        <w:t xml:space="preserve"> work with structured tabular data, which is common in e-commerce transactions</w:t>
-      </w:r>
-      <w:r>
-        <w:rPr>
-          <w:rFonts w:ascii="Calibri" w:hAnsi="Calibri" w:cs="Calibri"/>
-          <w:sz w:val="24"/>
-          <w:szCs w:val="24"/>
-        </w:rPr>
-        <w:t xml:space="preserve"> </w:t>
-      </w:r>
-      <w:r>
-        <w:rPr>
-          <w:rFonts w:ascii="Calibri" w:hAnsi="Calibri" w:cs="Calibri"/>
-          <w:sz w:val="24"/>
-          <w:szCs w:val="24"/>
-        </w:rPr>
-        <w:t xml:space="preserve">(Molnar, 2022; </w:t>
-      </w:r>
-      <w:r>
-        <w:rPr>
-          <w:rFonts w:ascii="Calibri" w:hAnsi="Calibri" w:cs="Calibri"/>
-          <w:sz w:val="24"/>
-          <w:szCs w:val="24"/>
-        </w:rPr>
-        <w:t>Slack et al. 2020</w:t>
-      </w:r>
-      <w:r>
-        <w:rPr>
-          <w:rFonts w:ascii="Calibri" w:hAnsi="Calibri" w:cs="Calibri"/>
-          <w:sz w:val="24"/>
-          <w:szCs w:val="24"/>
-        </w:rPr>
-        <w:t>)</w:t>
-      </w:r>
-      <w:r>
-        <w:rPr>
-          <w:rFonts w:ascii="Calibri" w:hAnsi="Calibri" w:cs="Calibri"/>
-          <w:sz w:val="24"/>
-          <w:szCs w:val="24"/>
-        </w:rPr>
-        <w:t xml:space="preserve">. The consistency and reliability of </w:t>
-      </w:r>
-      <w:r>
-        <w:rPr>
-          <w:rFonts w:ascii="Calibri" w:hAnsi="Calibri" w:cs="Calibri"/>
-          <w:sz w:val="24"/>
-          <w:szCs w:val="24"/>
-        </w:rPr>
-        <w:t>SHAP</w:t>
-      </w:r>
-      <w:r>
-        <w:rPr>
-          <w:rFonts w:ascii="Calibri" w:hAnsi="Calibri" w:cs="Calibri"/>
-          <w:sz w:val="24"/>
-          <w:szCs w:val="24"/>
-        </w:rPr>
-        <w:t xml:space="preserve"> explanations across various model architectures are also not well evaluated in the literature, which is crucial for practical implementation</w:t>
-      </w:r>
-      <w:r>
-        <w:rPr>
-          <w:rFonts w:ascii="Calibri" w:hAnsi="Calibri" w:cs="Calibri"/>
-          <w:sz w:val="24"/>
-          <w:szCs w:val="24"/>
-        </w:rPr>
-        <w:t xml:space="preserve"> </w:t>
-      </w:r>
-      <w:r>
-        <w:rPr>
-          <w:rFonts w:ascii="Calibri" w:hAnsi="Calibri" w:cs="Calibri"/>
-          <w:sz w:val="24"/>
-          <w:szCs w:val="24"/>
-        </w:rPr>
-        <w:t>(</w:t>
-      </w:r>
-      <w:proofErr w:type="spellStart"/>
-      <w:r>
-        <w:rPr>
-          <w:rFonts w:ascii="Calibri" w:hAnsi="Calibri" w:cs="Calibri"/>
-          <w:sz w:val="24"/>
-          <w:szCs w:val="24"/>
-        </w:rPr>
-        <w:t>Visani</w:t>
-      </w:r>
-      <w:proofErr w:type="spellEnd"/>
-      <w:r>
-        <w:rPr>
-          <w:rFonts w:ascii="Calibri" w:hAnsi="Calibri" w:cs="Calibri"/>
-          <w:sz w:val="24"/>
-          <w:szCs w:val="24"/>
-        </w:rPr>
-        <w:t xml:space="preserve"> et al., 2020)</w:t>
-      </w:r>
-      <w:r>
-        <w:rPr>
-          <w:rFonts w:ascii="Calibri" w:hAnsi="Calibri" w:cs="Calibri"/>
-          <w:sz w:val="24"/>
-          <w:szCs w:val="24"/>
-        </w:rPr>
-        <w:t>.</w:t>
-      </w:r>
-    </w:p>
-    <w:p>
-      <w:pPr>
-        <w:rPr>
-          <w:rFonts w:ascii="Calibri" w:hAnsi="Calibri" w:cs="Calibri"/>
-          <w:sz w:val="24"/>
-          <w:szCs w:val="24"/>
-        </w:rPr>
-      </w:pPr>
-      <w:r>
-        <w:rPr>
-          <w:rFonts w:ascii="Calibri" w:hAnsi="Calibri" w:cs="Calibri"/>
-          <w:sz w:val="24"/>
-          <w:szCs w:val="24"/>
-        </w:rPr>
-        <w:t>Additionally, the integration of strategic business needs with predictive modelling is lacking. A lot of studies </w:t>
-      </w:r>
-      <w:r>
-        <w:rPr>
-          <w:rFonts w:ascii="Calibri" w:hAnsi="Calibri" w:cs="Calibri"/>
-          <w:sz w:val="24"/>
-          <w:szCs w:val="24"/>
-        </w:rPr>
-        <w:t>stop</w:t>
-      </w:r>
-      <w:r>
-        <w:rPr>
-          <w:rFonts w:ascii="Calibri" w:hAnsi="Calibri" w:cs="Calibri"/>
-          <w:sz w:val="24"/>
-          <w:szCs w:val="24"/>
-        </w:rPr>
-        <w:t xml:space="preserve"> with model evaluation without providing stakeholders with useful insights.</w:t>
-      </w:r>
-      <w:r>
-        <w:rPr>
-          <w:rFonts w:ascii="Calibri" w:hAnsi="Calibri" w:cs="Calibri"/>
-          <w:sz w:val="24"/>
-          <w:szCs w:val="24"/>
-        </w:rPr>
-        <w:t xml:space="preserve"> </w:t>
-      </w:r>
-      <w:r>
-        <w:rPr>
-          <w:rFonts w:ascii="Calibri" w:hAnsi="Calibri" w:cs="Calibri"/>
-          <w:sz w:val="24"/>
-          <w:szCs w:val="24"/>
-        </w:rPr>
-        <w:t>This restricts the usefulness of research in practice and ignores how crucial it is to match analytics with business goals like campaign optimi</w:t>
-      </w:r>
-      <w:r>
-        <w:rPr>
-          <w:rFonts w:ascii="Calibri" w:hAnsi="Calibri" w:cs="Calibri"/>
-          <w:sz w:val="24"/>
-          <w:szCs w:val="24"/>
-        </w:rPr>
-        <w:t>z</w:t>
-      </w:r>
-      <w:r>
-        <w:rPr>
-          <w:rFonts w:ascii="Calibri" w:hAnsi="Calibri" w:cs="Calibri"/>
-          <w:sz w:val="24"/>
-          <w:szCs w:val="24"/>
-        </w:rPr>
-        <w:t>ation, customer lifetime value, and service personalisation (Harter et al., 2025).</w:t>
-      </w:r>
-    </w:p>
-    <w:p>
-      <w:pPr>
+        <w:t xml:space="preserve">.1 </w:t>
+      </w:r>
+      <w:r>
         <w:rPr>
           <w:rFonts w:ascii="Calibri" w:hAnsi="Calibri" w:cs="Calibri"/>
           <w:b/>
@@ -1503,8 +1013,263 @@
           <w:sz w:val="28"/>
           <w:szCs w:val="28"/>
         </w:rPr>
-      </w:pPr>
-      <w:r>
+        <w:t>Identified Gaps in the Literature</w:t>
+      </w:r>
+    </w:p>
+    <w:p>
+      <w:pPr>
+        <w:rPr>
+          <w:rFonts w:ascii="Calibri" w:hAnsi="Calibri" w:cs="Calibri"/>
+          <w:sz w:val="24"/>
+          <w:szCs w:val="24"/>
+        </w:rPr>
+      </w:pPr>
+      <w:r>
+        <w:rPr>
+          <w:rFonts w:ascii="Calibri" w:hAnsi="Calibri" w:cs="Calibri"/>
+          <w:sz w:val="24"/>
+          <w:szCs w:val="24"/>
+        </w:rPr>
+        <w:t xml:space="preserve">There are still a number of gaps in the current body of study despite these contributions. Many studies still use segmentation methods like rule-based classification or demographic clustering, which are either static or overly simplistic (Jeon et al., 2021; Cirqueira et al., 2021). The temporal and behavioural complexity of online buying, where consumer preferences and engagement patterns change quickly, is frequently missed by these methods. Such segmentation may result in misclassification and </w:t>
+      </w:r>
+      <w:r>
+        <w:rPr>
+          <w:rFonts w:ascii="Calibri" w:hAnsi="Calibri" w:cs="Calibri"/>
+          <w:sz w:val="24"/>
+          <w:szCs w:val="24"/>
+        </w:rPr>
+        <w:t>missed oppertunities</w:t>
+      </w:r>
+      <w:r>
+        <w:rPr>
+          <w:rFonts w:ascii="Calibri" w:hAnsi="Calibri" w:cs="Calibri"/>
+          <w:sz w:val="24"/>
+          <w:szCs w:val="24"/>
+        </w:rPr>
+        <w:t xml:space="preserve"> for targeted retention in high-volume e-commerce settings.</w:t>
+      </w:r>
+    </w:p>
+    <w:p>
+      <w:pPr>
+        <w:rPr>
+          <w:rFonts w:ascii="Calibri" w:hAnsi="Calibri" w:cs="Calibri"/>
+          <w:sz w:val="24"/>
+          <w:szCs w:val="24"/>
+        </w:rPr>
+      </w:pPr>
+      <w:r>
+        <w:rPr>
+          <w:rFonts w:ascii="Calibri" w:hAnsi="Calibri" w:cs="Calibri"/>
+          <w:sz w:val="24"/>
+          <w:szCs w:val="24"/>
+        </w:rPr>
+        <w:t xml:space="preserve">Despite the popularity of predictive modelling, a large portion of the literature places more emphasis on accuracy than interpretability. </w:t>
+      </w:r>
+      <w:r>
+        <w:rPr>
+          <w:rFonts w:ascii="Calibri" w:hAnsi="Calibri" w:cs="Calibri"/>
+          <w:sz w:val="24"/>
+          <w:szCs w:val="24"/>
+        </w:rPr>
+        <w:t>Neural networks and XGBoost are examples of black-box models that are commonly used without giving enough thought to how non-technical stakeholders might comprehend and use their outputs (Henninger &amp; Strobl, 2024).</w:t>
+      </w:r>
+      <w:r>
+        <w:rPr>
+          <w:rFonts w:ascii="Calibri" w:hAnsi="Calibri" w:cs="Calibri"/>
+          <w:sz w:val="24"/>
+          <w:szCs w:val="24"/>
+        </w:rPr>
+        <w:t xml:space="preserve"> </w:t>
+      </w:r>
+      <w:r>
+        <w:rPr>
+          <w:rFonts w:ascii="Calibri" w:hAnsi="Calibri" w:cs="Calibri"/>
+          <w:sz w:val="24"/>
+          <w:szCs w:val="24"/>
+        </w:rPr>
+        <w:t>This causes a disconnect between business activity and analytical insight, especially in areas like marketing and CRM where decisions need to be justified and relevant to customers.</w:t>
+      </w:r>
+    </w:p>
+    <w:p>
+      <w:pPr>
+        <w:rPr>
+          <w:rFonts w:ascii="Calibri" w:hAnsi="Calibri" w:cs="Calibri"/>
+          <w:sz w:val="24"/>
+          <w:szCs w:val="24"/>
+        </w:rPr>
+      </w:pPr>
+      <w:r>
+        <w:rPr>
+          <w:rFonts w:ascii="Calibri" w:hAnsi="Calibri" w:cs="Calibri"/>
+          <w:sz w:val="24"/>
+          <w:szCs w:val="24"/>
+        </w:rPr>
+        <w:t xml:space="preserve">Despite the introduction of SHAP to address interpretability, their use in transactional prediction tasks is still not well explored. The majority of studies concentrate on classifying images or text, which leaves a gap in knowledge on how well </w:t>
+      </w:r>
+      <w:r>
+        <w:rPr>
+          <w:rFonts w:ascii="Calibri" w:hAnsi="Calibri" w:cs="Calibri"/>
+          <w:sz w:val="24"/>
+          <w:szCs w:val="24"/>
+        </w:rPr>
+        <w:t>SHAP</w:t>
+      </w:r>
+      <w:r>
+        <w:rPr>
+          <w:rFonts w:ascii="Calibri" w:hAnsi="Calibri" w:cs="Calibri"/>
+          <w:sz w:val="24"/>
+          <w:szCs w:val="24"/>
+        </w:rPr>
+        <w:t xml:space="preserve"> work with structured tabular data, which is common in e-commerce transactions</w:t>
+      </w:r>
+      <w:r>
+        <w:rPr>
+          <w:rFonts w:ascii="Calibri" w:hAnsi="Calibri" w:cs="Calibri"/>
+          <w:sz w:val="24"/>
+          <w:szCs w:val="24"/>
+        </w:rPr>
+        <w:t xml:space="preserve"> </w:t>
+      </w:r>
+      <w:r>
+        <w:rPr>
+          <w:rFonts w:ascii="Calibri" w:hAnsi="Calibri" w:cs="Calibri"/>
+          <w:sz w:val="24"/>
+          <w:szCs w:val="24"/>
+        </w:rPr>
+        <w:t xml:space="preserve">(Molnar, 2022; </w:t>
+      </w:r>
+      <w:r>
+        <w:rPr>
+          <w:rFonts w:ascii="Calibri" w:hAnsi="Calibri" w:cs="Calibri"/>
+          <w:sz w:val="24"/>
+          <w:szCs w:val="24"/>
+        </w:rPr>
+        <w:t>Slack et al. 2020</w:t>
+      </w:r>
+      <w:r>
+        <w:rPr>
+          <w:rFonts w:ascii="Calibri" w:hAnsi="Calibri" w:cs="Calibri"/>
+          <w:sz w:val="24"/>
+          <w:szCs w:val="24"/>
+        </w:rPr>
+        <w:t>)</w:t>
+      </w:r>
+      <w:r>
+        <w:rPr>
+          <w:rFonts w:ascii="Calibri" w:hAnsi="Calibri" w:cs="Calibri"/>
+          <w:sz w:val="24"/>
+          <w:szCs w:val="24"/>
+        </w:rPr>
+        <w:t xml:space="preserve">. The consistency and reliability of </w:t>
+      </w:r>
+      <w:r>
+        <w:rPr>
+          <w:rFonts w:ascii="Calibri" w:hAnsi="Calibri" w:cs="Calibri"/>
+          <w:sz w:val="24"/>
+          <w:szCs w:val="24"/>
+        </w:rPr>
+        <w:t>SHAP</w:t>
+      </w:r>
+      <w:r>
+        <w:rPr>
+          <w:rFonts w:ascii="Calibri" w:hAnsi="Calibri" w:cs="Calibri"/>
+          <w:sz w:val="24"/>
+          <w:szCs w:val="24"/>
+        </w:rPr>
+        <w:t xml:space="preserve"> explanations across various model architectures are also not well evaluated in the literature, which is crucial for practical implementation</w:t>
+      </w:r>
+      <w:r>
+        <w:rPr>
+          <w:rFonts w:ascii="Calibri" w:hAnsi="Calibri" w:cs="Calibri"/>
+          <w:sz w:val="24"/>
+          <w:szCs w:val="24"/>
+        </w:rPr>
+        <w:t xml:space="preserve"> </w:t>
+      </w:r>
+      <w:r>
+        <w:rPr>
+          <w:rFonts w:ascii="Calibri" w:hAnsi="Calibri" w:cs="Calibri"/>
+          <w:sz w:val="24"/>
+          <w:szCs w:val="24"/>
+        </w:rPr>
+        <w:t>(Visani et al., 2020)</w:t>
+      </w:r>
+      <w:r>
+        <w:rPr>
+          <w:rFonts w:ascii="Calibri" w:hAnsi="Calibri" w:cs="Calibri"/>
+          <w:sz w:val="24"/>
+          <w:szCs w:val="24"/>
+        </w:rPr>
+        <w:t>.</w:t>
+      </w:r>
+    </w:p>
+    <w:p>
+      <w:pPr>
+        <w:rPr>
+          <w:rFonts w:ascii="Calibri" w:hAnsi="Calibri" w:cs="Calibri"/>
+          <w:sz w:val="24"/>
+          <w:szCs w:val="24"/>
+        </w:rPr>
+      </w:pPr>
+      <w:r>
+        <w:rPr>
+          <w:rFonts w:ascii="Calibri" w:hAnsi="Calibri" w:cs="Calibri"/>
+          <w:sz w:val="24"/>
+          <w:szCs w:val="24"/>
+        </w:rPr>
+        <w:t>Additionally, the integration of strategic business needs with predictive modelling is lacking. A lot of studies </w:t>
+      </w:r>
+      <w:r>
+        <w:rPr>
+          <w:rFonts w:ascii="Calibri" w:hAnsi="Calibri" w:cs="Calibri"/>
+          <w:sz w:val="24"/>
+          <w:szCs w:val="24"/>
+        </w:rPr>
+        <w:t>stop</w:t>
+      </w:r>
+      <w:r>
+        <w:rPr>
+          <w:rFonts w:ascii="Calibri" w:hAnsi="Calibri" w:cs="Calibri"/>
+          <w:sz w:val="24"/>
+          <w:szCs w:val="24"/>
+        </w:rPr>
+        <w:t xml:space="preserve"> with model evaluation without providing stakeholders with useful insights.</w:t>
+      </w:r>
+      <w:r>
+        <w:rPr>
+          <w:rFonts w:ascii="Calibri" w:hAnsi="Calibri" w:cs="Calibri"/>
+          <w:sz w:val="24"/>
+          <w:szCs w:val="24"/>
+        </w:rPr>
+        <w:t xml:space="preserve"> </w:t>
+      </w:r>
+      <w:r>
+        <w:rPr>
+          <w:rFonts w:ascii="Calibri" w:hAnsi="Calibri" w:cs="Calibri"/>
+          <w:sz w:val="24"/>
+          <w:szCs w:val="24"/>
+        </w:rPr>
+        <w:t>This restricts the usefulness of research in practice and ignores how crucial it is to match analytics with business goals like campaign optimi</w:t>
+      </w:r>
+      <w:r>
+        <w:rPr>
+          <w:rFonts w:ascii="Calibri" w:hAnsi="Calibri" w:cs="Calibri"/>
+          <w:sz w:val="24"/>
+          <w:szCs w:val="24"/>
+        </w:rPr>
+        <w:t>z</w:t>
+      </w:r>
+      <w:r>
+        <w:rPr>
+          <w:rFonts w:ascii="Calibri" w:hAnsi="Calibri" w:cs="Calibri"/>
+          <w:sz w:val="24"/>
+          <w:szCs w:val="24"/>
+        </w:rPr>
+        <w:t>ation, customer lifetime value, and service personalisation (Harter et al., 2025).</w:t>
+      </w:r>
+    </w:p>
+    <w:p>
+      <w:pPr>
         <w:rPr>
           <w:rFonts w:ascii="Calibri" w:hAnsi="Calibri" w:cs="Calibri"/>
           <w:b/>
@@ -1512,8 +1277,7 @@
           <w:sz w:val="28"/>
           <w:szCs w:val="28"/>
         </w:rPr>
-        <w:t xml:space="preserve">4.2 </w:t>
-      </w:r>
+      </w:pPr>
       <w:r>
         <w:rPr>
           <w:rFonts w:ascii="Calibri" w:hAnsi="Calibri" w:cs="Calibri"/>
@@ -1522,6 +1286,26 @@
           <w:sz w:val="28"/>
           <w:szCs w:val="28"/>
         </w:rPr>
+        <w:t>3</w:t>
+      </w:r>
+      <w:r>
+        <w:rPr>
+          <w:rFonts w:ascii="Calibri" w:hAnsi="Calibri" w:cs="Calibri"/>
+          <w:b/>
+          <w:bCs/>
+          <w:sz w:val="28"/>
+          <w:szCs w:val="28"/>
+        </w:rPr>
+        <w:t xml:space="preserve">.2 </w:t>
+      </w:r>
+      <w:r>
+        <w:rPr>
+          <w:rFonts w:ascii="Calibri" w:hAnsi="Calibri" w:cs="Calibri"/>
+          <w:b/>
+          <w:bCs/>
+          <w:sz w:val="28"/>
+          <w:szCs w:val="28"/>
+        </w:rPr>
         <w:t>Contribution of This Study</w:t>
       </w:r>
     </w:p>
@@ -1539,60 +1323,24 @@
           <w:sz w:val="24"/>
           <w:szCs w:val="24"/>
         </w:rPr>
-        <w:t>By developing a supervised machine learning framework especially designed to predict repeat purchases in e-commerce, this study fills in the gaps that have been found. It uses transactional variables, like purchase frequency, recency, and monetary value, to capture scalable and dynamic behavioural signals, in contrast to segmentation-based methods (</w:t>
-      </w:r>
-      <w:proofErr w:type="spellStart"/>
-      <w:r>
-        <w:rPr>
-          <w:rFonts w:ascii="Calibri" w:hAnsi="Calibri" w:cs="Calibri"/>
-          <w:sz w:val="24"/>
-          <w:szCs w:val="24"/>
-        </w:rPr>
-        <w:t>Cirqueira</w:t>
-      </w:r>
-      <w:proofErr w:type="spellEnd"/>
-      <w:r>
-        <w:rPr>
-          <w:rFonts w:ascii="Calibri" w:hAnsi="Calibri" w:cs="Calibri"/>
-          <w:sz w:val="24"/>
-          <w:szCs w:val="24"/>
-        </w:rPr>
-        <w:t xml:space="preserve"> et al., 2021). This makes it possible to target high-value customers more precisely and encourages proactive retention strategies.</w:t>
-      </w:r>
-    </w:p>
-    <w:p>
-      <w:pPr>
-        <w:rPr>
-          <w:rFonts w:ascii="Calibri" w:hAnsi="Calibri" w:cs="Calibri"/>
-          <w:sz w:val="24"/>
-          <w:szCs w:val="24"/>
-        </w:rPr>
-      </w:pPr>
-      <w:r>
-        <w:rPr>
-          <w:rFonts w:ascii="Calibri" w:hAnsi="Calibri" w:cs="Calibri"/>
-          <w:sz w:val="24"/>
-          <w:szCs w:val="24"/>
-        </w:rPr>
-        <w:t xml:space="preserve">The study evaluates several classification techniques, such as </w:t>
-      </w:r>
-      <w:proofErr w:type="spellStart"/>
-      <w:r>
-        <w:rPr>
-          <w:rFonts w:ascii="Calibri" w:hAnsi="Calibri" w:cs="Calibri"/>
-          <w:sz w:val="24"/>
-          <w:szCs w:val="24"/>
-        </w:rPr>
-        <w:t>XGBoost</w:t>
-      </w:r>
-      <w:proofErr w:type="spellEnd"/>
-      <w:r>
-        <w:rPr>
-          <w:rFonts w:ascii="Calibri" w:hAnsi="Calibri" w:cs="Calibri"/>
-          <w:sz w:val="24"/>
-          <w:szCs w:val="24"/>
-        </w:rPr>
-        <w:t>, Random Forest, Decision Tree, and Logistic Regression</w:t>
+        <w:t>By developing a supervised machine learning framework especially designed to predict repeat purchases in e-commerce, this study fills in the gaps that have been found. It uses transactional variables, like purchase frequency, recency, and monetary value, to capture scalable and dynamic behavioural signals, in contrast to segmentation-based methods (Cirqueira et al., 2021). This makes it possible to target high-value customers more precisely and encourages proactive retention strategies.</w:t>
+      </w:r>
+    </w:p>
+    <w:p>
+      <w:pPr>
+        <w:rPr>
+          <w:rFonts w:ascii="Calibri" w:hAnsi="Calibri" w:cs="Calibri"/>
+          <w:sz w:val="24"/>
+          <w:szCs w:val="24"/>
+        </w:rPr>
+      </w:pPr>
+      <w:r>
+        <w:rPr>
+          <w:rFonts w:ascii="Calibri" w:hAnsi="Calibri" w:cs="Calibri"/>
+          <w:sz w:val="24"/>
+          <w:szCs w:val="24"/>
+        </w:rPr>
+        <w:t>The study evaluates several classification techniques, such as XGBoost, Random Forest, Decision Tree, and Logistic Regression</w:t>
       </w:r>
       <w:r>
         <w:t xml:space="preserve"> </w:t>
@@ -1779,7 +1527,7 @@
           <w:sz w:val="32"/>
           <w:szCs w:val="32"/>
         </w:rPr>
-        <w:t>5</w:t>
+        <w:t>4</w:t>
       </w:r>
       <w:r>
         <w:rPr>
@@ -1872,61 +1620,7 @@
           <w:sz w:val="24"/>
           <w:szCs w:val="24"/>
         </w:rPr>
-        <w:t xml:space="preserve">Exploratory analysis of anonymised transactional records was carried out during the data understanding step. </w:t>
-      </w:r>
-      <w:proofErr w:type="spellStart"/>
-      <w:r>
-        <w:rPr>
-          <w:rFonts w:ascii="Calibri" w:hAnsi="Calibri" w:cs="Calibri"/>
-          <w:sz w:val="24"/>
-          <w:szCs w:val="24"/>
-        </w:rPr>
-        <w:t>Avg_days_between_purchases</w:t>
-      </w:r>
-      <w:proofErr w:type="spellEnd"/>
-      <w:r>
-        <w:rPr>
-          <w:rFonts w:ascii="Calibri" w:hAnsi="Calibri" w:cs="Calibri"/>
-          <w:sz w:val="24"/>
-          <w:szCs w:val="24"/>
-        </w:rPr>
-        <w:t xml:space="preserve">, </w:t>
-      </w:r>
-      <w:proofErr w:type="spellStart"/>
-      <w:r>
-        <w:rPr>
-          <w:rFonts w:ascii="Calibri" w:hAnsi="Calibri" w:cs="Calibri"/>
-          <w:sz w:val="24"/>
-          <w:szCs w:val="24"/>
-        </w:rPr>
-        <w:t>total_spend_per_customer</w:t>
-      </w:r>
-      <w:proofErr w:type="spellEnd"/>
-      <w:r>
-        <w:rPr>
-          <w:rFonts w:ascii="Calibri" w:hAnsi="Calibri" w:cs="Calibri"/>
-          <w:sz w:val="24"/>
-          <w:szCs w:val="24"/>
-        </w:rPr>
-        <w:t xml:space="preserve">, and </w:t>
-      </w:r>
-      <w:proofErr w:type="spellStart"/>
-      <w:r>
-        <w:rPr>
-          <w:rFonts w:ascii="Calibri" w:hAnsi="Calibri" w:cs="Calibri"/>
-          <w:sz w:val="24"/>
-          <w:szCs w:val="24"/>
-        </w:rPr>
-        <w:t>category_diversity</w:t>
-      </w:r>
-      <w:proofErr w:type="spellEnd"/>
-      <w:r>
-        <w:rPr>
-          <w:rFonts w:ascii="Calibri" w:hAnsi="Calibri" w:cs="Calibri"/>
-          <w:sz w:val="24"/>
-          <w:szCs w:val="24"/>
-        </w:rPr>
-        <w:t xml:space="preserve"> are important behavioural features that were found to be possibly predictive. To guide preprocessing choices, descriptive statistics, class imbalance, and missingness patterns were evaluated.</w:t>
+        <w:t>Exploratory analysis of anonymised transactional records was carried out during the data understanding step. Avg_days_between_purchases, total_spend_per_customer, and category_diversity are important behavioural features that were found to be possibly predictive. To guide preprocessing choices, descriptive statistics, class imbalance, and missingness patterns were evaluated.</w:t>
       </w:r>
     </w:p>
     <w:p>
@@ -2017,43 +1711,7 @@
           <w:szCs w:val="24"/>
         </w:rPr>
         <w:lastRenderedPageBreak/>
-        <w:t xml:space="preserve">Four classifiers such as Logistic Regression, Decision Tree, Random Forest, and </w:t>
-      </w:r>
-      <w:proofErr w:type="spellStart"/>
-      <w:r>
-        <w:rPr>
-          <w:rFonts w:ascii="Calibri" w:hAnsi="Calibri" w:cs="Calibri"/>
-          <w:sz w:val="24"/>
-          <w:szCs w:val="24"/>
-        </w:rPr>
-        <w:t>XGBoost</w:t>
-      </w:r>
-      <w:proofErr w:type="spellEnd"/>
-      <w:r>
-        <w:rPr>
-          <w:rFonts w:ascii="Calibri" w:hAnsi="Calibri" w:cs="Calibri"/>
-          <w:sz w:val="24"/>
-          <w:szCs w:val="24"/>
-        </w:rPr>
-        <w:t xml:space="preserve"> were benchmarked throughout the modelling phase. </w:t>
-      </w:r>
-      <w:proofErr w:type="spellStart"/>
-      <w:r>
-        <w:rPr>
-          <w:rFonts w:ascii="Calibri" w:hAnsi="Calibri" w:cs="Calibri"/>
-          <w:sz w:val="24"/>
-          <w:szCs w:val="24"/>
-        </w:rPr>
-        <w:t>GridSearchCV</w:t>
-      </w:r>
-      <w:proofErr w:type="spellEnd"/>
-      <w:r>
-        <w:rPr>
-          <w:rFonts w:ascii="Calibri" w:hAnsi="Calibri" w:cs="Calibri"/>
-          <w:sz w:val="24"/>
-          <w:szCs w:val="24"/>
-        </w:rPr>
-        <w:t xml:space="preserve"> was applied to tune hyperparameters using F1-score as the main metric and 5-fold cross-validation. With an F1-score of 0.988 and ROC-AUC of 0.991, the Decision Tree was ultimately chosen for final implementation because it balanced performance and interpretability.</w:t>
+        <w:t>Four classifiers such as Logistic Regression, Decision Tree, Random Forest, and XGBoost were benchmarked throughout the modelling phase. GridSearchCV was applied to tune hyperparameters using F1-score as the main metric and 5-fold cross-validation. With an F1-score of 0.988 and ROC-AUC of 0.991, the Decision Tree was ultimately chosen for final implementation because it balanced performance and interpretability.</w:t>
       </w:r>
     </w:p>
     <w:p>
@@ -2104,6 +1762,135 @@
           <w:szCs w:val="24"/>
         </w:rPr>
         <w:t>The deliverables included SHAP plots and insights that can support with customer engagement planning and CRM strategy. This made sure that the project's results were both technically sound and flexible enough to inform more general marketing applications, such as cross-selling campaigns and targeted promotions.</w:t>
+      </w:r>
+    </w:p>
+    <w:p>
+      <w:pPr>
+        <w:rPr>
+          <w:rFonts w:ascii="Calibri" w:hAnsi="Calibri" w:cs="Calibri"/>
+          <w:sz w:val="24"/>
+          <w:szCs w:val="24"/>
+        </w:rPr>
+      </w:pPr>
+      <w:r>
+        <w:rPr>
+          <w:rFonts w:ascii="Calibri" w:hAnsi="Calibri" w:cs="Calibri"/>
+          <w:b/>
+          <w:bCs/>
+          <w:sz w:val="32"/>
+          <w:szCs w:val="32"/>
+        </w:rPr>
+        <w:t xml:space="preserve">6. </w:t>
+      </w:r>
+      <w:r>
+        <w:rPr>
+          <w:rFonts w:ascii="Calibri" w:hAnsi="Calibri" w:cs="Calibri"/>
+          <w:b/>
+          <w:bCs/>
+          <w:sz w:val="32"/>
+          <w:szCs w:val="32"/>
+        </w:rPr>
+        <w:t>Tools and Technologies Used</w:t>
+      </w:r>
+    </w:p>
+    <w:p>
+      <w:pPr>
+        <w:rPr>
+          <w:rFonts w:ascii="Calibri" w:hAnsi="Calibri" w:cs="Calibri"/>
+          <w:sz w:val="24"/>
+          <w:szCs w:val="24"/>
+        </w:rPr>
+      </w:pPr>
+      <w:r>
+        <w:rPr>
+          <w:rFonts w:ascii="Calibri" w:hAnsi="Calibri" w:cs="Calibri"/>
+          <w:sz w:val="24"/>
+          <w:szCs w:val="24"/>
+        </w:rPr>
+        <w:t>Jupyter Notebook was used to implement this project in Python, including iterative development, inline visualization, and transparent documentation.</w:t>
+      </w:r>
+      <w:r>
+        <w:rPr>
+          <w:rFonts w:ascii="Calibri" w:hAnsi="Calibri" w:cs="Calibri"/>
+          <w:sz w:val="24"/>
+          <w:szCs w:val="24"/>
+        </w:rPr>
+        <w:t xml:space="preserve"> </w:t>
+      </w:r>
+      <w:r>
+        <w:rPr>
+          <w:rFonts w:ascii="Calibri" w:hAnsi="Calibri" w:cs="Calibri"/>
+          <w:sz w:val="24"/>
+          <w:szCs w:val="24"/>
+        </w:rPr>
+        <w:t>Every analytical step, from data understanding to interpretability, was carried out in the notebook with its structure aligned with the CRISP-DM framework.</w:t>
+      </w:r>
+    </w:p>
+    <w:p>
+      <w:pPr>
+        <w:rPr>
+          <w:rFonts w:ascii="Calibri" w:hAnsi="Calibri" w:cs="Calibri"/>
+          <w:sz w:val="24"/>
+          <w:szCs w:val="24"/>
+        </w:rPr>
+      </w:pPr>
+      <w:r>
+        <w:rPr>
+          <w:rFonts w:ascii="Calibri" w:hAnsi="Calibri" w:cs="Calibri"/>
+          <w:sz w:val="24"/>
+          <w:szCs w:val="24"/>
+        </w:rPr>
+        <w:t>Scikit-learn was used to develop baseline models such Random Forest, Decision Tree, and Logistic Regression, Seaborn and matplotlib were used for visual diagnostics, and pandas and NumPy were used for data manipulation. A comparison of XGBoost's performance was also evaluated. Every model was assessed using precision, recall, F1-score, and ROC-AUC after being trained on a SMOTE-balanced dataset. GridSearchCV was used for hyperparameter tuning, and a tuned Decision Tree classifier was chosen as the final model based on its balanced interpretability and performance.</w:t>
+      </w:r>
+    </w:p>
+    <w:p>
+      <w:pPr>
+        <w:rPr>
+          <w:rFonts w:ascii="Calibri" w:hAnsi="Calibri" w:cs="Calibri"/>
+          <w:sz w:val="24"/>
+          <w:szCs w:val="24"/>
+        </w:rPr>
+      </w:pPr>
+      <w:r>
+        <w:rPr>
+          <w:rFonts w:ascii="Calibri" w:hAnsi="Calibri" w:cs="Calibri"/>
+          <w:sz w:val="24"/>
+          <w:szCs w:val="24"/>
+        </w:rPr>
+        <w:t>Both LIME and SHAP were used to address interpretability.</w:t>
+      </w:r>
+      <w:r>
+        <w:rPr>
+          <w:rFonts w:ascii="Calibri" w:hAnsi="Calibri" w:cs="Calibri"/>
+          <w:sz w:val="24"/>
+          <w:szCs w:val="24"/>
+        </w:rPr>
+        <w:t xml:space="preserve"> </w:t>
+      </w:r>
+      <w:r>
+        <w:rPr>
+          <w:rFonts w:ascii="Calibri" w:hAnsi="Calibri" w:cs="Calibri"/>
+          <w:sz w:val="24"/>
+          <w:szCs w:val="24"/>
+        </w:rPr>
+        <w:t>To produce local explanations, LIMETabularExplainer was used on three strategic test cases such as correctly classified, misclassified and, edge case. Class-specific and global feature importance plots, including waterfall charts and aggregated rankings, were created using SHAP. Transparent communication of model behaviour to non-technical stakeholders was made possible by these technologies.</w:t>
+      </w:r>
+    </w:p>
+    <w:p>
+      <w:pPr>
+        <w:rPr>
+          <w:rFonts w:ascii="Calibri" w:hAnsi="Calibri" w:cs="Calibri"/>
+          <w:sz w:val="24"/>
+          <w:szCs w:val="24"/>
+        </w:rPr>
+      </w:pPr>
+      <w:r>
+        <w:rPr>
+          <w:rFonts w:ascii="Calibri" w:hAnsi="Calibri" w:cs="Calibri"/>
+          <w:sz w:val="24"/>
+          <w:szCs w:val="24"/>
+        </w:rPr>
+        <w:t>In order to ensure adherence to ethical standards and data protection regulations, all data used was anonymised and publicly available. Stakeholder trust in predictive decision-making and a dedication to responsible AI are demonstrated by the incorporation of interpretable tools.</w:t>
       </w:r>
     </w:p>
     <w:p/>
@@ -2125,13 +1912,93 @@
           <w:szCs w:val="32"/>
         </w:rPr>
       </w:pPr>
-      <w:r>
+    </w:p>
+    <w:p>
+      <w:pPr>
         <w:rPr>
           <w:b/>
           <w:bCs/>
           <w:sz w:val="32"/>
           <w:szCs w:val="32"/>
         </w:rPr>
+      </w:pPr>
+    </w:p>
+    <w:p>
+      <w:pPr>
+        <w:rPr>
+          <w:b/>
+          <w:bCs/>
+          <w:sz w:val="32"/>
+          <w:szCs w:val="32"/>
+        </w:rPr>
+      </w:pPr>
+    </w:p>
+    <w:p>
+      <w:pPr>
+        <w:rPr>
+          <w:b/>
+          <w:bCs/>
+          <w:sz w:val="32"/>
+          <w:szCs w:val="32"/>
+        </w:rPr>
+      </w:pPr>
+    </w:p>
+    <w:p>
+      <w:pPr>
+        <w:rPr>
+          <w:b/>
+          <w:bCs/>
+          <w:sz w:val="32"/>
+          <w:szCs w:val="32"/>
+        </w:rPr>
+      </w:pPr>
+    </w:p>
+    <w:p>
+      <w:pPr>
+        <w:rPr>
+          <w:b/>
+          <w:bCs/>
+          <w:sz w:val="32"/>
+          <w:szCs w:val="32"/>
+        </w:rPr>
+      </w:pPr>
+    </w:p>
+    <w:p>
+      <w:pPr>
+        <w:rPr>
+          <w:b/>
+          <w:bCs/>
+          <w:sz w:val="32"/>
+          <w:szCs w:val="32"/>
+        </w:rPr>
+      </w:pPr>
+    </w:p>
+    <w:p>
+      <w:pPr>
+        <w:rPr>
+          <w:b/>
+          <w:bCs/>
+          <w:sz w:val="32"/>
+          <w:szCs w:val="32"/>
+        </w:rPr>
+      </w:pPr>
+    </w:p>
+    <w:p>
+      <w:pPr>
+        <w:rPr>
+          <w:b/>
+          <w:bCs/>
+          <w:sz w:val="32"/>
+          <w:szCs w:val="32"/>
+        </w:rPr>
+      </w:pPr>
+      <w:r>
+        <w:rPr>
+          <w:b/>
+          <w:bCs/>
+          <w:sz w:val="32"/>
+          <w:szCs w:val="32"/>
+        </w:rPr>
         <w:t>References</w:t>
       </w:r>
     </w:p>
@@ -2151,7 +2018,6 @@
         </w:rPr>
         <w:t xml:space="preserve">Fader, P.S. and Hardie, B.G.S. (2010). Customer-Base Valuation in a Contractual Setting: The Perils of Ignoring Heterogeneity. Marketing Science, 29(1), pp.85–93. </w:t>
       </w:r>
-      <w:proofErr w:type="spellStart"/>
       <w:proofErr w:type="gramStart"/>
       <w:r>
         <w:rPr>
@@ -2159,16 +2025,7 @@
           <w:sz w:val="24"/>
           <w:szCs w:val="24"/>
         </w:rPr>
-        <w:t>doi:https</w:t>
-      </w:r>
-      <w:proofErr w:type="spellEnd"/>
-      <w:r>
-        <w:rPr>
-          <w:rFonts w:ascii="Calibri" w:hAnsi="Calibri" w:cs="Calibri"/>
-          <w:sz w:val="24"/>
-          <w:szCs w:val="24"/>
-        </w:rPr>
-        <w:t>://doi.org/10.1287/mksc.1080.0482</w:t>
+        <w:t>doi:https://doi.org/10.1287/mksc.1080.0482</w:t>
       </w:r>
       <w:proofErr w:type="gramEnd"/>
       <w:r>
@@ -2188,43 +2045,14 @@
           <w:szCs w:val="24"/>
         </w:rPr>
       </w:pPr>
-      <w:proofErr w:type="spellStart"/>
-      <w:r>
-        <w:rPr>
-          <w:rFonts w:ascii="Calibri" w:hAnsi="Calibri" w:cs="Calibri"/>
-          <w:sz w:val="24"/>
-          <w:szCs w:val="24"/>
-        </w:rPr>
-        <w:t>Cirqueira</w:t>
-      </w:r>
-      <w:proofErr w:type="spellEnd"/>
-      <w:r>
-        <w:rPr>
-          <w:rFonts w:ascii="Calibri" w:hAnsi="Calibri" w:cs="Calibri"/>
-          <w:sz w:val="24"/>
-          <w:szCs w:val="24"/>
-        </w:rPr>
-        <w:t xml:space="preserve">, D., Hofer, M., Nedbal, D., Helfert, M. and Bezbradica, M. (2020). Customer Purchase </w:t>
-      </w:r>
-      <w:proofErr w:type="spellStart"/>
-      <w:r>
-        <w:rPr>
-          <w:rFonts w:ascii="Calibri" w:hAnsi="Calibri" w:cs="Calibri"/>
-          <w:sz w:val="24"/>
-          <w:szCs w:val="24"/>
-        </w:rPr>
-        <w:t>Behavior</w:t>
-      </w:r>
-      <w:proofErr w:type="spellEnd"/>
-      <w:r>
-        <w:rPr>
-          <w:rFonts w:ascii="Calibri" w:hAnsi="Calibri" w:cs="Calibri"/>
-          <w:sz w:val="24"/>
-          <w:szCs w:val="24"/>
-        </w:rPr>
-        <w:t xml:space="preserve"> Prediction in E-commerce: A Conceptual Framework and Research Agenda. New Frontiers in Mining Complex Patterns, pp.119–136. </w:t>
-      </w:r>
-      <w:proofErr w:type="spellStart"/>
+      <w:r>
+        <w:rPr>
+          <w:rFonts w:ascii="Calibri" w:hAnsi="Calibri" w:cs="Calibri"/>
+          <w:sz w:val="24"/>
+          <w:szCs w:val="24"/>
+        </w:rPr>
+        <w:t xml:space="preserve">Cirqueira, D., Hofer, M., Nedbal, D., Helfert, M. and Bezbradica, M. (2020). Customer Purchase Behavior Prediction in E-commerce: A Conceptual Framework and Research Agenda. New Frontiers in Mining Complex Patterns, pp.119–136. </w:t>
+      </w:r>
       <w:proofErr w:type="gramStart"/>
       <w:r>
         <w:rPr>
@@ -2232,16 +2060,7 @@
           <w:sz w:val="24"/>
           <w:szCs w:val="24"/>
         </w:rPr>
-        <w:t>doi:https</w:t>
-      </w:r>
-      <w:proofErr w:type="spellEnd"/>
-      <w:r>
-        <w:rPr>
-          <w:rFonts w:ascii="Calibri" w:hAnsi="Calibri" w:cs="Calibri"/>
-          <w:sz w:val="24"/>
-          <w:szCs w:val="24"/>
-        </w:rPr>
-        <w:t>://doi.org/10.1007/978-3-030-48861-1_8</w:t>
+        <w:t>doi:https://doi.org/10.1007/978-3-030-48861-1_8</w:t>
       </w:r>
       <w:proofErr w:type="gramEnd"/>
       <w:r>
@@ -2269,7 +2088,6 @@
         </w:rPr>
         <w:t xml:space="preserve">Jeon, H.G., Kim, C., Lee, J. and Lee, K.C. (2021). Understanding E-Commerce Consumers’ Repeat Purchase Intention: The Role of Trust Transfer and the Moderating Effect of Neuroticism. Frontiers in Psychology, 12. </w:t>
       </w:r>
-      <w:proofErr w:type="spellStart"/>
       <w:proofErr w:type="gramStart"/>
       <w:r>
         <w:rPr>
@@ -2277,16 +2095,7 @@
           <w:sz w:val="24"/>
           <w:szCs w:val="24"/>
         </w:rPr>
-        <w:t>doi:https</w:t>
-      </w:r>
-      <w:proofErr w:type="spellEnd"/>
-      <w:r>
-        <w:rPr>
-          <w:rFonts w:ascii="Calibri" w:hAnsi="Calibri" w:cs="Calibri"/>
-          <w:sz w:val="24"/>
-          <w:szCs w:val="24"/>
-        </w:rPr>
-        <w:t>://doi.org/10.3389/fpsyg.2021.690039</w:t>
+        <w:t>doi:https://doi.org/10.3389/fpsyg.2021.690039</w:t>
       </w:r>
       <w:proofErr w:type="gramEnd"/>
       <w:r>
@@ -2312,10 +2121,61 @@
           <w:sz w:val="24"/>
           <w:szCs w:val="24"/>
         </w:rPr>
+        <w:t xml:space="preserve">Lundberg, S. and Lee, S.-I. (2017). A Unified Approach to Interpreting Model Predictions. [online] arXiv.org. </w:t>
+      </w:r>
+      <w:proofErr w:type="gramStart"/>
+      <w:r>
+        <w:rPr>
+          <w:rFonts w:ascii="Calibri" w:hAnsi="Calibri" w:cs="Calibri"/>
+          <w:sz w:val="24"/>
+          <w:szCs w:val="24"/>
+        </w:rPr>
+        <w:t>doi:https://doi.org/10.48550/arXiv.1705.07874</w:t>
+      </w:r>
+      <w:proofErr w:type="gramEnd"/>
+      <w:r>
+        <w:rPr>
+          <w:rFonts w:ascii="Calibri" w:hAnsi="Calibri" w:cs="Calibri"/>
+          <w:sz w:val="24"/>
+          <w:szCs w:val="24"/>
+        </w:rPr>
+        <w:t>.</w:t>
+      </w:r>
+    </w:p>
+    <w:p>
+      <w:pPr>
+        <w:rPr>
+          <w:rFonts w:ascii="Calibri" w:hAnsi="Calibri" w:cs="Calibri"/>
+          <w:sz w:val="24"/>
+          <w:szCs w:val="24"/>
+        </w:rPr>
+      </w:pPr>
+      <w:r>
+        <w:rPr>
+          <w:rFonts w:ascii="Calibri" w:hAnsi="Calibri" w:cs="Calibri"/>
+          <w:sz w:val="24"/>
+          <w:szCs w:val="24"/>
+        </w:rPr>
+        <w:t>Molnar, C. (2019). Interpretable machine learning: a guide for making Black Box Models interpretable. Morisville, North Carolina: Lulu.</w:t>
+      </w:r>
+    </w:p>
+    <w:p>
+      <w:pPr>
+        <w:rPr>
+          <w:rFonts w:ascii="Calibri" w:hAnsi="Calibri" w:cs="Calibri"/>
+          <w:sz w:val="24"/>
+          <w:szCs w:val="24"/>
+        </w:rPr>
+      </w:pPr>
+      <w:r>
+        <w:rPr>
+          <w:rFonts w:ascii="Calibri" w:hAnsi="Calibri" w:cs="Calibri"/>
+          <w:sz w:val="24"/>
+          <w:szCs w:val="24"/>
+        </w:rPr>
         <w:lastRenderedPageBreak/>
-        <w:t xml:space="preserve">Lundberg, S. and Lee, S.-I. (2017). A Unified Approach to Interpreting Model Predictions. [online] arXiv.org. </w:t>
-      </w:r>
-      <w:proofErr w:type="spellStart"/>
+        <w:t xml:space="preserve">Harter, A., Stich, L. and Spann, M. (2024). The Effect of Delivery Time on Repurchase Behavior in Quick Commerce. Journal of Service Research, [online] 28(2). </w:t>
+      </w:r>
       <w:proofErr w:type="gramStart"/>
       <w:r>
         <w:rPr>
@@ -2323,16 +2183,7 @@
           <w:sz w:val="24"/>
           <w:szCs w:val="24"/>
         </w:rPr>
-        <w:t>doi:https</w:t>
-      </w:r>
-      <w:proofErr w:type="spellEnd"/>
-      <w:r>
-        <w:rPr>
-          <w:rFonts w:ascii="Calibri" w:hAnsi="Calibri" w:cs="Calibri"/>
-          <w:sz w:val="24"/>
-          <w:szCs w:val="24"/>
-        </w:rPr>
-        <w:t>://doi.org/10.48550/arXiv.1705.07874</w:t>
+        <w:t>doi:https://doi.org/10.1177/10946705241236961</w:t>
       </w:r>
       <w:proofErr w:type="gramEnd"/>
       <w:r>
@@ -2358,44 +2209,8 @@
           <w:sz w:val="24"/>
           <w:szCs w:val="24"/>
         </w:rPr>
-        <w:t>Molnar, C. (2019). Interpretable machine learning: a guide for making Black Box Models interpretable. Morisville, North Carolina: Lulu.</w:t>
-      </w:r>
-    </w:p>
-    <w:p>
-      <w:pPr>
-        <w:rPr>
-          <w:rFonts w:ascii="Calibri" w:hAnsi="Calibri" w:cs="Calibri"/>
-          <w:sz w:val="24"/>
-          <w:szCs w:val="24"/>
-        </w:rPr>
-      </w:pPr>
-      <w:r>
-        <w:rPr>
-          <w:rFonts w:ascii="Calibri" w:hAnsi="Calibri" w:cs="Calibri"/>
-          <w:sz w:val="24"/>
-          <w:szCs w:val="24"/>
-        </w:rPr>
-        <w:t xml:space="preserve">Harter, A., Stich, L. and Spann, M. (2024). The Effect of Delivery Time on Repurchase </w:t>
-      </w:r>
-      <w:proofErr w:type="spellStart"/>
-      <w:r>
-        <w:rPr>
-          <w:rFonts w:ascii="Calibri" w:hAnsi="Calibri" w:cs="Calibri"/>
-          <w:sz w:val="24"/>
-          <w:szCs w:val="24"/>
-        </w:rPr>
-        <w:t>Behavior</w:t>
-      </w:r>
-      <w:proofErr w:type="spellEnd"/>
-      <w:r>
-        <w:rPr>
-          <w:rFonts w:ascii="Calibri" w:hAnsi="Calibri" w:cs="Calibri"/>
-          <w:sz w:val="24"/>
-          <w:szCs w:val="24"/>
-        </w:rPr>
-        <w:t xml:space="preserve"> in Quick Commerce. Journal of Service Research, [online] 28(2). </w:t>
-      </w:r>
-      <w:proofErr w:type="spellStart"/>
+        <w:t xml:space="preserve">Henninger, M. and Strobl, C. (2024). Interpreting machine learning predictions with LIME and Shapley values: theoretical insights, challenges, and meaningful interpretations. Behaviormetrika, 52(1), pp.45–75. </w:t>
+      </w:r>
       <w:proofErr w:type="gramStart"/>
       <w:r>
         <w:rPr>
@@ -2403,79 +2218,7 @@
           <w:sz w:val="24"/>
           <w:szCs w:val="24"/>
         </w:rPr>
-        <w:t>doi:https</w:t>
-      </w:r>
-      <w:proofErr w:type="spellEnd"/>
-      <w:r>
-        <w:rPr>
-          <w:rFonts w:ascii="Calibri" w:hAnsi="Calibri" w:cs="Calibri"/>
-          <w:sz w:val="24"/>
-          <w:szCs w:val="24"/>
-        </w:rPr>
-        <w:t>://doi.org/10.1177/10946705241236961</w:t>
-      </w:r>
-      <w:proofErr w:type="gramEnd"/>
-      <w:r>
-        <w:rPr>
-          <w:rFonts w:ascii="Calibri" w:hAnsi="Calibri" w:cs="Calibri"/>
-          <w:sz w:val="24"/>
-          <w:szCs w:val="24"/>
-        </w:rPr>
-        <w:t>.</w:t>
-      </w:r>
-    </w:p>
-    <w:p>
-      <w:pPr>
-        <w:rPr>
-          <w:rFonts w:ascii="Calibri" w:hAnsi="Calibri" w:cs="Calibri"/>
-          <w:sz w:val="24"/>
-          <w:szCs w:val="24"/>
-        </w:rPr>
-      </w:pPr>
-      <w:r>
-        <w:rPr>
-          <w:rFonts w:ascii="Calibri" w:hAnsi="Calibri" w:cs="Calibri"/>
-          <w:sz w:val="24"/>
-          <w:szCs w:val="24"/>
-        </w:rPr>
-        <w:t xml:space="preserve">Henninger, M. and Strobl, C. (2024). Interpreting machine learning predictions with LIME and Shapley values: theoretical insights, challenges, and meaningful interpretations. </w:t>
-      </w:r>
-      <w:proofErr w:type="spellStart"/>
-      <w:r>
-        <w:rPr>
-          <w:rFonts w:ascii="Calibri" w:hAnsi="Calibri" w:cs="Calibri"/>
-          <w:sz w:val="24"/>
-          <w:szCs w:val="24"/>
-        </w:rPr>
-        <w:t>Behaviormetrika</w:t>
-      </w:r>
-      <w:proofErr w:type="spellEnd"/>
-      <w:r>
-        <w:rPr>
-          <w:rFonts w:ascii="Calibri" w:hAnsi="Calibri" w:cs="Calibri"/>
-          <w:sz w:val="24"/>
-          <w:szCs w:val="24"/>
-        </w:rPr>
-        <w:t xml:space="preserve">, 52(1), pp.45–75. </w:t>
-      </w:r>
-      <w:proofErr w:type="spellStart"/>
-      <w:proofErr w:type="gramStart"/>
-      <w:r>
-        <w:rPr>
-          <w:rFonts w:ascii="Calibri" w:hAnsi="Calibri" w:cs="Calibri"/>
-          <w:sz w:val="24"/>
-          <w:szCs w:val="24"/>
-        </w:rPr>
-        <w:t>doi:https</w:t>
-      </w:r>
-      <w:proofErr w:type="spellEnd"/>
-      <w:r>
-        <w:rPr>
-          <w:rFonts w:ascii="Calibri" w:hAnsi="Calibri" w:cs="Calibri"/>
-          <w:sz w:val="24"/>
-          <w:szCs w:val="24"/>
-        </w:rPr>
-        <w:t>://doi.org/10.1007/s41237-024-00253-2</w:t>
+        <w:t>doi:https://doi.org/10.1007/s41237-024-00253-2</w:t>
       </w:r>
       <w:proofErr w:type="gramEnd"/>
       <w:r>

</xml_diff>

<commit_message>
Add Data Understanding chapter
</commit_message>
<xml_diff>
--- a/CA3-Capstone.docx
+++ b/CA3-Capstone.docx
@@ -79,7 +79,25 @@
           <w:sz w:val="24"/>
           <w:szCs w:val="24"/>
         </w:rPr>
-        <w:t>Retention has become a strategic priority in the quickly changing e-commerce industry, where customer acquisition costs are increasing and consumer expectations are changing. According to Fader and Hardie (2009) and Cirqueira et al. (2021), repeat customers are more likely to spend more, interact more frequently, and respond favourably to tailored marketing campaigns.</w:t>
+        <w:t xml:space="preserve">Retention has become a strategic priority in the quickly changing e-commerce industry, where customer acquisition costs are increasing and consumer expectations are changing. According to Fader and Hardie (2009) and </w:t>
+      </w:r>
+      <w:proofErr w:type="spellStart"/>
+      <w:r>
+        <w:rPr>
+          <w:rFonts w:ascii="Calibri" w:hAnsi="Calibri" w:cs="Calibri"/>
+          <w:sz w:val="24"/>
+          <w:szCs w:val="24"/>
+        </w:rPr>
+        <w:t>Cirqueira</w:t>
+      </w:r>
+      <w:proofErr w:type="spellEnd"/>
+      <w:r>
+        <w:rPr>
+          <w:rFonts w:ascii="Calibri" w:hAnsi="Calibri" w:cs="Calibri"/>
+          <w:sz w:val="24"/>
+          <w:szCs w:val="24"/>
+        </w:rPr>
+        <w:t xml:space="preserve"> et al. (2021), repeat customers are more likely to spend more, interact more frequently, and respond favourably to tailored marketing campaigns.</w:t>
       </w:r>
       <w:r>
         <w:rPr>
@@ -185,8 +203,54 @@
           <w:sz w:val="24"/>
           <w:szCs w:val="24"/>
         </w:rPr>
-        <w:t>To explain both global feature importance and local predictions, the project uses SHAP (SHapley Additive exPlanations) in addition to high-performing algorithms including Logistic Regression, Decision Tree, Random Forest, and XGBoost</w:t>
-      </w:r>
+        <w:t>To explain both global feature importance and local predictions, the project uses SHAP (</w:t>
+      </w:r>
+      <w:proofErr w:type="spellStart"/>
+      <w:r>
+        <w:rPr>
+          <w:rFonts w:ascii="Calibri" w:hAnsi="Calibri" w:cs="Calibri"/>
+          <w:sz w:val="24"/>
+          <w:szCs w:val="24"/>
+        </w:rPr>
+        <w:t>SHapley</w:t>
+      </w:r>
+      <w:proofErr w:type="spellEnd"/>
+      <w:r>
+        <w:rPr>
+          <w:rFonts w:ascii="Calibri" w:hAnsi="Calibri" w:cs="Calibri"/>
+          <w:sz w:val="24"/>
+          <w:szCs w:val="24"/>
+        </w:rPr>
+        <w:t xml:space="preserve"> Additive </w:t>
+      </w:r>
+      <w:proofErr w:type="spellStart"/>
+      <w:r>
+        <w:rPr>
+          <w:rFonts w:ascii="Calibri" w:hAnsi="Calibri" w:cs="Calibri"/>
+          <w:sz w:val="24"/>
+          <w:szCs w:val="24"/>
+        </w:rPr>
+        <w:t>exPlanations</w:t>
+      </w:r>
+      <w:proofErr w:type="spellEnd"/>
+      <w:r>
+        <w:rPr>
+          <w:rFonts w:ascii="Calibri" w:hAnsi="Calibri" w:cs="Calibri"/>
+          <w:sz w:val="24"/>
+          <w:szCs w:val="24"/>
+        </w:rPr>
+        <w:t xml:space="preserve">) in addition to high-performing algorithms including Logistic Regression, Decision Tree, Random Forest, and </w:t>
+      </w:r>
+      <w:proofErr w:type="spellStart"/>
+      <w:r>
+        <w:rPr>
+          <w:rFonts w:ascii="Calibri" w:hAnsi="Calibri" w:cs="Calibri"/>
+          <w:sz w:val="24"/>
+          <w:szCs w:val="24"/>
+        </w:rPr>
+        <w:t>XGBoost</w:t>
+      </w:r>
+      <w:proofErr w:type="spellEnd"/>
       <w:r>
         <w:rPr>
           <w:rFonts w:ascii="Calibri" w:hAnsi="Calibri" w:cs="Calibri"/>
@@ -274,7 +338,25 @@
           <w:sz w:val="24"/>
           <w:szCs w:val="24"/>
         </w:rPr>
-        <w:t>can effectively differentiate between one-time and repeat buyers (Cirqueira et al., 2021).</w:t>
+        <w:t>can effectively differentiate between one-time and repeat buyers (</w:t>
+      </w:r>
+      <w:proofErr w:type="spellStart"/>
+      <w:r>
+        <w:rPr>
+          <w:rFonts w:ascii="Calibri" w:hAnsi="Calibri" w:cs="Calibri"/>
+          <w:sz w:val="24"/>
+          <w:szCs w:val="24"/>
+        </w:rPr>
+        <w:t>Cirqueira</w:t>
+      </w:r>
+      <w:proofErr w:type="spellEnd"/>
+      <w:r>
+        <w:rPr>
+          <w:rFonts w:ascii="Calibri" w:hAnsi="Calibri" w:cs="Calibri"/>
+          <w:sz w:val="24"/>
+          <w:szCs w:val="24"/>
+        </w:rPr>
+        <w:t xml:space="preserve"> et al., 2021).</w:t>
       </w:r>
     </w:p>
     <w:p>
@@ -467,7 +549,25 @@
           <w:sz w:val="24"/>
           <w:szCs w:val="24"/>
         </w:rPr>
-        <w:t>To develop a supervised machine learning model that predicts repeat purchase behavior using transactional features.</w:t>
+        <w:t xml:space="preserve">To develop a supervised machine learning model that predicts repeat purchase </w:t>
+      </w:r>
+      <w:proofErr w:type="spellStart"/>
+      <w:r>
+        <w:rPr>
+          <w:rFonts w:ascii="Calibri" w:hAnsi="Calibri" w:cs="Calibri"/>
+          <w:sz w:val="24"/>
+          <w:szCs w:val="24"/>
+        </w:rPr>
+        <w:t>behavior</w:t>
+      </w:r>
+      <w:proofErr w:type="spellEnd"/>
+      <w:r>
+        <w:rPr>
+          <w:rFonts w:ascii="Calibri" w:hAnsi="Calibri" w:cs="Calibri"/>
+          <w:sz w:val="24"/>
+          <w:szCs w:val="24"/>
+        </w:rPr>
+        <w:t xml:space="preserve"> using transactional features.</w:t>
       </w:r>
     </w:p>
     <w:p>
@@ -492,7 +592,25 @@
           <w:sz w:val="24"/>
           <w:szCs w:val="24"/>
         </w:rPr>
-        <w:t>To evaluate and compare the performance of multiple classification algorithms (e.g., Random Forest, XGBoost).</w:t>
+        <w:t xml:space="preserve">To evaluate and compare the performance of multiple classification algorithms (e.g., Random Forest, </w:t>
+      </w:r>
+      <w:proofErr w:type="spellStart"/>
+      <w:r>
+        <w:rPr>
+          <w:rFonts w:ascii="Calibri" w:hAnsi="Calibri" w:cs="Calibri"/>
+          <w:sz w:val="24"/>
+          <w:szCs w:val="24"/>
+        </w:rPr>
+        <w:t>XGBoost</w:t>
+      </w:r>
+      <w:proofErr w:type="spellEnd"/>
+      <w:r>
+        <w:rPr>
+          <w:rFonts w:ascii="Calibri" w:hAnsi="Calibri" w:cs="Calibri"/>
+          <w:sz w:val="24"/>
+          <w:szCs w:val="24"/>
+        </w:rPr>
+        <w:t>).</w:t>
       </w:r>
     </w:p>
     <w:p>
@@ -771,7 +889,25 @@
           <w:szCs w:val="24"/>
         </w:rPr>
         <w:lastRenderedPageBreak/>
-        <w:t>essential to customer-base valuation models because they are more predictable and cost-effective to serve, according to Fader and Hardie (2009). Businesses are focussing on individualized prediction instead of broad segmentation as acquisition costs increase and consumer behaviour becomes more fragmented (Cirqueira et al., 2021).</w:t>
+        <w:t>essential to customer-base valuation models because they are more predictable and cost-effective to serve, according to Fader and Hardie (2009). Businesses are focussing on individualized prediction instead of broad segmentation as acquisition costs increase and consumer behaviour becomes more fragmented (</w:t>
+      </w:r>
+      <w:proofErr w:type="spellStart"/>
+      <w:r>
+        <w:rPr>
+          <w:rFonts w:ascii="Calibri" w:hAnsi="Calibri" w:cs="Calibri"/>
+          <w:sz w:val="24"/>
+          <w:szCs w:val="24"/>
+        </w:rPr>
+        <w:t>Cirqueira</w:t>
+      </w:r>
+      <w:proofErr w:type="spellEnd"/>
+      <w:r>
+        <w:rPr>
+          <w:rFonts w:ascii="Calibri" w:hAnsi="Calibri" w:cs="Calibri"/>
+          <w:sz w:val="24"/>
+          <w:szCs w:val="24"/>
+        </w:rPr>
+        <w:t xml:space="preserve"> et al., 2021).</w:t>
       </w:r>
     </w:p>
     <w:p>
@@ -837,7 +973,25 @@
           <w:sz w:val="24"/>
           <w:szCs w:val="24"/>
         </w:rPr>
-        <w:t>A scalable alternative is provided by predictive analytics. Using transactional data like frequency, recency, and monetary value, supervised machine learning models can predict the likelihood of repeat purchases. In order to accommodate the data limitations of numerous e-commerce platforms, Cirqueira et al. (2021) offer a conceptual framework for predicting purchase behaviour that prioritises behavioural features over demographic ones. A larger trend in data-driven customer strategy is seen in this move from descriptive segmentation to predictive modelling.</w:t>
+        <w:t xml:space="preserve">A scalable alternative is provided by predictive analytics. Using transactional data like frequency, recency, and monetary value, supervised machine learning models can predict the likelihood of repeat purchases. In order to accommodate the data limitations of numerous e-commerce platforms, </w:t>
+      </w:r>
+      <w:proofErr w:type="spellStart"/>
+      <w:r>
+        <w:rPr>
+          <w:rFonts w:ascii="Calibri" w:hAnsi="Calibri" w:cs="Calibri"/>
+          <w:sz w:val="24"/>
+          <w:szCs w:val="24"/>
+        </w:rPr>
+        <w:t>Cirqueira</w:t>
+      </w:r>
+      <w:proofErr w:type="spellEnd"/>
+      <w:r>
+        <w:rPr>
+          <w:rFonts w:ascii="Calibri" w:hAnsi="Calibri" w:cs="Calibri"/>
+          <w:sz w:val="24"/>
+          <w:szCs w:val="24"/>
+        </w:rPr>
+        <w:t xml:space="preserve"> et al. (2021) offer a conceptual framework for predicting purchase behaviour that prioritises behavioural features over demographic ones. A larger trend in data-driven customer strategy is seen in this move from descriptive segmentation to predictive modelling.</w:t>
       </w:r>
     </w:p>
     <w:p>
@@ -913,7 +1067,25 @@
           <w:sz w:val="24"/>
           <w:szCs w:val="24"/>
         </w:rPr>
-        <w:t>Building on this basis, SHAP (SHapley Additive reasons) provides a more theoretically grounded method that delivers both local explanations for specific predictions and global insights into feature importance (Lundberg and Lee, 2017; Molnar, 2022). In contrast to LIME, SHAP is based on cooperative game theory, which ensures consistency and fairness in the computation of feature contributions (Lundberg and Lee, 2017).</w:t>
+        <w:t>Building on this basis, SHAP (</w:t>
+      </w:r>
+      <w:proofErr w:type="spellStart"/>
+      <w:r>
+        <w:rPr>
+          <w:rFonts w:ascii="Calibri" w:hAnsi="Calibri" w:cs="Calibri"/>
+          <w:sz w:val="24"/>
+          <w:szCs w:val="24"/>
+        </w:rPr>
+        <w:t>SHapley</w:t>
+      </w:r>
+      <w:proofErr w:type="spellEnd"/>
+      <w:r>
+        <w:rPr>
+          <w:rFonts w:ascii="Calibri" w:hAnsi="Calibri" w:cs="Calibri"/>
+          <w:sz w:val="24"/>
+          <w:szCs w:val="24"/>
+        </w:rPr>
+        <w:t xml:space="preserve"> Additive reasons) provides a more theoretically grounded method that delivers both local explanations for specific predictions and global insights into feature importance (Lundberg and Lee, 2017; Molnar, 2022). In contrast to LIME, SHAP is based on cooperative game theory, which ensures consistency and fairness in the computation of feature contributions (Lundberg and Lee, 2017).</w:t>
       </w:r>
     </w:p>
     <w:p>
@@ -1030,16 +1202,44 @@
           <w:sz w:val="24"/>
           <w:szCs w:val="24"/>
         </w:rPr>
-        <w:t xml:space="preserve">There are still a number of gaps in the current body of study despite these contributions. Many studies still use segmentation methods like rule-based classification or demographic clustering, which are either static or overly simplistic (Jeon et al., 2021; Cirqueira et al., 2021). The temporal and behavioural complexity of online buying, where consumer preferences and engagement patterns change quickly, is frequently missed by these methods. Such segmentation may result in misclassification and </w:t>
-      </w:r>
-      <w:r>
-        <w:rPr>
-          <w:rFonts w:ascii="Calibri" w:hAnsi="Calibri" w:cs="Calibri"/>
-          <w:sz w:val="24"/>
-          <w:szCs w:val="24"/>
-        </w:rPr>
-        <w:t>missed oppertunities</w:t>
-      </w:r>
+        <w:t xml:space="preserve">There are still a number of gaps in the current body of study despite these contributions. Many studies still use segmentation methods like rule-based classification or demographic clustering, which are either static or overly simplistic (Jeon et al., 2021; </w:t>
+      </w:r>
+      <w:proofErr w:type="spellStart"/>
+      <w:r>
+        <w:rPr>
+          <w:rFonts w:ascii="Calibri" w:hAnsi="Calibri" w:cs="Calibri"/>
+          <w:sz w:val="24"/>
+          <w:szCs w:val="24"/>
+        </w:rPr>
+        <w:t>Cirqueira</w:t>
+      </w:r>
+      <w:proofErr w:type="spellEnd"/>
+      <w:r>
+        <w:rPr>
+          <w:rFonts w:ascii="Calibri" w:hAnsi="Calibri" w:cs="Calibri"/>
+          <w:sz w:val="24"/>
+          <w:szCs w:val="24"/>
+        </w:rPr>
+        <w:t xml:space="preserve"> et al., 2021). The temporal and behavioural complexity of online buying, where consumer preferences and engagement patterns change quickly, is frequently missed by these methods. Such segmentation may result in misclassification and </w:t>
+      </w:r>
+      <w:r>
+        <w:rPr>
+          <w:rFonts w:ascii="Calibri" w:hAnsi="Calibri" w:cs="Calibri"/>
+          <w:sz w:val="24"/>
+          <w:szCs w:val="24"/>
+        </w:rPr>
+        <w:t xml:space="preserve">missed </w:t>
+      </w:r>
+      <w:proofErr w:type="spellStart"/>
+      <w:r>
+        <w:rPr>
+          <w:rFonts w:ascii="Calibri" w:hAnsi="Calibri" w:cs="Calibri"/>
+          <w:sz w:val="24"/>
+          <w:szCs w:val="24"/>
+        </w:rPr>
+        <w:t>oppertunities</w:t>
+      </w:r>
+      <w:proofErr w:type="spellEnd"/>
       <w:r>
         <w:rPr>
           <w:rFonts w:ascii="Calibri" w:hAnsi="Calibri" w:cs="Calibri"/>
@@ -1071,7 +1271,25 @@
           <w:sz w:val="24"/>
           <w:szCs w:val="24"/>
         </w:rPr>
-        <w:t>Neural networks and XGBoost are examples of black-box models that are commonly used without giving enough thought to how non-technical stakeholders might comprehend and use their outputs (Henninger &amp; Strobl, 2024).</w:t>
+        <w:t xml:space="preserve">Neural networks and </w:t>
+      </w:r>
+      <w:proofErr w:type="spellStart"/>
+      <w:r>
+        <w:rPr>
+          <w:rFonts w:ascii="Calibri" w:hAnsi="Calibri" w:cs="Calibri"/>
+          <w:sz w:val="24"/>
+          <w:szCs w:val="24"/>
+        </w:rPr>
+        <w:t>XGBoost</w:t>
+      </w:r>
+      <w:proofErr w:type="spellEnd"/>
+      <w:r>
+        <w:rPr>
+          <w:rFonts w:ascii="Calibri" w:hAnsi="Calibri" w:cs="Calibri"/>
+          <w:sz w:val="24"/>
+          <w:szCs w:val="24"/>
+        </w:rPr>
+        <w:t xml:space="preserve"> are examples of black-box models that are commonly used without giving enough thought to how non-technical stakeholders might comprehend and use their outputs (Henninger &amp; Strobl, 2024).</w:t>
       </w:r>
       <w:r>
         <w:rPr>
@@ -1192,7 +1410,25 @@
           <w:sz w:val="24"/>
           <w:szCs w:val="24"/>
         </w:rPr>
-        <w:t>(Visani et al., 2020)</w:t>
+        <w:t>(</w:t>
+      </w:r>
+      <w:proofErr w:type="spellStart"/>
+      <w:r>
+        <w:rPr>
+          <w:rFonts w:ascii="Calibri" w:hAnsi="Calibri" w:cs="Calibri"/>
+          <w:sz w:val="24"/>
+          <w:szCs w:val="24"/>
+        </w:rPr>
+        <w:t>Visani</w:t>
+      </w:r>
+      <w:proofErr w:type="spellEnd"/>
+      <w:r>
+        <w:rPr>
+          <w:rFonts w:ascii="Calibri" w:hAnsi="Calibri" w:cs="Calibri"/>
+          <w:sz w:val="24"/>
+          <w:szCs w:val="24"/>
+        </w:rPr>
+        <w:t xml:space="preserve"> et al., 2020)</w:t>
       </w:r>
       <w:r>
         <w:rPr>
@@ -1323,24 +1559,60 @@
           <w:sz w:val="24"/>
           <w:szCs w:val="24"/>
         </w:rPr>
-        <w:t>By developing a supervised machine learning framework especially designed to predict repeat purchases in e-commerce, this study fills in the gaps that have been found. It uses transactional variables, like purchase frequency, recency, and monetary value, to capture scalable and dynamic behavioural signals, in contrast to segmentation-based methods (Cirqueira et al., 2021). This makes it possible to target high-value customers more precisely and encourages proactive retention strategies.</w:t>
-      </w:r>
-    </w:p>
-    <w:p>
-      <w:pPr>
-        <w:rPr>
-          <w:rFonts w:ascii="Calibri" w:hAnsi="Calibri" w:cs="Calibri"/>
-          <w:sz w:val="24"/>
-          <w:szCs w:val="24"/>
-        </w:rPr>
-      </w:pPr>
-      <w:r>
-        <w:rPr>
-          <w:rFonts w:ascii="Calibri" w:hAnsi="Calibri" w:cs="Calibri"/>
-          <w:sz w:val="24"/>
-          <w:szCs w:val="24"/>
-        </w:rPr>
-        <w:t>The study evaluates several classification techniques, such as XGBoost, Random Forest, Decision Tree, and Logistic Regression</w:t>
+        <w:t>By developing a supervised machine learning framework especially designed to predict repeat purchases in e-commerce, this study fills in the gaps that have been found. It uses transactional variables, like purchase frequency, recency, and monetary value, to capture scalable and dynamic behavioural signals, in contrast to segmentation-based methods (</w:t>
+      </w:r>
+      <w:proofErr w:type="spellStart"/>
+      <w:r>
+        <w:rPr>
+          <w:rFonts w:ascii="Calibri" w:hAnsi="Calibri" w:cs="Calibri"/>
+          <w:sz w:val="24"/>
+          <w:szCs w:val="24"/>
+        </w:rPr>
+        <w:t>Cirqueira</w:t>
+      </w:r>
+      <w:proofErr w:type="spellEnd"/>
+      <w:r>
+        <w:rPr>
+          <w:rFonts w:ascii="Calibri" w:hAnsi="Calibri" w:cs="Calibri"/>
+          <w:sz w:val="24"/>
+          <w:szCs w:val="24"/>
+        </w:rPr>
+        <w:t xml:space="preserve"> et al., 2021). This makes it possible to target high-value customers more precisely and encourages proactive retention strategies.</w:t>
+      </w:r>
+    </w:p>
+    <w:p>
+      <w:pPr>
+        <w:rPr>
+          <w:rFonts w:ascii="Calibri" w:hAnsi="Calibri" w:cs="Calibri"/>
+          <w:sz w:val="24"/>
+          <w:szCs w:val="24"/>
+        </w:rPr>
+      </w:pPr>
+      <w:r>
+        <w:rPr>
+          <w:rFonts w:ascii="Calibri" w:hAnsi="Calibri" w:cs="Calibri"/>
+          <w:sz w:val="24"/>
+          <w:szCs w:val="24"/>
+        </w:rPr>
+        <w:t xml:space="preserve">The study evaluates several classification techniques, such as </w:t>
+      </w:r>
+      <w:proofErr w:type="spellStart"/>
+      <w:r>
+        <w:rPr>
+          <w:rFonts w:ascii="Calibri" w:hAnsi="Calibri" w:cs="Calibri"/>
+          <w:sz w:val="24"/>
+          <w:szCs w:val="24"/>
+        </w:rPr>
+        <w:t>XGBoost</w:t>
+      </w:r>
+      <w:proofErr w:type="spellEnd"/>
+      <w:r>
+        <w:rPr>
+          <w:rFonts w:ascii="Calibri" w:hAnsi="Calibri" w:cs="Calibri"/>
+          <w:sz w:val="24"/>
+          <w:szCs w:val="24"/>
+        </w:rPr>
+        <w:t>, Random Forest, Decision Tree, and Logistic Regression</w:t>
       </w:r>
       <w:r>
         <w:t xml:space="preserve"> </w:t>
@@ -1620,7 +1892,61 @@
           <w:sz w:val="24"/>
           <w:szCs w:val="24"/>
         </w:rPr>
-        <w:t>Exploratory analysis of anonymised transactional records was carried out during the data understanding step. Avg_days_between_purchases, total_spend_per_customer, and category_diversity are important behavioural features that were found to be possibly predictive. To guide preprocessing choices, descriptive statistics, class imbalance, and missingness patterns were evaluated.</w:t>
+        <w:t xml:space="preserve">Exploratory analysis of anonymised transactional records was carried out during the data understanding step. </w:t>
+      </w:r>
+      <w:proofErr w:type="spellStart"/>
+      <w:r>
+        <w:rPr>
+          <w:rFonts w:ascii="Calibri" w:hAnsi="Calibri" w:cs="Calibri"/>
+          <w:sz w:val="24"/>
+          <w:szCs w:val="24"/>
+        </w:rPr>
+        <w:t>Avg_days_between_purchases</w:t>
+      </w:r>
+      <w:proofErr w:type="spellEnd"/>
+      <w:r>
+        <w:rPr>
+          <w:rFonts w:ascii="Calibri" w:hAnsi="Calibri" w:cs="Calibri"/>
+          <w:sz w:val="24"/>
+          <w:szCs w:val="24"/>
+        </w:rPr>
+        <w:t xml:space="preserve">, </w:t>
+      </w:r>
+      <w:proofErr w:type="spellStart"/>
+      <w:r>
+        <w:rPr>
+          <w:rFonts w:ascii="Calibri" w:hAnsi="Calibri" w:cs="Calibri"/>
+          <w:sz w:val="24"/>
+          <w:szCs w:val="24"/>
+        </w:rPr>
+        <w:t>total_spend_per_customer</w:t>
+      </w:r>
+      <w:proofErr w:type="spellEnd"/>
+      <w:r>
+        <w:rPr>
+          <w:rFonts w:ascii="Calibri" w:hAnsi="Calibri" w:cs="Calibri"/>
+          <w:sz w:val="24"/>
+          <w:szCs w:val="24"/>
+        </w:rPr>
+        <w:t xml:space="preserve">, and </w:t>
+      </w:r>
+      <w:proofErr w:type="spellStart"/>
+      <w:r>
+        <w:rPr>
+          <w:rFonts w:ascii="Calibri" w:hAnsi="Calibri" w:cs="Calibri"/>
+          <w:sz w:val="24"/>
+          <w:szCs w:val="24"/>
+        </w:rPr>
+        <w:t>category_diversity</w:t>
+      </w:r>
+      <w:proofErr w:type="spellEnd"/>
+      <w:r>
+        <w:rPr>
+          <w:rFonts w:ascii="Calibri" w:hAnsi="Calibri" w:cs="Calibri"/>
+          <w:sz w:val="24"/>
+          <w:szCs w:val="24"/>
+        </w:rPr>
+        <w:t xml:space="preserve"> are important behavioural features that were found to be possibly predictive. To guide preprocessing choices, descriptive statistics, class imbalance, and missingness patterns were evaluated.</w:t>
       </w:r>
     </w:p>
     <w:p>
@@ -1711,7 +2037,43 @@
           <w:szCs w:val="24"/>
         </w:rPr>
         <w:lastRenderedPageBreak/>
-        <w:t>Four classifiers such as Logistic Regression, Decision Tree, Random Forest, and XGBoost were benchmarked throughout the modelling phase. GridSearchCV was applied to tune hyperparameters using F1-score as the main metric and 5-fold cross-validation. With an F1-score of 0.988 and ROC-AUC of 0.991, the Decision Tree was ultimately chosen for final implementation because it balanced performance and interpretability.</w:t>
+        <w:t xml:space="preserve">Four classifiers such as Logistic Regression, Decision Tree, Random Forest, and </w:t>
+      </w:r>
+      <w:proofErr w:type="spellStart"/>
+      <w:r>
+        <w:rPr>
+          <w:rFonts w:ascii="Calibri" w:hAnsi="Calibri" w:cs="Calibri"/>
+          <w:sz w:val="24"/>
+          <w:szCs w:val="24"/>
+        </w:rPr>
+        <w:t>XGBoost</w:t>
+      </w:r>
+      <w:proofErr w:type="spellEnd"/>
+      <w:r>
+        <w:rPr>
+          <w:rFonts w:ascii="Calibri" w:hAnsi="Calibri" w:cs="Calibri"/>
+          <w:sz w:val="24"/>
+          <w:szCs w:val="24"/>
+        </w:rPr>
+        <w:t xml:space="preserve"> were benchmarked throughout the modelling phase. </w:t>
+      </w:r>
+      <w:proofErr w:type="spellStart"/>
+      <w:r>
+        <w:rPr>
+          <w:rFonts w:ascii="Calibri" w:hAnsi="Calibri" w:cs="Calibri"/>
+          <w:sz w:val="24"/>
+          <w:szCs w:val="24"/>
+        </w:rPr>
+        <w:t>GridSearchCV</w:t>
+      </w:r>
+      <w:proofErr w:type="spellEnd"/>
+      <w:r>
+        <w:rPr>
+          <w:rFonts w:ascii="Calibri" w:hAnsi="Calibri" w:cs="Calibri"/>
+          <w:sz w:val="24"/>
+          <w:szCs w:val="24"/>
+        </w:rPr>
+        <w:t xml:space="preserve"> was applied to tune hyperparameters using F1-score as the main metric and 5-fold cross-validation. With an F1-score of 0.988 and ROC-AUC of 0.991, the Decision Tree was ultimately chosen for final implementation because it balanced performance and interpretability.</w:t>
       </w:r>
     </w:p>
     <w:p>
@@ -1780,7 +2142,7 @@
           <w:sz w:val="32"/>
           <w:szCs w:val="32"/>
         </w:rPr>
-        <w:t xml:space="preserve">6. </w:t>
+        <w:t>5</w:t>
       </w:r>
       <w:r>
         <w:rPr>
@@ -1790,6 +2152,16 @@
           <w:sz w:val="32"/>
           <w:szCs w:val="32"/>
         </w:rPr>
+        <w:t xml:space="preserve">. </w:t>
+      </w:r>
+      <w:r>
+        <w:rPr>
+          <w:rFonts w:ascii="Calibri" w:hAnsi="Calibri" w:cs="Calibri"/>
+          <w:b/>
+          <w:bCs/>
+          <w:sz w:val="32"/>
+          <w:szCs w:val="32"/>
+        </w:rPr>
         <w:t>Tools and Technologies Used</w:t>
       </w:r>
     </w:p>
@@ -1801,13 +2173,23 @@
           <w:szCs w:val="24"/>
         </w:rPr>
       </w:pPr>
-      <w:r>
-        <w:rPr>
-          <w:rFonts w:ascii="Calibri" w:hAnsi="Calibri" w:cs="Calibri"/>
-          <w:sz w:val="24"/>
-          <w:szCs w:val="24"/>
-        </w:rPr>
-        <w:t>Jupyter Notebook was used to implement this project in Python, including iterative development, inline visualization, and transparent documentation.</w:t>
+      <w:proofErr w:type="spellStart"/>
+      <w:r>
+        <w:rPr>
+          <w:rFonts w:ascii="Calibri" w:hAnsi="Calibri" w:cs="Calibri"/>
+          <w:sz w:val="24"/>
+          <w:szCs w:val="24"/>
+        </w:rPr>
+        <w:t>Jupyter</w:t>
+      </w:r>
+      <w:proofErr w:type="spellEnd"/>
+      <w:r>
+        <w:rPr>
+          <w:rFonts w:ascii="Calibri" w:hAnsi="Calibri" w:cs="Calibri"/>
+          <w:sz w:val="24"/>
+          <w:szCs w:val="24"/>
+        </w:rPr>
+        <w:t xml:space="preserve"> Notebook was used to implement this project in Python, including iterative development, inline visualization, and transparent documentation.</w:t>
       </w:r>
       <w:r>
         <w:rPr>
@@ -1840,7 +2222,43 @@
           <w:sz w:val="24"/>
           <w:szCs w:val="24"/>
         </w:rPr>
-        <w:t>Scikit-learn was used to develop baseline models such Random Forest, Decision Tree, and Logistic Regression, Seaborn and matplotlib were used for visual diagnostics, and pandas and NumPy were used for data manipulation. A comparison of XGBoost's performance was also evaluated. Every model was assessed using precision, recall, F1-score, and ROC-AUC after being trained on a SMOTE-balanced dataset. GridSearchCV was used for hyperparameter tuning, and a tuned Decision Tree classifier was chosen as the final model based on its balanced interpretability and performance.</w:t>
+        <w:t xml:space="preserve">Scikit-learn was used to develop baseline models such Random Forest, Decision Tree, and Logistic Regression, Seaborn and matplotlib were used for visual diagnostics, and pandas and NumPy were used for data manipulation. A comparison of </w:t>
+      </w:r>
+      <w:proofErr w:type="spellStart"/>
+      <w:r>
+        <w:rPr>
+          <w:rFonts w:ascii="Calibri" w:hAnsi="Calibri" w:cs="Calibri"/>
+          <w:sz w:val="24"/>
+          <w:szCs w:val="24"/>
+        </w:rPr>
+        <w:t>XGBoost's</w:t>
+      </w:r>
+      <w:proofErr w:type="spellEnd"/>
+      <w:r>
+        <w:rPr>
+          <w:rFonts w:ascii="Calibri" w:hAnsi="Calibri" w:cs="Calibri"/>
+          <w:sz w:val="24"/>
+          <w:szCs w:val="24"/>
+        </w:rPr>
+        <w:t xml:space="preserve"> performance was also evaluated. Every model was assessed using precision, recall, F1-score, and ROC-AUC after being trained on a SMOTE-balanced dataset. </w:t>
+      </w:r>
+      <w:proofErr w:type="spellStart"/>
+      <w:r>
+        <w:rPr>
+          <w:rFonts w:ascii="Calibri" w:hAnsi="Calibri" w:cs="Calibri"/>
+          <w:sz w:val="24"/>
+          <w:szCs w:val="24"/>
+        </w:rPr>
+        <w:t>GridSearchCV</w:t>
+      </w:r>
+      <w:proofErr w:type="spellEnd"/>
+      <w:r>
+        <w:rPr>
+          <w:rFonts w:ascii="Calibri" w:hAnsi="Calibri" w:cs="Calibri"/>
+          <w:sz w:val="24"/>
+          <w:szCs w:val="24"/>
+        </w:rPr>
+        <w:t xml:space="preserve"> was used for hyperparameter tuning, and a tuned Decision Tree classifier was chosen as the final model based on its balanced interpretability and performance.</w:t>
       </w:r>
     </w:p>
     <w:p>
@@ -1873,7 +2291,25 @@
           <w:sz w:val="24"/>
           <w:szCs w:val="24"/>
         </w:rPr>
-        <w:t>To produce local explanations, LIMETabularExplainer was used on three strategic test cases such as correctly classified, misclassified and, edge case. Class-specific and global feature importance plots, including waterfall charts and aggregated rankings, were created using SHAP. Transparent communication of model behaviour to non-technical stakeholders was made possible by these technologies.</w:t>
+        <w:t xml:space="preserve">To produce local explanations, </w:t>
+      </w:r>
+      <w:proofErr w:type="spellStart"/>
+      <w:r>
+        <w:rPr>
+          <w:rFonts w:ascii="Calibri" w:hAnsi="Calibri" w:cs="Calibri"/>
+          <w:sz w:val="24"/>
+          <w:szCs w:val="24"/>
+        </w:rPr>
+        <w:t>LIMETabularExplainer</w:t>
+      </w:r>
+      <w:proofErr w:type="spellEnd"/>
+      <w:r>
+        <w:rPr>
+          <w:rFonts w:ascii="Calibri" w:hAnsi="Calibri" w:cs="Calibri"/>
+          <w:sz w:val="24"/>
+          <w:szCs w:val="24"/>
+        </w:rPr>
+        <w:t xml:space="preserve"> was used on three strategic test cases such as correctly classified, misclassified and, edge case. Class-specific and global feature importance plots, including waterfall charts and aggregated rankings, were created using SHAP. Transparent communication of model behaviour to non-technical stakeholders was made possible by these technologies.</w:t>
       </w:r>
     </w:p>
     <w:p>
@@ -1892,6 +2328,478 @@
         </w:rPr>
         <w:t>In order to ensure adherence to ethical standards and data protection regulations, all data used was anonymised and publicly available. Stakeholder trust in predictive decision-making and a dedication to responsible AI are demonstrated by the incorporation of interpretable tools.</w:t>
       </w:r>
+    </w:p>
+    <w:p>
+      <w:pPr>
+        <w:rPr>
+          <w:rFonts w:ascii="Calibri" w:hAnsi="Calibri" w:cs="Calibri"/>
+          <w:b/>
+          <w:bCs/>
+          <w:sz w:val="32"/>
+          <w:szCs w:val="32"/>
+        </w:rPr>
+      </w:pPr>
+      <w:r>
+        <w:rPr>
+          <w:rFonts w:ascii="Calibri" w:hAnsi="Calibri" w:cs="Calibri"/>
+          <w:b/>
+          <w:bCs/>
+          <w:sz w:val="32"/>
+          <w:szCs w:val="32"/>
+        </w:rPr>
+        <w:t>6</w:t>
+      </w:r>
+      <w:r>
+        <w:rPr>
+          <w:rFonts w:ascii="Calibri" w:hAnsi="Calibri" w:cs="Calibri"/>
+          <w:b/>
+          <w:bCs/>
+          <w:sz w:val="32"/>
+          <w:szCs w:val="32"/>
+        </w:rPr>
+        <w:t>. Data Understanding</w:t>
+      </w:r>
+    </w:p>
+    <w:p>
+      <w:pPr>
+        <w:rPr>
+          <w:rFonts w:ascii="Calibri" w:hAnsi="Calibri" w:cs="Calibri"/>
+          <w:sz w:val="24"/>
+          <w:szCs w:val="24"/>
+        </w:rPr>
+      </w:pPr>
+      <w:r>
+        <w:rPr>
+          <w:rFonts w:ascii="Calibri" w:hAnsi="Calibri" w:cs="Calibri"/>
+          <w:sz w:val="24"/>
+          <w:szCs w:val="24"/>
+        </w:rPr>
+        <w:t>The publicly available Online Retail dataset, which contains 541,909 rows and 8 columns of transactional data from a UK-based e-commerce platform, was used in this project. An item-</w:t>
+      </w:r>
+      <w:r>
+        <w:rPr>
+          <w:rFonts w:ascii="Calibri" w:hAnsi="Calibri" w:cs="Calibri"/>
+          <w:sz w:val="24"/>
+          <w:szCs w:val="24"/>
+        </w:rPr>
+        <w:lastRenderedPageBreak/>
+        <w:t>level transaction, containing the invoice number, product code, description, quantity, unit price, timestamp, customer ID, and country, is represented by each row. The data is itemised and granular, requiring aggregation to extract customer-level behavioural features suitable for predictive modelling, according to the initial exploration.</w:t>
+      </w:r>
+    </w:p>
+    <w:p>
+      <w:pPr>
+        <w:rPr>
+          <w:rFonts w:ascii="Calibri" w:hAnsi="Calibri" w:cs="Calibri"/>
+          <w:sz w:val="24"/>
+          <w:szCs w:val="24"/>
+        </w:rPr>
+      </w:pPr>
+      <w:r>
+        <w:rPr>
+          <w:rFonts w:ascii="Calibri" w:hAnsi="Calibri" w:cs="Calibri"/>
+          <w:sz w:val="24"/>
+          <w:szCs w:val="24"/>
+        </w:rPr>
+        <w:t xml:space="preserve">The Description and </w:t>
+      </w:r>
+      <w:proofErr w:type="spellStart"/>
+      <w:r>
+        <w:rPr>
+          <w:rFonts w:ascii="Calibri" w:hAnsi="Calibri" w:cs="Calibri"/>
+          <w:sz w:val="24"/>
+          <w:szCs w:val="24"/>
+        </w:rPr>
+        <w:t>CustomerID</w:t>
+      </w:r>
+      <w:proofErr w:type="spellEnd"/>
+      <w:r>
+        <w:rPr>
+          <w:rFonts w:ascii="Calibri" w:hAnsi="Calibri" w:cs="Calibri"/>
+          <w:sz w:val="24"/>
+          <w:szCs w:val="24"/>
+        </w:rPr>
+        <w:t xml:space="preserve"> fields both had missing values</w:t>
+      </w:r>
+      <w:r>
+        <w:rPr>
+          <w:rFonts w:ascii="Calibri" w:hAnsi="Calibri" w:cs="Calibri"/>
+          <w:sz w:val="24"/>
+          <w:szCs w:val="24"/>
+        </w:rPr>
+        <w:t xml:space="preserve">, with </w:t>
+      </w:r>
+      <w:r>
+        <w:rPr>
+          <w:rFonts w:ascii="Calibri" w:hAnsi="Calibri" w:cs="Calibri"/>
+          <w:sz w:val="24"/>
+          <w:szCs w:val="24"/>
+        </w:rPr>
+        <w:t xml:space="preserve">the latter was missing in almost 25% of the records. Rows without </w:t>
+      </w:r>
+      <w:proofErr w:type="spellStart"/>
+      <w:r>
+        <w:rPr>
+          <w:rFonts w:ascii="Calibri" w:hAnsi="Calibri" w:cs="Calibri"/>
+          <w:sz w:val="24"/>
+          <w:szCs w:val="24"/>
+        </w:rPr>
+        <w:t>CustomerID</w:t>
+      </w:r>
+      <w:proofErr w:type="spellEnd"/>
+      <w:r>
+        <w:rPr>
+          <w:rFonts w:ascii="Calibri" w:hAnsi="Calibri" w:cs="Calibri"/>
+          <w:sz w:val="24"/>
+          <w:szCs w:val="24"/>
+        </w:rPr>
+        <w:t xml:space="preserve"> were eliminated because customer-level modelling was essential to this project. To ensure data integrity, 10,147 completely duplicate rows were found and eliminated. Both Quantity and UnitPrice had extreme outliers, with values ranging from -80,995 to 80,995 and -11,062.06 to 38,970.00, respectively, according to summary statistics. Histograms and boxplots were used to visualise these anomalies (Figure 1), demonstrating the presence of extreme values and heavy skewness.</w:t>
+      </w:r>
+    </w:p>
+    <w:p>
+      <w:pPr>
+        <w:rPr>
+          <w:rFonts w:ascii="Calibri" w:hAnsi="Calibri" w:cs="Calibri"/>
+          <w:sz w:val="24"/>
+          <w:szCs w:val="24"/>
+        </w:rPr>
+      </w:pPr>
+    </w:p>
+    <w:p>
+      <w:pPr>
+        <w:rPr>
+          <w:rFonts w:ascii="Calibri" w:hAnsi="Calibri" w:cs="Calibri"/>
+          <w:sz w:val="24"/>
+          <w:szCs w:val="24"/>
+        </w:rPr>
+      </w:pPr>
+      <w:r>
+        <w:rPr>
+          <w:rFonts w:ascii="Calibri" w:hAnsi="Calibri" w:cs="Calibri"/>
+          <w:noProof/>
+          <w:sz w:val="24"/>
+          <w:szCs w:val="24"/>
+        </w:rPr>
+        <w:drawing>
+          <wp:inline distT="0" distB="0" distL="0" distR="0" wp14:anchorId="4FF3BC66" wp14:editId="08FA2342">
+            <wp:extent cx="5731510" cy="4010025"/>
+            <wp:effectExtent l="0" t="0" r="2540" b="9525"/>
+            <wp:docPr id="1938980792" name="Picture 1" descr="A close-up of a graph&#10;&#10;AI-generated content may be incorrect."/>
+            <wp:cNvGraphicFramePr>
+              <a:graphicFrameLocks xmlns:a="http://schemas.openxmlformats.org/drawingml/2006/main" noChangeAspect="1"/>
+            </wp:cNvGraphicFramePr>
+            <a:graphic xmlns:a="http://schemas.openxmlformats.org/drawingml/2006/main">
+              <a:graphicData uri="http://schemas.openxmlformats.org/drawingml/2006/picture">
+                <pic:pic xmlns:pic="http://schemas.openxmlformats.org/drawingml/2006/picture">
+                  <pic:nvPicPr>
+                    <pic:cNvPr id="1938980792" name="Picture 1" descr="A close-up of a graph&#10;&#10;AI-generated content may be incorrect."/>
+                    <pic:cNvPicPr/>
+                  </pic:nvPicPr>
+                  <pic:blipFill>
+                    <a:blip r:embed="rId4">
+                      <a:extLst>
+                        <a:ext uri="{28A0092B-C50C-407E-A947-70E740481C1C}">
+                          <a14:useLocalDpi xmlns:a14="http://schemas.microsoft.com/office/drawing/2010/main" val="0"/>
+                        </a:ext>
+                      </a:extLst>
+                    </a:blip>
+                    <a:stretch>
+                      <a:fillRect/>
+                    </a:stretch>
+                  </pic:blipFill>
+                  <pic:spPr>
+                    <a:xfrm>
+                      <a:off x="0" y="0"/>
+                      <a:ext cx="5731510" cy="4010025"/>
+                    </a:xfrm>
+                    <a:prstGeom prst="rect">
+                      <a:avLst/>
+                    </a:prstGeom>
+                  </pic:spPr>
+                </pic:pic>
+              </a:graphicData>
+            </a:graphic>
+          </wp:inline>
+        </w:drawing>
+      </w:r>
+    </w:p>
+    <w:p>
+      <w:pPr>
+        <w:rPr>
+          <w:rFonts w:ascii="Calibri" w:hAnsi="Calibri" w:cs="Calibri"/>
+          <w:sz w:val="24"/>
+          <w:szCs w:val="24"/>
+        </w:rPr>
+      </w:pPr>
+      <w:r>
+        <w:rPr>
+          <w:rFonts w:ascii="Calibri" w:hAnsi="Calibri" w:cs="Calibri"/>
+          <w:sz w:val="24"/>
+          <w:szCs w:val="24"/>
+        </w:rPr>
+        <w:t>Figure 1. Distribution and boxplot of Quantity and UnitPrice showing skewed distributions and extreme outliers.</w:t>
+      </w:r>
+    </w:p>
+    <w:p>
+      <w:pPr>
+        <w:rPr>
+          <w:rFonts w:ascii="Calibri" w:hAnsi="Calibri" w:cs="Calibri"/>
+          <w:sz w:val="24"/>
+          <w:szCs w:val="24"/>
+        </w:rPr>
+      </w:pPr>
+      <w:r>
+        <w:rPr>
+          <w:rFonts w:ascii="Calibri" w:hAnsi="Calibri" w:cs="Calibri"/>
+          <w:sz w:val="24"/>
+          <w:szCs w:val="24"/>
+        </w:rPr>
+        <w:t>The United Kingdom dominated transaction volume, followed by Germany, France, and Ireland, according to exploratory analysis. The choice to regard Country as a contextual rather than predictive feature was influenced by this regional imbalance. Figure 2, which shows the top 20 countries by transaction count, illustrates the imbalance.</w:t>
+      </w:r>
+    </w:p>
+    <w:p>
+      <w:pPr>
+        <w:rPr>
+          <w:rFonts w:ascii="Calibri" w:hAnsi="Calibri" w:cs="Calibri"/>
+          <w:sz w:val="24"/>
+          <w:szCs w:val="24"/>
+        </w:rPr>
+      </w:pPr>
+      <w:r>
+        <w:rPr>
+          <w:rFonts w:ascii="Calibri" w:hAnsi="Calibri" w:cs="Calibri"/>
+          <w:noProof/>
+          <w:sz w:val="24"/>
+          <w:szCs w:val="24"/>
+        </w:rPr>
+        <w:lastRenderedPageBreak/>
+        <w:drawing>
+          <wp:inline distT="0" distB="0" distL="0" distR="0" wp14:anchorId="5EE4D9BF" wp14:editId="26818C41">
+            <wp:extent cx="5731510" cy="2840355"/>
+            <wp:effectExtent l="0" t="0" r="2540" b="0"/>
+            <wp:docPr id="1019362471" name="Picture 2" descr="A white rectangular object with numbers&#10;&#10;AI-generated content may be incorrect."/>
+            <wp:cNvGraphicFramePr>
+              <a:graphicFrameLocks xmlns:a="http://schemas.openxmlformats.org/drawingml/2006/main" noChangeAspect="1"/>
+            </wp:cNvGraphicFramePr>
+            <a:graphic xmlns:a="http://schemas.openxmlformats.org/drawingml/2006/main">
+              <a:graphicData uri="http://schemas.openxmlformats.org/drawingml/2006/picture">
+                <pic:pic xmlns:pic="http://schemas.openxmlformats.org/drawingml/2006/picture">
+                  <pic:nvPicPr>
+                    <pic:cNvPr id="1019362471" name="Picture 2" descr="A white rectangular object with numbers&#10;&#10;AI-generated content may be incorrect."/>
+                    <pic:cNvPicPr/>
+                  </pic:nvPicPr>
+                  <pic:blipFill>
+                    <a:blip r:embed="rId5">
+                      <a:extLst>
+                        <a:ext uri="{28A0092B-C50C-407E-A947-70E740481C1C}">
+                          <a14:useLocalDpi xmlns:a14="http://schemas.microsoft.com/office/drawing/2010/main" val="0"/>
+                        </a:ext>
+                      </a:extLst>
+                    </a:blip>
+                    <a:stretch>
+                      <a:fillRect/>
+                    </a:stretch>
+                  </pic:blipFill>
+                  <pic:spPr>
+                    <a:xfrm>
+                      <a:off x="0" y="0"/>
+                      <a:ext cx="5731510" cy="2840355"/>
+                    </a:xfrm>
+                    <a:prstGeom prst="rect">
+                      <a:avLst/>
+                    </a:prstGeom>
+                  </pic:spPr>
+                </pic:pic>
+              </a:graphicData>
+            </a:graphic>
+          </wp:inline>
+        </w:drawing>
+      </w:r>
+    </w:p>
+    <w:p>
+      <w:pPr>
+        <w:rPr>
+          <w:rFonts w:ascii="Calibri" w:hAnsi="Calibri" w:cs="Calibri"/>
+          <w:sz w:val="24"/>
+          <w:szCs w:val="24"/>
+        </w:rPr>
+      </w:pPr>
+      <w:r>
+        <w:rPr>
+          <w:rFonts w:ascii="Calibri" w:hAnsi="Calibri" w:cs="Calibri"/>
+          <w:sz w:val="24"/>
+          <w:szCs w:val="24"/>
+        </w:rPr>
+        <w:t xml:space="preserve">                                            </w:t>
+      </w:r>
+      <w:r>
+        <w:rPr>
+          <w:rFonts w:ascii="Calibri" w:hAnsi="Calibri" w:cs="Calibri"/>
+          <w:sz w:val="24"/>
+          <w:szCs w:val="24"/>
+        </w:rPr>
+        <w:t>Figure 2. Top 20 countries by transaction count</w:t>
+      </w:r>
+    </w:p>
+    <w:p>
+      <w:pPr>
+        <w:rPr>
+          <w:rFonts w:ascii="Calibri" w:hAnsi="Calibri" w:cs="Calibri"/>
+          <w:sz w:val="24"/>
+          <w:szCs w:val="24"/>
+        </w:rPr>
+      </w:pPr>
+      <w:r>
+        <w:rPr>
+          <w:rFonts w:ascii="Calibri" w:hAnsi="Calibri" w:cs="Calibri"/>
+          <w:sz w:val="24"/>
+          <w:szCs w:val="24"/>
+        </w:rPr>
+        <w:t>There is no linear relationship between Quantity and UnitPrice, according to correlation analysis, which produced a nearly zero coefficient (-0.0012). The correlation matrix heatmap in Figure 3 illustrates this.</w:t>
+      </w:r>
+    </w:p>
+    <w:p>
+      <w:pPr>
+        <w:rPr>
+          <w:rFonts w:ascii="Calibri" w:hAnsi="Calibri" w:cs="Calibri"/>
+          <w:sz w:val="24"/>
+          <w:szCs w:val="24"/>
+        </w:rPr>
+      </w:pPr>
+    </w:p>
+    <w:p>
+      <w:pPr>
+        <w:rPr>
+          <w:rFonts w:ascii="Calibri" w:hAnsi="Calibri" w:cs="Calibri"/>
+          <w:sz w:val="24"/>
+          <w:szCs w:val="24"/>
+        </w:rPr>
+      </w:pPr>
+      <w:r>
+        <w:rPr>
+          <w:rFonts w:ascii="Calibri" w:hAnsi="Calibri" w:cs="Calibri"/>
+          <w:noProof/>
+          <w:sz w:val="24"/>
+          <w:szCs w:val="24"/>
+        </w:rPr>
+        <w:drawing>
+          <wp:inline distT="0" distB="0" distL="0" distR="0" wp14:anchorId="2252ABCE" wp14:editId="2C24385D">
+            <wp:extent cx="4820323" cy="3648584"/>
+            <wp:effectExtent l="0" t="0" r="0" b="9525"/>
+            <wp:docPr id="747673130" name="Picture 3" descr="A red and blue squares with white text&#10;&#10;AI-generated content may be incorrect."/>
+            <wp:cNvGraphicFramePr>
+              <a:graphicFrameLocks xmlns:a="http://schemas.openxmlformats.org/drawingml/2006/main" noChangeAspect="1"/>
+            </wp:cNvGraphicFramePr>
+            <a:graphic xmlns:a="http://schemas.openxmlformats.org/drawingml/2006/main">
+              <a:graphicData uri="http://schemas.openxmlformats.org/drawingml/2006/picture">
+                <pic:pic xmlns:pic="http://schemas.openxmlformats.org/drawingml/2006/picture">
+                  <pic:nvPicPr>
+                    <pic:cNvPr id="747673130" name="Picture 3" descr="A red and blue squares with white text&#10;&#10;AI-generated content may be incorrect."/>
+                    <pic:cNvPicPr/>
+                  </pic:nvPicPr>
+                  <pic:blipFill>
+                    <a:blip r:embed="rId6">
+                      <a:extLst>
+                        <a:ext uri="{28A0092B-C50C-407E-A947-70E740481C1C}">
+                          <a14:useLocalDpi xmlns:a14="http://schemas.microsoft.com/office/drawing/2010/main" val="0"/>
+                        </a:ext>
+                      </a:extLst>
+                    </a:blip>
+                    <a:stretch>
+                      <a:fillRect/>
+                    </a:stretch>
+                  </pic:blipFill>
+                  <pic:spPr>
+                    <a:xfrm>
+                      <a:off x="0" y="0"/>
+                      <a:ext cx="4820323" cy="3648584"/>
+                    </a:xfrm>
+                    <a:prstGeom prst="rect">
+                      <a:avLst/>
+                    </a:prstGeom>
+                  </pic:spPr>
+                </pic:pic>
+              </a:graphicData>
+            </a:graphic>
+          </wp:inline>
+        </w:drawing>
+      </w:r>
+    </w:p>
+    <w:p>
+      <w:pPr>
+        <w:rPr>
+          <w:rFonts w:ascii="Calibri" w:hAnsi="Calibri" w:cs="Calibri"/>
+          <w:sz w:val="24"/>
+          <w:szCs w:val="24"/>
+        </w:rPr>
+      </w:pPr>
+      <w:r>
+        <w:rPr>
+          <w:rFonts w:ascii="Calibri" w:hAnsi="Calibri" w:cs="Calibri"/>
+          <w:sz w:val="24"/>
+          <w:szCs w:val="24"/>
+        </w:rPr>
+        <w:t>Figure 3. Correlation matrix between Quantity and UnitPrice showing negligible linear association.</w:t>
+      </w:r>
+    </w:p>
+    <w:p>
+      <w:pPr>
+        <w:rPr>
+          <w:rFonts w:ascii="Calibri" w:hAnsi="Calibri" w:cs="Calibri"/>
+          <w:sz w:val="24"/>
+          <w:szCs w:val="24"/>
+        </w:rPr>
+      </w:pPr>
+      <w:r>
+        <w:rPr>
+          <w:rFonts w:ascii="Calibri" w:hAnsi="Calibri" w:cs="Calibri"/>
+          <w:sz w:val="24"/>
+          <w:szCs w:val="24"/>
+        </w:rPr>
+        <w:lastRenderedPageBreak/>
+        <w:t>The IQR method of outlier detection found 39,627 outliers in unit price and 58,619 outliers in quantity. UnitPrice had a strong right skew (186.51) and Quantity had a moderate left skew (-0.26), according to skewness analysis. Subsequent scaling and transformation decisions were informed by these insights.</w:t>
+      </w:r>
+    </w:p>
+    <w:p>
+      <w:pPr>
+        <w:rPr>
+          <w:rFonts w:ascii="Calibri" w:hAnsi="Calibri" w:cs="Calibri"/>
+          <w:sz w:val="24"/>
+          <w:szCs w:val="24"/>
+        </w:rPr>
+      </w:pPr>
+      <w:r>
+        <w:rPr>
+          <w:rFonts w:ascii="Calibri" w:hAnsi="Calibri" w:cs="Calibri"/>
+          <w:sz w:val="24"/>
+          <w:szCs w:val="24"/>
+        </w:rPr>
+        <w:t>Additionally, all of the features used in the modelling were obtained through feature engineering, guided by exploratory analysis and business intuition. Features such as average days between purchases, total spend per customer, category diversity, and unique products purchased were among them. The target variable, repeat purchase behaviour, was defined at the customer level. If a customer made more than one transaction, they were marked as repeat buyers.</w:t>
+      </w:r>
+      <w:r>
+        <w:rPr>
+          <w:rFonts w:ascii="Calibri" w:hAnsi="Calibri" w:cs="Calibri"/>
+          <w:sz w:val="24"/>
+          <w:szCs w:val="24"/>
+        </w:rPr>
+        <w:t xml:space="preserve"> </w:t>
+      </w:r>
+      <w:r>
+        <w:rPr>
+          <w:rFonts w:ascii="Calibri" w:hAnsi="Calibri" w:cs="Calibri"/>
+          <w:sz w:val="24"/>
+          <w:szCs w:val="24"/>
+        </w:rPr>
+        <w:t>This binary classification setup made it possible to use supervised learning and SHAP and LIME for interpretability.</w:t>
+      </w:r>
+    </w:p>
+    <w:p>
+      <w:pPr>
+        <w:rPr>
+          <w:rFonts w:ascii="Calibri" w:hAnsi="Calibri" w:cs="Calibri"/>
+          <w:sz w:val="24"/>
+          <w:szCs w:val="24"/>
+        </w:rPr>
+      </w:pPr>
     </w:p>
     <w:p/>
     <w:p/>
@@ -1992,13 +2900,24 @@
           <w:szCs w:val="32"/>
         </w:rPr>
       </w:pPr>
-      <w:r>
+    </w:p>
+    <w:p>
+      <w:pPr>
         <w:rPr>
           <w:b/>
           <w:bCs/>
           <w:sz w:val="32"/>
           <w:szCs w:val="32"/>
         </w:rPr>
+      </w:pPr>
+      <w:r>
+        <w:rPr>
+          <w:b/>
+          <w:bCs/>
+          <w:sz w:val="32"/>
+          <w:szCs w:val="32"/>
+        </w:rPr>
+        <w:lastRenderedPageBreak/>
         <w:t>References</w:t>
       </w:r>
     </w:p>
@@ -2018,6 +2937,7 @@
         </w:rPr>
         <w:t xml:space="preserve">Fader, P.S. and Hardie, B.G.S. (2010). Customer-Base Valuation in a Contractual Setting: The Perils of Ignoring Heterogeneity. Marketing Science, 29(1), pp.85–93. </w:t>
       </w:r>
+      <w:proofErr w:type="spellStart"/>
       <w:proofErr w:type="gramStart"/>
       <w:r>
         <w:rPr>
@@ -2025,7 +2945,16 @@
           <w:sz w:val="24"/>
           <w:szCs w:val="24"/>
         </w:rPr>
-        <w:t>doi:https://doi.org/10.1287/mksc.1080.0482</w:t>
+        <w:t>doi:https</w:t>
+      </w:r>
+      <w:proofErr w:type="spellEnd"/>
+      <w:r>
+        <w:rPr>
+          <w:rFonts w:ascii="Calibri" w:hAnsi="Calibri" w:cs="Calibri"/>
+          <w:sz w:val="24"/>
+          <w:szCs w:val="24"/>
+        </w:rPr>
+        <w:t>://doi.org/10.1287/mksc.1080.0482</w:t>
       </w:r>
       <w:proofErr w:type="gramEnd"/>
       <w:r>
@@ -2045,14 +2974,43 @@
           <w:szCs w:val="24"/>
         </w:rPr>
       </w:pPr>
-      <w:r>
-        <w:rPr>
-          <w:rFonts w:ascii="Calibri" w:hAnsi="Calibri" w:cs="Calibri"/>
-          <w:sz w:val="24"/>
-          <w:szCs w:val="24"/>
-        </w:rPr>
-        <w:t xml:space="preserve">Cirqueira, D., Hofer, M., Nedbal, D., Helfert, M. and Bezbradica, M. (2020). Customer Purchase Behavior Prediction in E-commerce: A Conceptual Framework and Research Agenda. New Frontiers in Mining Complex Patterns, pp.119–136. </w:t>
-      </w:r>
+      <w:proofErr w:type="spellStart"/>
+      <w:r>
+        <w:rPr>
+          <w:rFonts w:ascii="Calibri" w:hAnsi="Calibri" w:cs="Calibri"/>
+          <w:sz w:val="24"/>
+          <w:szCs w:val="24"/>
+        </w:rPr>
+        <w:t>Cirqueira</w:t>
+      </w:r>
+      <w:proofErr w:type="spellEnd"/>
+      <w:r>
+        <w:rPr>
+          <w:rFonts w:ascii="Calibri" w:hAnsi="Calibri" w:cs="Calibri"/>
+          <w:sz w:val="24"/>
+          <w:szCs w:val="24"/>
+        </w:rPr>
+        <w:t xml:space="preserve">, D., Hofer, M., Nedbal, D., Helfert, M. and Bezbradica, M. (2020). Customer Purchase </w:t>
+      </w:r>
+      <w:proofErr w:type="spellStart"/>
+      <w:r>
+        <w:rPr>
+          <w:rFonts w:ascii="Calibri" w:hAnsi="Calibri" w:cs="Calibri"/>
+          <w:sz w:val="24"/>
+          <w:szCs w:val="24"/>
+        </w:rPr>
+        <w:t>Behavior</w:t>
+      </w:r>
+      <w:proofErr w:type="spellEnd"/>
+      <w:r>
+        <w:rPr>
+          <w:rFonts w:ascii="Calibri" w:hAnsi="Calibri" w:cs="Calibri"/>
+          <w:sz w:val="24"/>
+          <w:szCs w:val="24"/>
+        </w:rPr>
+        <w:t xml:space="preserve"> Prediction in E-commerce: A Conceptual Framework and Research Agenda. New Frontiers in Mining Complex Patterns, pp.119–136. </w:t>
+      </w:r>
+      <w:proofErr w:type="spellStart"/>
       <w:proofErr w:type="gramStart"/>
       <w:r>
         <w:rPr>
@@ -2060,7 +3018,16 @@
           <w:sz w:val="24"/>
           <w:szCs w:val="24"/>
         </w:rPr>
-        <w:t>doi:https://doi.org/10.1007/978-3-030-48861-1_8</w:t>
+        <w:t>doi:https</w:t>
+      </w:r>
+      <w:proofErr w:type="spellEnd"/>
+      <w:r>
+        <w:rPr>
+          <w:rFonts w:ascii="Calibri" w:hAnsi="Calibri" w:cs="Calibri"/>
+          <w:sz w:val="24"/>
+          <w:szCs w:val="24"/>
+        </w:rPr>
+        <w:t>://doi.org/10.1007/978-3-030-48861-1_8</w:t>
       </w:r>
       <w:proofErr w:type="gramEnd"/>
       <w:r>
@@ -2088,6 +3055,7 @@
         </w:rPr>
         <w:t xml:space="preserve">Jeon, H.G., Kim, C., Lee, J. and Lee, K.C. (2021). Understanding E-Commerce Consumers’ Repeat Purchase Intention: The Role of Trust Transfer and the Moderating Effect of Neuroticism. Frontiers in Psychology, 12. </w:t>
       </w:r>
+      <w:proofErr w:type="spellStart"/>
       <w:proofErr w:type="gramStart"/>
       <w:r>
         <w:rPr>
@@ -2095,7 +3063,16 @@
           <w:sz w:val="24"/>
           <w:szCs w:val="24"/>
         </w:rPr>
-        <w:t>doi:https://doi.org/10.3389/fpsyg.2021.690039</w:t>
+        <w:t>doi:https</w:t>
+      </w:r>
+      <w:proofErr w:type="spellEnd"/>
+      <w:r>
+        <w:rPr>
+          <w:rFonts w:ascii="Calibri" w:hAnsi="Calibri" w:cs="Calibri"/>
+          <w:sz w:val="24"/>
+          <w:szCs w:val="24"/>
+        </w:rPr>
+        <w:t>://doi.org/10.3389/fpsyg.2021.690039</w:t>
       </w:r>
       <w:proofErr w:type="gramEnd"/>
       <w:r>
@@ -2123,6 +3100,7 @@
         </w:rPr>
         <w:t xml:space="preserve">Lundberg, S. and Lee, S.-I. (2017). A Unified Approach to Interpreting Model Predictions. [online] arXiv.org. </w:t>
       </w:r>
+      <w:proofErr w:type="spellStart"/>
       <w:proofErr w:type="gramStart"/>
       <w:r>
         <w:rPr>
@@ -2130,7 +3108,16 @@
           <w:sz w:val="24"/>
           <w:szCs w:val="24"/>
         </w:rPr>
-        <w:t>doi:https://doi.org/10.48550/arXiv.1705.07874</w:t>
+        <w:t>doi:https</w:t>
+      </w:r>
+      <w:proofErr w:type="spellEnd"/>
+      <w:r>
+        <w:rPr>
+          <w:rFonts w:ascii="Calibri" w:hAnsi="Calibri" w:cs="Calibri"/>
+          <w:sz w:val="24"/>
+          <w:szCs w:val="24"/>
+        </w:rPr>
+        <w:t>://doi.org/10.48550/arXiv.1705.07874</w:t>
       </w:r>
       <w:proofErr w:type="gramEnd"/>
       <w:r>
@@ -2173,9 +3160,27 @@
           <w:sz w:val="24"/>
           <w:szCs w:val="24"/>
         </w:rPr>
-        <w:lastRenderedPageBreak/>
-        <w:t xml:space="preserve">Harter, A., Stich, L. and Spann, M. (2024). The Effect of Delivery Time on Repurchase Behavior in Quick Commerce. Journal of Service Research, [online] 28(2). </w:t>
-      </w:r>
+        <w:t xml:space="preserve">Harter, A., Stich, L. and Spann, M. (2024). The Effect of Delivery Time on Repurchase </w:t>
+      </w:r>
+      <w:proofErr w:type="spellStart"/>
+      <w:r>
+        <w:rPr>
+          <w:rFonts w:ascii="Calibri" w:hAnsi="Calibri" w:cs="Calibri"/>
+          <w:sz w:val="24"/>
+          <w:szCs w:val="24"/>
+        </w:rPr>
+        <w:t>Behavior</w:t>
+      </w:r>
+      <w:proofErr w:type="spellEnd"/>
+      <w:r>
+        <w:rPr>
+          <w:rFonts w:ascii="Calibri" w:hAnsi="Calibri" w:cs="Calibri"/>
+          <w:sz w:val="24"/>
+          <w:szCs w:val="24"/>
+        </w:rPr>
+        <w:t xml:space="preserve"> in Quick Commerce. Journal of Service Research, [online] 28(2). </w:t>
+      </w:r>
+      <w:proofErr w:type="spellStart"/>
       <w:proofErr w:type="gramStart"/>
       <w:r>
         <w:rPr>
@@ -2183,7 +3188,16 @@
           <w:sz w:val="24"/>
           <w:szCs w:val="24"/>
         </w:rPr>
-        <w:t>doi:https://doi.org/10.1177/10946705241236961</w:t>
+        <w:t>doi:https</w:t>
+      </w:r>
+      <w:proofErr w:type="spellEnd"/>
+      <w:r>
+        <w:rPr>
+          <w:rFonts w:ascii="Calibri" w:hAnsi="Calibri" w:cs="Calibri"/>
+          <w:sz w:val="24"/>
+          <w:szCs w:val="24"/>
+        </w:rPr>
+        <w:t>://doi.org/10.1177/10946705241236961</w:t>
       </w:r>
       <w:proofErr w:type="gramEnd"/>
       <w:r>
@@ -2209,8 +3223,27 @@
           <w:sz w:val="24"/>
           <w:szCs w:val="24"/>
         </w:rPr>
-        <w:t xml:space="preserve">Henninger, M. and Strobl, C. (2024). Interpreting machine learning predictions with LIME and Shapley values: theoretical insights, challenges, and meaningful interpretations. Behaviormetrika, 52(1), pp.45–75. </w:t>
-      </w:r>
+        <w:t xml:space="preserve">Henninger, M. and Strobl, C. (2024). Interpreting machine learning predictions with LIME and Shapley values: theoretical insights, challenges, and meaningful interpretations. </w:t>
+      </w:r>
+      <w:proofErr w:type="spellStart"/>
+      <w:r>
+        <w:rPr>
+          <w:rFonts w:ascii="Calibri" w:hAnsi="Calibri" w:cs="Calibri"/>
+          <w:sz w:val="24"/>
+          <w:szCs w:val="24"/>
+        </w:rPr>
+        <w:t>Behaviormetrika</w:t>
+      </w:r>
+      <w:proofErr w:type="spellEnd"/>
+      <w:r>
+        <w:rPr>
+          <w:rFonts w:ascii="Calibri" w:hAnsi="Calibri" w:cs="Calibri"/>
+          <w:sz w:val="24"/>
+          <w:szCs w:val="24"/>
+        </w:rPr>
+        <w:t xml:space="preserve">, 52(1), pp.45–75. </w:t>
+      </w:r>
+      <w:proofErr w:type="spellStart"/>
       <w:proofErr w:type="gramStart"/>
       <w:r>
         <w:rPr>
@@ -2218,7 +3251,16 @@
           <w:sz w:val="24"/>
           <w:szCs w:val="24"/>
         </w:rPr>
-        <w:t>doi:https://doi.org/10.1007/s41237-024-00253-2</w:t>
+        <w:t>doi:https</w:t>
+      </w:r>
+      <w:proofErr w:type="spellEnd"/>
+      <w:r>
+        <w:rPr>
+          <w:rFonts w:ascii="Calibri" w:hAnsi="Calibri" w:cs="Calibri"/>
+          <w:sz w:val="24"/>
+          <w:szCs w:val="24"/>
+        </w:rPr>
+        <w:t>://doi.org/10.1007/s41237-024-00253-2</w:t>
       </w:r>
       <w:proofErr w:type="gramEnd"/>
       <w:r>

</xml_diff>

<commit_message>
Add Data Preparation chapter
</commit_message>
<xml_diff>
--- a/CA3-Capstone.docx
+++ b/CA3-Capstone.docx
@@ -79,25 +79,7 @@
           <w:sz w:val="24"/>
           <w:szCs w:val="24"/>
         </w:rPr>
-        <w:t xml:space="preserve">Retention has become a strategic priority in the quickly changing e-commerce industry, where customer acquisition costs are increasing and consumer expectations are changing. According to Fader and Hardie (2009) and </w:t>
-      </w:r>
-      <w:proofErr w:type="spellStart"/>
-      <w:r>
-        <w:rPr>
-          <w:rFonts w:ascii="Calibri" w:hAnsi="Calibri" w:cs="Calibri"/>
-          <w:sz w:val="24"/>
-          <w:szCs w:val="24"/>
-        </w:rPr>
-        <w:t>Cirqueira</w:t>
-      </w:r>
-      <w:proofErr w:type="spellEnd"/>
-      <w:r>
-        <w:rPr>
-          <w:rFonts w:ascii="Calibri" w:hAnsi="Calibri" w:cs="Calibri"/>
-          <w:sz w:val="24"/>
-          <w:szCs w:val="24"/>
-        </w:rPr>
-        <w:t xml:space="preserve"> et al. (2021), repeat customers are more likely to spend more, interact more frequently, and respond favourably to tailored marketing campaigns.</w:t>
+        <w:t>Retention has become a strategic priority in the quickly changing e-commerce industry, where customer acquisition costs are increasing and consumer expectations are changing. According to Fader and Hardie (2009) and Cirqueira et al. (2021), repeat customers are more likely to spend more, interact more frequently, and respond favourably to tailored marketing campaigns.</w:t>
       </w:r>
       <w:r>
         <w:rPr>
@@ -203,54 +185,8 @@
           <w:sz w:val="24"/>
           <w:szCs w:val="24"/>
         </w:rPr>
-        <w:t>To explain both global feature importance and local predictions, the project uses SHAP (</w:t>
-      </w:r>
-      <w:proofErr w:type="spellStart"/>
-      <w:r>
-        <w:rPr>
-          <w:rFonts w:ascii="Calibri" w:hAnsi="Calibri" w:cs="Calibri"/>
-          <w:sz w:val="24"/>
-          <w:szCs w:val="24"/>
-        </w:rPr>
-        <w:t>SHapley</w:t>
-      </w:r>
-      <w:proofErr w:type="spellEnd"/>
-      <w:r>
-        <w:rPr>
-          <w:rFonts w:ascii="Calibri" w:hAnsi="Calibri" w:cs="Calibri"/>
-          <w:sz w:val="24"/>
-          <w:szCs w:val="24"/>
-        </w:rPr>
-        <w:t xml:space="preserve"> Additive </w:t>
-      </w:r>
-      <w:proofErr w:type="spellStart"/>
-      <w:r>
-        <w:rPr>
-          <w:rFonts w:ascii="Calibri" w:hAnsi="Calibri" w:cs="Calibri"/>
-          <w:sz w:val="24"/>
-          <w:szCs w:val="24"/>
-        </w:rPr>
-        <w:t>exPlanations</w:t>
-      </w:r>
-      <w:proofErr w:type="spellEnd"/>
-      <w:r>
-        <w:rPr>
-          <w:rFonts w:ascii="Calibri" w:hAnsi="Calibri" w:cs="Calibri"/>
-          <w:sz w:val="24"/>
-          <w:szCs w:val="24"/>
-        </w:rPr>
-        <w:t xml:space="preserve">) in addition to high-performing algorithms including Logistic Regression, Decision Tree, Random Forest, and </w:t>
-      </w:r>
-      <w:proofErr w:type="spellStart"/>
-      <w:r>
-        <w:rPr>
-          <w:rFonts w:ascii="Calibri" w:hAnsi="Calibri" w:cs="Calibri"/>
-          <w:sz w:val="24"/>
-          <w:szCs w:val="24"/>
-        </w:rPr>
-        <w:t>XGBoost</w:t>
-      </w:r>
-      <w:proofErr w:type="spellEnd"/>
+        <w:t>To explain both global feature importance and local predictions, the project uses SHAP (SHapley Additive exPlanations) in addition to high-performing algorithms including Logistic Regression, Decision Tree, Random Forest, and XGBoost</w:t>
+      </w:r>
       <w:r>
         <w:rPr>
           <w:rFonts w:ascii="Calibri" w:hAnsi="Calibri" w:cs="Calibri"/>
@@ -338,25 +274,7 @@
           <w:sz w:val="24"/>
           <w:szCs w:val="24"/>
         </w:rPr>
-        <w:t>can effectively differentiate between one-time and repeat buyers (</w:t>
-      </w:r>
-      <w:proofErr w:type="spellStart"/>
-      <w:r>
-        <w:rPr>
-          <w:rFonts w:ascii="Calibri" w:hAnsi="Calibri" w:cs="Calibri"/>
-          <w:sz w:val="24"/>
-          <w:szCs w:val="24"/>
-        </w:rPr>
-        <w:t>Cirqueira</w:t>
-      </w:r>
-      <w:proofErr w:type="spellEnd"/>
-      <w:r>
-        <w:rPr>
-          <w:rFonts w:ascii="Calibri" w:hAnsi="Calibri" w:cs="Calibri"/>
-          <w:sz w:val="24"/>
-          <w:szCs w:val="24"/>
-        </w:rPr>
-        <w:t xml:space="preserve"> et al., 2021).</w:t>
+        <w:t>can effectively differentiate between one-time and repeat buyers (Cirqueira et al., 2021).</w:t>
       </w:r>
     </w:p>
     <w:p>
@@ -549,25 +467,7 @@
           <w:sz w:val="24"/>
           <w:szCs w:val="24"/>
         </w:rPr>
-        <w:t xml:space="preserve">To develop a supervised machine learning model that predicts repeat purchase </w:t>
-      </w:r>
-      <w:proofErr w:type="spellStart"/>
-      <w:r>
-        <w:rPr>
-          <w:rFonts w:ascii="Calibri" w:hAnsi="Calibri" w:cs="Calibri"/>
-          <w:sz w:val="24"/>
-          <w:szCs w:val="24"/>
-        </w:rPr>
-        <w:t>behavior</w:t>
-      </w:r>
-      <w:proofErr w:type="spellEnd"/>
-      <w:r>
-        <w:rPr>
-          <w:rFonts w:ascii="Calibri" w:hAnsi="Calibri" w:cs="Calibri"/>
-          <w:sz w:val="24"/>
-          <w:szCs w:val="24"/>
-        </w:rPr>
-        <w:t xml:space="preserve"> using transactional features.</w:t>
+        <w:t>To develop a supervised machine learning model that predicts repeat purchase behavior using transactional features.</w:t>
       </w:r>
     </w:p>
     <w:p>
@@ -592,25 +492,7 @@
           <w:sz w:val="24"/>
           <w:szCs w:val="24"/>
         </w:rPr>
-        <w:t xml:space="preserve">To evaluate and compare the performance of multiple classification algorithms (e.g., Random Forest, </w:t>
-      </w:r>
-      <w:proofErr w:type="spellStart"/>
-      <w:r>
-        <w:rPr>
-          <w:rFonts w:ascii="Calibri" w:hAnsi="Calibri" w:cs="Calibri"/>
-          <w:sz w:val="24"/>
-          <w:szCs w:val="24"/>
-        </w:rPr>
-        <w:t>XGBoost</w:t>
-      </w:r>
-      <w:proofErr w:type="spellEnd"/>
-      <w:r>
-        <w:rPr>
-          <w:rFonts w:ascii="Calibri" w:hAnsi="Calibri" w:cs="Calibri"/>
-          <w:sz w:val="24"/>
-          <w:szCs w:val="24"/>
-        </w:rPr>
-        <w:t>).</w:t>
+        <w:t>To evaluate and compare the performance of multiple classification algorithms (e.g., Random Forest, XGBoost).</w:t>
       </w:r>
     </w:p>
     <w:p>
@@ -889,25 +771,7 @@
           <w:szCs w:val="24"/>
         </w:rPr>
         <w:lastRenderedPageBreak/>
-        <w:t>essential to customer-base valuation models because they are more predictable and cost-effective to serve, according to Fader and Hardie (2009). Businesses are focussing on individualized prediction instead of broad segmentation as acquisition costs increase and consumer behaviour becomes more fragmented (</w:t>
-      </w:r>
-      <w:proofErr w:type="spellStart"/>
-      <w:r>
-        <w:rPr>
-          <w:rFonts w:ascii="Calibri" w:hAnsi="Calibri" w:cs="Calibri"/>
-          <w:sz w:val="24"/>
-          <w:szCs w:val="24"/>
-        </w:rPr>
-        <w:t>Cirqueira</w:t>
-      </w:r>
-      <w:proofErr w:type="spellEnd"/>
-      <w:r>
-        <w:rPr>
-          <w:rFonts w:ascii="Calibri" w:hAnsi="Calibri" w:cs="Calibri"/>
-          <w:sz w:val="24"/>
-          <w:szCs w:val="24"/>
-        </w:rPr>
-        <w:t xml:space="preserve"> et al., 2021).</w:t>
+        <w:t>essential to customer-base valuation models because they are more predictable and cost-effective to serve, according to Fader and Hardie (2009). Businesses are focussing on individualized prediction instead of broad segmentation as acquisition costs increase and consumer behaviour becomes more fragmented (Cirqueira et al., 2021).</w:t>
       </w:r>
     </w:p>
     <w:p>
@@ -973,25 +837,7 @@
           <w:sz w:val="24"/>
           <w:szCs w:val="24"/>
         </w:rPr>
-        <w:t xml:space="preserve">A scalable alternative is provided by predictive analytics. Using transactional data like frequency, recency, and monetary value, supervised machine learning models can predict the likelihood of repeat purchases. In order to accommodate the data limitations of numerous e-commerce platforms, </w:t>
-      </w:r>
-      <w:proofErr w:type="spellStart"/>
-      <w:r>
-        <w:rPr>
-          <w:rFonts w:ascii="Calibri" w:hAnsi="Calibri" w:cs="Calibri"/>
-          <w:sz w:val="24"/>
-          <w:szCs w:val="24"/>
-        </w:rPr>
-        <w:t>Cirqueira</w:t>
-      </w:r>
-      <w:proofErr w:type="spellEnd"/>
-      <w:r>
-        <w:rPr>
-          <w:rFonts w:ascii="Calibri" w:hAnsi="Calibri" w:cs="Calibri"/>
-          <w:sz w:val="24"/>
-          <w:szCs w:val="24"/>
-        </w:rPr>
-        <w:t xml:space="preserve"> et al. (2021) offer a conceptual framework for predicting purchase behaviour that prioritises behavioural features over demographic ones. A larger trend in data-driven customer strategy is seen in this move from descriptive segmentation to predictive modelling.</w:t>
+        <w:t>A scalable alternative is provided by predictive analytics. Using transactional data like frequency, recency, and monetary value, supervised machine learning models can predict the likelihood of repeat purchases. In order to accommodate the data limitations of numerous e-commerce platforms, Cirqueira et al. (2021) offer a conceptual framework for predicting purchase behaviour that prioritises behavioural features over demographic ones. A larger trend in data-driven customer strategy is seen in this move from descriptive segmentation to predictive modelling.</w:t>
       </w:r>
     </w:p>
     <w:p>
@@ -1067,25 +913,7 @@
           <w:sz w:val="24"/>
           <w:szCs w:val="24"/>
         </w:rPr>
-        <w:t>Building on this basis, SHAP (</w:t>
-      </w:r>
-      <w:proofErr w:type="spellStart"/>
-      <w:r>
-        <w:rPr>
-          <w:rFonts w:ascii="Calibri" w:hAnsi="Calibri" w:cs="Calibri"/>
-          <w:sz w:val="24"/>
-          <w:szCs w:val="24"/>
-        </w:rPr>
-        <w:t>SHapley</w:t>
-      </w:r>
-      <w:proofErr w:type="spellEnd"/>
-      <w:r>
-        <w:rPr>
-          <w:rFonts w:ascii="Calibri" w:hAnsi="Calibri" w:cs="Calibri"/>
-          <w:sz w:val="24"/>
-          <w:szCs w:val="24"/>
-        </w:rPr>
-        <w:t xml:space="preserve"> Additive reasons) provides a more theoretically grounded method that delivers both local explanations for specific predictions and global insights into feature importance (Lundberg and Lee, 2017; Molnar, 2022). In contrast to LIME, SHAP is based on cooperative game theory, which ensures consistency and fairness in the computation of feature contributions (Lundberg and Lee, 2017).</w:t>
+        <w:t>Building on this basis, SHAP (SHapley Additive reasons) provides a more theoretically grounded method that delivers both local explanations for specific predictions and global insights into feature importance (Lundberg and Lee, 2017; Molnar, 2022). In contrast to LIME, SHAP is based on cooperative game theory, which ensures consistency and fairness in the computation of feature contributions (Lundberg and Lee, 2017).</w:t>
       </w:r>
     </w:p>
     <w:p>
@@ -1202,44 +1030,16 @@
           <w:sz w:val="24"/>
           <w:szCs w:val="24"/>
         </w:rPr>
-        <w:t xml:space="preserve">There are still a number of gaps in the current body of study despite these contributions. Many studies still use segmentation methods like rule-based classification or demographic clustering, which are either static or overly simplistic (Jeon et al., 2021; </w:t>
-      </w:r>
-      <w:proofErr w:type="spellStart"/>
-      <w:r>
-        <w:rPr>
-          <w:rFonts w:ascii="Calibri" w:hAnsi="Calibri" w:cs="Calibri"/>
-          <w:sz w:val="24"/>
-          <w:szCs w:val="24"/>
-        </w:rPr>
-        <w:t>Cirqueira</w:t>
-      </w:r>
-      <w:proofErr w:type="spellEnd"/>
-      <w:r>
-        <w:rPr>
-          <w:rFonts w:ascii="Calibri" w:hAnsi="Calibri" w:cs="Calibri"/>
-          <w:sz w:val="24"/>
-          <w:szCs w:val="24"/>
-        </w:rPr>
-        <w:t xml:space="preserve"> et al., 2021). The temporal and behavioural complexity of online buying, where consumer preferences and engagement patterns change quickly, is frequently missed by these methods. Such segmentation may result in misclassification and </w:t>
-      </w:r>
-      <w:r>
-        <w:rPr>
-          <w:rFonts w:ascii="Calibri" w:hAnsi="Calibri" w:cs="Calibri"/>
-          <w:sz w:val="24"/>
-          <w:szCs w:val="24"/>
-        </w:rPr>
-        <w:t xml:space="preserve">missed </w:t>
-      </w:r>
-      <w:proofErr w:type="spellStart"/>
-      <w:r>
-        <w:rPr>
-          <w:rFonts w:ascii="Calibri" w:hAnsi="Calibri" w:cs="Calibri"/>
-          <w:sz w:val="24"/>
-          <w:szCs w:val="24"/>
-        </w:rPr>
-        <w:t>oppertunities</w:t>
-      </w:r>
-      <w:proofErr w:type="spellEnd"/>
+        <w:t xml:space="preserve">There are still a number of gaps in the current body of study despite these contributions. Many studies still use segmentation methods like rule-based classification or demographic clustering, which are either static or overly simplistic (Jeon et al., 2021; Cirqueira et al., 2021). The temporal and behavioural complexity of online buying, where consumer preferences and engagement patterns change quickly, is frequently missed by these methods. Such segmentation may result in misclassification and </w:t>
+      </w:r>
+      <w:r>
+        <w:rPr>
+          <w:rFonts w:ascii="Calibri" w:hAnsi="Calibri" w:cs="Calibri"/>
+          <w:sz w:val="24"/>
+          <w:szCs w:val="24"/>
+        </w:rPr>
+        <w:t>missed oppertunities</w:t>
+      </w:r>
       <w:r>
         <w:rPr>
           <w:rFonts w:ascii="Calibri" w:hAnsi="Calibri" w:cs="Calibri"/>
@@ -1271,25 +1071,7 @@
           <w:sz w:val="24"/>
           <w:szCs w:val="24"/>
         </w:rPr>
-        <w:t xml:space="preserve">Neural networks and </w:t>
-      </w:r>
-      <w:proofErr w:type="spellStart"/>
-      <w:r>
-        <w:rPr>
-          <w:rFonts w:ascii="Calibri" w:hAnsi="Calibri" w:cs="Calibri"/>
-          <w:sz w:val="24"/>
-          <w:szCs w:val="24"/>
-        </w:rPr>
-        <w:t>XGBoost</w:t>
-      </w:r>
-      <w:proofErr w:type="spellEnd"/>
-      <w:r>
-        <w:rPr>
-          <w:rFonts w:ascii="Calibri" w:hAnsi="Calibri" w:cs="Calibri"/>
-          <w:sz w:val="24"/>
-          <w:szCs w:val="24"/>
-        </w:rPr>
-        <w:t xml:space="preserve"> are examples of black-box models that are commonly used without giving enough thought to how non-technical stakeholders might comprehend and use their outputs (Henninger &amp; Strobl, 2024).</w:t>
+        <w:t>Neural networks and XGBoost are examples of black-box models that are commonly used without giving enough thought to how non-technical stakeholders might comprehend and use their outputs (Henninger &amp; Strobl, 2024).</w:t>
       </w:r>
       <w:r>
         <w:rPr>
@@ -1410,25 +1192,7 @@
           <w:sz w:val="24"/>
           <w:szCs w:val="24"/>
         </w:rPr>
-        <w:t>(</w:t>
-      </w:r>
-      <w:proofErr w:type="spellStart"/>
-      <w:r>
-        <w:rPr>
-          <w:rFonts w:ascii="Calibri" w:hAnsi="Calibri" w:cs="Calibri"/>
-          <w:sz w:val="24"/>
-          <w:szCs w:val="24"/>
-        </w:rPr>
-        <w:t>Visani</w:t>
-      </w:r>
-      <w:proofErr w:type="spellEnd"/>
-      <w:r>
-        <w:rPr>
-          <w:rFonts w:ascii="Calibri" w:hAnsi="Calibri" w:cs="Calibri"/>
-          <w:sz w:val="24"/>
-          <w:szCs w:val="24"/>
-        </w:rPr>
-        <w:t xml:space="preserve"> et al., 2020)</w:t>
+        <w:t>(Visani et al., 2020)</w:t>
       </w:r>
       <w:r>
         <w:rPr>
@@ -1559,60 +1323,24 @@
           <w:sz w:val="24"/>
           <w:szCs w:val="24"/>
         </w:rPr>
-        <w:t>By developing a supervised machine learning framework especially designed to predict repeat purchases in e-commerce, this study fills in the gaps that have been found. It uses transactional variables, like purchase frequency, recency, and monetary value, to capture scalable and dynamic behavioural signals, in contrast to segmentation-based methods (</w:t>
-      </w:r>
-      <w:proofErr w:type="spellStart"/>
-      <w:r>
-        <w:rPr>
-          <w:rFonts w:ascii="Calibri" w:hAnsi="Calibri" w:cs="Calibri"/>
-          <w:sz w:val="24"/>
-          <w:szCs w:val="24"/>
-        </w:rPr>
-        <w:t>Cirqueira</w:t>
-      </w:r>
-      <w:proofErr w:type="spellEnd"/>
-      <w:r>
-        <w:rPr>
-          <w:rFonts w:ascii="Calibri" w:hAnsi="Calibri" w:cs="Calibri"/>
-          <w:sz w:val="24"/>
-          <w:szCs w:val="24"/>
-        </w:rPr>
-        <w:t xml:space="preserve"> et al., 2021). This makes it possible to target high-value customers more precisely and encourages proactive retention strategies.</w:t>
-      </w:r>
-    </w:p>
-    <w:p>
-      <w:pPr>
-        <w:rPr>
-          <w:rFonts w:ascii="Calibri" w:hAnsi="Calibri" w:cs="Calibri"/>
-          <w:sz w:val="24"/>
-          <w:szCs w:val="24"/>
-        </w:rPr>
-      </w:pPr>
-      <w:r>
-        <w:rPr>
-          <w:rFonts w:ascii="Calibri" w:hAnsi="Calibri" w:cs="Calibri"/>
-          <w:sz w:val="24"/>
-          <w:szCs w:val="24"/>
-        </w:rPr>
-        <w:t xml:space="preserve">The study evaluates several classification techniques, such as </w:t>
-      </w:r>
-      <w:proofErr w:type="spellStart"/>
-      <w:r>
-        <w:rPr>
-          <w:rFonts w:ascii="Calibri" w:hAnsi="Calibri" w:cs="Calibri"/>
-          <w:sz w:val="24"/>
-          <w:szCs w:val="24"/>
-        </w:rPr>
-        <w:t>XGBoost</w:t>
-      </w:r>
-      <w:proofErr w:type="spellEnd"/>
-      <w:r>
-        <w:rPr>
-          <w:rFonts w:ascii="Calibri" w:hAnsi="Calibri" w:cs="Calibri"/>
-          <w:sz w:val="24"/>
-          <w:szCs w:val="24"/>
-        </w:rPr>
-        <w:t>, Random Forest, Decision Tree, and Logistic Regression</w:t>
+        <w:t>By developing a supervised machine learning framework especially designed to predict repeat purchases in e-commerce, this study fills in the gaps that have been found. It uses transactional variables, like purchase frequency, recency, and monetary value, to capture scalable and dynamic behavioural signals, in contrast to segmentation-based methods (Cirqueira et al., 2021). This makes it possible to target high-value customers more precisely and encourages proactive retention strategies.</w:t>
+      </w:r>
+    </w:p>
+    <w:p>
+      <w:pPr>
+        <w:rPr>
+          <w:rFonts w:ascii="Calibri" w:hAnsi="Calibri" w:cs="Calibri"/>
+          <w:sz w:val="24"/>
+          <w:szCs w:val="24"/>
+        </w:rPr>
+      </w:pPr>
+      <w:r>
+        <w:rPr>
+          <w:rFonts w:ascii="Calibri" w:hAnsi="Calibri" w:cs="Calibri"/>
+          <w:sz w:val="24"/>
+          <w:szCs w:val="24"/>
+        </w:rPr>
+        <w:t>The study evaluates several classification techniques, such as XGBoost, Random Forest, Decision Tree, and Logistic Regression</w:t>
       </w:r>
       <w:r>
         <w:t xml:space="preserve"> </w:t>
@@ -1892,61 +1620,7 @@
           <w:sz w:val="24"/>
           <w:szCs w:val="24"/>
         </w:rPr>
-        <w:t xml:space="preserve">Exploratory analysis of anonymised transactional records was carried out during the data understanding step. </w:t>
-      </w:r>
-      <w:proofErr w:type="spellStart"/>
-      <w:r>
-        <w:rPr>
-          <w:rFonts w:ascii="Calibri" w:hAnsi="Calibri" w:cs="Calibri"/>
-          <w:sz w:val="24"/>
-          <w:szCs w:val="24"/>
-        </w:rPr>
-        <w:t>Avg_days_between_purchases</w:t>
-      </w:r>
-      <w:proofErr w:type="spellEnd"/>
-      <w:r>
-        <w:rPr>
-          <w:rFonts w:ascii="Calibri" w:hAnsi="Calibri" w:cs="Calibri"/>
-          <w:sz w:val="24"/>
-          <w:szCs w:val="24"/>
-        </w:rPr>
-        <w:t xml:space="preserve">, </w:t>
-      </w:r>
-      <w:proofErr w:type="spellStart"/>
-      <w:r>
-        <w:rPr>
-          <w:rFonts w:ascii="Calibri" w:hAnsi="Calibri" w:cs="Calibri"/>
-          <w:sz w:val="24"/>
-          <w:szCs w:val="24"/>
-        </w:rPr>
-        <w:t>total_spend_per_customer</w:t>
-      </w:r>
-      <w:proofErr w:type="spellEnd"/>
-      <w:r>
-        <w:rPr>
-          <w:rFonts w:ascii="Calibri" w:hAnsi="Calibri" w:cs="Calibri"/>
-          <w:sz w:val="24"/>
-          <w:szCs w:val="24"/>
-        </w:rPr>
-        <w:t xml:space="preserve">, and </w:t>
-      </w:r>
-      <w:proofErr w:type="spellStart"/>
-      <w:r>
-        <w:rPr>
-          <w:rFonts w:ascii="Calibri" w:hAnsi="Calibri" w:cs="Calibri"/>
-          <w:sz w:val="24"/>
-          <w:szCs w:val="24"/>
-        </w:rPr>
-        <w:t>category_diversity</w:t>
-      </w:r>
-      <w:proofErr w:type="spellEnd"/>
-      <w:r>
-        <w:rPr>
-          <w:rFonts w:ascii="Calibri" w:hAnsi="Calibri" w:cs="Calibri"/>
-          <w:sz w:val="24"/>
-          <w:szCs w:val="24"/>
-        </w:rPr>
-        <w:t xml:space="preserve"> are important behavioural features that were found to be possibly predictive. To guide preprocessing choices, descriptive statistics, class imbalance, and missingness patterns were evaluated.</w:t>
+        <w:t>Exploratory analysis of anonymised transactional records was carried out during the data understanding step. Avg_days_between_purchases, total_spend_per_customer, and category_diversity are important behavioural features that were found to be possibly predictive. To guide preprocessing choices, descriptive statistics, class imbalance, and missingness patterns were evaluated.</w:t>
       </w:r>
     </w:p>
     <w:p>
@@ -2037,43 +1711,7 @@
           <w:szCs w:val="24"/>
         </w:rPr>
         <w:lastRenderedPageBreak/>
-        <w:t xml:space="preserve">Four classifiers such as Logistic Regression, Decision Tree, Random Forest, and </w:t>
-      </w:r>
-      <w:proofErr w:type="spellStart"/>
-      <w:r>
-        <w:rPr>
-          <w:rFonts w:ascii="Calibri" w:hAnsi="Calibri" w:cs="Calibri"/>
-          <w:sz w:val="24"/>
-          <w:szCs w:val="24"/>
-        </w:rPr>
-        <w:t>XGBoost</w:t>
-      </w:r>
-      <w:proofErr w:type="spellEnd"/>
-      <w:r>
-        <w:rPr>
-          <w:rFonts w:ascii="Calibri" w:hAnsi="Calibri" w:cs="Calibri"/>
-          <w:sz w:val="24"/>
-          <w:szCs w:val="24"/>
-        </w:rPr>
-        <w:t xml:space="preserve"> were benchmarked throughout the modelling phase. </w:t>
-      </w:r>
-      <w:proofErr w:type="spellStart"/>
-      <w:r>
-        <w:rPr>
-          <w:rFonts w:ascii="Calibri" w:hAnsi="Calibri" w:cs="Calibri"/>
-          <w:sz w:val="24"/>
-          <w:szCs w:val="24"/>
-        </w:rPr>
-        <w:t>GridSearchCV</w:t>
-      </w:r>
-      <w:proofErr w:type="spellEnd"/>
-      <w:r>
-        <w:rPr>
-          <w:rFonts w:ascii="Calibri" w:hAnsi="Calibri" w:cs="Calibri"/>
-          <w:sz w:val="24"/>
-          <w:szCs w:val="24"/>
-        </w:rPr>
-        <w:t xml:space="preserve"> was applied to tune hyperparameters using F1-score as the main metric and 5-fold cross-validation. With an F1-score of 0.988 and ROC-AUC of 0.991, the Decision Tree was ultimately chosen for final implementation because it balanced performance and interpretability.</w:t>
+        <w:t>Four classifiers such as Logistic Regression, Decision Tree, Random Forest, and XGBoost were benchmarked throughout the modelling phase. GridSearchCV was applied to tune hyperparameters using F1-score as the main metric and 5-fold cross-validation. With an F1-score of 0.988 and ROC-AUC of 0.991, the Decision Tree was ultimately chosen for final implementation because it balanced performance and interpretability.</w:t>
       </w:r>
     </w:p>
     <w:p>
@@ -2173,23 +1811,13 @@
           <w:szCs w:val="24"/>
         </w:rPr>
       </w:pPr>
-      <w:proofErr w:type="spellStart"/>
-      <w:r>
-        <w:rPr>
-          <w:rFonts w:ascii="Calibri" w:hAnsi="Calibri" w:cs="Calibri"/>
-          <w:sz w:val="24"/>
-          <w:szCs w:val="24"/>
-        </w:rPr>
-        <w:t>Jupyter</w:t>
-      </w:r>
-      <w:proofErr w:type="spellEnd"/>
-      <w:r>
-        <w:rPr>
-          <w:rFonts w:ascii="Calibri" w:hAnsi="Calibri" w:cs="Calibri"/>
-          <w:sz w:val="24"/>
-          <w:szCs w:val="24"/>
-        </w:rPr>
-        <w:t xml:space="preserve"> Notebook was used to implement this project in Python, including iterative development, inline visualization, and transparent documentation.</w:t>
+      <w:r>
+        <w:rPr>
+          <w:rFonts w:ascii="Calibri" w:hAnsi="Calibri" w:cs="Calibri"/>
+          <w:sz w:val="24"/>
+          <w:szCs w:val="24"/>
+        </w:rPr>
+        <w:t>Jupyter Notebook was used to implement this project in Python, including iterative development, inline visualization, and transparent documentation.</w:t>
       </w:r>
       <w:r>
         <w:rPr>
@@ -2222,43 +1850,7 @@
           <w:sz w:val="24"/>
           <w:szCs w:val="24"/>
         </w:rPr>
-        <w:t xml:space="preserve">Scikit-learn was used to develop baseline models such Random Forest, Decision Tree, and Logistic Regression, Seaborn and matplotlib were used for visual diagnostics, and pandas and NumPy were used for data manipulation. A comparison of </w:t>
-      </w:r>
-      <w:proofErr w:type="spellStart"/>
-      <w:r>
-        <w:rPr>
-          <w:rFonts w:ascii="Calibri" w:hAnsi="Calibri" w:cs="Calibri"/>
-          <w:sz w:val="24"/>
-          <w:szCs w:val="24"/>
-        </w:rPr>
-        <w:t>XGBoost's</w:t>
-      </w:r>
-      <w:proofErr w:type="spellEnd"/>
-      <w:r>
-        <w:rPr>
-          <w:rFonts w:ascii="Calibri" w:hAnsi="Calibri" w:cs="Calibri"/>
-          <w:sz w:val="24"/>
-          <w:szCs w:val="24"/>
-        </w:rPr>
-        <w:t xml:space="preserve"> performance was also evaluated. Every model was assessed using precision, recall, F1-score, and ROC-AUC after being trained on a SMOTE-balanced dataset. </w:t>
-      </w:r>
-      <w:proofErr w:type="spellStart"/>
-      <w:r>
-        <w:rPr>
-          <w:rFonts w:ascii="Calibri" w:hAnsi="Calibri" w:cs="Calibri"/>
-          <w:sz w:val="24"/>
-          <w:szCs w:val="24"/>
-        </w:rPr>
-        <w:t>GridSearchCV</w:t>
-      </w:r>
-      <w:proofErr w:type="spellEnd"/>
-      <w:r>
-        <w:rPr>
-          <w:rFonts w:ascii="Calibri" w:hAnsi="Calibri" w:cs="Calibri"/>
-          <w:sz w:val="24"/>
-          <w:szCs w:val="24"/>
-        </w:rPr>
-        <w:t xml:space="preserve"> was used for hyperparameter tuning, and a tuned Decision Tree classifier was chosen as the final model based on its balanced interpretability and performance.</w:t>
+        <w:t>Scikit-learn was used to develop baseline models such Random Forest, Decision Tree, and Logistic Regression, Seaborn and matplotlib were used for visual diagnostics, and pandas and NumPy were used for data manipulation. A comparison of XGBoost's performance was also evaluated. Every model was assessed using precision, recall, F1-score, and ROC-AUC after being trained on a SMOTE-balanced dataset. GridSearchCV was used for hyperparameter tuning, and a tuned Decision Tree classifier was chosen as the final model based on its balanced interpretability and performance.</w:t>
       </w:r>
     </w:p>
     <w:p>
@@ -2291,25 +1883,7 @@
           <w:sz w:val="24"/>
           <w:szCs w:val="24"/>
         </w:rPr>
-        <w:t xml:space="preserve">To produce local explanations, </w:t>
-      </w:r>
-      <w:proofErr w:type="spellStart"/>
-      <w:r>
-        <w:rPr>
-          <w:rFonts w:ascii="Calibri" w:hAnsi="Calibri" w:cs="Calibri"/>
-          <w:sz w:val="24"/>
-          <w:szCs w:val="24"/>
-        </w:rPr>
-        <w:t>LIMETabularExplainer</w:t>
-      </w:r>
-      <w:proofErr w:type="spellEnd"/>
-      <w:r>
-        <w:rPr>
-          <w:rFonts w:ascii="Calibri" w:hAnsi="Calibri" w:cs="Calibri"/>
-          <w:sz w:val="24"/>
-          <w:szCs w:val="24"/>
-        </w:rPr>
-        <w:t xml:space="preserve"> was used on three strategic test cases such as correctly classified, misclassified and, edge case. Class-specific and global feature importance plots, including waterfall charts and aggregated rankings, were created using SHAP. Transparent communication of model behaviour to non-technical stakeholders was made possible by these technologies.</w:t>
+        <w:t>To produce local explanations, LIMETabularExplainer was used on three strategic test cases such as correctly classified, misclassified and, edge case. Class-specific and global feature importance plots, including waterfall charts and aggregated rankings, were created using SHAP. Transparent communication of model behaviour to non-technical stakeholders was made possible by these technologies.</w:t>
       </w:r>
     </w:p>
     <w:p>
@@ -2400,25 +1974,7 @@
           <w:sz w:val="24"/>
           <w:szCs w:val="24"/>
         </w:rPr>
-        <w:t xml:space="preserve">The Description and </w:t>
-      </w:r>
-      <w:proofErr w:type="spellStart"/>
-      <w:r>
-        <w:rPr>
-          <w:rFonts w:ascii="Calibri" w:hAnsi="Calibri" w:cs="Calibri"/>
-          <w:sz w:val="24"/>
-          <w:szCs w:val="24"/>
-        </w:rPr>
-        <w:t>CustomerID</w:t>
-      </w:r>
-      <w:proofErr w:type="spellEnd"/>
-      <w:r>
-        <w:rPr>
-          <w:rFonts w:ascii="Calibri" w:hAnsi="Calibri" w:cs="Calibri"/>
-          <w:sz w:val="24"/>
-          <w:szCs w:val="24"/>
-        </w:rPr>
-        <w:t xml:space="preserve"> fields both had missing values</w:t>
+        <w:t>The Description and CustomerID fields both had missing values</w:t>
       </w:r>
       <w:r>
         <w:rPr>
@@ -2434,25 +1990,7 @@
           <w:sz w:val="24"/>
           <w:szCs w:val="24"/>
         </w:rPr>
-        <w:t xml:space="preserve">the latter was missing in almost 25% of the records. Rows without </w:t>
-      </w:r>
-      <w:proofErr w:type="spellStart"/>
-      <w:r>
-        <w:rPr>
-          <w:rFonts w:ascii="Calibri" w:hAnsi="Calibri" w:cs="Calibri"/>
-          <w:sz w:val="24"/>
-          <w:szCs w:val="24"/>
-        </w:rPr>
-        <w:t>CustomerID</w:t>
-      </w:r>
-      <w:proofErr w:type="spellEnd"/>
-      <w:r>
-        <w:rPr>
-          <w:rFonts w:ascii="Calibri" w:hAnsi="Calibri" w:cs="Calibri"/>
-          <w:sz w:val="24"/>
-          <w:szCs w:val="24"/>
-        </w:rPr>
-        <w:t xml:space="preserve"> were eliminated because customer-level modelling was essential to this project. To ensure data integrity, 10,147 completely duplicate rows were found and eliminated. Both Quantity and UnitPrice had extreme outliers, with values ranging from -80,995 to 80,995 and -11,062.06 to 38,970.00, respectively, according to summary statistics. Histograms and boxplots were used to visualise these anomalies (Figure 1), demonstrating the presence of extreme values and heavy skewness.</w:t>
+        <w:t>the latter was missing in almost 25% of the records. Rows without CustomerID were eliminated because customer-level modelling was essential to this project. To ensure data integrity, 10,147 completely duplicate rows were found and eliminated. Both Quantity and UnitPrice had extreme outliers, with values ranging from -80,995 to 80,995 and -11,062.06 to 38,970.00, respectively, according to summary statistics. Histograms and boxplots were used to visualise these anomalies (Figure 1), demonstrating the presence of extreme values and heavy skewness.</w:t>
       </w:r>
     </w:p>
     <w:p>
@@ -2536,7 +2074,23 @@
           <w:sz w:val="24"/>
           <w:szCs w:val="24"/>
         </w:rPr>
-        <w:t>Figure 1. Distribution and boxplot of Quantity and UnitPrice showing skewed distributions and extreme outliers.</w:t>
+        <w:t>Figure 1</w:t>
+      </w:r>
+      <w:r>
+        <w:rPr>
+          <w:rFonts w:ascii="Calibri" w:hAnsi="Calibri" w:cs="Calibri"/>
+          <w:sz w:val="24"/>
+          <w:szCs w:val="24"/>
+        </w:rPr>
+        <w:t>:</w:t>
+      </w:r>
+      <w:r>
+        <w:rPr>
+          <w:rFonts w:ascii="Calibri" w:hAnsi="Calibri" w:cs="Calibri"/>
+          <w:sz w:val="24"/>
+          <w:szCs w:val="24"/>
+        </w:rPr>
+        <w:t xml:space="preserve"> Distribution and boxplot of Quantity and UnitPrice showing skewed distributions and extreme outliers.</w:t>
       </w:r>
     </w:p>
     <w:p>
@@ -2637,7 +2191,23 @@
           <w:sz w:val="24"/>
           <w:szCs w:val="24"/>
         </w:rPr>
-        <w:t>Figure 2. Top 20 countries by transaction count</w:t>
+        <w:t>Figure 2</w:t>
+      </w:r>
+      <w:r>
+        <w:rPr>
+          <w:rFonts w:ascii="Calibri" w:hAnsi="Calibri" w:cs="Calibri"/>
+          <w:sz w:val="24"/>
+          <w:szCs w:val="24"/>
+        </w:rPr>
+        <w:t>:</w:t>
+      </w:r>
+      <w:r>
+        <w:rPr>
+          <w:rFonts w:ascii="Calibri" w:hAnsi="Calibri" w:cs="Calibri"/>
+          <w:sz w:val="24"/>
+          <w:szCs w:val="24"/>
+        </w:rPr>
+        <w:t xml:space="preserve"> Top 20 countries by transaction count</w:t>
       </w:r>
     </w:p>
     <w:p>
@@ -2738,7 +2308,23 @@
           <w:sz w:val="24"/>
           <w:szCs w:val="24"/>
         </w:rPr>
-        <w:t>Figure 3. Correlation matrix between Quantity and UnitPrice showing negligible linear association.</w:t>
+        <w:t>Figure 3</w:t>
+      </w:r>
+      <w:r>
+        <w:rPr>
+          <w:rFonts w:ascii="Calibri" w:hAnsi="Calibri" w:cs="Calibri"/>
+          <w:sz w:val="24"/>
+          <w:szCs w:val="24"/>
+        </w:rPr>
+        <w:t>:</w:t>
+      </w:r>
+      <w:r>
+        <w:rPr>
+          <w:rFonts w:ascii="Calibri" w:hAnsi="Calibri" w:cs="Calibri"/>
+          <w:sz w:val="24"/>
+          <w:szCs w:val="24"/>
+        </w:rPr>
+        <w:t xml:space="preserve"> Correlation matrix between Quantity and UnitPrice showing negligible linear association.</w:t>
       </w:r>
     </w:p>
     <w:p>
@@ -2791,6 +2377,720 @@
         </w:rPr>
         <w:t>This binary classification setup made it possible to use supervised learning and SHAP and LIME for interpretability.</w:t>
       </w:r>
+    </w:p>
+    <w:p>
+      <w:pPr>
+        <w:rPr>
+          <w:rFonts w:ascii="Calibri" w:hAnsi="Calibri" w:cs="Calibri"/>
+          <w:b/>
+          <w:bCs/>
+          <w:sz w:val="32"/>
+          <w:szCs w:val="32"/>
+        </w:rPr>
+      </w:pPr>
+      <w:r>
+        <w:rPr>
+          <w:rFonts w:ascii="Calibri" w:hAnsi="Calibri" w:cs="Calibri"/>
+          <w:b/>
+          <w:bCs/>
+          <w:sz w:val="32"/>
+          <w:szCs w:val="32"/>
+        </w:rPr>
+        <w:t>7</w:t>
+      </w:r>
+      <w:r>
+        <w:rPr>
+          <w:rFonts w:ascii="Calibri" w:hAnsi="Calibri" w:cs="Calibri"/>
+          <w:b/>
+          <w:bCs/>
+          <w:sz w:val="32"/>
+          <w:szCs w:val="32"/>
+        </w:rPr>
+        <w:t>. Data Preparation</w:t>
+      </w:r>
+    </w:p>
+    <w:p>
+      <w:pPr>
+        <w:rPr>
+          <w:rFonts w:ascii="Calibri" w:hAnsi="Calibri" w:cs="Calibri"/>
+          <w:sz w:val="24"/>
+          <w:szCs w:val="24"/>
+        </w:rPr>
+      </w:pPr>
+      <w:r>
+        <w:rPr>
+          <w:rFonts w:ascii="Calibri" w:hAnsi="Calibri" w:cs="Calibri"/>
+          <w:sz w:val="24"/>
+          <w:szCs w:val="24"/>
+        </w:rPr>
+        <w:t>During the data preparation stage, raw transactional records were converted into a clean, customer-level dataset that could be used for predictive modelling. Data cleaning, feature engineering, outlier handling, transformation, and class balancing were all part of this process.</w:t>
+      </w:r>
+    </w:p>
+    <w:p>
+      <w:pPr>
+        <w:rPr>
+          <w:rFonts w:ascii="Calibri" w:hAnsi="Calibri" w:cs="Calibri"/>
+          <w:b/>
+          <w:bCs/>
+          <w:sz w:val="28"/>
+          <w:szCs w:val="28"/>
+        </w:rPr>
+      </w:pPr>
+      <w:r>
+        <w:rPr>
+          <w:rFonts w:ascii="Calibri" w:hAnsi="Calibri" w:cs="Calibri"/>
+          <w:b/>
+          <w:bCs/>
+          <w:sz w:val="28"/>
+          <w:szCs w:val="28"/>
+        </w:rPr>
+        <w:t>7</w:t>
+      </w:r>
+      <w:r>
+        <w:rPr>
+          <w:rFonts w:ascii="Calibri" w:hAnsi="Calibri" w:cs="Calibri"/>
+          <w:b/>
+          <w:bCs/>
+          <w:sz w:val="28"/>
+          <w:szCs w:val="28"/>
+        </w:rPr>
+        <w:t xml:space="preserve">.1 </w:t>
+      </w:r>
+      <w:r>
+        <w:rPr>
+          <w:rFonts w:ascii="Calibri" w:hAnsi="Calibri" w:cs="Calibri"/>
+          <w:b/>
+          <w:bCs/>
+          <w:sz w:val="28"/>
+          <w:szCs w:val="28"/>
+        </w:rPr>
+        <w:t>Data Cleaning and Transformation</w:t>
+      </w:r>
+    </w:p>
+    <w:p>
+      <w:pPr>
+        <w:rPr>
+          <w:rFonts w:ascii="Calibri" w:hAnsi="Calibri" w:cs="Calibri"/>
+          <w:sz w:val="24"/>
+          <w:szCs w:val="24"/>
+        </w:rPr>
+      </w:pPr>
+      <w:r>
+        <w:rPr>
+          <w:rFonts w:ascii="Calibri" w:hAnsi="Calibri" w:cs="Calibri"/>
+          <w:sz w:val="24"/>
+          <w:szCs w:val="24"/>
+        </w:rPr>
+        <w:t>Dropping rows with missing CustomerID, changing identifiers to the proper data types, and parsing InvoiceDate into datetime format were among the first cleaning steps. To eliminate returns and data entry errors, invalid transactions</w:t>
+      </w:r>
+      <w:r>
+        <w:rPr>
+          <w:rFonts w:ascii="Calibri" w:hAnsi="Calibri" w:cs="Calibri"/>
+          <w:sz w:val="24"/>
+          <w:szCs w:val="24"/>
+        </w:rPr>
+        <w:t xml:space="preserve">, </w:t>
+      </w:r>
+      <w:r>
+        <w:rPr>
+          <w:rFonts w:ascii="Calibri" w:hAnsi="Calibri" w:cs="Calibri"/>
+          <w:sz w:val="24"/>
+          <w:szCs w:val="24"/>
+        </w:rPr>
+        <w:t>those with non-positive Quantity or UnitPrice</w:t>
+      </w:r>
+      <w:r>
+        <w:rPr>
+          <w:rFonts w:ascii="Calibri" w:hAnsi="Calibri" w:cs="Calibri"/>
+          <w:sz w:val="24"/>
+          <w:szCs w:val="24"/>
+        </w:rPr>
+        <w:t xml:space="preserve">, </w:t>
+      </w:r>
+      <w:r>
+        <w:rPr>
+          <w:rFonts w:ascii="Calibri" w:hAnsi="Calibri" w:cs="Calibri"/>
+          <w:sz w:val="24"/>
+          <w:szCs w:val="24"/>
+        </w:rPr>
+        <w:t>were eliminated. To maintain data integrity, fully duplicates were eliminated.</w:t>
+      </w:r>
+      <w:r>
+        <w:rPr>
+          <w:rFonts w:ascii="Calibri" w:hAnsi="Calibri" w:cs="Calibri"/>
+          <w:sz w:val="24"/>
+          <w:szCs w:val="24"/>
+        </w:rPr>
+        <w:t xml:space="preserve"> </w:t>
+      </w:r>
+    </w:p>
+    <w:p>
+      <w:pPr>
+        <w:rPr>
+          <w:rFonts w:ascii="Calibri" w:hAnsi="Calibri" w:cs="Calibri"/>
+          <w:sz w:val="24"/>
+          <w:szCs w:val="24"/>
+        </w:rPr>
+      </w:pPr>
+      <w:r>
+        <w:rPr>
+          <w:rFonts w:ascii="Calibri" w:hAnsi="Calibri" w:cs="Calibri"/>
+          <w:sz w:val="24"/>
+          <w:szCs w:val="24"/>
+        </w:rPr>
+        <w:t>The IQR approach was used to eliminate outliers in Quantity and UnitPrice, and log transformation was then applied to reduce skewness.</w:t>
+      </w:r>
+      <w:r>
+        <w:rPr>
+          <w:rFonts w:ascii="Calibri" w:hAnsi="Calibri" w:cs="Calibri"/>
+          <w:sz w:val="24"/>
+          <w:szCs w:val="24"/>
+        </w:rPr>
+        <w:t xml:space="preserve"> </w:t>
+      </w:r>
+      <w:r>
+        <w:rPr>
+          <w:rFonts w:ascii="Calibri" w:hAnsi="Calibri" w:cs="Calibri"/>
+          <w:sz w:val="24"/>
+          <w:szCs w:val="24"/>
+        </w:rPr>
+        <w:t>The quantity and unit price post-transformation skewness values were lowered to 0.09 and 0.23, respectively.</w:t>
+      </w:r>
+    </w:p>
+    <w:p>
+      <w:pPr>
+        <w:rPr>
+          <w:rFonts w:ascii="Calibri" w:hAnsi="Calibri" w:cs="Calibri"/>
+          <w:b/>
+          <w:bCs/>
+          <w:sz w:val="28"/>
+          <w:szCs w:val="28"/>
+        </w:rPr>
+      </w:pPr>
+      <w:r>
+        <w:rPr>
+          <w:rFonts w:ascii="Calibri" w:hAnsi="Calibri" w:cs="Calibri"/>
+          <w:b/>
+          <w:bCs/>
+          <w:sz w:val="28"/>
+          <w:szCs w:val="28"/>
+        </w:rPr>
+        <w:t>7</w:t>
+      </w:r>
+      <w:r>
+        <w:rPr>
+          <w:rFonts w:ascii="Calibri" w:hAnsi="Calibri" w:cs="Calibri"/>
+          <w:b/>
+          <w:bCs/>
+          <w:sz w:val="28"/>
+          <w:szCs w:val="28"/>
+        </w:rPr>
+        <w:t xml:space="preserve">.2 </w:t>
+      </w:r>
+      <w:r>
+        <w:rPr>
+          <w:rFonts w:ascii="Calibri" w:hAnsi="Calibri" w:cs="Calibri"/>
+          <w:b/>
+          <w:bCs/>
+          <w:sz w:val="28"/>
+          <w:szCs w:val="28"/>
+        </w:rPr>
+        <w:t>Feature Engineering</w:t>
+      </w:r>
+    </w:p>
+    <w:p>
+      <w:pPr>
+        <w:rPr>
+          <w:rFonts w:ascii="Calibri" w:hAnsi="Calibri" w:cs="Calibri"/>
+          <w:sz w:val="24"/>
+          <w:szCs w:val="24"/>
+        </w:rPr>
+      </w:pPr>
+      <w:r>
+        <w:rPr>
+          <w:rFonts w:ascii="Calibri" w:hAnsi="Calibri" w:cs="Calibri"/>
+          <w:sz w:val="24"/>
+          <w:szCs w:val="24"/>
+        </w:rPr>
+        <w:t>Transactional data was aggregated to produce customer-level features. These included the average number of days between purchases (avg_days_between_purchases), the total amount of money spent on purchases (total_spend_per_customer), the quantity of distinct product codes (unique_products_purchased), the number of unique product descriptions purchased (category_diversity), and the amount of time since the customer's first purchase (time_since_first_purchase). Average_order_value, purchase_freq_90d, and recency_days are other features that were explored but were not included in the final modelling because of their lower mutual information scores and strong correlation with selected features. As shown in Figures 2 and 3, feature selection was guided by both multicollinearity diagnostics and predictive relevance.</w:t>
+      </w:r>
+    </w:p>
+    <w:p>
+      <w:pPr>
+        <w:rPr>
+          <w:rFonts w:ascii="Calibri" w:hAnsi="Calibri" w:cs="Calibri"/>
+          <w:sz w:val="24"/>
+          <w:szCs w:val="24"/>
+        </w:rPr>
+      </w:pPr>
+      <w:r>
+        <w:rPr>
+          <w:rFonts w:ascii="Calibri" w:hAnsi="Calibri" w:cs="Calibri"/>
+          <w:noProof/>
+          <w:sz w:val="24"/>
+          <w:szCs w:val="24"/>
+        </w:rPr>
+        <w:lastRenderedPageBreak/>
+        <w:drawing>
+          <wp:inline distT="0" distB="0" distL="0" distR="0" wp14:anchorId="1C7C9A48" wp14:editId="73B72745">
+            <wp:extent cx="5731510" cy="4426585"/>
+            <wp:effectExtent l="0" t="0" r="2540" b="0"/>
+            <wp:docPr id="378012589" name="Picture 4" descr="A screenshot of a graph&#10;&#10;AI-generated content may be incorrect."/>
+            <wp:cNvGraphicFramePr>
+              <a:graphicFrameLocks xmlns:a="http://schemas.openxmlformats.org/drawingml/2006/main" noChangeAspect="1"/>
+            </wp:cNvGraphicFramePr>
+            <a:graphic xmlns:a="http://schemas.openxmlformats.org/drawingml/2006/main">
+              <a:graphicData uri="http://schemas.openxmlformats.org/drawingml/2006/picture">
+                <pic:pic xmlns:pic="http://schemas.openxmlformats.org/drawingml/2006/picture">
+                  <pic:nvPicPr>
+                    <pic:cNvPr id="378012589" name="Picture 4" descr="A screenshot of a graph&#10;&#10;AI-generated content may be incorrect."/>
+                    <pic:cNvPicPr/>
+                  </pic:nvPicPr>
+                  <pic:blipFill>
+                    <a:blip r:embed="rId7">
+                      <a:extLst>
+                        <a:ext uri="{28A0092B-C50C-407E-A947-70E740481C1C}">
+                          <a14:useLocalDpi xmlns:a14="http://schemas.microsoft.com/office/drawing/2010/main" val="0"/>
+                        </a:ext>
+                      </a:extLst>
+                    </a:blip>
+                    <a:stretch>
+                      <a:fillRect/>
+                    </a:stretch>
+                  </pic:blipFill>
+                  <pic:spPr>
+                    <a:xfrm>
+                      <a:off x="0" y="0"/>
+                      <a:ext cx="5731510" cy="4426585"/>
+                    </a:xfrm>
+                    <a:prstGeom prst="rect">
+                      <a:avLst/>
+                    </a:prstGeom>
+                  </pic:spPr>
+                </pic:pic>
+              </a:graphicData>
+            </a:graphic>
+          </wp:inline>
+        </w:drawing>
+      </w:r>
+    </w:p>
+    <w:p>
+      <w:pPr>
+        <w:rPr>
+          <w:rFonts w:ascii="Calibri" w:hAnsi="Calibri" w:cs="Calibri"/>
+          <w:sz w:val="24"/>
+          <w:szCs w:val="24"/>
+        </w:rPr>
+      </w:pPr>
+      <w:r>
+        <w:rPr>
+          <w:rFonts w:ascii="Calibri" w:hAnsi="Calibri" w:cs="Calibri"/>
+          <w:sz w:val="24"/>
+          <w:szCs w:val="24"/>
+        </w:rPr>
+        <w:t xml:space="preserve">Figure 1: </w:t>
+      </w:r>
+      <w:r>
+        <w:rPr>
+          <w:rFonts w:ascii="Calibri" w:hAnsi="Calibri" w:cs="Calibri"/>
+          <w:sz w:val="24"/>
+          <w:szCs w:val="24"/>
+        </w:rPr>
+        <w:t>Engineered feature boxplots and histograms that display distribution patterns and outliers before transformation.</w:t>
+      </w:r>
+    </w:p>
+    <w:p>
+      <w:pPr>
+        <w:rPr>
+          <w:rFonts w:ascii="Calibri" w:hAnsi="Calibri" w:cs="Calibri"/>
+          <w:sz w:val="24"/>
+          <w:szCs w:val="24"/>
+        </w:rPr>
+      </w:pPr>
+      <w:r>
+        <w:rPr>
+          <w:rFonts w:ascii="Calibri" w:hAnsi="Calibri" w:cs="Calibri"/>
+          <w:noProof/>
+          <w:sz w:val="24"/>
+          <w:szCs w:val="24"/>
+        </w:rPr>
+        <w:lastRenderedPageBreak/>
+        <w:drawing>
+          <wp:inline distT="0" distB="0" distL="0" distR="0" wp14:anchorId="41A0F7B9" wp14:editId="32CB54F2">
+            <wp:extent cx="5731510" cy="4984115"/>
+            <wp:effectExtent l="0" t="0" r="2540" b="6985"/>
+            <wp:docPr id="1288642560" name="Picture 5" descr="A diagram of a number of items&#10;&#10;AI-generated content may be incorrect."/>
+            <wp:cNvGraphicFramePr>
+              <a:graphicFrameLocks xmlns:a="http://schemas.openxmlformats.org/drawingml/2006/main" noChangeAspect="1"/>
+            </wp:cNvGraphicFramePr>
+            <a:graphic xmlns:a="http://schemas.openxmlformats.org/drawingml/2006/main">
+              <a:graphicData uri="http://schemas.openxmlformats.org/drawingml/2006/picture">
+                <pic:pic xmlns:pic="http://schemas.openxmlformats.org/drawingml/2006/picture">
+                  <pic:nvPicPr>
+                    <pic:cNvPr id="1288642560" name="Picture 5" descr="A diagram of a number of items&#10;&#10;AI-generated content may be incorrect."/>
+                    <pic:cNvPicPr/>
+                  </pic:nvPicPr>
+                  <pic:blipFill>
+                    <a:blip r:embed="rId8">
+                      <a:extLst>
+                        <a:ext uri="{28A0092B-C50C-407E-A947-70E740481C1C}">
+                          <a14:useLocalDpi xmlns:a14="http://schemas.microsoft.com/office/drawing/2010/main" val="0"/>
+                        </a:ext>
+                      </a:extLst>
+                    </a:blip>
+                    <a:stretch>
+                      <a:fillRect/>
+                    </a:stretch>
+                  </pic:blipFill>
+                  <pic:spPr>
+                    <a:xfrm>
+                      <a:off x="0" y="0"/>
+                      <a:ext cx="5731510" cy="4984115"/>
+                    </a:xfrm>
+                    <a:prstGeom prst="rect">
+                      <a:avLst/>
+                    </a:prstGeom>
+                  </pic:spPr>
+                </pic:pic>
+              </a:graphicData>
+            </a:graphic>
+          </wp:inline>
+        </w:drawing>
+      </w:r>
+    </w:p>
+    <w:p>
+      <w:pPr>
+        <w:rPr>
+          <w:rFonts w:ascii="Calibri" w:hAnsi="Calibri" w:cs="Calibri"/>
+          <w:sz w:val="24"/>
+          <w:szCs w:val="24"/>
+        </w:rPr>
+      </w:pPr>
+      <w:r>
+        <w:rPr>
+          <w:rFonts w:ascii="Calibri" w:hAnsi="Calibri" w:cs="Calibri"/>
+          <w:sz w:val="24"/>
+          <w:szCs w:val="24"/>
+        </w:rPr>
+        <w:t xml:space="preserve">Figure 2: </w:t>
+      </w:r>
+      <w:r>
+        <w:rPr>
+          <w:rFonts w:ascii="Calibri" w:hAnsi="Calibri" w:cs="Calibri"/>
+          <w:sz w:val="24"/>
+          <w:szCs w:val="24"/>
+        </w:rPr>
+        <w:t>A feature correlation matrix that directs feature selection and evaluates multicollinearity.</w:t>
+      </w:r>
+    </w:p>
+    <w:p>
+      <w:pPr>
+        <w:rPr>
+          <w:rFonts w:ascii="Calibri" w:hAnsi="Calibri" w:cs="Calibri"/>
+          <w:sz w:val="24"/>
+          <w:szCs w:val="24"/>
+        </w:rPr>
+      </w:pPr>
+    </w:p>
+    <w:p>
+      <w:pPr>
+        <w:rPr>
+          <w:rFonts w:ascii="Calibri" w:hAnsi="Calibri" w:cs="Calibri"/>
+          <w:sz w:val="24"/>
+          <w:szCs w:val="24"/>
+        </w:rPr>
+      </w:pPr>
+      <w:r>
+        <w:rPr>
+          <w:rFonts w:ascii="Calibri" w:hAnsi="Calibri" w:cs="Calibri"/>
+          <w:noProof/>
+          <w:sz w:val="24"/>
+          <w:szCs w:val="24"/>
+        </w:rPr>
+        <w:drawing>
+          <wp:inline distT="0" distB="0" distL="0" distR="0" wp14:anchorId="11DB2BDA" wp14:editId="36FCA1AE">
+            <wp:extent cx="5731510" cy="2414270"/>
+            <wp:effectExtent l="0" t="0" r="2540" b="5080"/>
+            <wp:docPr id="1116436725" name="Picture 6" descr="A screenshot of a computer screen&#10;&#10;AI-generated content may be incorrect."/>
+            <wp:cNvGraphicFramePr>
+              <a:graphicFrameLocks xmlns:a="http://schemas.openxmlformats.org/drawingml/2006/main" noChangeAspect="1"/>
+            </wp:cNvGraphicFramePr>
+            <a:graphic xmlns:a="http://schemas.openxmlformats.org/drawingml/2006/main">
+              <a:graphicData uri="http://schemas.openxmlformats.org/drawingml/2006/picture">
+                <pic:pic xmlns:pic="http://schemas.openxmlformats.org/drawingml/2006/picture">
+                  <pic:nvPicPr>
+                    <pic:cNvPr id="1116436725" name="Picture 6" descr="A screenshot of a computer screen&#10;&#10;AI-generated content may be incorrect."/>
+                    <pic:cNvPicPr/>
+                  </pic:nvPicPr>
+                  <pic:blipFill>
+                    <a:blip r:embed="rId9">
+                      <a:extLst>
+                        <a:ext uri="{28A0092B-C50C-407E-A947-70E740481C1C}">
+                          <a14:useLocalDpi xmlns:a14="http://schemas.microsoft.com/office/drawing/2010/main" val="0"/>
+                        </a:ext>
+                      </a:extLst>
+                    </a:blip>
+                    <a:stretch>
+                      <a:fillRect/>
+                    </a:stretch>
+                  </pic:blipFill>
+                  <pic:spPr>
+                    <a:xfrm>
+                      <a:off x="0" y="0"/>
+                      <a:ext cx="5731510" cy="2414270"/>
+                    </a:xfrm>
+                    <a:prstGeom prst="rect">
+                      <a:avLst/>
+                    </a:prstGeom>
+                  </pic:spPr>
+                </pic:pic>
+              </a:graphicData>
+            </a:graphic>
+          </wp:inline>
+        </w:drawing>
+      </w:r>
+    </w:p>
+    <w:p>
+      <w:pPr>
+        <w:rPr>
+          <w:rFonts w:ascii="Calibri" w:hAnsi="Calibri" w:cs="Calibri"/>
+          <w:sz w:val="24"/>
+          <w:szCs w:val="24"/>
+        </w:rPr>
+      </w:pPr>
+      <w:r>
+        <w:rPr>
+          <w:rFonts w:ascii="Calibri" w:hAnsi="Calibri" w:cs="Calibri"/>
+          <w:sz w:val="24"/>
+          <w:szCs w:val="24"/>
+        </w:rPr>
+        <w:t xml:space="preserve">                                     Figure 3: </w:t>
+      </w:r>
+      <w:r>
+        <w:rPr>
+          <w:rFonts w:ascii="Calibri" w:hAnsi="Calibri" w:cs="Calibri"/>
+          <w:sz w:val="24"/>
+          <w:szCs w:val="24"/>
+        </w:rPr>
+        <w:t>Mutual information scores</w:t>
+      </w:r>
+    </w:p>
+    <w:p>
+      <w:pPr>
+        <w:rPr>
+          <w:rFonts w:ascii="Calibri" w:hAnsi="Calibri" w:cs="Calibri"/>
+          <w:b/>
+          <w:bCs/>
+          <w:sz w:val="28"/>
+          <w:szCs w:val="28"/>
+        </w:rPr>
+      </w:pPr>
+      <w:r>
+        <w:rPr>
+          <w:rFonts w:ascii="Calibri" w:hAnsi="Calibri" w:cs="Calibri"/>
+          <w:b/>
+          <w:bCs/>
+          <w:sz w:val="28"/>
+          <w:szCs w:val="28"/>
+        </w:rPr>
+        <w:lastRenderedPageBreak/>
+        <w:t>7</w:t>
+      </w:r>
+      <w:r>
+        <w:rPr>
+          <w:rFonts w:ascii="Calibri" w:hAnsi="Calibri" w:cs="Calibri"/>
+          <w:b/>
+          <w:bCs/>
+          <w:sz w:val="28"/>
+          <w:szCs w:val="28"/>
+        </w:rPr>
+        <w:t xml:space="preserve">.3 </w:t>
+      </w:r>
+      <w:r>
+        <w:rPr>
+          <w:rFonts w:ascii="Calibri" w:hAnsi="Calibri" w:cs="Calibri"/>
+          <w:b/>
+          <w:bCs/>
+          <w:sz w:val="28"/>
+          <w:szCs w:val="28"/>
+        </w:rPr>
+        <w:t>Target Variable and Class Balance</w:t>
+      </w:r>
+    </w:p>
+    <w:p>
+      <w:pPr>
+        <w:rPr>
+          <w:rFonts w:ascii="Calibri" w:hAnsi="Calibri" w:cs="Calibri"/>
+          <w:sz w:val="24"/>
+          <w:szCs w:val="24"/>
+        </w:rPr>
+      </w:pPr>
+      <w:r>
+        <w:rPr>
+          <w:rFonts w:ascii="Calibri" w:hAnsi="Calibri" w:cs="Calibri"/>
+          <w:sz w:val="24"/>
+          <w:szCs w:val="24"/>
+        </w:rPr>
+        <w:t>Customers who made more than one purchase were classified as repeat buyers in the target variable, repeat_purchase, which was defined as a binary indicator. Resampling was required since the resulting class distribution was slightly imbalanced (65.5% repeat vs. 34.5% non-repeat).</w:t>
+      </w:r>
+    </w:p>
+    <w:p>
+      <w:pPr>
+        <w:rPr>
+          <w:rFonts w:ascii="Calibri" w:hAnsi="Calibri" w:cs="Calibri"/>
+          <w:b/>
+          <w:bCs/>
+          <w:sz w:val="28"/>
+          <w:szCs w:val="28"/>
+        </w:rPr>
+      </w:pPr>
+      <w:r>
+        <w:rPr>
+          <w:rFonts w:ascii="Calibri" w:hAnsi="Calibri" w:cs="Calibri"/>
+          <w:b/>
+          <w:bCs/>
+          <w:sz w:val="28"/>
+          <w:szCs w:val="28"/>
+        </w:rPr>
+        <w:t>7</w:t>
+      </w:r>
+      <w:r>
+        <w:rPr>
+          <w:rFonts w:ascii="Calibri" w:hAnsi="Calibri" w:cs="Calibri"/>
+          <w:b/>
+          <w:bCs/>
+          <w:sz w:val="28"/>
+          <w:szCs w:val="28"/>
+        </w:rPr>
+        <w:t xml:space="preserve">.4 </w:t>
+      </w:r>
+      <w:r>
+        <w:rPr>
+          <w:rFonts w:ascii="Calibri" w:hAnsi="Calibri" w:cs="Calibri"/>
+          <w:b/>
+          <w:bCs/>
+          <w:sz w:val="28"/>
+          <w:szCs w:val="28"/>
+        </w:rPr>
+        <w:t>Outlier Handling and Feature Transformation</w:t>
+      </w:r>
+    </w:p>
+    <w:p>
+      <w:pPr>
+        <w:rPr>
+          <w:rFonts w:ascii="Calibri" w:hAnsi="Calibri" w:cs="Calibri"/>
+          <w:sz w:val="24"/>
+          <w:szCs w:val="24"/>
+        </w:rPr>
+      </w:pPr>
+      <w:r>
+        <w:rPr>
+          <w:rFonts w:ascii="Calibri" w:hAnsi="Calibri" w:cs="Calibri"/>
+          <w:sz w:val="24"/>
+          <w:szCs w:val="24"/>
+        </w:rPr>
+        <w:t>To evaluate distribution and identify outliers, engineered features were visualized using boxplots and histograms (Figure 1). Each numerical feature was filtered using IQR, and skewed distributions were then normalised using log transformation. Compatibility with both tree-based and linear classifiers was therefore ensured.</w:t>
+      </w:r>
+    </w:p>
+    <w:p>
+      <w:pPr>
+        <w:rPr>
+          <w:rFonts w:ascii="Calibri" w:hAnsi="Calibri" w:cs="Calibri"/>
+          <w:b/>
+          <w:bCs/>
+          <w:sz w:val="28"/>
+          <w:szCs w:val="28"/>
+        </w:rPr>
+      </w:pPr>
+      <w:r>
+        <w:rPr>
+          <w:rFonts w:ascii="Calibri" w:hAnsi="Calibri" w:cs="Calibri"/>
+          <w:b/>
+          <w:bCs/>
+          <w:sz w:val="28"/>
+          <w:szCs w:val="28"/>
+        </w:rPr>
+        <w:t>7</w:t>
+      </w:r>
+      <w:r>
+        <w:rPr>
+          <w:rFonts w:ascii="Calibri" w:hAnsi="Calibri" w:cs="Calibri"/>
+          <w:b/>
+          <w:bCs/>
+          <w:sz w:val="28"/>
+          <w:szCs w:val="28"/>
+        </w:rPr>
+        <w:t xml:space="preserve">.5 </w:t>
+      </w:r>
+      <w:r>
+        <w:rPr>
+          <w:rFonts w:ascii="Calibri" w:hAnsi="Calibri" w:cs="Calibri"/>
+          <w:b/>
+          <w:bCs/>
+          <w:sz w:val="28"/>
+          <w:szCs w:val="28"/>
+        </w:rPr>
+        <w:t>Scaling and Resampling</w:t>
+      </w:r>
+    </w:p>
+    <w:p>
+      <w:pPr>
+        <w:rPr>
+          <w:rFonts w:ascii="Calibri" w:hAnsi="Calibri" w:cs="Calibri"/>
+          <w:sz w:val="24"/>
+          <w:szCs w:val="24"/>
+        </w:rPr>
+      </w:pPr>
+      <w:r>
+        <w:rPr>
+          <w:rFonts w:ascii="Calibri" w:hAnsi="Calibri" w:cs="Calibri"/>
+          <w:sz w:val="24"/>
+          <w:szCs w:val="24"/>
+        </w:rPr>
+        <w:t>To standardize input ranges, selected features were scaled using StandardScaler. Class proportions were maintained through a stratified train-test split, while minority class instances were synthetically balanced in the training set using SMOTE.</w:t>
+      </w:r>
+      <w:r>
+        <w:rPr>
+          <w:rFonts w:ascii="Calibri" w:hAnsi="Calibri" w:cs="Calibri"/>
+          <w:sz w:val="24"/>
+          <w:szCs w:val="24"/>
+        </w:rPr>
+        <w:t xml:space="preserve"> </w:t>
+      </w:r>
+      <w:r>
+        <w:rPr>
+          <w:rFonts w:ascii="Calibri" w:hAnsi="Calibri" w:cs="Calibri"/>
+          <w:sz w:val="24"/>
+          <w:szCs w:val="24"/>
+        </w:rPr>
+        <w:t>By doing this, it ensured that models trained on the data would not be biassed in favour of the majority class.</w:t>
+      </w:r>
+    </w:p>
+    <w:p>
+      <w:pPr>
+        <w:rPr>
+          <w:rFonts w:ascii="Calibri" w:hAnsi="Calibri" w:cs="Calibri"/>
+          <w:sz w:val="24"/>
+          <w:szCs w:val="24"/>
+        </w:rPr>
+      </w:pPr>
+      <w:r>
+        <w:rPr>
+          <w:rFonts w:ascii="Calibri" w:hAnsi="Calibri" w:cs="Calibri"/>
+          <w:sz w:val="24"/>
+          <w:szCs w:val="24"/>
+        </w:rPr>
+        <w:t>In order to enable robust model training and interpretable evaluation in later stages, this preparation pipeline made sure that the final dataset was clean, balanced, and feature rich.</w:t>
+      </w:r>
+    </w:p>
+    <w:p>
+      <w:pPr>
+        <w:rPr>
+          <w:rFonts w:ascii="Calibri" w:hAnsi="Calibri" w:cs="Calibri"/>
+          <w:sz w:val="24"/>
+          <w:szCs w:val="24"/>
+        </w:rPr>
+      </w:pPr>
     </w:p>
     <w:p>
       <w:pPr>
@@ -2917,7 +3217,6 @@
           <w:sz w:val="32"/>
           <w:szCs w:val="32"/>
         </w:rPr>
-        <w:lastRenderedPageBreak/>
         <w:t>References</w:t>
       </w:r>
     </w:p>
@@ -2937,7 +3236,6 @@
         </w:rPr>
         <w:t xml:space="preserve">Fader, P.S. and Hardie, B.G.S. (2010). Customer-Base Valuation in a Contractual Setting: The Perils of Ignoring Heterogeneity. Marketing Science, 29(1), pp.85–93. </w:t>
       </w:r>
-      <w:proofErr w:type="spellStart"/>
       <w:proofErr w:type="gramStart"/>
       <w:r>
         <w:rPr>
@@ -2945,16 +3243,7 @@
           <w:sz w:val="24"/>
           <w:szCs w:val="24"/>
         </w:rPr>
-        <w:t>doi:https</w:t>
-      </w:r>
-      <w:proofErr w:type="spellEnd"/>
-      <w:r>
-        <w:rPr>
-          <w:rFonts w:ascii="Calibri" w:hAnsi="Calibri" w:cs="Calibri"/>
-          <w:sz w:val="24"/>
-          <w:szCs w:val="24"/>
-        </w:rPr>
-        <w:t>://doi.org/10.1287/mksc.1080.0482</w:t>
+        <w:t>doi:https://doi.org/10.1287/mksc.1080.0482</w:t>
       </w:r>
       <w:proofErr w:type="gramEnd"/>
       <w:r>
@@ -2974,43 +3263,14 @@
           <w:szCs w:val="24"/>
         </w:rPr>
       </w:pPr>
-      <w:proofErr w:type="spellStart"/>
-      <w:r>
-        <w:rPr>
-          <w:rFonts w:ascii="Calibri" w:hAnsi="Calibri" w:cs="Calibri"/>
-          <w:sz w:val="24"/>
-          <w:szCs w:val="24"/>
-        </w:rPr>
-        <w:t>Cirqueira</w:t>
-      </w:r>
-      <w:proofErr w:type="spellEnd"/>
-      <w:r>
-        <w:rPr>
-          <w:rFonts w:ascii="Calibri" w:hAnsi="Calibri" w:cs="Calibri"/>
-          <w:sz w:val="24"/>
-          <w:szCs w:val="24"/>
-        </w:rPr>
-        <w:t xml:space="preserve">, D., Hofer, M., Nedbal, D., Helfert, M. and Bezbradica, M. (2020). Customer Purchase </w:t>
-      </w:r>
-      <w:proofErr w:type="spellStart"/>
-      <w:r>
-        <w:rPr>
-          <w:rFonts w:ascii="Calibri" w:hAnsi="Calibri" w:cs="Calibri"/>
-          <w:sz w:val="24"/>
-          <w:szCs w:val="24"/>
-        </w:rPr>
-        <w:t>Behavior</w:t>
-      </w:r>
-      <w:proofErr w:type="spellEnd"/>
-      <w:r>
-        <w:rPr>
-          <w:rFonts w:ascii="Calibri" w:hAnsi="Calibri" w:cs="Calibri"/>
-          <w:sz w:val="24"/>
-          <w:szCs w:val="24"/>
-        </w:rPr>
-        <w:t xml:space="preserve"> Prediction in E-commerce: A Conceptual Framework and Research Agenda. New Frontiers in Mining Complex Patterns, pp.119–136. </w:t>
-      </w:r>
-      <w:proofErr w:type="spellStart"/>
+      <w:r>
+        <w:rPr>
+          <w:rFonts w:ascii="Calibri" w:hAnsi="Calibri" w:cs="Calibri"/>
+          <w:sz w:val="24"/>
+          <w:szCs w:val="24"/>
+        </w:rPr>
+        <w:t xml:space="preserve">Cirqueira, D., Hofer, M., Nedbal, D., Helfert, M. and Bezbradica, M. (2020). Customer Purchase Behavior Prediction in E-commerce: A Conceptual Framework and Research Agenda. New Frontiers in Mining Complex Patterns, pp.119–136. </w:t>
+      </w:r>
       <w:proofErr w:type="gramStart"/>
       <w:r>
         <w:rPr>
@@ -3018,16 +3278,7 @@
           <w:sz w:val="24"/>
           <w:szCs w:val="24"/>
         </w:rPr>
-        <w:t>doi:https</w:t>
-      </w:r>
-      <w:proofErr w:type="spellEnd"/>
-      <w:r>
-        <w:rPr>
-          <w:rFonts w:ascii="Calibri" w:hAnsi="Calibri" w:cs="Calibri"/>
-          <w:sz w:val="24"/>
-          <w:szCs w:val="24"/>
-        </w:rPr>
-        <w:t>://doi.org/10.1007/978-3-030-48861-1_8</w:t>
+        <w:t>doi:https://doi.org/10.1007/978-3-030-48861-1_8</w:t>
       </w:r>
       <w:proofErr w:type="gramEnd"/>
       <w:r>
@@ -3055,7 +3306,6 @@
         </w:rPr>
         <w:t xml:space="preserve">Jeon, H.G., Kim, C., Lee, J. and Lee, K.C. (2021). Understanding E-Commerce Consumers’ Repeat Purchase Intention: The Role of Trust Transfer and the Moderating Effect of Neuroticism. Frontiers in Psychology, 12. </w:t>
       </w:r>
-      <w:proofErr w:type="spellStart"/>
       <w:proofErr w:type="gramStart"/>
       <w:r>
         <w:rPr>
@@ -3063,16 +3313,7 @@
           <w:sz w:val="24"/>
           <w:szCs w:val="24"/>
         </w:rPr>
-        <w:t>doi:https</w:t>
-      </w:r>
-      <w:proofErr w:type="spellEnd"/>
-      <w:r>
-        <w:rPr>
-          <w:rFonts w:ascii="Calibri" w:hAnsi="Calibri" w:cs="Calibri"/>
-          <w:sz w:val="24"/>
-          <w:szCs w:val="24"/>
-        </w:rPr>
-        <w:t>://doi.org/10.3389/fpsyg.2021.690039</w:t>
+        <w:t>doi:https://doi.org/10.3389/fpsyg.2021.690039</w:t>
       </w:r>
       <w:proofErr w:type="gramEnd"/>
       <w:r>
@@ -3100,7 +3341,6 @@
         </w:rPr>
         <w:t xml:space="preserve">Lundberg, S. and Lee, S.-I. (2017). A Unified Approach to Interpreting Model Predictions. [online] arXiv.org. </w:t>
       </w:r>
-      <w:proofErr w:type="spellStart"/>
       <w:proofErr w:type="gramStart"/>
       <w:r>
         <w:rPr>
@@ -3108,16 +3348,7 @@
           <w:sz w:val="24"/>
           <w:szCs w:val="24"/>
         </w:rPr>
-        <w:t>doi:https</w:t>
-      </w:r>
-      <w:proofErr w:type="spellEnd"/>
-      <w:r>
-        <w:rPr>
-          <w:rFonts w:ascii="Calibri" w:hAnsi="Calibri" w:cs="Calibri"/>
-          <w:sz w:val="24"/>
-          <w:szCs w:val="24"/>
-        </w:rPr>
-        <w:t>://doi.org/10.48550/arXiv.1705.07874</w:t>
+        <w:t>doi:https://doi.org/10.48550/arXiv.1705.07874</w:t>
       </w:r>
       <w:proofErr w:type="gramEnd"/>
       <w:r>
@@ -3160,27 +3391,8 @@
           <w:sz w:val="24"/>
           <w:szCs w:val="24"/>
         </w:rPr>
-        <w:t xml:space="preserve">Harter, A., Stich, L. and Spann, M. (2024). The Effect of Delivery Time on Repurchase </w:t>
-      </w:r>
-      <w:proofErr w:type="spellStart"/>
-      <w:r>
-        <w:rPr>
-          <w:rFonts w:ascii="Calibri" w:hAnsi="Calibri" w:cs="Calibri"/>
-          <w:sz w:val="24"/>
-          <w:szCs w:val="24"/>
-        </w:rPr>
-        <w:t>Behavior</w:t>
-      </w:r>
-      <w:proofErr w:type="spellEnd"/>
-      <w:r>
-        <w:rPr>
-          <w:rFonts w:ascii="Calibri" w:hAnsi="Calibri" w:cs="Calibri"/>
-          <w:sz w:val="24"/>
-          <w:szCs w:val="24"/>
-        </w:rPr>
-        <w:t xml:space="preserve"> in Quick Commerce. Journal of Service Research, [online] 28(2). </w:t>
-      </w:r>
-      <w:proofErr w:type="spellStart"/>
+        <w:t xml:space="preserve">Harter, A., Stich, L. and Spann, M. (2024). The Effect of Delivery Time on Repurchase Behavior in Quick Commerce. Journal of Service Research, [online] 28(2). </w:t>
+      </w:r>
       <w:proofErr w:type="gramStart"/>
       <w:r>
         <w:rPr>
@@ -3188,16 +3400,7 @@
           <w:sz w:val="24"/>
           <w:szCs w:val="24"/>
         </w:rPr>
-        <w:t>doi:https</w:t>
-      </w:r>
-      <w:proofErr w:type="spellEnd"/>
-      <w:r>
-        <w:rPr>
-          <w:rFonts w:ascii="Calibri" w:hAnsi="Calibri" w:cs="Calibri"/>
-          <w:sz w:val="24"/>
-          <w:szCs w:val="24"/>
-        </w:rPr>
-        <w:t>://doi.org/10.1177/10946705241236961</w:t>
+        <w:t>doi:https://doi.org/10.1177/10946705241236961</w:t>
       </w:r>
       <w:proofErr w:type="gramEnd"/>
       <w:r>
@@ -3223,27 +3426,8 @@
           <w:sz w:val="24"/>
           <w:szCs w:val="24"/>
         </w:rPr>
-        <w:t xml:space="preserve">Henninger, M. and Strobl, C. (2024). Interpreting machine learning predictions with LIME and Shapley values: theoretical insights, challenges, and meaningful interpretations. </w:t>
-      </w:r>
-      <w:proofErr w:type="spellStart"/>
-      <w:r>
-        <w:rPr>
-          <w:rFonts w:ascii="Calibri" w:hAnsi="Calibri" w:cs="Calibri"/>
-          <w:sz w:val="24"/>
-          <w:szCs w:val="24"/>
-        </w:rPr>
-        <w:t>Behaviormetrika</w:t>
-      </w:r>
-      <w:proofErr w:type="spellEnd"/>
-      <w:r>
-        <w:rPr>
-          <w:rFonts w:ascii="Calibri" w:hAnsi="Calibri" w:cs="Calibri"/>
-          <w:sz w:val="24"/>
-          <w:szCs w:val="24"/>
-        </w:rPr>
-        <w:t xml:space="preserve">, 52(1), pp.45–75. </w:t>
-      </w:r>
-      <w:proofErr w:type="spellStart"/>
+        <w:t xml:space="preserve">Henninger, M. and Strobl, C. (2024). Interpreting machine learning predictions with LIME and Shapley values: theoretical insights, challenges, and meaningful interpretations. Behaviormetrika, 52(1), pp.45–75. </w:t>
+      </w:r>
       <w:proofErr w:type="gramStart"/>
       <w:r>
         <w:rPr>
@@ -3251,16 +3435,7 @@
           <w:sz w:val="24"/>
           <w:szCs w:val="24"/>
         </w:rPr>
-        <w:t>doi:https</w:t>
-      </w:r>
-      <w:proofErr w:type="spellEnd"/>
-      <w:r>
-        <w:rPr>
-          <w:rFonts w:ascii="Calibri" w:hAnsi="Calibri" w:cs="Calibri"/>
-          <w:sz w:val="24"/>
-          <w:szCs w:val="24"/>
-        </w:rPr>
-        <w:t>://doi.org/10.1007/s41237-024-00253-2</w:t>
+        <w:t>doi:https://doi.org/10.1007/s41237-024-00253-2</w:t>
       </w:r>
       <w:proofErr w:type="gramEnd"/>
       <w:r>

</xml_diff>

<commit_message>
Add Machine Learning implementation chapter
</commit_message>
<xml_diff>
--- a/CA3-Capstone.docx
+++ b/CA3-Capstone.docx
@@ -79,7 +79,25 @@
           <w:sz w:val="24"/>
           <w:szCs w:val="24"/>
         </w:rPr>
-        <w:t>Retention has become a strategic priority in the quickly changing e-commerce industry, where customer acquisition costs are increasing and consumer expectations are changing. According to Fader and Hardie (2009) and Cirqueira et al. (2021), repeat customers are more likely to spend more, interact more frequently, and respond favourably to tailored marketing campaigns.</w:t>
+        <w:t xml:space="preserve">Retention has become a strategic priority in the quickly changing e-commerce industry, where customer acquisition costs are increasing and consumer expectations are changing. According to Fader and Hardie (2009) and </w:t>
+      </w:r>
+      <w:proofErr w:type="spellStart"/>
+      <w:r>
+        <w:rPr>
+          <w:rFonts w:ascii="Calibri" w:hAnsi="Calibri" w:cs="Calibri"/>
+          <w:sz w:val="24"/>
+          <w:szCs w:val="24"/>
+        </w:rPr>
+        <w:t>Cirqueira</w:t>
+      </w:r>
+      <w:proofErr w:type="spellEnd"/>
+      <w:r>
+        <w:rPr>
+          <w:rFonts w:ascii="Calibri" w:hAnsi="Calibri" w:cs="Calibri"/>
+          <w:sz w:val="24"/>
+          <w:szCs w:val="24"/>
+        </w:rPr>
+        <w:t xml:space="preserve"> et al. (2021), repeat customers are more likely to spend more, interact more frequently, and respond favourably to tailored marketing campaigns.</w:t>
       </w:r>
       <w:r>
         <w:rPr>
@@ -185,8 +203,54 @@
           <w:sz w:val="24"/>
           <w:szCs w:val="24"/>
         </w:rPr>
-        <w:t>To explain both global feature importance and local predictions, the project uses SHAP (SHapley Additive exPlanations) in addition to high-performing algorithms including Logistic Regression, Decision Tree, Random Forest, and XGBoost</w:t>
-      </w:r>
+        <w:t>To explain both global feature importance and local predictions, the project uses SHAP (</w:t>
+      </w:r>
+      <w:proofErr w:type="spellStart"/>
+      <w:r>
+        <w:rPr>
+          <w:rFonts w:ascii="Calibri" w:hAnsi="Calibri" w:cs="Calibri"/>
+          <w:sz w:val="24"/>
+          <w:szCs w:val="24"/>
+        </w:rPr>
+        <w:t>SHapley</w:t>
+      </w:r>
+      <w:proofErr w:type="spellEnd"/>
+      <w:r>
+        <w:rPr>
+          <w:rFonts w:ascii="Calibri" w:hAnsi="Calibri" w:cs="Calibri"/>
+          <w:sz w:val="24"/>
+          <w:szCs w:val="24"/>
+        </w:rPr>
+        <w:t xml:space="preserve"> Additive </w:t>
+      </w:r>
+      <w:proofErr w:type="spellStart"/>
+      <w:r>
+        <w:rPr>
+          <w:rFonts w:ascii="Calibri" w:hAnsi="Calibri" w:cs="Calibri"/>
+          <w:sz w:val="24"/>
+          <w:szCs w:val="24"/>
+        </w:rPr>
+        <w:t>exPlanations</w:t>
+      </w:r>
+      <w:proofErr w:type="spellEnd"/>
+      <w:r>
+        <w:rPr>
+          <w:rFonts w:ascii="Calibri" w:hAnsi="Calibri" w:cs="Calibri"/>
+          <w:sz w:val="24"/>
+          <w:szCs w:val="24"/>
+        </w:rPr>
+        <w:t xml:space="preserve">) in addition to high-performing algorithms including Logistic Regression, Decision Tree, Random Forest, and </w:t>
+      </w:r>
+      <w:proofErr w:type="spellStart"/>
+      <w:r>
+        <w:rPr>
+          <w:rFonts w:ascii="Calibri" w:hAnsi="Calibri" w:cs="Calibri"/>
+          <w:sz w:val="24"/>
+          <w:szCs w:val="24"/>
+        </w:rPr>
+        <w:t>XGBoost</w:t>
+      </w:r>
+      <w:proofErr w:type="spellEnd"/>
       <w:r>
         <w:rPr>
           <w:rFonts w:ascii="Calibri" w:hAnsi="Calibri" w:cs="Calibri"/>
@@ -274,7 +338,25 @@
           <w:sz w:val="24"/>
           <w:szCs w:val="24"/>
         </w:rPr>
-        <w:t>can effectively differentiate between one-time and repeat buyers (Cirqueira et al., 2021).</w:t>
+        <w:t>can effectively differentiate between one-time and repeat buyers (</w:t>
+      </w:r>
+      <w:proofErr w:type="spellStart"/>
+      <w:r>
+        <w:rPr>
+          <w:rFonts w:ascii="Calibri" w:hAnsi="Calibri" w:cs="Calibri"/>
+          <w:sz w:val="24"/>
+          <w:szCs w:val="24"/>
+        </w:rPr>
+        <w:t>Cirqueira</w:t>
+      </w:r>
+      <w:proofErr w:type="spellEnd"/>
+      <w:r>
+        <w:rPr>
+          <w:rFonts w:ascii="Calibri" w:hAnsi="Calibri" w:cs="Calibri"/>
+          <w:sz w:val="24"/>
+          <w:szCs w:val="24"/>
+        </w:rPr>
+        <w:t xml:space="preserve"> et al., 2021).</w:t>
       </w:r>
     </w:p>
     <w:p>
@@ -467,7 +549,25 @@
           <w:sz w:val="24"/>
           <w:szCs w:val="24"/>
         </w:rPr>
-        <w:t>To develop a supervised machine learning model that predicts repeat purchase behavior using transactional features.</w:t>
+        <w:t xml:space="preserve">To develop a supervised machine learning model that predicts repeat purchase </w:t>
+      </w:r>
+      <w:proofErr w:type="spellStart"/>
+      <w:r>
+        <w:rPr>
+          <w:rFonts w:ascii="Calibri" w:hAnsi="Calibri" w:cs="Calibri"/>
+          <w:sz w:val="24"/>
+          <w:szCs w:val="24"/>
+        </w:rPr>
+        <w:t>behavior</w:t>
+      </w:r>
+      <w:proofErr w:type="spellEnd"/>
+      <w:r>
+        <w:rPr>
+          <w:rFonts w:ascii="Calibri" w:hAnsi="Calibri" w:cs="Calibri"/>
+          <w:sz w:val="24"/>
+          <w:szCs w:val="24"/>
+        </w:rPr>
+        <w:t xml:space="preserve"> using transactional features.</w:t>
       </w:r>
     </w:p>
     <w:p>
@@ -492,7 +592,25 @@
           <w:sz w:val="24"/>
           <w:szCs w:val="24"/>
         </w:rPr>
-        <w:t>To evaluate and compare the performance of multiple classification algorithms (e.g., Random Forest, XGBoost).</w:t>
+        <w:t xml:space="preserve">To evaluate and compare the performance of multiple classification algorithms (e.g., Random Forest, </w:t>
+      </w:r>
+      <w:proofErr w:type="spellStart"/>
+      <w:r>
+        <w:rPr>
+          <w:rFonts w:ascii="Calibri" w:hAnsi="Calibri" w:cs="Calibri"/>
+          <w:sz w:val="24"/>
+          <w:szCs w:val="24"/>
+        </w:rPr>
+        <w:t>XGBoost</w:t>
+      </w:r>
+      <w:proofErr w:type="spellEnd"/>
+      <w:r>
+        <w:rPr>
+          <w:rFonts w:ascii="Calibri" w:hAnsi="Calibri" w:cs="Calibri"/>
+          <w:sz w:val="24"/>
+          <w:szCs w:val="24"/>
+        </w:rPr>
+        <w:t>).</w:t>
       </w:r>
     </w:p>
     <w:p>
@@ -771,7 +889,25 @@
           <w:szCs w:val="24"/>
         </w:rPr>
         <w:lastRenderedPageBreak/>
-        <w:t>essential to customer-base valuation models because they are more predictable and cost-effective to serve, according to Fader and Hardie (2009). Businesses are focussing on individualized prediction instead of broad segmentation as acquisition costs increase and consumer behaviour becomes more fragmented (Cirqueira et al., 2021).</w:t>
+        <w:t>essential to customer-base valuation models because they are more predictable and cost-effective to serve, according to Fader and Hardie (2009). Businesses are focussing on individualized prediction instead of broad segmentation as acquisition costs increase and consumer behaviour becomes more fragmented (</w:t>
+      </w:r>
+      <w:proofErr w:type="spellStart"/>
+      <w:r>
+        <w:rPr>
+          <w:rFonts w:ascii="Calibri" w:hAnsi="Calibri" w:cs="Calibri"/>
+          <w:sz w:val="24"/>
+          <w:szCs w:val="24"/>
+        </w:rPr>
+        <w:t>Cirqueira</w:t>
+      </w:r>
+      <w:proofErr w:type="spellEnd"/>
+      <w:r>
+        <w:rPr>
+          <w:rFonts w:ascii="Calibri" w:hAnsi="Calibri" w:cs="Calibri"/>
+          <w:sz w:val="24"/>
+          <w:szCs w:val="24"/>
+        </w:rPr>
+        <w:t xml:space="preserve"> et al., 2021).</w:t>
       </w:r>
     </w:p>
     <w:p>
@@ -837,7 +973,25 @@
           <w:sz w:val="24"/>
           <w:szCs w:val="24"/>
         </w:rPr>
-        <w:t>A scalable alternative is provided by predictive analytics. Using transactional data like frequency, recency, and monetary value, supervised machine learning models can predict the likelihood of repeat purchases. In order to accommodate the data limitations of numerous e-commerce platforms, Cirqueira et al. (2021) offer a conceptual framework for predicting purchase behaviour that prioritises behavioural features over demographic ones. A larger trend in data-driven customer strategy is seen in this move from descriptive segmentation to predictive modelling.</w:t>
+        <w:t xml:space="preserve">A scalable alternative is provided by predictive analytics. Using transactional data like frequency, recency, and monetary value, supervised machine learning models can predict the likelihood of repeat purchases. In order to accommodate the data limitations of numerous e-commerce platforms, </w:t>
+      </w:r>
+      <w:proofErr w:type="spellStart"/>
+      <w:r>
+        <w:rPr>
+          <w:rFonts w:ascii="Calibri" w:hAnsi="Calibri" w:cs="Calibri"/>
+          <w:sz w:val="24"/>
+          <w:szCs w:val="24"/>
+        </w:rPr>
+        <w:t>Cirqueira</w:t>
+      </w:r>
+      <w:proofErr w:type="spellEnd"/>
+      <w:r>
+        <w:rPr>
+          <w:rFonts w:ascii="Calibri" w:hAnsi="Calibri" w:cs="Calibri"/>
+          <w:sz w:val="24"/>
+          <w:szCs w:val="24"/>
+        </w:rPr>
+        <w:t xml:space="preserve"> et al. (2021) offer a conceptual framework for predicting purchase behaviour that prioritises behavioural features over demographic ones. A larger trend in data-driven customer strategy is seen in this move from descriptive segmentation to predictive modelling.</w:t>
       </w:r>
     </w:p>
     <w:p>
@@ -913,7 +1067,25 @@
           <w:sz w:val="24"/>
           <w:szCs w:val="24"/>
         </w:rPr>
-        <w:t>Building on this basis, SHAP (SHapley Additive reasons) provides a more theoretically grounded method that delivers both local explanations for specific predictions and global insights into feature importance (Lundberg and Lee, 2017; Molnar, 2022). In contrast to LIME, SHAP is based on cooperative game theory, which ensures consistency and fairness in the computation of feature contributions (Lundberg and Lee, 2017).</w:t>
+        <w:t>Building on this basis, SHAP (</w:t>
+      </w:r>
+      <w:proofErr w:type="spellStart"/>
+      <w:r>
+        <w:rPr>
+          <w:rFonts w:ascii="Calibri" w:hAnsi="Calibri" w:cs="Calibri"/>
+          <w:sz w:val="24"/>
+          <w:szCs w:val="24"/>
+        </w:rPr>
+        <w:t>SHapley</w:t>
+      </w:r>
+      <w:proofErr w:type="spellEnd"/>
+      <w:r>
+        <w:rPr>
+          <w:rFonts w:ascii="Calibri" w:hAnsi="Calibri" w:cs="Calibri"/>
+          <w:sz w:val="24"/>
+          <w:szCs w:val="24"/>
+        </w:rPr>
+        <w:t xml:space="preserve"> Additive reasons) provides a more theoretically grounded method that delivers both local explanations for specific predictions and global insights into feature importance (Lundberg and Lee, 2017; Molnar, 2022). In contrast to LIME, SHAP is based on cooperative game theory, which ensures consistency and fairness in the computation of feature contributions (Lundberg and Lee, 2017).</w:t>
       </w:r>
     </w:p>
     <w:p>
@@ -1030,16 +1202,44 @@
           <w:sz w:val="24"/>
           <w:szCs w:val="24"/>
         </w:rPr>
-        <w:t xml:space="preserve">There are still a number of gaps in the current body of study despite these contributions. Many studies still use segmentation methods like rule-based classification or demographic clustering, which are either static or overly simplistic (Jeon et al., 2021; Cirqueira et al., 2021). The temporal and behavioural complexity of online buying, where consumer preferences and engagement patterns change quickly, is frequently missed by these methods. Such segmentation may result in misclassification and </w:t>
-      </w:r>
-      <w:r>
-        <w:rPr>
-          <w:rFonts w:ascii="Calibri" w:hAnsi="Calibri" w:cs="Calibri"/>
-          <w:sz w:val="24"/>
-          <w:szCs w:val="24"/>
-        </w:rPr>
-        <w:t>missed oppertunities</w:t>
-      </w:r>
+        <w:t xml:space="preserve">There are still a number of gaps in the current body of study despite these contributions. Many studies still use segmentation methods like rule-based classification or demographic clustering, which are either static or overly simplistic (Jeon et al., 2021; </w:t>
+      </w:r>
+      <w:proofErr w:type="spellStart"/>
+      <w:r>
+        <w:rPr>
+          <w:rFonts w:ascii="Calibri" w:hAnsi="Calibri" w:cs="Calibri"/>
+          <w:sz w:val="24"/>
+          <w:szCs w:val="24"/>
+        </w:rPr>
+        <w:t>Cirqueira</w:t>
+      </w:r>
+      <w:proofErr w:type="spellEnd"/>
+      <w:r>
+        <w:rPr>
+          <w:rFonts w:ascii="Calibri" w:hAnsi="Calibri" w:cs="Calibri"/>
+          <w:sz w:val="24"/>
+          <w:szCs w:val="24"/>
+        </w:rPr>
+        <w:t xml:space="preserve"> et al., 2021). The temporal and behavioural complexity of online buying, where consumer preferences and engagement patterns change quickly, is frequently missed by these methods. Such segmentation may result in misclassification and </w:t>
+      </w:r>
+      <w:r>
+        <w:rPr>
+          <w:rFonts w:ascii="Calibri" w:hAnsi="Calibri" w:cs="Calibri"/>
+          <w:sz w:val="24"/>
+          <w:szCs w:val="24"/>
+        </w:rPr>
+        <w:t xml:space="preserve">missed </w:t>
+      </w:r>
+      <w:proofErr w:type="spellStart"/>
+      <w:r>
+        <w:rPr>
+          <w:rFonts w:ascii="Calibri" w:hAnsi="Calibri" w:cs="Calibri"/>
+          <w:sz w:val="24"/>
+          <w:szCs w:val="24"/>
+        </w:rPr>
+        <w:t>oppertunities</w:t>
+      </w:r>
+      <w:proofErr w:type="spellEnd"/>
       <w:r>
         <w:rPr>
           <w:rFonts w:ascii="Calibri" w:hAnsi="Calibri" w:cs="Calibri"/>
@@ -1071,7 +1271,25 @@
           <w:sz w:val="24"/>
           <w:szCs w:val="24"/>
         </w:rPr>
-        <w:t>Neural networks and XGBoost are examples of black-box models that are commonly used without giving enough thought to how non-technical stakeholders might comprehend and use their outputs (Henninger &amp; Strobl, 2024).</w:t>
+        <w:t xml:space="preserve">Neural networks and </w:t>
+      </w:r>
+      <w:proofErr w:type="spellStart"/>
+      <w:r>
+        <w:rPr>
+          <w:rFonts w:ascii="Calibri" w:hAnsi="Calibri" w:cs="Calibri"/>
+          <w:sz w:val="24"/>
+          <w:szCs w:val="24"/>
+        </w:rPr>
+        <w:t>XGBoost</w:t>
+      </w:r>
+      <w:proofErr w:type="spellEnd"/>
+      <w:r>
+        <w:rPr>
+          <w:rFonts w:ascii="Calibri" w:hAnsi="Calibri" w:cs="Calibri"/>
+          <w:sz w:val="24"/>
+          <w:szCs w:val="24"/>
+        </w:rPr>
+        <w:t xml:space="preserve"> are examples of black-box models that are commonly used without giving enough thought to how non-technical stakeholders might comprehend and use their outputs (Henninger &amp; Strobl, 2024).</w:t>
       </w:r>
       <w:r>
         <w:rPr>
@@ -1192,7 +1410,25 @@
           <w:sz w:val="24"/>
           <w:szCs w:val="24"/>
         </w:rPr>
-        <w:t>(Visani et al., 2020)</w:t>
+        <w:t>(</w:t>
+      </w:r>
+      <w:proofErr w:type="spellStart"/>
+      <w:r>
+        <w:rPr>
+          <w:rFonts w:ascii="Calibri" w:hAnsi="Calibri" w:cs="Calibri"/>
+          <w:sz w:val="24"/>
+          <w:szCs w:val="24"/>
+        </w:rPr>
+        <w:t>Visani</w:t>
+      </w:r>
+      <w:proofErr w:type="spellEnd"/>
+      <w:r>
+        <w:rPr>
+          <w:rFonts w:ascii="Calibri" w:hAnsi="Calibri" w:cs="Calibri"/>
+          <w:sz w:val="24"/>
+          <w:szCs w:val="24"/>
+        </w:rPr>
+        <w:t xml:space="preserve"> et al., 2020)</w:t>
       </w:r>
       <w:r>
         <w:rPr>
@@ -1323,24 +1559,60 @@
           <w:sz w:val="24"/>
           <w:szCs w:val="24"/>
         </w:rPr>
-        <w:t>By developing a supervised machine learning framework especially designed to predict repeat purchases in e-commerce, this study fills in the gaps that have been found. It uses transactional variables, like purchase frequency, recency, and monetary value, to capture scalable and dynamic behavioural signals, in contrast to segmentation-based methods (Cirqueira et al., 2021). This makes it possible to target high-value customers more precisely and encourages proactive retention strategies.</w:t>
-      </w:r>
-    </w:p>
-    <w:p>
-      <w:pPr>
-        <w:rPr>
-          <w:rFonts w:ascii="Calibri" w:hAnsi="Calibri" w:cs="Calibri"/>
-          <w:sz w:val="24"/>
-          <w:szCs w:val="24"/>
-        </w:rPr>
-      </w:pPr>
-      <w:r>
-        <w:rPr>
-          <w:rFonts w:ascii="Calibri" w:hAnsi="Calibri" w:cs="Calibri"/>
-          <w:sz w:val="24"/>
-          <w:szCs w:val="24"/>
-        </w:rPr>
-        <w:t>The study evaluates several classification techniques, such as XGBoost, Random Forest, Decision Tree, and Logistic Regression</w:t>
+        <w:t>By developing a supervised machine learning framework especially designed to predict repeat purchases in e-commerce, this study fills in the gaps that have been found. It uses transactional variables, like purchase frequency, recency, and monetary value, to capture scalable and dynamic behavioural signals, in contrast to segmentation-based methods (</w:t>
+      </w:r>
+      <w:proofErr w:type="spellStart"/>
+      <w:r>
+        <w:rPr>
+          <w:rFonts w:ascii="Calibri" w:hAnsi="Calibri" w:cs="Calibri"/>
+          <w:sz w:val="24"/>
+          <w:szCs w:val="24"/>
+        </w:rPr>
+        <w:t>Cirqueira</w:t>
+      </w:r>
+      <w:proofErr w:type="spellEnd"/>
+      <w:r>
+        <w:rPr>
+          <w:rFonts w:ascii="Calibri" w:hAnsi="Calibri" w:cs="Calibri"/>
+          <w:sz w:val="24"/>
+          <w:szCs w:val="24"/>
+        </w:rPr>
+        <w:t xml:space="preserve"> et al., 2021). This makes it possible to target high-value customers more precisely and encourages proactive retention strategies.</w:t>
+      </w:r>
+    </w:p>
+    <w:p>
+      <w:pPr>
+        <w:rPr>
+          <w:rFonts w:ascii="Calibri" w:hAnsi="Calibri" w:cs="Calibri"/>
+          <w:sz w:val="24"/>
+          <w:szCs w:val="24"/>
+        </w:rPr>
+      </w:pPr>
+      <w:r>
+        <w:rPr>
+          <w:rFonts w:ascii="Calibri" w:hAnsi="Calibri" w:cs="Calibri"/>
+          <w:sz w:val="24"/>
+          <w:szCs w:val="24"/>
+        </w:rPr>
+        <w:t xml:space="preserve">The study evaluates several classification techniques, such as </w:t>
+      </w:r>
+      <w:proofErr w:type="spellStart"/>
+      <w:r>
+        <w:rPr>
+          <w:rFonts w:ascii="Calibri" w:hAnsi="Calibri" w:cs="Calibri"/>
+          <w:sz w:val="24"/>
+          <w:szCs w:val="24"/>
+        </w:rPr>
+        <w:t>XGBoost</w:t>
+      </w:r>
+      <w:proofErr w:type="spellEnd"/>
+      <w:r>
+        <w:rPr>
+          <w:rFonts w:ascii="Calibri" w:hAnsi="Calibri" w:cs="Calibri"/>
+          <w:sz w:val="24"/>
+          <w:szCs w:val="24"/>
+        </w:rPr>
+        <w:t>, Random Forest, Decision Tree, and Logistic Regression</w:t>
       </w:r>
       <w:r>
         <w:t xml:space="preserve"> </w:t>
@@ -1620,7 +1892,61 @@
           <w:sz w:val="24"/>
           <w:szCs w:val="24"/>
         </w:rPr>
-        <w:t>Exploratory analysis of anonymised transactional records was carried out during the data understanding step. Avg_days_between_purchases, total_spend_per_customer, and category_diversity are important behavioural features that were found to be possibly predictive. To guide preprocessing choices, descriptive statistics, class imbalance, and missingness patterns were evaluated.</w:t>
+        <w:t xml:space="preserve">Exploratory analysis of anonymised transactional records was carried out during the data understanding step. </w:t>
+      </w:r>
+      <w:proofErr w:type="spellStart"/>
+      <w:r>
+        <w:rPr>
+          <w:rFonts w:ascii="Calibri" w:hAnsi="Calibri" w:cs="Calibri"/>
+          <w:sz w:val="24"/>
+          <w:szCs w:val="24"/>
+        </w:rPr>
+        <w:t>Avg_days_between_purchases</w:t>
+      </w:r>
+      <w:proofErr w:type="spellEnd"/>
+      <w:r>
+        <w:rPr>
+          <w:rFonts w:ascii="Calibri" w:hAnsi="Calibri" w:cs="Calibri"/>
+          <w:sz w:val="24"/>
+          <w:szCs w:val="24"/>
+        </w:rPr>
+        <w:t xml:space="preserve">, </w:t>
+      </w:r>
+      <w:proofErr w:type="spellStart"/>
+      <w:r>
+        <w:rPr>
+          <w:rFonts w:ascii="Calibri" w:hAnsi="Calibri" w:cs="Calibri"/>
+          <w:sz w:val="24"/>
+          <w:szCs w:val="24"/>
+        </w:rPr>
+        <w:t>total_spend_per_customer</w:t>
+      </w:r>
+      <w:proofErr w:type="spellEnd"/>
+      <w:r>
+        <w:rPr>
+          <w:rFonts w:ascii="Calibri" w:hAnsi="Calibri" w:cs="Calibri"/>
+          <w:sz w:val="24"/>
+          <w:szCs w:val="24"/>
+        </w:rPr>
+        <w:t xml:space="preserve">, and </w:t>
+      </w:r>
+      <w:proofErr w:type="spellStart"/>
+      <w:r>
+        <w:rPr>
+          <w:rFonts w:ascii="Calibri" w:hAnsi="Calibri" w:cs="Calibri"/>
+          <w:sz w:val="24"/>
+          <w:szCs w:val="24"/>
+        </w:rPr>
+        <w:t>category_diversity</w:t>
+      </w:r>
+      <w:proofErr w:type="spellEnd"/>
+      <w:r>
+        <w:rPr>
+          <w:rFonts w:ascii="Calibri" w:hAnsi="Calibri" w:cs="Calibri"/>
+          <w:sz w:val="24"/>
+          <w:szCs w:val="24"/>
+        </w:rPr>
+        <w:t xml:space="preserve"> are important behavioural features that were found to be possibly predictive. To guide preprocessing choices, descriptive statistics, class imbalance, and missingness patterns were evaluated.</w:t>
       </w:r>
     </w:p>
     <w:p>
@@ -1711,7 +2037,43 @@
           <w:szCs w:val="24"/>
         </w:rPr>
         <w:lastRenderedPageBreak/>
-        <w:t>Four classifiers such as Logistic Regression, Decision Tree, Random Forest, and XGBoost were benchmarked throughout the modelling phase. GridSearchCV was applied to tune hyperparameters using F1-score as the main metric and 5-fold cross-validation. With an F1-score of 0.988 and ROC-AUC of 0.991, the Decision Tree was ultimately chosen for final implementation because it balanced performance and interpretability.</w:t>
+        <w:t xml:space="preserve">Four classifiers such as Logistic Regression, Decision Tree, Random Forest, and </w:t>
+      </w:r>
+      <w:proofErr w:type="spellStart"/>
+      <w:r>
+        <w:rPr>
+          <w:rFonts w:ascii="Calibri" w:hAnsi="Calibri" w:cs="Calibri"/>
+          <w:sz w:val="24"/>
+          <w:szCs w:val="24"/>
+        </w:rPr>
+        <w:t>XGBoost</w:t>
+      </w:r>
+      <w:proofErr w:type="spellEnd"/>
+      <w:r>
+        <w:rPr>
+          <w:rFonts w:ascii="Calibri" w:hAnsi="Calibri" w:cs="Calibri"/>
+          <w:sz w:val="24"/>
+          <w:szCs w:val="24"/>
+        </w:rPr>
+        <w:t xml:space="preserve"> were benchmarked throughout the modelling phase. </w:t>
+      </w:r>
+      <w:proofErr w:type="spellStart"/>
+      <w:r>
+        <w:rPr>
+          <w:rFonts w:ascii="Calibri" w:hAnsi="Calibri" w:cs="Calibri"/>
+          <w:sz w:val="24"/>
+          <w:szCs w:val="24"/>
+        </w:rPr>
+        <w:t>GridSearchCV</w:t>
+      </w:r>
+      <w:proofErr w:type="spellEnd"/>
+      <w:r>
+        <w:rPr>
+          <w:rFonts w:ascii="Calibri" w:hAnsi="Calibri" w:cs="Calibri"/>
+          <w:sz w:val="24"/>
+          <w:szCs w:val="24"/>
+        </w:rPr>
+        <w:t xml:space="preserve"> was applied to tune hyperparameters using F1-score as the main metric and 5-fold cross-validation. With an F1-score of 0.988 and ROC-AUC of 0.991, the Decision Tree was ultimately chosen for final implementation because it balanced performance and interpretability.</w:t>
       </w:r>
     </w:p>
     <w:p>
@@ -1811,13 +2173,23 @@
           <w:szCs w:val="24"/>
         </w:rPr>
       </w:pPr>
-      <w:r>
-        <w:rPr>
-          <w:rFonts w:ascii="Calibri" w:hAnsi="Calibri" w:cs="Calibri"/>
-          <w:sz w:val="24"/>
-          <w:szCs w:val="24"/>
-        </w:rPr>
-        <w:t>Jupyter Notebook was used to implement this project in Python, including iterative development, inline visualization, and transparent documentation.</w:t>
+      <w:proofErr w:type="spellStart"/>
+      <w:r>
+        <w:rPr>
+          <w:rFonts w:ascii="Calibri" w:hAnsi="Calibri" w:cs="Calibri"/>
+          <w:sz w:val="24"/>
+          <w:szCs w:val="24"/>
+        </w:rPr>
+        <w:t>Jupyter</w:t>
+      </w:r>
+      <w:proofErr w:type="spellEnd"/>
+      <w:r>
+        <w:rPr>
+          <w:rFonts w:ascii="Calibri" w:hAnsi="Calibri" w:cs="Calibri"/>
+          <w:sz w:val="24"/>
+          <w:szCs w:val="24"/>
+        </w:rPr>
+        <w:t xml:space="preserve"> Notebook was used to implement this project in Python, including iterative development, inline visualization, and transparent documentation.</w:t>
       </w:r>
       <w:r>
         <w:rPr>
@@ -1850,7 +2222,43 @@
           <w:sz w:val="24"/>
           <w:szCs w:val="24"/>
         </w:rPr>
-        <w:t>Scikit-learn was used to develop baseline models such Random Forest, Decision Tree, and Logistic Regression, Seaborn and matplotlib were used for visual diagnostics, and pandas and NumPy were used for data manipulation. A comparison of XGBoost's performance was also evaluated. Every model was assessed using precision, recall, F1-score, and ROC-AUC after being trained on a SMOTE-balanced dataset. GridSearchCV was used for hyperparameter tuning, and a tuned Decision Tree classifier was chosen as the final model based on its balanced interpretability and performance.</w:t>
+        <w:t xml:space="preserve">Scikit-learn was used to develop baseline models such Random Forest, Decision Tree, and Logistic Regression, Seaborn and matplotlib were used for visual diagnostics, and pandas and NumPy were used for data manipulation. A comparison of </w:t>
+      </w:r>
+      <w:proofErr w:type="spellStart"/>
+      <w:r>
+        <w:rPr>
+          <w:rFonts w:ascii="Calibri" w:hAnsi="Calibri" w:cs="Calibri"/>
+          <w:sz w:val="24"/>
+          <w:szCs w:val="24"/>
+        </w:rPr>
+        <w:t>XGBoost's</w:t>
+      </w:r>
+      <w:proofErr w:type="spellEnd"/>
+      <w:r>
+        <w:rPr>
+          <w:rFonts w:ascii="Calibri" w:hAnsi="Calibri" w:cs="Calibri"/>
+          <w:sz w:val="24"/>
+          <w:szCs w:val="24"/>
+        </w:rPr>
+        <w:t xml:space="preserve"> performance was also evaluated. Every model was assessed using precision, recall, F1-score, and ROC-AUC after being trained on a SMOTE-balanced dataset. </w:t>
+      </w:r>
+      <w:proofErr w:type="spellStart"/>
+      <w:r>
+        <w:rPr>
+          <w:rFonts w:ascii="Calibri" w:hAnsi="Calibri" w:cs="Calibri"/>
+          <w:sz w:val="24"/>
+          <w:szCs w:val="24"/>
+        </w:rPr>
+        <w:t>GridSearchCV</w:t>
+      </w:r>
+      <w:proofErr w:type="spellEnd"/>
+      <w:r>
+        <w:rPr>
+          <w:rFonts w:ascii="Calibri" w:hAnsi="Calibri" w:cs="Calibri"/>
+          <w:sz w:val="24"/>
+          <w:szCs w:val="24"/>
+        </w:rPr>
+        <w:t xml:space="preserve"> was used for hyperparameter tuning, and a tuned Decision Tree classifier was chosen as the final model based on its balanced interpretability and performance.</w:t>
       </w:r>
     </w:p>
     <w:p>
@@ -1883,7 +2291,25 @@
           <w:sz w:val="24"/>
           <w:szCs w:val="24"/>
         </w:rPr>
-        <w:t>To produce local explanations, LIMETabularExplainer was used on three strategic test cases such as correctly classified, misclassified and, edge case. Class-specific and global feature importance plots, including waterfall charts and aggregated rankings, were created using SHAP. Transparent communication of model behaviour to non-technical stakeholders was made possible by these technologies.</w:t>
+        <w:t xml:space="preserve">To produce local explanations, </w:t>
+      </w:r>
+      <w:proofErr w:type="spellStart"/>
+      <w:r>
+        <w:rPr>
+          <w:rFonts w:ascii="Calibri" w:hAnsi="Calibri" w:cs="Calibri"/>
+          <w:sz w:val="24"/>
+          <w:szCs w:val="24"/>
+        </w:rPr>
+        <w:t>LIMETabularExplainer</w:t>
+      </w:r>
+      <w:proofErr w:type="spellEnd"/>
+      <w:r>
+        <w:rPr>
+          <w:rFonts w:ascii="Calibri" w:hAnsi="Calibri" w:cs="Calibri"/>
+          <w:sz w:val="24"/>
+          <w:szCs w:val="24"/>
+        </w:rPr>
+        <w:t xml:space="preserve"> was used on three strategic test cases such as correctly classified, misclassified and, edge case. Class-specific and global feature importance plots, including waterfall charts and aggregated rankings, were created using SHAP. Transparent communication of model behaviour to non-technical stakeholders was made possible by these technologies.</w:t>
       </w:r>
     </w:p>
     <w:p>
@@ -1974,7 +2400,25 @@
           <w:sz w:val="24"/>
           <w:szCs w:val="24"/>
         </w:rPr>
-        <w:t>The Description and CustomerID fields both had missing values</w:t>
+        <w:t xml:space="preserve">The Description and </w:t>
+      </w:r>
+      <w:proofErr w:type="spellStart"/>
+      <w:r>
+        <w:rPr>
+          <w:rFonts w:ascii="Calibri" w:hAnsi="Calibri" w:cs="Calibri"/>
+          <w:sz w:val="24"/>
+          <w:szCs w:val="24"/>
+        </w:rPr>
+        <w:t>CustomerID</w:t>
+      </w:r>
+      <w:proofErr w:type="spellEnd"/>
+      <w:r>
+        <w:rPr>
+          <w:rFonts w:ascii="Calibri" w:hAnsi="Calibri" w:cs="Calibri"/>
+          <w:sz w:val="24"/>
+          <w:szCs w:val="24"/>
+        </w:rPr>
+        <w:t xml:space="preserve"> fields both had missing values</w:t>
       </w:r>
       <w:r>
         <w:rPr>
@@ -1990,7 +2434,25 @@
           <w:sz w:val="24"/>
           <w:szCs w:val="24"/>
         </w:rPr>
-        <w:t>the latter was missing in almost 25% of the records. Rows without CustomerID were eliminated because customer-level modelling was essential to this project. To ensure data integrity, 10,147 completely duplicate rows were found and eliminated. Both Quantity and UnitPrice had extreme outliers, with values ranging from -80,995 to 80,995 and -11,062.06 to 38,970.00, respectively, according to summary statistics. Histograms and boxplots were used to visualise these anomalies (Figure 1), demonstrating the presence of extreme values and heavy skewness.</w:t>
+        <w:t xml:space="preserve">the latter was missing in almost 25% of the records. Rows without </w:t>
+      </w:r>
+      <w:proofErr w:type="spellStart"/>
+      <w:r>
+        <w:rPr>
+          <w:rFonts w:ascii="Calibri" w:hAnsi="Calibri" w:cs="Calibri"/>
+          <w:sz w:val="24"/>
+          <w:szCs w:val="24"/>
+        </w:rPr>
+        <w:t>CustomerID</w:t>
+      </w:r>
+      <w:proofErr w:type="spellEnd"/>
+      <w:r>
+        <w:rPr>
+          <w:rFonts w:ascii="Calibri" w:hAnsi="Calibri" w:cs="Calibri"/>
+          <w:sz w:val="24"/>
+          <w:szCs w:val="24"/>
+        </w:rPr>
+        <w:t xml:space="preserve"> were eliminated because customer-level modelling was essential to this project. To ensure data integrity, 10,147 completely duplicate rows were found and eliminated. Both Quantity and UnitPrice had extreme outliers, with values ranging from -80,995 to 80,995 and -11,062.06 to 38,970.00, respectively, according to summary statistics. Histograms and boxplots were used to visualise these anomalies (Figure 1), demonstrating the presence of extreme values and heavy skewness.</w:t>
       </w:r>
     </w:p>
     <w:p>
@@ -2481,7 +2943,43 @@
           <w:sz w:val="24"/>
           <w:szCs w:val="24"/>
         </w:rPr>
-        <w:t>Dropping rows with missing CustomerID, changing identifiers to the proper data types, and parsing InvoiceDate into datetime format were among the first cleaning steps. To eliminate returns and data entry errors, invalid transactions</w:t>
+        <w:t xml:space="preserve">Dropping rows with missing </w:t>
+      </w:r>
+      <w:proofErr w:type="spellStart"/>
+      <w:r>
+        <w:rPr>
+          <w:rFonts w:ascii="Calibri" w:hAnsi="Calibri" w:cs="Calibri"/>
+          <w:sz w:val="24"/>
+          <w:szCs w:val="24"/>
+        </w:rPr>
+        <w:t>CustomerID</w:t>
+      </w:r>
+      <w:proofErr w:type="spellEnd"/>
+      <w:r>
+        <w:rPr>
+          <w:rFonts w:ascii="Calibri" w:hAnsi="Calibri" w:cs="Calibri"/>
+          <w:sz w:val="24"/>
+          <w:szCs w:val="24"/>
+        </w:rPr>
+        <w:t xml:space="preserve">, changing identifiers to the proper data types, and parsing </w:t>
+      </w:r>
+      <w:proofErr w:type="spellStart"/>
+      <w:r>
+        <w:rPr>
+          <w:rFonts w:ascii="Calibri" w:hAnsi="Calibri" w:cs="Calibri"/>
+          <w:sz w:val="24"/>
+          <w:szCs w:val="24"/>
+        </w:rPr>
+        <w:t>InvoiceDate</w:t>
+      </w:r>
+      <w:proofErr w:type="spellEnd"/>
+      <w:r>
+        <w:rPr>
+          <w:rFonts w:ascii="Calibri" w:hAnsi="Calibri" w:cs="Calibri"/>
+          <w:sz w:val="24"/>
+          <w:szCs w:val="24"/>
+        </w:rPr>
+        <w:t xml:space="preserve"> into datetime format were among the first cleaning steps. To eliminate returns and data entry errors, invalid transactions</w:t>
       </w:r>
       <w:r>
         <w:rPr>
@@ -2612,7 +3110,133 @@
           <w:sz w:val="24"/>
           <w:szCs w:val="24"/>
         </w:rPr>
-        <w:t>Transactional data was aggregated to produce customer-level features. These included the average number of days between purchases (avg_days_between_purchases), the total amount of money spent on purchases (total_spend_per_customer), the quantity of distinct product codes (unique_products_purchased), the number of unique product descriptions purchased (category_diversity), and the amount of time since the customer's first purchase (time_since_first_purchase). Average_order_value, purchase_freq_90d, and recency_days are other features that were explored but were not included in the final modelling because of their lower mutual information scores and strong correlation with selected features. As shown in Figures 2 and 3, feature selection was guided by both multicollinearity diagnostics and predictive relevance.</w:t>
+        <w:t>Transactional data was aggregated to produce customer-level features. These included the average number of days between purchases (</w:t>
+      </w:r>
+      <w:proofErr w:type="spellStart"/>
+      <w:r>
+        <w:rPr>
+          <w:rFonts w:ascii="Calibri" w:hAnsi="Calibri" w:cs="Calibri"/>
+          <w:sz w:val="24"/>
+          <w:szCs w:val="24"/>
+        </w:rPr>
+        <w:t>avg_days_between_purchases</w:t>
+      </w:r>
+      <w:proofErr w:type="spellEnd"/>
+      <w:r>
+        <w:rPr>
+          <w:rFonts w:ascii="Calibri" w:hAnsi="Calibri" w:cs="Calibri"/>
+          <w:sz w:val="24"/>
+          <w:szCs w:val="24"/>
+        </w:rPr>
+        <w:t>), the total amount of money spent on purchases (</w:t>
+      </w:r>
+      <w:proofErr w:type="spellStart"/>
+      <w:r>
+        <w:rPr>
+          <w:rFonts w:ascii="Calibri" w:hAnsi="Calibri" w:cs="Calibri"/>
+          <w:sz w:val="24"/>
+          <w:szCs w:val="24"/>
+        </w:rPr>
+        <w:t>total_spend_per_customer</w:t>
+      </w:r>
+      <w:proofErr w:type="spellEnd"/>
+      <w:r>
+        <w:rPr>
+          <w:rFonts w:ascii="Calibri" w:hAnsi="Calibri" w:cs="Calibri"/>
+          <w:sz w:val="24"/>
+          <w:szCs w:val="24"/>
+        </w:rPr>
+        <w:t>), the quantity of distinct product codes (</w:t>
+      </w:r>
+      <w:proofErr w:type="spellStart"/>
+      <w:r>
+        <w:rPr>
+          <w:rFonts w:ascii="Calibri" w:hAnsi="Calibri" w:cs="Calibri"/>
+          <w:sz w:val="24"/>
+          <w:szCs w:val="24"/>
+        </w:rPr>
+        <w:t>unique_products_purchased</w:t>
+      </w:r>
+      <w:proofErr w:type="spellEnd"/>
+      <w:r>
+        <w:rPr>
+          <w:rFonts w:ascii="Calibri" w:hAnsi="Calibri" w:cs="Calibri"/>
+          <w:sz w:val="24"/>
+          <w:szCs w:val="24"/>
+        </w:rPr>
+        <w:t>), the number of unique product descriptions purchased (</w:t>
+      </w:r>
+      <w:proofErr w:type="spellStart"/>
+      <w:r>
+        <w:rPr>
+          <w:rFonts w:ascii="Calibri" w:hAnsi="Calibri" w:cs="Calibri"/>
+          <w:sz w:val="24"/>
+          <w:szCs w:val="24"/>
+        </w:rPr>
+        <w:t>category_diversity</w:t>
+      </w:r>
+      <w:proofErr w:type="spellEnd"/>
+      <w:r>
+        <w:rPr>
+          <w:rFonts w:ascii="Calibri" w:hAnsi="Calibri" w:cs="Calibri"/>
+          <w:sz w:val="24"/>
+          <w:szCs w:val="24"/>
+        </w:rPr>
+        <w:t>), and the amount of time since the customer's first purchase (</w:t>
+      </w:r>
+      <w:proofErr w:type="spellStart"/>
+      <w:r>
+        <w:rPr>
+          <w:rFonts w:ascii="Calibri" w:hAnsi="Calibri" w:cs="Calibri"/>
+          <w:sz w:val="24"/>
+          <w:szCs w:val="24"/>
+        </w:rPr>
+        <w:t>time_since_first_purchase</w:t>
+      </w:r>
+      <w:proofErr w:type="spellEnd"/>
+      <w:r>
+        <w:rPr>
+          <w:rFonts w:ascii="Calibri" w:hAnsi="Calibri" w:cs="Calibri"/>
+          <w:sz w:val="24"/>
+          <w:szCs w:val="24"/>
+        </w:rPr>
+        <w:t xml:space="preserve">). </w:t>
+      </w:r>
+      <w:proofErr w:type="spellStart"/>
+      <w:r>
+        <w:rPr>
+          <w:rFonts w:ascii="Calibri" w:hAnsi="Calibri" w:cs="Calibri"/>
+          <w:sz w:val="24"/>
+          <w:szCs w:val="24"/>
+        </w:rPr>
+        <w:t>Average_order_value</w:t>
+      </w:r>
+      <w:proofErr w:type="spellEnd"/>
+      <w:r>
+        <w:rPr>
+          <w:rFonts w:ascii="Calibri" w:hAnsi="Calibri" w:cs="Calibri"/>
+          <w:sz w:val="24"/>
+          <w:szCs w:val="24"/>
+        </w:rPr>
+        <w:t xml:space="preserve">, purchase_freq_90d, and </w:t>
+      </w:r>
+      <w:proofErr w:type="spellStart"/>
+      <w:r>
+        <w:rPr>
+          <w:rFonts w:ascii="Calibri" w:hAnsi="Calibri" w:cs="Calibri"/>
+          <w:sz w:val="24"/>
+          <w:szCs w:val="24"/>
+        </w:rPr>
+        <w:t>recency_days</w:t>
+      </w:r>
+      <w:proofErr w:type="spellEnd"/>
+      <w:r>
+        <w:rPr>
+          <w:rFonts w:ascii="Calibri" w:hAnsi="Calibri" w:cs="Calibri"/>
+          <w:sz w:val="24"/>
+          <w:szCs w:val="24"/>
+        </w:rPr>
+        <w:t xml:space="preserve"> are other features that were explored but were not included in the final modelling because of their lower mutual information scores and strong correlation with selected features. As shown in Figures 2 and 3, feature selection was guided by both multicollinearity diagnostics and predictive relevance.</w:t>
       </w:r>
     </w:p>
     <w:p>
@@ -2931,7 +3555,25 @@
           <w:sz w:val="24"/>
           <w:szCs w:val="24"/>
         </w:rPr>
-        <w:t>Customers who made more than one purchase were classified as repeat buyers in the target variable, repeat_purchase, which was defined as a binary indicator. Resampling was required since the resulting class distribution was slightly imbalanced (65.5% repeat vs. 34.5% non-repeat).</w:t>
+        <w:t xml:space="preserve">Customers who made more than one purchase were classified as repeat buyers in the target variable, </w:t>
+      </w:r>
+      <w:proofErr w:type="spellStart"/>
+      <w:r>
+        <w:rPr>
+          <w:rFonts w:ascii="Calibri" w:hAnsi="Calibri" w:cs="Calibri"/>
+          <w:sz w:val="24"/>
+          <w:szCs w:val="24"/>
+        </w:rPr>
+        <w:t>repeat_purchase</w:t>
+      </w:r>
+      <w:proofErr w:type="spellEnd"/>
+      <w:r>
+        <w:rPr>
+          <w:rFonts w:ascii="Calibri" w:hAnsi="Calibri" w:cs="Calibri"/>
+          <w:sz w:val="24"/>
+          <w:szCs w:val="24"/>
+        </w:rPr>
+        <w:t>, which was defined as a binary indicator. Resampling was required since the resulting class distribution was slightly imbalanced (65.5% repeat vs. 34.5% non-repeat).</w:t>
       </w:r>
     </w:p>
     <w:p>
@@ -3047,7 +3689,25 @@
           <w:sz w:val="24"/>
           <w:szCs w:val="24"/>
         </w:rPr>
-        <w:t>To standardize input ranges, selected features were scaled using StandardScaler. Class proportions were maintained through a stratified train-test split, while minority class instances were synthetically balanced in the training set using SMOTE.</w:t>
+        <w:t xml:space="preserve">To standardize input ranges, selected features were scaled using </w:t>
+      </w:r>
+      <w:proofErr w:type="spellStart"/>
+      <w:r>
+        <w:rPr>
+          <w:rFonts w:ascii="Calibri" w:hAnsi="Calibri" w:cs="Calibri"/>
+          <w:sz w:val="24"/>
+          <w:szCs w:val="24"/>
+        </w:rPr>
+        <w:t>StandardScaler</w:t>
+      </w:r>
+      <w:proofErr w:type="spellEnd"/>
+      <w:r>
+        <w:rPr>
+          <w:rFonts w:ascii="Calibri" w:hAnsi="Calibri" w:cs="Calibri"/>
+          <w:sz w:val="24"/>
+          <w:szCs w:val="24"/>
+        </w:rPr>
+        <w:t>. Class proportions were maintained through a stratified train-test split, while minority class instances were synthetically balanced in the training set using SMOTE.</w:t>
       </w:r>
       <w:r>
         <w:rPr>
@@ -3082,6 +3742,978 @@
         </w:rPr>
         <w:t>In order to enable robust model training and interpretable evaluation in later stages, this preparation pipeline made sure that the final dataset was clean, balanced, and feature rich.</w:t>
       </w:r>
+    </w:p>
+    <w:p>
+      <w:pPr>
+        <w:rPr>
+          <w:rFonts w:ascii="Calibri" w:hAnsi="Calibri" w:cs="Calibri"/>
+          <w:b/>
+          <w:bCs/>
+          <w:sz w:val="32"/>
+          <w:szCs w:val="32"/>
+        </w:rPr>
+      </w:pPr>
+      <w:r>
+        <w:rPr>
+          <w:rFonts w:ascii="Calibri" w:hAnsi="Calibri" w:cs="Calibri"/>
+          <w:b/>
+          <w:bCs/>
+          <w:sz w:val="32"/>
+          <w:szCs w:val="32"/>
+        </w:rPr>
+        <w:t>8</w:t>
+      </w:r>
+      <w:r>
+        <w:rPr>
+          <w:rFonts w:ascii="Calibri" w:hAnsi="Calibri" w:cs="Calibri"/>
+          <w:b/>
+          <w:bCs/>
+          <w:sz w:val="32"/>
+          <w:szCs w:val="32"/>
+        </w:rPr>
+        <w:t>. Machine Learning Implementation</w:t>
+      </w:r>
+    </w:p>
+    <w:p>
+      <w:pPr>
+        <w:rPr>
+          <w:rFonts w:ascii="Calibri" w:hAnsi="Calibri" w:cs="Calibri"/>
+          <w:sz w:val="24"/>
+          <w:szCs w:val="24"/>
+        </w:rPr>
+      </w:pPr>
+      <w:r>
+        <w:rPr>
+          <w:rFonts w:ascii="Calibri" w:hAnsi="Calibri" w:cs="Calibri"/>
+          <w:sz w:val="24"/>
+          <w:szCs w:val="24"/>
+        </w:rPr>
+        <w:t>The supervised learning pipeline used to predict customer repeat purchase behaviour is described in this section. Baseline modelling, hyperparameter tuning, performance</w:t>
+      </w:r>
+      <w:r>
+        <w:rPr>
+          <w:rFonts w:ascii="Calibri" w:hAnsi="Calibri" w:cs="Calibri"/>
+          <w:sz w:val="24"/>
+          <w:szCs w:val="24"/>
+        </w:rPr>
+        <w:t xml:space="preserve"> </w:t>
+      </w:r>
+      <w:r>
+        <w:rPr>
+          <w:rFonts w:ascii="Calibri" w:hAnsi="Calibri" w:cs="Calibri"/>
+          <w:sz w:val="24"/>
+          <w:szCs w:val="24"/>
+        </w:rPr>
+        <w:t>evaluation, and interpretability preparation were all part of the implementation.</w:t>
+      </w:r>
+      <w:r>
+        <w:rPr>
+          <w:rFonts w:ascii="Calibri" w:hAnsi="Calibri" w:cs="Calibri"/>
+          <w:sz w:val="24"/>
+          <w:szCs w:val="24"/>
+        </w:rPr>
+        <w:t xml:space="preserve"> </w:t>
+      </w:r>
+      <w:r>
+        <w:rPr>
+          <w:rFonts w:ascii="Calibri" w:hAnsi="Calibri" w:cs="Calibri"/>
+          <w:sz w:val="24"/>
+          <w:szCs w:val="24"/>
+        </w:rPr>
+        <w:t>The objective was to develop a transparent, robust model that could recognise repeat purchasers using behavioural features at the customer level that were obtained from transactional data</w:t>
+      </w:r>
+      <w:r>
+        <w:rPr>
+          <w:rFonts w:ascii="Calibri" w:hAnsi="Calibri" w:cs="Calibri"/>
+          <w:sz w:val="24"/>
+          <w:szCs w:val="24"/>
+        </w:rPr>
+        <w:t xml:space="preserve">, </w:t>
+      </w:r>
+      <w:r>
+        <w:rPr>
+          <w:rFonts w:ascii="Calibri" w:hAnsi="Calibri" w:cs="Calibri"/>
+          <w:sz w:val="24"/>
+          <w:szCs w:val="24"/>
+        </w:rPr>
+        <w:t>addressing the first research objective</w:t>
+      </w:r>
+      <w:r>
+        <w:rPr>
+          <w:rFonts w:ascii="Calibri" w:hAnsi="Calibri" w:cs="Calibri"/>
+          <w:sz w:val="24"/>
+          <w:szCs w:val="24"/>
+        </w:rPr>
+        <w:t>.</w:t>
+      </w:r>
+    </w:p>
+    <w:p>
+      <w:pPr>
+        <w:rPr>
+          <w:rFonts w:ascii="Calibri" w:hAnsi="Calibri" w:cs="Calibri"/>
+          <w:b/>
+          <w:bCs/>
+          <w:sz w:val="28"/>
+          <w:szCs w:val="28"/>
+        </w:rPr>
+      </w:pPr>
+      <w:r>
+        <w:rPr>
+          <w:rFonts w:ascii="Calibri" w:hAnsi="Calibri" w:cs="Calibri"/>
+          <w:b/>
+          <w:bCs/>
+          <w:sz w:val="28"/>
+          <w:szCs w:val="28"/>
+        </w:rPr>
+        <w:t>8</w:t>
+      </w:r>
+      <w:r>
+        <w:rPr>
+          <w:rFonts w:ascii="Calibri" w:hAnsi="Calibri" w:cs="Calibri"/>
+          <w:b/>
+          <w:bCs/>
+          <w:sz w:val="28"/>
+          <w:szCs w:val="28"/>
+        </w:rPr>
+        <w:t>.1 Model Training and Evaluation</w:t>
+      </w:r>
+    </w:p>
+    <w:p>
+      <w:pPr>
+        <w:rPr>
+          <w:rFonts w:ascii="Calibri" w:hAnsi="Calibri" w:cs="Calibri"/>
+          <w:sz w:val="24"/>
+          <w:szCs w:val="24"/>
+        </w:rPr>
+      </w:pPr>
+      <w:r>
+        <w:rPr>
+          <w:rFonts w:ascii="Calibri" w:hAnsi="Calibri" w:cs="Calibri"/>
+          <w:sz w:val="24"/>
+          <w:szCs w:val="24"/>
+        </w:rPr>
+        <w:t>The following four classification algorithms were used namely Logistic Regression, Decision Tree, Random Forest, and </w:t>
+      </w:r>
+      <w:proofErr w:type="spellStart"/>
+      <w:r>
+        <w:rPr>
+          <w:rFonts w:ascii="Calibri" w:hAnsi="Calibri" w:cs="Calibri"/>
+          <w:sz w:val="24"/>
+          <w:szCs w:val="24"/>
+        </w:rPr>
+        <w:t>XGBoost</w:t>
+      </w:r>
+      <w:proofErr w:type="spellEnd"/>
+      <w:r>
+        <w:rPr>
+          <w:rFonts w:ascii="Calibri" w:hAnsi="Calibri" w:cs="Calibri"/>
+          <w:sz w:val="24"/>
+          <w:szCs w:val="24"/>
+        </w:rPr>
+        <w:t xml:space="preserve">. These models were chosen to balance between interpretability, predictive strength, and computational efficiency. Logistic Regression and Decision Tree offered transparent baselines (Hosmer et al., 2013; Quinlan, </w:t>
+      </w:r>
+      <w:r>
+        <w:rPr>
+          <w:rFonts w:ascii="Calibri" w:hAnsi="Calibri" w:cs="Calibri"/>
+          <w:sz w:val="24"/>
+          <w:szCs w:val="24"/>
+        </w:rPr>
+        <w:t>1993</w:t>
+      </w:r>
+      <w:r>
+        <w:rPr>
+          <w:rFonts w:ascii="Calibri" w:hAnsi="Calibri" w:cs="Calibri"/>
+          <w:sz w:val="24"/>
+          <w:szCs w:val="24"/>
+        </w:rPr>
+        <w:t xml:space="preserve">), While Random Forest and </w:t>
+      </w:r>
+      <w:proofErr w:type="spellStart"/>
+      <w:r>
+        <w:rPr>
+          <w:rFonts w:ascii="Calibri" w:hAnsi="Calibri" w:cs="Calibri"/>
+          <w:sz w:val="24"/>
+          <w:szCs w:val="24"/>
+        </w:rPr>
+        <w:t>XGBoost</w:t>
+      </w:r>
+      <w:proofErr w:type="spellEnd"/>
+      <w:r>
+        <w:rPr>
+          <w:rFonts w:ascii="Calibri" w:hAnsi="Calibri" w:cs="Calibri"/>
+          <w:sz w:val="24"/>
+          <w:szCs w:val="24"/>
+        </w:rPr>
+        <w:t xml:space="preserve"> provided ensemble-based enhancements in non-linear pattern recognition </w:t>
+      </w:r>
+      <w:r>
+        <w:rPr>
+          <w:rFonts w:ascii="Calibri" w:hAnsi="Calibri" w:cs="Calibri"/>
+          <w:sz w:val="24"/>
+          <w:szCs w:val="24"/>
+        </w:rPr>
+        <w:t xml:space="preserve">(Chen and </w:t>
+      </w:r>
+      <w:proofErr w:type="spellStart"/>
+      <w:r>
+        <w:rPr>
+          <w:rFonts w:ascii="Calibri" w:hAnsi="Calibri" w:cs="Calibri"/>
+          <w:sz w:val="24"/>
+          <w:szCs w:val="24"/>
+        </w:rPr>
+        <w:t>Guestrin</w:t>
+      </w:r>
+      <w:proofErr w:type="spellEnd"/>
+      <w:r>
+        <w:rPr>
+          <w:rFonts w:ascii="Calibri" w:hAnsi="Calibri" w:cs="Calibri"/>
+          <w:sz w:val="24"/>
+          <w:szCs w:val="24"/>
+        </w:rPr>
+        <w:t>, 2016; Bogaert and Delaere, 2023).</w:t>
+      </w:r>
+    </w:p>
+    <w:p>
+      <w:pPr>
+        <w:rPr>
+          <w:rFonts w:ascii="Calibri" w:hAnsi="Calibri" w:cs="Calibri"/>
+          <w:sz w:val="24"/>
+          <w:szCs w:val="24"/>
+        </w:rPr>
+      </w:pPr>
+      <w:r>
+        <w:rPr>
+          <w:rFonts w:ascii="Calibri" w:hAnsi="Calibri" w:cs="Calibri"/>
+          <w:sz w:val="24"/>
+          <w:szCs w:val="24"/>
+        </w:rPr>
+        <w:t xml:space="preserve">To resolve class imbalance, the training set was resampled using SMOTE, a widely adopted oversampling strategy that provides synthetic minority class examples to improve classifier sensitivity (Fernández et al., 2018). To maintain class proportions, a stratified test set was implemented. </w:t>
+      </w:r>
+      <w:proofErr w:type="spellStart"/>
+      <w:r>
+        <w:rPr>
+          <w:rFonts w:ascii="Calibri" w:hAnsi="Calibri" w:cs="Calibri"/>
+          <w:sz w:val="24"/>
+          <w:szCs w:val="24"/>
+        </w:rPr>
+        <w:t>StandardScaler</w:t>
+      </w:r>
+      <w:proofErr w:type="spellEnd"/>
+      <w:r>
+        <w:rPr>
+          <w:rFonts w:ascii="Calibri" w:hAnsi="Calibri" w:cs="Calibri"/>
+          <w:sz w:val="24"/>
+          <w:szCs w:val="24"/>
+        </w:rPr>
+        <w:t xml:space="preserve"> was used to standardize the input features, and where appropriate, categorical variables were encoded. Evaluation metrics comprised accuracy, </w:t>
+      </w:r>
+      <w:r>
+        <w:rPr>
+          <w:rFonts w:ascii="Calibri" w:hAnsi="Calibri" w:cs="Calibri"/>
+          <w:sz w:val="24"/>
+          <w:szCs w:val="24"/>
+        </w:rPr>
+        <w:lastRenderedPageBreak/>
+        <w:t xml:space="preserve">precision, recall, F1-score, and ROC-AUC, ensuring both class-specific and overall performance were measured </w:t>
+      </w:r>
+      <w:r>
+        <w:rPr>
+          <w:rFonts w:ascii="Calibri" w:hAnsi="Calibri" w:cs="Calibri"/>
+          <w:sz w:val="24"/>
+          <w:szCs w:val="24"/>
+        </w:rPr>
+        <w:t>(Tharwat, 2020)</w:t>
+      </w:r>
+      <w:r>
+        <w:rPr>
+          <w:rFonts w:ascii="Calibri" w:hAnsi="Calibri" w:cs="Calibri"/>
+          <w:sz w:val="24"/>
+          <w:szCs w:val="24"/>
+        </w:rPr>
+        <w:t>.</w:t>
+      </w:r>
+    </w:p>
+    <w:p>
+      <w:pPr>
+        <w:rPr>
+          <w:rFonts w:ascii="Calibri" w:hAnsi="Calibri" w:cs="Calibri"/>
+          <w:sz w:val="24"/>
+          <w:szCs w:val="24"/>
+        </w:rPr>
+      </w:pPr>
+      <w:r>
+        <w:rPr>
+          <w:rFonts w:ascii="Calibri" w:hAnsi="Calibri" w:cs="Calibri"/>
+          <w:sz w:val="24"/>
+          <w:szCs w:val="24"/>
+        </w:rPr>
+        <w:t xml:space="preserve">The ROC curves for each of the four baseline models are shown in Figure 1. With AUC values greater than 0.97, the curves show that all classifiers attained high separability between classes. Remarkably, </w:t>
+      </w:r>
+      <w:r>
+        <w:rPr>
+          <w:rFonts w:ascii="Calibri" w:hAnsi="Calibri" w:cs="Calibri"/>
+          <w:sz w:val="24"/>
+          <w:szCs w:val="24"/>
+        </w:rPr>
+        <w:t>Logistic Regression</w:t>
+      </w:r>
+      <w:r>
+        <w:rPr>
+          <w:rFonts w:ascii="Calibri" w:hAnsi="Calibri" w:cs="Calibri"/>
+          <w:sz w:val="24"/>
+          <w:szCs w:val="24"/>
+        </w:rPr>
+        <w:t>,</w:t>
+      </w:r>
+      <w:r>
+        <w:rPr>
+          <w:rFonts w:ascii="Calibri" w:hAnsi="Calibri" w:cs="Calibri"/>
+          <w:sz w:val="24"/>
+          <w:szCs w:val="24"/>
+        </w:rPr>
+        <w:t xml:space="preserve"> </w:t>
+      </w:r>
+      <w:r>
+        <w:rPr>
+          <w:rFonts w:ascii="Calibri" w:hAnsi="Calibri" w:cs="Calibri"/>
+          <w:sz w:val="24"/>
+          <w:szCs w:val="24"/>
+        </w:rPr>
+        <w:t xml:space="preserve">Random Forest and </w:t>
+      </w:r>
+      <w:proofErr w:type="spellStart"/>
+      <w:r>
+        <w:rPr>
+          <w:rFonts w:ascii="Calibri" w:hAnsi="Calibri" w:cs="Calibri"/>
+          <w:sz w:val="24"/>
+          <w:szCs w:val="24"/>
+        </w:rPr>
+        <w:t>XGBoost</w:t>
+      </w:r>
+      <w:proofErr w:type="spellEnd"/>
+      <w:r>
+        <w:rPr>
+          <w:rFonts w:ascii="Calibri" w:hAnsi="Calibri" w:cs="Calibri"/>
+          <w:sz w:val="24"/>
+          <w:szCs w:val="24"/>
+        </w:rPr>
+        <w:t xml:space="preserve"> demonstrated exceptional discriminative abilities </w:t>
+      </w:r>
+      <w:r>
+        <w:rPr>
+          <w:rFonts w:ascii="Calibri" w:hAnsi="Calibri" w:cs="Calibri"/>
+          <w:sz w:val="24"/>
+          <w:szCs w:val="24"/>
+        </w:rPr>
+        <w:t xml:space="preserve">and superior predictive performance </w:t>
+      </w:r>
+      <w:r>
+        <w:rPr>
+          <w:rFonts w:ascii="Calibri" w:hAnsi="Calibri" w:cs="Calibri"/>
+          <w:sz w:val="24"/>
+          <w:szCs w:val="24"/>
+        </w:rPr>
+        <w:t>with near-perfect AUCs of 0.99.</w:t>
+      </w:r>
+      <w:r>
+        <w:rPr>
+          <w:rFonts w:ascii="Calibri" w:hAnsi="Calibri" w:cs="Calibri"/>
+          <w:sz w:val="24"/>
+          <w:szCs w:val="24"/>
+        </w:rPr>
+        <w:t xml:space="preserve"> </w:t>
+      </w:r>
+      <w:r>
+        <w:rPr>
+          <w:rFonts w:ascii="Calibri" w:hAnsi="Calibri" w:cs="Calibri"/>
+          <w:sz w:val="24"/>
+          <w:szCs w:val="24"/>
+        </w:rPr>
+        <w:t>Research Question 2, which examines model comparison in terms of performance and generalizability, is directly supported by this.</w:t>
+      </w:r>
+    </w:p>
+    <w:p>
+      <w:pPr>
+        <w:rPr>
+          <w:rFonts w:ascii="Calibri" w:hAnsi="Calibri" w:cs="Calibri"/>
+          <w:sz w:val="24"/>
+          <w:szCs w:val="24"/>
+        </w:rPr>
+      </w:pPr>
+      <w:r>
+        <w:rPr>
+          <w:rFonts w:ascii="Calibri" w:hAnsi="Calibri" w:cs="Calibri"/>
+          <w:noProof/>
+          <w:sz w:val="24"/>
+          <w:szCs w:val="24"/>
+        </w:rPr>
+        <w:drawing>
+          <wp:inline distT="0" distB="0" distL="0" distR="0" wp14:anchorId="0D8AA28D" wp14:editId="1A8AB3CC">
+            <wp:extent cx="5731510" cy="4644390"/>
+            <wp:effectExtent l="0" t="0" r="2540" b="3810"/>
+            <wp:docPr id="1838660474" name="Picture 1" descr="A group of graphs with different colored lines&#10;&#10;AI-generated content may be incorrect."/>
+            <wp:cNvGraphicFramePr>
+              <a:graphicFrameLocks xmlns:a="http://schemas.openxmlformats.org/drawingml/2006/main" noChangeAspect="1"/>
+            </wp:cNvGraphicFramePr>
+            <a:graphic xmlns:a="http://schemas.openxmlformats.org/drawingml/2006/main">
+              <a:graphicData uri="http://schemas.openxmlformats.org/drawingml/2006/picture">
+                <pic:pic xmlns:pic="http://schemas.openxmlformats.org/drawingml/2006/picture">
+                  <pic:nvPicPr>
+                    <pic:cNvPr id="1838660474" name="Picture 1" descr="A group of graphs with different colored lines&#10;&#10;AI-generated content may be incorrect."/>
+                    <pic:cNvPicPr/>
+                  </pic:nvPicPr>
+                  <pic:blipFill>
+                    <a:blip r:embed="rId10">
+                      <a:extLst>
+                        <a:ext uri="{28A0092B-C50C-407E-A947-70E740481C1C}">
+                          <a14:useLocalDpi xmlns:a14="http://schemas.microsoft.com/office/drawing/2010/main" val="0"/>
+                        </a:ext>
+                      </a:extLst>
+                    </a:blip>
+                    <a:stretch>
+                      <a:fillRect/>
+                    </a:stretch>
+                  </pic:blipFill>
+                  <pic:spPr>
+                    <a:xfrm>
+                      <a:off x="0" y="0"/>
+                      <a:ext cx="5731510" cy="4644390"/>
+                    </a:xfrm>
+                    <a:prstGeom prst="rect">
+                      <a:avLst/>
+                    </a:prstGeom>
+                  </pic:spPr>
+                </pic:pic>
+              </a:graphicData>
+            </a:graphic>
+          </wp:inline>
+        </w:drawing>
+      </w:r>
+    </w:p>
+    <w:p>
+      <w:pPr>
+        <w:rPr>
+          <w:rFonts w:ascii="Calibri" w:hAnsi="Calibri" w:cs="Calibri"/>
+          <w:sz w:val="24"/>
+          <w:szCs w:val="24"/>
+        </w:rPr>
+      </w:pPr>
+      <w:r>
+        <w:rPr>
+          <w:rFonts w:ascii="Calibri" w:hAnsi="Calibri" w:cs="Calibri"/>
+          <w:b/>
+          <w:bCs/>
+          <w:sz w:val="24"/>
+          <w:szCs w:val="24"/>
+        </w:rPr>
+        <w:t>Figure 1:</w:t>
+      </w:r>
+      <w:r>
+        <w:rPr>
+          <w:rFonts w:ascii="Calibri" w:hAnsi="Calibri" w:cs="Calibri"/>
+          <w:sz w:val="24"/>
+          <w:szCs w:val="24"/>
+        </w:rPr>
+        <w:t xml:space="preserve"> ROC curves for baseline models that display the classification performance</w:t>
+      </w:r>
+      <w:r>
+        <w:rPr>
+          <w:rFonts w:ascii="Calibri" w:hAnsi="Calibri" w:cs="Calibri"/>
+          <w:sz w:val="24"/>
+          <w:szCs w:val="24"/>
+        </w:rPr>
+        <w:t xml:space="preserve"> of </w:t>
+      </w:r>
+      <w:r>
+        <w:rPr>
+          <w:rFonts w:ascii="Calibri" w:hAnsi="Calibri" w:cs="Calibri"/>
+          <w:sz w:val="24"/>
+          <w:szCs w:val="24"/>
+        </w:rPr>
+        <w:t xml:space="preserve">Logistic Regression, Decision Tree, Random Forest, and </w:t>
+      </w:r>
+      <w:proofErr w:type="spellStart"/>
+      <w:r>
+        <w:rPr>
+          <w:rFonts w:ascii="Calibri" w:hAnsi="Calibri" w:cs="Calibri"/>
+          <w:sz w:val="24"/>
+          <w:szCs w:val="24"/>
+        </w:rPr>
+        <w:t>XGBoost</w:t>
+      </w:r>
+      <w:proofErr w:type="spellEnd"/>
+      <w:r>
+        <w:rPr>
+          <w:rFonts w:ascii="Calibri" w:hAnsi="Calibri" w:cs="Calibri"/>
+          <w:sz w:val="24"/>
+          <w:szCs w:val="24"/>
+        </w:rPr>
+        <w:t>.</w:t>
+      </w:r>
+    </w:p>
+    <w:p>
+      <w:pPr>
+        <w:rPr>
+          <w:rFonts w:ascii="Calibri" w:hAnsi="Calibri" w:cs="Calibri"/>
+          <w:sz w:val="24"/>
+          <w:szCs w:val="24"/>
+        </w:rPr>
+      </w:pPr>
+      <w:r>
+        <w:rPr>
+          <w:rFonts w:ascii="Calibri" w:hAnsi="Calibri" w:cs="Calibri"/>
+          <w:sz w:val="24"/>
+          <w:szCs w:val="24"/>
+        </w:rPr>
+        <w:t>The confusion matrices for the same models are displayed in Figure 2. Logistic Regression and Decision Tree showed slightly more false negatives than the ensemble models, despite the fact that all models performed well. This highlights the trade-off between predictive strength and interpretability, which is crucial when choosing a model for applications that interact with stakeholders.</w:t>
+      </w:r>
+    </w:p>
+    <w:p>
+      <w:pPr>
+        <w:rPr>
+          <w:rFonts w:ascii="Calibri" w:hAnsi="Calibri" w:cs="Calibri"/>
+          <w:sz w:val="24"/>
+          <w:szCs w:val="24"/>
+        </w:rPr>
+      </w:pPr>
+    </w:p>
+    <w:p>
+      <w:pPr>
+        <w:rPr>
+          <w:rFonts w:ascii="Calibri" w:hAnsi="Calibri" w:cs="Calibri"/>
+          <w:sz w:val="24"/>
+          <w:szCs w:val="24"/>
+        </w:rPr>
+      </w:pPr>
+      <w:r>
+        <w:rPr>
+          <w:rFonts w:ascii="Calibri" w:hAnsi="Calibri" w:cs="Calibri"/>
+          <w:noProof/>
+          <w:sz w:val="24"/>
+          <w:szCs w:val="24"/>
+        </w:rPr>
+        <w:lastRenderedPageBreak/>
+        <w:drawing>
+          <wp:inline distT="0" distB="0" distL="0" distR="0" wp14:anchorId="562051E7" wp14:editId="30F2FEFC">
+            <wp:extent cx="5731510" cy="3826510"/>
+            <wp:effectExtent l="0" t="0" r="2540" b="2540"/>
+            <wp:docPr id="2053294596" name="Picture 2" descr="A group of blue squares with white text&#10;&#10;AI-generated content may be incorrect."/>
+            <wp:cNvGraphicFramePr>
+              <a:graphicFrameLocks xmlns:a="http://schemas.openxmlformats.org/drawingml/2006/main" noChangeAspect="1"/>
+            </wp:cNvGraphicFramePr>
+            <a:graphic xmlns:a="http://schemas.openxmlformats.org/drawingml/2006/main">
+              <a:graphicData uri="http://schemas.openxmlformats.org/drawingml/2006/picture">
+                <pic:pic xmlns:pic="http://schemas.openxmlformats.org/drawingml/2006/picture">
+                  <pic:nvPicPr>
+                    <pic:cNvPr id="2053294596" name="Picture 2" descr="A group of blue squares with white text&#10;&#10;AI-generated content may be incorrect."/>
+                    <pic:cNvPicPr/>
+                  </pic:nvPicPr>
+                  <pic:blipFill>
+                    <a:blip r:embed="rId11">
+                      <a:extLst>
+                        <a:ext uri="{28A0092B-C50C-407E-A947-70E740481C1C}">
+                          <a14:useLocalDpi xmlns:a14="http://schemas.microsoft.com/office/drawing/2010/main" val="0"/>
+                        </a:ext>
+                      </a:extLst>
+                    </a:blip>
+                    <a:stretch>
+                      <a:fillRect/>
+                    </a:stretch>
+                  </pic:blipFill>
+                  <pic:spPr>
+                    <a:xfrm>
+                      <a:off x="0" y="0"/>
+                      <a:ext cx="5731510" cy="3826510"/>
+                    </a:xfrm>
+                    <a:prstGeom prst="rect">
+                      <a:avLst/>
+                    </a:prstGeom>
+                  </pic:spPr>
+                </pic:pic>
+              </a:graphicData>
+            </a:graphic>
+          </wp:inline>
+        </w:drawing>
+      </w:r>
+    </w:p>
+    <w:p>
+      <w:pPr>
+        <w:rPr>
+          <w:rFonts w:ascii="Calibri" w:hAnsi="Calibri" w:cs="Calibri"/>
+          <w:sz w:val="24"/>
+          <w:szCs w:val="24"/>
+        </w:rPr>
+      </w:pPr>
+    </w:p>
+    <w:p>
+      <w:pPr>
+        <w:rPr>
+          <w:rFonts w:ascii="Calibri" w:hAnsi="Calibri" w:cs="Calibri"/>
+          <w:sz w:val="24"/>
+          <w:szCs w:val="24"/>
+        </w:rPr>
+      </w:pPr>
+      <w:r>
+        <w:rPr>
+          <w:rFonts w:ascii="Calibri" w:hAnsi="Calibri" w:cs="Calibri"/>
+          <w:b/>
+          <w:bCs/>
+          <w:sz w:val="24"/>
+          <w:szCs w:val="24"/>
+        </w:rPr>
+        <w:t>Figure 2:</w:t>
+      </w:r>
+      <w:r>
+        <w:rPr>
+          <w:rFonts w:ascii="Calibri" w:hAnsi="Calibri" w:cs="Calibri"/>
+          <w:sz w:val="24"/>
+          <w:szCs w:val="24"/>
+        </w:rPr>
+        <w:t xml:space="preserve"> </w:t>
+      </w:r>
+      <w:r>
+        <w:rPr>
+          <w:rFonts w:ascii="Calibri" w:hAnsi="Calibri" w:cs="Calibri"/>
+          <w:sz w:val="24"/>
+          <w:szCs w:val="24"/>
+        </w:rPr>
+        <w:t>Confusion matrices for baseline models that show prediction accuracy and class distribution across both classes.</w:t>
+      </w:r>
+    </w:p>
+    <w:p>
+      <w:pPr>
+        <w:rPr>
+          <w:rFonts w:ascii="Calibri" w:hAnsi="Calibri" w:cs="Calibri"/>
+          <w:b/>
+          <w:bCs/>
+          <w:sz w:val="28"/>
+          <w:szCs w:val="28"/>
+        </w:rPr>
+      </w:pPr>
+      <w:r>
+        <w:rPr>
+          <w:rFonts w:ascii="Calibri" w:hAnsi="Calibri" w:cs="Calibri"/>
+          <w:b/>
+          <w:bCs/>
+          <w:sz w:val="28"/>
+          <w:szCs w:val="28"/>
+        </w:rPr>
+        <w:t>8</w:t>
+      </w:r>
+      <w:r>
+        <w:rPr>
+          <w:rFonts w:ascii="Calibri" w:hAnsi="Calibri" w:cs="Calibri"/>
+          <w:b/>
+          <w:bCs/>
+          <w:sz w:val="28"/>
+          <w:szCs w:val="28"/>
+        </w:rPr>
+        <w:t xml:space="preserve">.2 </w:t>
+      </w:r>
+      <w:r>
+        <w:rPr>
+          <w:rFonts w:ascii="Calibri" w:hAnsi="Calibri" w:cs="Calibri"/>
+          <w:b/>
+          <w:bCs/>
+          <w:sz w:val="28"/>
+          <w:szCs w:val="28"/>
+        </w:rPr>
+        <w:t>Hyperparameter Tuning</w:t>
+      </w:r>
+    </w:p>
+    <w:p>
+      <w:pPr>
+        <w:rPr>
+          <w:rFonts w:ascii="Calibri" w:hAnsi="Calibri" w:cs="Calibri"/>
+          <w:sz w:val="24"/>
+          <w:szCs w:val="24"/>
+        </w:rPr>
+      </w:pPr>
+      <w:proofErr w:type="spellStart"/>
+      <w:r>
+        <w:rPr>
+          <w:rFonts w:ascii="Calibri" w:hAnsi="Calibri" w:cs="Calibri"/>
+          <w:sz w:val="24"/>
+          <w:szCs w:val="24"/>
+        </w:rPr>
+        <w:t>GridSearchCV</w:t>
+      </w:r>
+      <w:proofErr w:type="spellEnd"/>
+      <w:r>
+        <w:rPr>
+          <w:rFonts w:ascii="Calibri" w:hAnsi="Calibri" w:cs="Calibri"/>
+          <w:sz w:val="24"/>
+          <w:szCs w:val="24"/>
+        </w:rPr>
+        <w:t xml:space="preserve"> was used using 5-fold cross-validation and F1-score as the scoring metric to optimize model performance. Each model's parameter grids were customised, including tree-based hyperparameters for ensemble models, maximum depth and splitting criteria for Decision Trees, and regularization strength for Logistic Regression (Probst et al., 2019; Pedregosa et al., 2011).</w:t>
+      </w:r>
+    </w:p>
+    <w:p>
+      <w:pPr>
+        <w:rPr>
+          <w:rFonts w:ascii="Calibri" w:hAnsi="Calibri" w:cs="Calibri"/>
+          <w:sz w:val="24"/>
+          <w:szCs w:val="24"/>
+        </w:rPr>
+      </w:pPr>
+      <w:r>
+        <w:rPr>
+          <w:rFonts w:ascii="Calibri" w:hAnsi="Calibri" w:cs="Calibri"/>
+          <w:sz w:val="24"/>
+          <w:szCs w:val="24"/>
+        </w:rPr>
+        <w:t>The ROC curves for the tuned models are shown in Figure 3. Although the curves' general shapes did not change, there were minor gains in AUC, especially for the Decision Tree, which went from 0.97 to 0.991. This illustrates how tuning can improve generalization, particularly for simpler models.</w:t>
+      </w:r>
+    </w:p>
+    <w:p>
+      <w:pPr>
+        <w:rPr>
+          <w:rFonts w:ascii="Calibri" w:hAnsi="Calibri" w:cs="Calibri"/>
+          <w:sz w:val="24"/>
+          <w:szCs w:val="24"/>
+        </w:rPr>
+      </w:pPr>
+    </w:p>
+    <w:p>
+      <w:pPr>
+        <w:rPr>
+          <w:rFonts w:ascii="Calibri" w:hAnsi="Calibri" w:cs="Calibri"/>
+          <w:sz w:val="24"/>
+          <w:szCs w:val="24"/>
+        </w:rPr>
+      </w:pPr>
+      <w:r>
+        <w:rPr>
+          <w:rFonts w:ascii="Calibri" w:hAnsi="Calibri" w:cs="Calibri"/>
+          <w:noProof/>
+          <w:sz w:val="24"/>
+          <w:szCs w:val="24"/>
+        </w:rPr>
+        <w:lastRenderedPageBreak/>
+        <w:drawing>
+          <wp:inline distT="0" distB="0" distL="0" distR="0" wp14:anchorId="752CCAE2" wp14:editId="527028ED">
+            <wp:extent cx="5731510" cy="4653915"/>
+            <wp:effectExtent l="0" t="0" r="2540" b="0"/>
+            <wp:docPr id="961204917" name="Picture 3" descr="A group of graphs with different colored lines&#10;&#10;AI-generated content may be incorrect."/>
+            <wp:cNvGraphicFramePr>
+              <a:graphicFrameLocks xmlns:a="http://schemas.openxmlformats.org/drawingml/2006/main" noChangeAspect="1"/>
+            </wp:cNvGraphicFramePr>
+            <a:graphic xmlns:a="http://schemas.openxmlformats.org/drawingml/2006/main">
+              <a:graphicData uri="http://schemas.openxmlformats.org/drawingml/2006/picture">
+                <pic:pic xmlns:pic="http://schemas.openxmlformats.org/drawingml/2006/picture">
+                  <pic:nvPicPr>
+                    <pic:cNvPr id="961204917" name="Picture 3" descr="A group of graphs with different colored lines&#10;&#10;AI-generated content may be incorrect."/>
+                    <pic:cNvPicPr/>
+                  </pic:nvPicPr>
+                  <pic:blipFill>
+                    <a:blip r:embed="rId12">
+                      <a:extLst>
+                        <a:ext uri="{28A0092B-C50C-407E-A947-70E740481C1C}">
+                          <a14:useLocalDpi xmlns:a14="http://schemas.microsoft.com/office/drawing/2010/main" val="0"/>
+                        </a:ext>
+                      </a:extLst>
+                    </a:blip>
+                    <a:stretch>
+                      <a:fillRect/>
+                    </a:stretch>
+                  </pic:blipFill>
+                  <pic:spPr>
+                    <a:xfrm>
+                      <a:off x="0" y="0"/>
+                      <a:ext cx="5731510" cy="4653915"/>
+                    </a:xfrm>
+                    <a:prstGeom prst="rect">
+                      <a:avLst/>
+                    </a:prstGeom>
+                  </pic:spPr>
+                </pic:pic>
+              </a:graphicData>
+            </a:graphic>
+          </wp:inline>
+        </w:drawing>
+      </w:r>
+    </w:p>
+    <w:p>
+      <w:pPr>
+        <w:rPr>
+          <w:rFonts w:ascii="Calibri" w:hAnsi="Calibri" w:cs="Calibri"/>
+          <w:sz w:val="24"/>
+          <w:szCs w:val="24"/>
+        </w:rPr>
+      </w:pPr>
+    </w:p>
+    <w:p>
+      <w:pPr>
+        <w:rPr>
+          <w:rFonts w:ascii="Calibri" w:hAnsi="Calibri" w:cs="Calibri"/>
+          <w:sz w:val="24"/>
+          <w:szCs w:val="24"/>
+        </w:rPr>
+      </w:pPr>
+      <w:r>
+        <w:rPr>
+          <w:rFonts w:ascii="Calibri" w:hAnsi="Calibri" w:cs="Calibri"/>
+          <w:b/>
+          <w:bCs/>
+          <w:sz w:val="24"/>
+          <w:szCs w:val="24"/>
+        </w:rPr>
+        <w:t>Figure 3:</w:t>
+      </w:r>
+      <w:r>
+        <w:rPr>
+          <w:rFonts w:ascii="Calibri" w:hAnsi="Calibri" w:cs="Calibri"/>
+          <w:sz w:val="24"/>
+          <w:szCs w:val="24"/>
+        </w:rPr>
+        <w:t xml:space="preserve"> ROC curves that show enhanced separability and classifier performance for tuned models following hyperparameter optimization.</w:t>
+      </w:r>
+    </w:p>
+    <w:p>
+      <w:pPr>
+        <w:rPr>
+          <w:rFonts w:ascii="Calibri" w:hAnsi="Calibri" w:cs="Calibri"/>
+          <w:sz w:val="24"/>
+          <w:szCs w:val="24"/>
+        </w:rPr>
+      </w:pPr>
+      <w:r>
+        <w:rPr>
+          <w:rFonts w:ascii="Calibri" w:hAnsi="Calibri" w:cs="Calibri"/>
+          <w:sz w:val="24"/>
+          <w:szCs w:val="24"/>
+        </w:rPr>
+        <w:t>The updated confusion matrices are shown in Figure 4. The tuned Decision Tree demonstrated a decrease in false positives and false negatives, making it a better option for deployment in situations where interpretability is of utmost importance. This demonstrates that tuning can reduce the performance gap between interpretable and complex models.</w:t>
+      </w:r>
+    </w:p>
+    <w:p>
+      <w:pPr>
+        <w:rPr>
+          <w:rFonts w:ascii="Calibri" w:hAnsi="Calibri" w:cs="Calibri"/>
+          <w:sz w:val="24"/>
+          <w:szCs w:val="24"/>
+        </w:rPr>
+      </w:pPr>
+      <w:r>
+        <w:rPr>
+          <w:rFonts w:ascii="Calibri" w:hAnsi="Calibri" w:cs="Calibri"/>
+          <w:noProof/>
+          <w:sz w:val="24"/>
+          <w:szCs w:val="24"/>
+        </w:rPr>
+        <w:lastRenderedPageBreak/>
+        <w:drawing>
+          <wp:inline distT="0" distB="0" distL="0" distR="0" wp14:anchorId="33DEEA6F" wp14:editId="09D4721A">
+            <wp:extent cx="5731510" cy="3808095"/>
+            <wp:effectExtent l="0" t="0" r="2540" b="1905"/>
+            <wp:docPr id="654521133" name="Picture 4" descr="A group of blue squares with white text&#10;&#10;AI-generated content may be incorrect."/>
+            <wp:cNvGraphicFramePr>
+              <a:graphicFrameLocks xmlns:a="http://schemas.openxmlformats.org/drawingml/2006/main" noChangeAspect="1"/>
+            </wp:cNvGraphicFramePr>
+            <a:graphic xmlns:a="http://schemas.openxmlformats.org/drawingml/2006/main">
+              <a:graphicData uri="http://schemas.openxmlformats.org/drawingml/2006/picture">
+                <pic:pic xmlns:pic="http://schemas.openxmlformats.org/drawingml/2006/picture">
+                  <pic:nvPicPr>
+                    <pic:cNvPr id="654521133" name="Picture 4" descr="A group of blue squares with white text&#10;&#10;AI-generated content may be incorrect."/>
+                    <pic:cNvPicPr/>
+                  </pic:nvPicPr>
+                  <pic:blipFill>
+                    <a:blip r:embed="rId13">
+                      <a:extLst>
+                        <a:ext uri="{28A0092B-C50C-407E-A947-70E740481C1C}">
+                          <a14:useLocalDpi xmlns:a14="http://schemas.microsoft.com/office/drawing/2010/main" val="0"/>
+                        </a:ext>
+                      </a:extLst>
+                    </a:blip>
+                    <a:stretch>
+                      <a:fillRect/>
+                    </a:stretch>
+                  </pic:blipFill>
+                  <pic:spPr>
+                    <a:xfrm>
+                      <a:off x="0" y="0"/>
+                      <a:ext cx="5731510" cy="3808095"/>
+                    </a:xfrm>
+                    <a:prstGeom prst="rect">
+                      <a:avLst/>
+                    </a:prstGeom>
+                  </pic:spPr>
+                </pic:pic>
+              </a:graphicData>
+            </a:graphic>
+          </wp:inline>
+        </w:drawing>
+      </w:r>
+    </w:p>
+    <w:p>
+      <w:pPr>
+        <w:rPr>
+          <w:rFonts w:ascii="Calibri" w:hAnsi="Calibri" w:cs="Calibri"/>
+          <w:sz w:val="24"/>
+          <w:szCs w:val="24"/>
+        </w:rPr>
+      </w:pPr>
+    </w:p>
+    <w:p>
+      <w:pPr>
+        <w:rPr>
+          <w:rFonts w:ascii="Calibri" w:hAnsi="Calibri" w:cs="Calibri"/>
+          <w:sz w:val="24"/>
+          <w:szCs w:val="24"/>
+        </w:rPr>
+      </w:pPr>
+      <w:r>
+        <w:rPr>
+          <w:rFonts w:ascii="Calibri" w:hAnsi="Calibri" w:cs="Calibri"/>
+          <w:b/>
+          <w:bCs/>
+          <w:sz w:val="24"/>
+          <w:szCs w:val="24"/>
+        </w:rPr>
+        <w:t>Figure 4:</w:t>
+      </w:r>
+      <w:r>
+        <w:rPr>
+          <w:rFonts w:ascii="Calibri" w:hAnsi="Calibri" w:cs="Calibri"/>
+          <w:sz w:val="24"/>
+          <w:szCs w:val="24"/>
+        </w:rPr>
+        <w:t xml:space="preserve"> </w:t>
+      </w:r>
+      <w:r>
+        <w:rPr>
+          <w:rFonts w:ascii="Calibri" w:hAnsi="Calibri" w:cs="Calibri"/>
+          <w:sz w:val="24"/>
+          <w:szCs w:val="24"/>
+        </w:rPr>
+        <w:t>Confusion matrices for tuned models demonstrate less misclassification and better generalization in both classes.</w:t>
+      </w:r>
+    </w:p>
+    <w:p>
+      <w:pPr>
+        <w:rPr>
+          <w:rFonts w:ascii="Calibri" w:hAnsi="Calibri" w:cs="Calibri"/>
+          <w:sz w:val="24"/>
+          <w:szCs w:val="24"/>
+        </w:rPr>
+      </w:pPr>
+      <w:r>
+        <w:rPr>
+          <w:rFonts w:ascii="Calibri" w:hAnsi="Calibri" w:cs="Calibri"/>
+          <w:sz w:val="24"/>
+          <w:szCs w:val="24"/>
+        </w:rPr>
+        <w:t>The next section presents a comprehensive interpretability analysis using SHAP, directly addressing Research Questions 1 (feature importance) and 3 (stakeholder-relevant explanations), addressing the third research objective.</w:t>
+      </w:r>
+    </w:p>
+    <w:p>
+      <w:pPr>
+        <w:rPr>
+          <w:rFonts w:ascii="Calibri" w:hAnsi="Calibri" w:cs="Calibri"/>
+          <w:sz w:val="24"/>
+          <w:szCs w:val="24"/>
+        </w:rPr>
+      </w:pPr>
     </w:p>
     <w:p>
       <w:pPr>
@@ -3236,16 +4868,317 @@
         </w:rPr>
         <w:t xml:space="preserve">Fader, P.S. and Hardie, B.G.S. (2010). Customer-Base Valuation in a Contractual Setting: The Perils of Ignoring Heterogeneity. Marketing Science, 29(1), pp.85–93. </w:t>
       </w:r>
-      <w:proofErr w:type="gramStart"/>
-      <w:r>
-        <w:rPr>
-          <w:rFonts w:ascii="Calibri" w:hAnsi="Calibri" w:cs="Calibri"/>
-          <w:sz w:val="24"/>
-          <w:szCs w:val="24"/>
-        </w:rPr>
-        <w:t>doi:https://doi.org/10.1287/mksc.1080.0482</w:t>
-      </w:r>
-      <w:proofErr w:type="gramEnd"/>
+      <w:proofErr w:type="spellStart"/>
+      <w:r>
+        <w:rPr>
+          <w:rFonts w:ascii="Calibri" w:hAnsi="Calibri" w:cs="Calibri"/>
+          <w:sz w:val="24"/>
+          <w:szCs w:val="24"/>
+        </w:rPr>
+        <w:t>doi:https</w:t>
+      </w:r>
+      <w:proofErr w:type="spellEnd"/>
+      <w:r>
+        <w:rPr>
+          <w:rFonts w:ascii="Calibri" w:hAnsi="Calibri" w:cs="Calibri"/>
+          <w:sz w:val="24"/>
+          <w:szCs w:val="24"/>
+        </w:rPr>
+        <w:t>://doi.org/10.1287/mksc.1080.0482.</w:t>
+      </w:r>
+    </w:p>
+    <w:p>
+      <w:pPr>
+        <w:rPr>
+          <w:rFonts w:ascii="Calibri" w:hAnsi="Calibri" w:cs="Calibri"/>
+          <w:sz w:val="24"/>
+          <w:szCs w:val="24"/>
+        </w:rPr>
+      </w:pPr>
+      <w:proofErr w:type="spellStart"/>
+      <w:r>
+        <w:rPr>
+          <w:rFonts w:ascii="Calibri" w:hAnsi="Calibri" w:cs="Calibri"/>
+          <w:sz w:val="24"/>
+          <w:szCs w:val="24"/>
+        </w:rPr>
+        <w:t>Cirqueira</w:t>
+      </w:r>
+      <w:proofErr w:type="spellEnd"/>
+      <w:r>
+        <w:rPr>
+          <w:rFonts w:ascii="Calibri" w:hAnsi="Calibri" w:cs="Calibri"/>
+          <w:sz w:val="24"/>
+          <w:szCs w:val="24"/>
+        </w:rPr>
+        <w:t xml:space="preserve">, D., Hofer, M., Nedbal, D., Helfert, M. and Bezbradica, M. (2020). Customer Purchase </w:t>
+      </w:r>
+      <w:proofErr w:type="spellStart"/>
+      <w:r>
+        <w:rPr>
+          <w:rFonts w:ascii="Calibri" w:hAnsi="Calibri" w:cs="Calibri"/>
+          <w:sz w:val="24"/>
+          <w:szCs w:val="24"/>
+        </w:rPr>
+        <w:t>Behavior</w:t>
+      </w:r>
+      <w:proofErr w:type="spellEnd"/>
+      <w:r>
+        <w:rPr>
+          <w:rFonts w:ascii="Calibri" w:hAnsi="Calibri" w:cs="Calibri"/>
+          <w:sz w:val="24"/>
+          <w:szCs w:val="24"/>
+        </w:rPr>
+        <w:t xml:space="preserve"> Prediction in E-commerce: A Conceptual Framework and Research Agenda. New Frontiers in Mining Complex Patterns, pp.119–136. </w:t>
+      </w:r>
+      <w:proofErr w:type="spellStart"/>
+      <w:r>
+        <w:rPr>
+          <w:rFonts w:ascii="Calibri" w:hAnsi="Calibri" w:cs="Calibri"/>
+          <w:sz w:val="24"/>
+          <w:szCs w:val="24"/>
+        </w:rPr>
+        <w:t>doi:https</w:t>
+      </w:r>
+      <w:proofErr w:type="spellEnd"/>
+      <w:r>
+        <w:rPr>
+          <w:rFonts w:ascii="Calibri" w:hAnsi="Calibri" w:cs="Calibri"/>
+          <w:sz w:val="24"/>
+          <w:szCs w:val="24"/>
+        </w:rPr>
+        <w:t>://doi.org/10.1007/978-3-030-48861-1_8.</w:t>
+      </w:r>
+    </w:p>
+    <w:p>
+      <w:pPr>
+        <w:rPr>
+          <w:rFonts w:ascii="Calibri" w:hAnsi="Calibri" w:cs="Calibri"/>
+          <w:sz w:val="24"/>
+          <w:szCs w:val="24"/>
+        </w:rPr>
+      </w:pPr>
+      <w:r>
+        <w:rPr>
+          <w:rFonts w:ascii="Calibri" w:hAnsi="Calibri" w:cs="Calibri"/>
+          <w:sz w:val="24"/>
+          <w:szCs w:val="24"/>
+        </w:rPr>
+        <w:t xml:space="preserve">Jeon, H.G., Kim, C., Lee, J. and Lee, K.C. (2021). Understanding E-Commerce Consumers’ Repeat Purchase Intention: The Role of Trust Transfer and the Moderating Effect of Neuroticism. Frontiers in Psychology, 12. </w:t>
+      </w:r>
+      <w:proofErr w:type="spellStart"/>
+      <w:r>
+        <w:rPr>
+          <w:rFonts w:ascii="Calibri" w:hAnsi="Calibri" w:cs="Calibri"/>
+          <w:sz w:val="24"/>
+          <w:szCs w:val="24"/>
+        </w:rPr>
+        <w:t>doi:https</w:t>
+      </w:r>
+      <w:proofErr w:type="spellEnd"/>
+      <w:r>
+        <w:rPr>
+          <w:rFonts w:ascii="Calibri" w:hAnsi="Calibri" w:cs="Calibri"/>
+          <w:sz w:val="24"/>
+          <w:szCs w:val="24"/>
+        </w:rPr>
+        <w:t>://doi.org/10.3389/fpsyg.2021.690039.</w:t>
+      </w:r>
+    </w:p>
+    <w:p>
+      <w:pPr>
+        <w:rPr>
+          <w:rFonts w:ascii="Calibri" w:hAnsi="Calibri" w:cs="Calibri"/>
+          <w:sz w:val="24"/>
+          <w:szCs w:val="24"/>
+        </w:rPr>
+      </w:pPr>
+      <w:r>
+        <w:rPr>
+          <w:rFonts w:ascii="Calibri" w:hAnsi="Calibri" w:cs="Calibri"/>
+          <w:sz w:val="24"/>
+          <w:szCs w:val="24"/>
+        </w:rPr>
+        <w:t xml:space="preserve">Lundberg, S. and Lee, S.-I. (2017). A Unified Approach to Interpreting Model Predictions. [online] arXiv.org. </w:t>
+      </w:r>
+      <w:proofErr w:type="spellStart"/>
+      <w:r>
+        <w:rPr>
+          <w:rFonts w:ascii="Calibri" w:hAnsi="Calibri" w:cs="Calibri"/>
+          <w:sz w:val="24"/>
+          <w:szCs w:val="24"/>
+        </w:rPr>
+        <w:t>doi:https</w:t>
+      </w:r>
+      <w:proofErr w:type="spellEnd"/>
+      <w:r>
+        <w:rPr>
+          <w:rFonts w:ascii="Calibri" w:hAnsi="Calibri" w:cs="Calibri"/>
+          <w:sz w:val="24"/>
+          <w:szCs w:val="24"/>
+        </w:rPr>
+        <w:t>://doi.org/10.48550/arXiv.1705.07874.</w:t>
+      </w:r>
+    </w:p>
+    <w:p>
+      <w:pPr>
+        <w:rPr>
+          <w:rFonts w:ascii="Calibri" w:hAnsi="Calibri" w:cs="Calibri"/>
+          <w:sz w:val="24"/>
+          <w:szCs w:val="24"/>
+        </w:rPr>
+      </w:pPr>
+      <w:r>
+        <w:rPr>
+          <w:rFonts w:ascii="Calibri" w:hAnsi="Calibri" w:cs="Calibri"/>
+          <w:sz w:val="24"/>
+          <w:szCs w:val="24"/>
+        </w:rPr>
+        <w:t>Molnar, C. (2019). Interpretable machine learning: a guide for making Black Box Models interpretable. Morisville, North Carolina: Lulu.</w:t>
+      </w:r>
+    </w:p>
+    <w:p>
+      <w:pPr>
+        <w:rPr>
+          <w:rFonts w:ascii="Calibri" w:hAnsi="Calibri" w:cs="Calibri"/>
+          <w:sz w:val="24"/>
+          <w:szCs w:val="24"/>
+        </w:rPr>
+      </w:pPr>
+      <w:r>
+        <w:rPr>
+          <w:rFonts w:ascii="Calibri" w:hAnsi="Calibri" w:cs="Calibri"/>
+          <w:sz w:val="24"/>
+          <w:szCs w:val="24"/>
+        </w:rPr>
+        <w:t xml:space="preserve">Harter, A., Stich, L. and Spann, M. (2024). The Effect of Delivery Time on Repurchase </w:t>
+      </w:r>
+      <w:proofErr w:type="spellStart"/>
+      <w:r>
+        <w:rPr>
+          <w:rFonts w:ascii="Calibri" w:hAnsi="Calibri" w:cs="Calibri"/>
+          <w:sz w:val="24"/>
+          <w:szCs w:val="24"/>
+        </w:rPr>
+        <w:t>Behavior</w:t>
+      </w:r>
+      <w:proofErr w:type="spellEnd"/>
+      <w:r>
+        <w:rPr>
+          <w:rFonts w:ascii="Calibri" w:hAnsi="Calibri" w:cs="Calibri"/>
+          <w:sz w:val="24"/>
+          <w:szCs w:val="24"/>
+        </w:rPr>
+        <w:t xml:space="preserve"> in Quick Commerce. Journal of Service Research, [online] 28(2). </w:t>
+      </w:r>
+      <w:proofErr w:type="spellStart"/>
+      <w:r>
+        <w:rPr>
+          <w:rFonts w:ascii="Calibri" w:hAnsi="Calibri" w:cs="Calibri"/>
+          <w:sz w:val="24"/>
+          <w:szCs w:val="24"/>
+        </w:rPr>
+        <w:t>doi:https</w:t>
+      </w:r>
+      <w:proofErr w:type="spellEnd"/>
+      <w:r>
+        <w:rPr>
+          <w:rFonts w:ascii="Calibri" w:hAnsi="Calibri" w:cs="Calibri"/>
+          <w:sz w:val="24"/>
+          <w:szCs w:val="24"/>
+        </w:rPr>
+        <w:t>://doi.org/10.1177/10946705241236961.</w:t>
+      </w:r>
+    </w:p>
+    <w:p>
+      <w:pPr>
+        <w:rPr>
+          <w:rFonts w:ascii="Calibri" w:hAnsi="Calibri" w:cs="Calibri"/>
+          <w:sz w:val="24"/>
+          <w:szCs w:val="24"/>
+        </w:rPr>
+      </w:pPr>
+      <w:r>
+        <w:rPr>
+          <w:rFonts w:ascii="Calibri" w:hAnsi="Calibri" w:cs="Calibri"/>
+          <w:sz w:val="24"/>
+          <w:szCs w:val="24"/>
+        </w:rPr>
+        <w:t xml:space="preserve">Henninger, M. and Strobl, C. (2024). Interpreting machine learning predictions with LIME and Shapley values: theoretical insights, challenges, and meaningful interpretations. </w:t>
+      </w:r>
+      <w:proofErr w:type="spellStart"/>
+      <w:r>
+        <w:rPr>
+          <w:rFonts w:ascii="Calibri" w:hAnsi="Calibri" w:cs="Calibri"/>
+          <w:sz w:val="24"/>
+          <w:szCs w:val="24"/>
+        </w:rPr>
+        <w:t>Behaviormetrika</w:t>
+      </w:r>
+      <w:proofErr w:type="spellEnd"/>
+      <w:r>
+        <w:rPr>
+          <w:rFonts w:ascii="Calibri" w:hAnsi="Calibri" w:cs="Calibri"/>
+          <w:sz w:val="24"/>
+          <w:szCs w:val="24"/>
+        </w:rPr>
+        <w:t xml:space="preserve">, 52(1), pp.45–75. </w:t>
+      </w:r>
+      <w:proofErr w:type="spellStart"/>
+      <w:r>
+        <w:rPr>
+          <w:rFonts w:ascii="Calibri" w:hAnsi="Calibri" w:cs="Calibri"/>
+          <w:sz w:val="24"/>
+          <w:szCs w:val="24"/>
+        </w:rPr>
+        <w:t>doi:https</w:t>
+      </w:r>
+      <w:proofErr w:type="spellEnd"/>
+      <w:r>
+        <w:rPr>
+          <w:rFonts w:ascii="Calibri" w:hAnsi="Calibri" w:cs="Calibri"/>
+          <w:sz w:val="24"/>
+          <w:szCs w:val="24"/>
+        </w:rPr>
+        <w:t>://doi.org/10.1007/s41237-024-00253-2.</w:t>
+      </w:r>
+    </w:p>
+    <w:p>
+      <w:pPr>
+        <w:rPr>
+          <w:rFonts w:ascii="Calibri" w:hAnsi="Calibri" w:cs="Calibri"/>
+          <w:sz w:val="24"/>
+          <w:szCs w:val="24"/>
+        </w:rPr>
+      </w:pPr>
+      <w:r>
+        <w:rPr>
+          <w:rFonts w:ascii="Calibri" w:hAnsi="Calibri" w:cs="Calibri"/>
+          <w:sz w:val="24"/>
+          <w:szCs w:val="24"/>
+        </w:rPr>
+        <w:lastRenderedPageBreak/>
+        <w:t>Wirth, R. and Hipp, J. (2000). CRISP-DM: Towards a Standard Process Model for Data Mining. [online] Available at:</w:t>
+      </w:r>
+      <w:r>
+        <w:rPr>
+          <w:rFonts w:ascii="Calibri" w:hAnsi="Calibri" w:cs="Calibri"/>
+          <w:sz w:val="24"/>
+          <w:szCs w:val="24"/>
+        </w:rPr>
+        <w:t xml:space="preserve"> </w:t>
+      </w:r>
+      <w:hyperlink r:id="rId14" w:history="1">
+        <w:r>
+          <w:rPr>
+            <w:rStyle w:val="Hyperlink"/>
+            <w:rFonts w:ascii="Calibri" w:hAnsi="Calibri" w:cs="Calibri"/>
+            <w:sz w:val="24"/>
+            <w:szCs w:val="24"/>
+          </w:rPr>
+          <w:t>https://www.cs.unibo.it/~danilo.montesi/CBD/Beatriz/10.1.1.198.5133.pdf</w:t>
+        </w:r>
+      </w:hyperlink>
       <w:r>
         <w:rPr>
           <w:rFonts w:ascii="Calibri" w:hAnsi="Calibri" w:cs="Calibri"/>
@@ -3269,18 +5202,72 @@
           <w:sz w:val="24"/>
           <w:szCs w:val="24"/>
         </w:rPr>
-        <w:t xml:space="preserve">Cirqueira, D., Hofer, M., Nedbal, D., Helfert, M. and Bezbradica, M. (2020). Customer Purchase Behavior Prediction in E-commerce: A Conceptual Framework and Research Agenda. New Frontiers in Mining Complex Patterns, pp.119–136. </w:t>
-      </w:r>
-      <w:proofErr w:type="gramStart"/>
-      <w:r>
-        <w:rPr>
-          <w:rFonts w:ascii="Calibri" w:hAnsi="Calibri" w:cs="Calibri"/>
-          <w:sz w:val="24"/>
-          <w:szCs w:val="24"/>
-        </w:rPr>
-        <w:t>doi:https://doi.org/10.1007/978-3-030-48861-1_8</w:t>
-      </w:r>
-      <w:proofErr w:type="gramEnd"/>
+        <w:t xml:space="preserve">Hosmer Jr., D.W., </w:t>
+      </w:r>
+      <w:proofErr w:type="spellStart"/>
+      <w:r>
+        <w:rPr>
+          <w:rFonts w:ascii="Calibri" w:hAnsi="Calibri" w:cs="Calibri"/>
+          <w:sz w:val="24"/>
+          <w:szCs w:val="24"/>
+        </w:rPr>
+        <w:t>Lemeshow</w:t>
+      </w:r>
+      <w:proofErr w:type="spellEnd"/>
+      <w:r>
+        <w:rPr>
+          <w:rFonts w:ascii="Calibri" w:hAnsi="Calibri" w:cs="Calibri"/>
+          <w:sz w:val="24"/>
+          <w:szCs w:val="24"/>
+        </w:rPr>
+        <w:t xml:space="preserve">, S. and Sturdivant, R.X. (2013). Applied Logistic Regression. Wiley Series in Probability and Statistics. Hoboken, NJ, USA: John Wiley &amp; Sons, Inc. </w:t>
+      </w:r>
+      <w:proofErr w:type="spellStart"/>
+      <w:r>
+        <w:rPr>
+          <w:rFonts w:ascii="Calibri" w:hAnsi="Calibri" w:cs="Calibri"/>
+          <w:sz w:val="24"/>
+          <w:szCs w:val="24"/>
+        </w:rPr>
+        <w:t>doi:https</w:t>
+      </w:r>
+      <w:proofErr w:type="spellEnd"/>
+      <w:r>
+        <w:rPr>
+          <w:rFonts w:ascii="Calibri" w:hAnsi="Calibri" w:cs="Calibri"/>
+          <w:sz w:val="24"/>
+          <w:szCs w:val="24"/>
+        </w:rPr>
+        <w:t>://doi.org/10.1002/9781118548387.</w:t>
+      </w:r>
+    </w:p>
+    <w:p>
+      <w:pPr>
+        <w:rPr>
+          <w:rFonts w:ascii="Calibri" w:hAnsi="Calibri" w:cs="Calibri"/>
+          <w:sz w:val="24"/>
+          <w:szCs w:val="24"/>
+        </w:rPr>
+      </w:pPr>
+      <w:r>
+        <w:rPr>
+          <w:rFonts w:ascii="Calibri" w:hAnsi="Calibri" w:cs="Calibri"/>
+          <w:sz w:val="24"/>
+          <w:szCs w:val="24"/>
+        </w:rPr>
+        <w:t xml:space="preserve">John Ross Quinlan (1993). C4.5 programs for machine learning. [online] San Mateo, Calif. M. Kaufmann. Available at: </w:t>
+      </w:r>
+      <w:hyperlink r:id="rId15" w:history="1">
+        <w:r>
+          <w:rPr>
+            <w:rStyle w:val="Hyperlink"/>
+            <w:rFonts w:ascii="Calibri" w:hAnsi="Calibri" w:cs="Calibri"/>
+            <w:sz w:val="24"/>
+            <w:szCs w:val="24"/>
+          </w:rPr>
+          <w:t>https://doi.acm.org/10.1145/152181</w:t>
+        </w:r>
+      </w:hyperlink>
       <w:r>
         <w:rPr>
           <w:rFonts w:ascii="Calibri" w:hAnsi="Calibri" w:cs="Calibri"/>
@@ -3304,181 +5291,363 @@
           <w:sz w:val="24"/>
           <w:szCs w:val="24"/>
         </w:rPr>
-        <w:t xml:space="preserve">Jeon, H.G., Kim, C., Lee, J. and Lee, K.C. (2021). Understanding E-Commerce Consumers’ Repeat Purchase Intention: The Role of Trust Transfer and the Moderating Effect of Neuroticism. Frontiers in Psychology, 12. </w:t>
-      </w:r>
-      <w:proofErr w:type="gramStart"/>
-      <w:r>
-        <w:rPr>
-          <w:rFonts w:ascii="Calibri" w:hAnsi="Calibri" w:cs="Calibri"/>
-          <w:sz w:val="24"/>
-          <w:szCs w:val="24"/>
-        </w:rPr>
-        <w:t>doi:https://doi.org/10.3389/fpsyg.2021.690039</w:t>
-      </w:r>
-      <w:proofErr w:type="gramEnd"/>
-      <w:r>
-        <w:rPr>
-          <w:rFonts w:ascii="Calibri" w:hAnsi="Calibri" w:cs="Calibri"/>
-          <w:sz w:val="24"/>
-          <w:szCs w:val="24"/>
-        </w:rPr>
-        <w:t>.</w:t>
-      </w:r>
-    </w:p>
-    <w:p>
-      <w:pPr>
-        <w:rPr>
-          <w:rFonts w:ascii="Calibri" w:hAnsi="Calibri" w:cs="Calibri"/>
-          <w:sz w:val="24"/>
-          <w:szCs w:val="24"/>
-        </w:rPr>
-      </w:pPr>
-      <w:r>
-        <w:rPr>
-          <w:rFonts w:ascii="Calibri" w:hAnsi="Calibri" w:cs="Calibri"/>
-          <w:sz w:val="24"/>
-          <w:szCs w:val="24"/>
-        </w:rPr>
-        <w:t xml:space="preserve">Lundberg, S. and Lee, S.-I. (2017). A Unified Approach to Interpreting Model Predictions. [online] arXiv.org. </w:t>
-      </w:r>
-      <w:proofErr w:type="gramStart"/>
-      <w:r>
-        <w:rPr>
-          <w:rFonts w:ascii="Calibri" w:hAnsi="Calibri" w:cs="Calibri"/>
-          <w:sz w:val="24"/>
-          <w:szCs w:val="24"/>
-        </w:rPr>
-        <w:t>doi:https://doi.org/10.48550/arXiv.1705.07874</w:t>
-      </w:r>
-      <w:proofErr w:type="gramEnd"/>
-      <w:r>
-        <w:rPr>
-          <w:rFonts w:ascii="Calibri" w:hAnsi="Calibri" w:cs="Calibri"/>
-          <w:sz w:val="24"/>
-          <w:szCs w:val="24"/>
-        </w:rPr>
-        <w:t>.</w:t>
-      </w:r>
-    </w:p>
-    <w:p>
-      <w:pPr>
-        <w:rPr>
-          <w:rFonts w:ascii="Calibri" w:hAnsi="Calibri" w:cs="Calibri"/>
-          <w:sz w:val="24"/>
-          <w:szCs w:val="24"/>
-        </w:rPr>
-      </w:pPr>
-      <w:r>
-        <w:rPr>
-          <w:rFonts w:ascii="Calibri" w:hAnsi="Calibri" w:cs="Calibri"/>
-          <w:sz w:val="24"/>
-          <w:szCs w:val="24"/>
-        </w:rPr>
-        <w:t>Molnar, C. (2019). Interpretable machine learning: a guide for making Black Box Models interpretable. Morisville, North Carolina: Lulu.</w:t>
-      </w:r>
-    </w:p>
-    <w:p>
-      <w:pPr>
-        <w:rPr>
-          <w:rFonts w:ascii="Calibri" w:hAnsi="Calibri" w:cs="Calibri"/>
-          <w:sz w:val="24"/>
-          <w:szCs w:val="24"/>
-        </w:rPr>
-      </w:pPr>
-      <w:r>
-        <w:rPr>
-          <w:rFonts w:ascii="Calibri" w:hAnsi="Calibri" w:cs="Calibri"/>
-          <w:sz w:val="24"/>
-          <w:szCs w:val="24"/>
-        </w:rPr>
-        <w:t xml:space="preserve">Harter, A., Stich, L. and Spann, M. (2024). The Effect of Delivery Time on Repurchase Behavior in Quick Commerce. Journal of Service Research, [online] 28(2). </w:t>
-      </w:r>
-      <w:proofErr w:type="gramStart"/>
-      <w:r>
-        <w:rPr>
-          <w:rFonts w:ascii="Calibri" w:hAnsi="Calibri" w:cs="Calibri"/>
-          <w:sz w:val="24"/>
-          <w:szCs w:val="24"/>
-        </w:rPr>
-        <w:t>doi:https://doi.org/10.1177/10946705241236961</w:t>
-      </w:r>
-      <w:proofErr w:type="gramEnd"/>
-      <w:r>
-        <w:rPr>
-          <w:rFonts w:ascii="Calibri" w:hAnsi="Calibri" w:cs="Calibri"/>
-          <w:sz w:val="24"/>
-          <w:szCs w:val="24"/>
-        </w:rPr>
-        <w:t>.</w:t>
-      </w:r>
-    </w:p>
-    <w:p>
-      <w:pPr>
-        <w:rPr>
-          <w:rFonts w:ascii="Calibri" w:hAnsi="Calibri" w:cs="Calibri"/>
-          <w:sz w:val="24"/>
-          <w:szCs w:val="24"/>
-        </w:rPr>
-      </w:pPr>
-      <w:r>
-        <w:rPr>
-          <w:rFonts w:ascii="Calibri" w:hAnsi="Calibri" w:cs="Calibri"/>
-          <w:sz w:val="24"/>
-          <w:szCs w:val="24"/>
-        </w:rPr>
-        <w:t xml:space="preserve">Henninger, M. and Strobl, C. (2024). Interpreting machine learning predictions with LIME and Shapley values: theoretical insights, challenges, and meaningful interpretations. Behaviormetrika, 52(1), pp.45–75. </w:t>
-      </w:r>
-      <w:proofErr w:type="gramStart"/>
-      <w:r>
-        <w:rPr>
-          <w:rFonts w:ascii="Calibri" w:hAnsi="Calibri" w:cs="Calibri"/>
-          <w:sz w:val="24"/>
-          <w:szCs w:val="24"/>
-        </w:rPr>
-        <w:t>doi:https://doi.org/10.1007/s41237-024-00253-2</w:t>
-      </w:r>
-      <w:proofErr w:type="gramEnd"/>
-      <w:r>
-        <w:rPr>
-          <w:rFonts w:ascii="Calibri" w:hAnsi="Calibri" w:cs="Calibri"/>
-          <w:sz w:val="24"/>
-          <w:szCs w:val="24"/>
-        </w:rPr>
-        <w:t>.</w:t>
-      </w:r>
-    </w:p>
-    <w:p>
-      <w:pPr>
-        <w:rPr>
-          <w:rFonts w:ascii="Calibri" w:hAnsi="Calibri" w:cs="Calibri"/>
-          <w:sz w:val="24"/>
-          <w:szCs w:val="24"/>
-        </w:rPr>
-      </w:pPr>
-      <w:r>
-        <w:rPr>
-          <w:rFonts w:ascii="Calibri" w:hAnsi="Calibri" w:cs="Calibri"/>
-          <w:sz w:val="24"/>
-          <w:szCs w:val="24"/>
-        </w:rPr>
-        <w:t>Wirth, R. and Hipp, J. (2000). CRISP-DM: Towards a Standard Process Model for Data Mining. [online] Available at:</w:t>
-      </w:r>
-      <w:r>
-        <w:rPr>
-          <w:rFonts w:ascii="Calibri" w:hAnsi="Calibri" w:cs="Calibri"/>
-          <w:sz w:val="24"/>
-          <w:szCs w:val="24"/>
-        </w:rPr>
-        <w:t xml:space="preserve"> </w:t>
-      </w:r>
-      <w:r>
-        <w:rPr>
-          <w:rFonts w:ascii="Calibri" w:hAnsi="Calibri" w:cs="Calibri"/>
-          <w:sz w:val="24"/>
-          <w:szCs w:val="24"/>
-        </w:rPr>
-        <w:t>https://www.cs.unibo.it/~danilo.montesi/CBD/Beatriz/10.1.1.198.5133.pdf.</w:t>
-      </w:r>
+        <w:t xml:space="preserve">Chen, T. and </w:t>
+      </w:r>
+      <w:proofErr w:type="spellStart"/>
+      <w:r>
+        <w:rPr>
+          <w:rFonts w:ascii="Calibri" w:hAnsi="Calibri" w:cs="Calibri"/>
+          <w:sz w:val="24"/>
+          <w:szCs w:val="24"/>
+        </w:rPr>
+        <w:t>Guestrin</w:t>
+      </w:r>
+      <w:proofErr w:type="spellEnd"/>
+      <w:r>
+        <w:rPr>
+          <w:rFonts w:ascii="Calibri" w:hAnsi="Calibri" w:cs="Calibri"/>
+          <w:sz w:val="24"/>
+          <w:szCs w:val="24"/>
+        </w:rPr>
+        <w:t xml:space="preserve">, C. (2016). </w:t>
+      </w:r>
+      <w:proofErr w:type="spellStart"/>
+      <w:r>
+        <w:rPr>
+          <w:rFonts w:ascii="Calibri" w:hAnsi="Calibri" w:cs="Calibri"/>
+          <w:sz w:val="24"/>
+          <w:szCs w:val="24"/>
+        </w:rPr>
+        <w:t>XGBoost</w:t>
+      </w:r>
+      <w:proofErr w:type="spellEnd"/>
+      <w:r>
+        <w:rPr>
+          <w:rFonts w:ascii="Calibri" w:hAnsi="Calibri" w:cs="Calibri"/>
+          <w:sz w:val="24"/>
+          <w:szCs w:val="24"/>
+        </w:rPr>
+        <w:t xml:space="preserve">: a Scalable Tree Boosting System. Proceedings of the 22nd ACM SIGKDD International Conference on Knowledge Discovery and Data Mining - KDD ’16, 1(1), pp.785–794. </w:t>
+      </w:r>
+      <w:proofErr w:type="spellStart"/>
+      <w:r>
+        <w:rPr>
+          <w:rFonts w:ascii="Calibri" w:hAnsi="Calibri" w:cs="Calibri"/>
+          <w:sz w:val="24"/>
+          <w:szCs w:val="24"/>
+        </w:rPr>
+        <w:t>doi:https</w:t>
+      </w:r>
+      <w:proofErr w:type="spellEnd"/>
+      <w:r>
+        <w:rPr>
+          <w:rFonts w:ascii="Calibri" w:hAnsi="Calibri" w:cs="Calibri"/>
+          <w:sz w:val="24"/>
+          <w:szCs w:val="24"/>
+        </w:rPr>
+        <w:t>://doi.org/10.1145/2939672.2939785.</w:t>
+      </w:r>
+    </w:p>
+    <w:p>
+      <w:pPr>
+        <w:rPr>
+          <w:rFonts w:ascii="Calibri" w:hAnsi="Calibri" w:cs="Calibri"/>
+          <w:sz w:val="24"/>
+          <w:szCs w:val="24"/>
+        </w:rPr>
+      </w:pPr>
+      <w:r>
+        <w:rPr>
+          <w:rFonts w:ascii="Calibri" w:hAnsi="Calibri" w:cs="Calibri"/>
+          <w:sz w:val="24"/>
+          <w:szCs w:val="24"/>
+        </w:rPr>
+        <w:t xml:space="preserve">Bogaert, M. and Delaere, L. (2023). Ensemble Methods in Customer Churn Prediction: A Comparative Analysis of the State-of-the-Art. Mathematics, 11(5), p.1137. </w:t>
+      </w:r>
+      <w:proofErr w:type="spellStart"/>
+      <w:r>
+        <w:rPr>
+          <w:rFonts w:ascii="Calibri" w:hAnsi="Calibri" w:cs="Calibri"/>
+          <w:sz w:val="24"/>
+          <w:szCs w:val="24"/>
+        </w:rPr>
+        <w:t>doi:https</w:t>
+      </w:r>
+      <w:proofErr w:type="spellEnd"/>
+      <w:r>
+        <w:rPr>
+          <w:rFonts w:ascii="Calibri" w:hAnsi="Calibri" w:cs="Calibri"/>
+          <w:sz w:val="24"/>
+          <w:szCs w:val="24"/>
+        </w:rPr>
+        <w:t>://doi.org/10.3390/math11051137.</w:t>
+      </w:r>
+    </w:p>
+    <w:p>
+      <w:pPr>
+        <w:rPr>
+          <w:rFonts w:ascii="Calibri" w:hAnsi="Calibri" w:cs="Calibri"/>
+          <w:sz w:val="24"/>
+          <w:szCs w:val="24"/>
+        </w:rPr>
+      </w:pPr>
+      <w:r>
+        <w:rPr>
+          <w:rFonts w:ascii="Calibri" w:hAnsi="Calibri" w:cs="Calibri"/>
+          <w:sz w:val="24"/>
+          <w:szCs w:val="24"/>
+        </w:rPr>
+        <w:t xml:space="preserve">Fernández, A., García, S., Galar, M., Prati, R.C., Krawczyk, B. and Herrera, F. (2018). Learning from Imbalanced Data Sets. Cham: Springer International Publishing. </w:t>
+      </w:r>
+      <w:proofErr w:type="spellStart"/>
+      <w:r>
+        <w:rPr>
+          <w:rFonts w:ascii="Calibri" w:hAnsi="Calibri" w:cs="Calibri"/>
+          <w:sz w:val="24"/>
+          <w:szCs w:val="24"/>
+        </w:rPr>
+        <w:t>doi:https</w:t>
+      </w:r>
+      <w:proofErr w:type="spellEnd"/>
+      <w:r>
+        <w:rPr>
+          <w:rFonts w:ascii="Calibri" w:hAnsi="Calibri" w:cs="Calibri"/>
+          <w:sz w:val="24"/>
+          <w:szCs w:val="24"/>
+        </w:rPr>
+        <w:t>://doi.org/10.1007/978-3-319-98074-4.</w:t>
+      </w:r>
+    </w:p>
+    <w:p>
+      <w:pPr>
+        <w:rPr>
+          <w:rFonts w:ascii="Calibri" w:hAnsi="Calibri" w:cs="Calibri"/>
+          <w:sz w:val="24"/>
+          <w:szCs w:val="24"/>
+        </w:rPr>
+      </w:pPr>
+      <w:r>
+        <w:rPr>
+          <w:rFonts w:ascii="Calibri" w:hAnsi="Calibri" w:cs="Calibri"/>
+          <w:sz w:val="24"/>
+          <w:szCs w:val="24"/>
+        </w:rPr>
+        <w:t xml:space="preserve">Tharwat, A. (2020). Classification assessment methods. Applied Computing and Informatics, 17(1). </w:t>
+      </w:r>
+      <w:proofErr w:type="spellStart"/>
+      <w:r>
+        <w:rPr>
+          <w:rFonts w:ascii="Calibri" w:hAnsi="Calibri" w:cs="Calibri"/>
+          <w:sz w:val="24"/>
+          <w:szCs w:val="24"/>
+        </w:rPr>
+        <w:t>doi:https</w:t>
+      </w:r>
+      <w:proofErr w:type="spellEnd"/>
+      <w:r>
+        <w:rPr>
+          <w:rFonts w:ascii="Calibri" w:hAnsi="Calibri" w:cs="Calibri"/>
+          <w:sz w:val="24"/>
+          <w:szCs w:val="24"/>
+        </w:rPr>
+        <w:t>://doi.org/10.1016/j.aci.2018.08.003.</w:t>
+      </w:r>
+    </w:p>
+    <w:p>
+      <w:pPr>
+        <w:rPr>
+          <w:rFonts w:ascii="Calibri" w:hAnsi="Calibri" w:cs="Calibri"/>
+          <w:sz w:val="24"/>
+          <w:szCs w:val="24"/>
+        </w:rPr>
+      </w:pPr>
+      <w:r>
+        <w:rPr>
+          <w:rFonts w:ascii="Calibri" w:hAnsi="Calibri" w:cs="Calibri"/>
+          <w:sz w:val="24"/>
+          <w:szCs w:val="24"/>
+        </w:rPr>
+        <w:t xml:space="preserve">Probst, P., Wright, M.N. and Boulesteix, A. (2019). Hyperparameters and tuning strategies for random forest. Wiley Interdisciplinary Reviews: Data Mining and Knowledge Discovery, 9(3). </w:t>
+      </w:r>
+      <w:proofErr w:type="spellStart"/>
+      <w:r>
+        <w:rPr>
+          <w:rFonts w:ascii="Calibri" w:hAnsi="Calibri" w:cs="Calibri"/>
+          <w:sz w:val="24"/>
+          <w:szCs w:val="24"/>
+        </w:rPr>
+        <w:t>doi:https</w:t>
+      </w:r>
+      <w:proofErr w:type="spellEnd"/>
+      <w:r>
+        <w:rPr>
+          <w:rFonts w:ascii="Calibri" w:hAnsi="Calibri" w:cs="Calibri"/>
+          <w:sz w:val="24"/>
+          <w:szCs w:val="24"/>
+        </w:rPr>
+        <w:t>://doi.org/10.1002/widm.1301.</w:t>
+      </w:r>
+    </w:p>
+    <w:p>
+      <w:pPr>
+        <w:rPr>
+          <w:rFonts w:ascii="Calibri" w:hAnsi="Calibri" w:cs="Calibri"/>
+          <w:sz w:val="24"/>
+          <w:szCs w:val="24"/>
+        </w:rPr>
+      </w:pPr>
+      <w:r>
+        <w:rPr>
+          <w:rFonts w:ascii="Calibri" w:hAnsi="Calibri" w:cs="Calibri"/>
+          <w:sz w:val="24"/>
+          <w:szCs w:val="24"/>
+        </w:rPr>
+        <w:t xml:space="preserve">Pedregosa, F., </w:t>
+      </w:r>
+      <w:proofErr w:type="spellStart"/>
+      <w:r>
+        <w:rPr>
+          <w:rFonts w:ascii="Calibri" w:hAnsi="Calibri" w:cs="Calibri"/>
+          <w:sz w:val="24"/>
+          <w:szCs w:val="24"/>
+        </w:rPr>
+        <w:t>Varoquaux</w:t>
+      </w:r>
+      <w:proofErr w:type="spellEnd"/>
+      <w:r>
+        <w:rPr>
+          <w:rFonts w:ascii="Calibri" w:hAnsi="Calibri" w:cs="Calibri"/>
+          <w:sz w:val="24"/>
+          <w:szCs w:val="24"/>
+        </w:rPr>
+        <w:t xml:space="preserve">, G., </w:t>
+      </w:r>
+      <w:proofErr w:type="spellStart"/>
+      <w:r>
+        <w:rPr>
+          <w:rFonts w:ascii="Calibri" w:hAnsi="Calibri" w:cs="Calibri"/>
+          <w:sz w:val="24"/>
+          <w:szCs w:val="24"/>
+        </w:rPr>
+        <w:t>Gramfort</w:t>
+      </w:r>
+      <w:proofErr w:type="spellEnd"/>
+      <w:r>
+        <w:rPr>
+          <w:rFonts w:ascii="Calibri" w:hAnsi="Calibri" w:cs="Calibri"/>
+          <w:sz w:val="24"/>
+          <w:szCs w:val="24"/>
+        </w:rPr>
+        <w:t xml:space="preserve">, A., Michel, V., Thirion, B., Grisel, O., Blondel, M., </w:t>
+      </w:r>
+      <w:proofErr w:type="spellStart"/>
+      <w:r>
+        <w:rPr>
+          <w:rFonts w:ascii="Calibri" w:hAnsi="Calibri" w:cs="Calibri"/>
+          <w:sz w:val="24"/>
+          <w:szCs w:val="24"/>
+        </w:rPr>
+        <w:t>Louppe</w:t>
+      </w:r>
+      <w:proofErr w:type="spellEnd"/>
+      <w:r>
+        <w:rPr>
+          <w:rFonts w:ascii="Calibri" w:hAnsi="Calibri" w:cs="Calibri"/>
+          <w:sz w:val="24"/>
+          <w:szCs w:val="24"/>
+        </w:rPr>
+        <w:t xml:space="preserve">, G., </w:t>
+      </w:r>
+      <w:proofErr w:type="spellStart"/>
+      <w:r>
+        <w:rPr>
+          <w:rFonts w:ascii="Calibri" w:hAnsi="Calibri" w:cs="Calibri"/>
+          <w:sz w:val="24"/>
+          <w:szCs w:val="24"/>
+        </w:rPr>
+        <w:t>Prettenhofer</w:t>
+      </w:r>
+      <w:proofErr w:type="spellEnd"/>
+      <w:r>
+        <w:rPr>
+          <w:rFonts w:ascii="Calibri" w:hAnsi="Calibri" w:cs="Calibri"/>
+          <w:sz w:val="24"/>
+          <w:szCs w:val="24"/>
+        </w:rPr>
+        <w:t xml:space="preserve">, P., Weiss, R., Weiss, R.J., Vanderplas, J., Passos, A., </w:t>
+      </w:r>
+      <w:proofErr w:type="spellStart"/>
+      <w:r>
+        <w:rPr>
+          <w:rFonts w:ascii="Calibri" w:hAnsi="Calibri" w:cs="Calibri"/>
+          <w:sz w:val="24"/>
+          <w:szCs w:val="24"/>
+        </w:rPr>
+        <w:t>Cournapeau</w:t>
+      </w:r>
+      <w:proofErr w:type="spellEnd"/>
+      <w:r>
+        <w:rPr>
+          <w:rFonts w:ascii="Calibri" w:hAnsi="Calibri" w:cs="Calibri"/>
+          <w:sz w:val="24"/>
+          <w:szCs w:val="24"/>
+        </w:rPr>
+        <w:t xml:space="preserve">, D., Brucher, M., Perrot, M. and Duchesnay, E. (2011). Scikit-learn: Machine Learning in Python. J. Mach. Learn. Res., [online] 12. </w:t>
+      </w:r>
+      <w:proofErr w:type="spellStart"/>
+      <w:r>
+        <w:rPr>
+          <w:rFonts w:ascii="Calibri" w:hAnsi="Calibri" w:cs="Calibri"/>
+          <w:sz w:val="24"/>
+          <w:szCs w:val="24"/>
+        </w:rPr>
+        <w:t>doi:https</w:t>
+      </w:r>
+      <w:proofErr w:type="spellEnd"/>
+      <w:r>
+        <w:rPr>
+          <w:rFonts w:ascii="Calibri" w:hAnsi="Calibri" w:cs="Calibri"/>
+          <w:sz w:val="24"/>
+          <w:szCs w:val="24"/>
+        </w:rPr>
+        <w:t>://doi.org/10.5555/1953048.2078195.</w:t>
+      </w:r>
+    </w:p>
+    <w:p>
+      <w:pPr>
+        <w:rPr>
+          <w:rFonts w:ascii="Calibri" w:hAnsi="Calibri" w:cs="Calibri"/>
+          <w:sz w:val="24"/>
+          <w:szCs w:val="24"/>
+        </w:rPr>
+      </w:pPr>
+    </w:p>
+    <w:p>
+      <w:pPr>
+        <w:rPr>
+          <w:rFonts w:ascii="Calibri" w:hAnsi="Calibri" w:cs="Calibri"/>
+          <w:sz w:val="24"/>
+          <w:szCs w:val="24"/>
+        </w:rPr>
+      </w:pPr>
+    </w:p>
+    <w:p>
+      <w:pPr>
+        <w:rPr>
+          <w:rFonts w:ascii="Calibri" w:hAnsi="Calibri" w:cs="Calibri"/>
+          <w:sz w:val="24"/>
+          <w:szCs w:val="24"/>
+        </w:rPr>
+      </w:pPr>
+    </w:p>
+    <w:p>
+      <w:pPr>
+        <w:rPr>
+          <w:rFonts w:ascii="Calibri" w:hAnsi="Calibri" w:cs="Calibri"/>
+          <w:sz w:val="24"/>
+          <w:szCs w:val="24"/>
+        </w:rPr>
+      </w:pPr>
     </w:p>
     <w:p>
       <w:pPr>
@@ -4464,6 +6633,29 @@
       <w:spacing w:val="5"/>
     </w:rPr>
   </w:style>
+  <w:style w:type="character" w:styleId="Hyperlink">
+    <w:name w:val="Hyperlink"/>
+    <w:basedOn w:val="DefaultParagraphFont"/>
+    <w:uiPriority w:val="99"/>
+    <w:unhideWhenUsed/>
+    <w:rsid w:val="009147DE"/>
+    <w:rPr>
+      <w:color w:val="467886" w:themeColor="hyperlink"/>
+      <w:u w:val="single"/>
+    </w:rPr>
+  </w:style>
+  <w:style w:type="character" w:styleId="UnresolvedMention">
+    <w:name w:val="Unresolved Mention"/>
+    <w:basedOn w:val="DefaultParagraphFont"/>
+    <w:uiPriority w:val="99"/>
+    <w:semiHidden/>
+    <w:unhideWhenUsed/>
+    <w:rsid w:val="009147DE"/>
+    <w:rPr>
+      <w:color w:val="605E5C"/>
+      <w:shd w:val="clear" w:color="auto" w:fill="E1DFDD"/>
+    </w:rPr>
+  </w:style>
 </w:styles>
 </file>
 

</xml_diff>

<commit_message>
Add findings and discussion chapter
</commit_message>
<xml_diff>
--- a/CA3-Capstone.docx
+++ b/CA3-Capstone.docx
@@ -6825,6 +6825,608 @@
           <w:szCs w:val="24"/>
         </w:rPr>
       </w:pPr>
+      <w:r>
+        <w:rPr>
+          <w:rFonts w:ascii="Calibri" w:hAnsi="Calibri" w:cs="Calibri"/>
+          <w:b/>
+          <w:bCs/>
+          <w:sz w:val="32"/>
+          <w:szCs w:val="32"/>
+        </w:rPr>
+        <w:lastRenderedPageBreak/>
+        <w:t>1</w:t>
+      </w:r>
+      <w:r>
+        <w:rPr>
+          <w:rFonts w:ascii="Calibri" w:hAnsi="Calibri" w:cs="Calibri"/>
+          <w:b/>
+          <w:bCs/>
+          <w:sz w:val="32"/>
+          <w:szCs w:val="32"/>
+        </w:rPr>
+        <w:t>1</w:t>
+      </w:r>
+      <w:r>
+        <w:rPr>
+          <w:rFonts w:ascii="Calibri" w:hAnsi="Calibri" w:cs="Calibri"/>
+          <w:b/>
+          <w:bCs/>
+          <w:sz w:val="32"/>
+          <w:szCs w:val="32"/>
+        </w:rPr>
+        <w:t>. Findings and Discussion</w:t>
+      </w:r>
+    </w:p>
+    <w:p>
+      <w:pPr>
+        <w:rPr>
+          <w:rFonts w:ascii="Calibri" w:hAnsi="Calibri" w:cs="Calibri"/>
+          <w:sz w:val="24"/>
+          <w:szCs w:val="24"/>
+        </w:rPr>
+      </w:pPr>
+      <w:r>
+        <w:rPr>
+          <w:rFonts w:ascii="Calibri" w:hAnsi="Calibri" w:cs="Calibri"/>
+          <w:sz w:val="24"/>
+          <w:szCs w:val="24"/>
+        </w:rPr>
+        <w:t>In order to answer the three research questions of the study and assess the extent to which its objectives were met, this section summarizes the modelling results and interpretability insights.</w:t>
+      </w:r>
+    </w:p>
+    <w:p>
+      <w:pPr>
+        <w:rPr>
+          <w:rFonts w:ascii="Calibri" w:hAnsi="Calibri" w:cs="Calibri"/>
+          <w:b/>
+          <w:bCs/>
+          <w:sz w:val="28"/>
+          <w:szCs w:val="28"/>
+        </w:rPr>
+      </w:pPr>
+      <w:r>
+        <w:rPr>
+          <w:rFonts w:ascii="Calibri" w:hAnsi="Calibri" w:cs="Calibri"/>
+          <w:b/>
+          <w:bCs/>
+          <w:sz w:val="28"/>
+          <w:szCs w:val="28"/>
+        </w:rPr>
+        <w:t>1</w:t>
+      </w:r>
+      <w:r>
+        <w:rPr>
+          <w:rFonts w:ascii="Calibri" w:hAnsi="Calibri" w:cs="Calibri"/>
+          <w:b/>
+          <w:bCs/>
+          <w:sz w:val="28"/>
+          <w:szCs w:val="28"/>
+        </w:rPr>
+        <w:t>1</w:t>
+      </w:r>
+      <w:r>
+        <w:rPr>
+          <w:rFonts w:ascii="Calibri" w:hAnsi="Calibri" w:cs="Calibri"/>
+          <w:b/>
+          <w:bCs/>
+          <w:sz w:val="28"/>
+          <w:szCs w:val="28"/>
+        </w:rPr>
+        <w:t xml:space="preserve">.1 </w:t>
+      </w:r>
+      <w:r>
+        <w:rPr>
+          <w:rFonts w:ascii="Calibri" w:hAnsi="Calibri" w:cs="Calibri"/>
+          <w:b/>
+          <w:bCs/>
+          <w:sz w:val="28"/>
+          <w:szCs w:val="28"/>
+        </w:rPr>
+        <w:t>Model Performance and Comparative Evaluation</w:t>
+      </w:r>
+    </w:p>
+    <w:p>
+      <w:pPr>
+        <w:rPr>
+          <w:rFonts w:ascii="Calibri" w:hAnsi="Calibri" w:cs="Calibri"/>
+          <w:sz w:val="24"/>
+          <w:szCs w:val="24"/>
+        </w:rPr>
+      </w:pPr>
+      <w:r>
+        <w:rPr>
+          <w:rFonts w:ascii="Calibri" w:hAnsi="Calibri" w:cs="Calibri"/>
+          <w:sz w:val="24"/>
+          <w:szCs w:val="24"/>
+        </w:rPr>
+        <w:t>The tuned Decision Tree classifier displayed excellent predictive performance with an F1-score of 0.988 and a ROC-AUC of 0.991.</w:t>
+      </w:r>
+      <w:r>
+        <w:rPr>
+          <w:rFonts w:ascii="Calibri" w:hAnsi="Calibri" w:cs="Calibri"/>
+          <w:sz w:val="24"/>
+          <w:szCs w:val="24"/>
+        </w:rPr>
+        <w:t xml:space="preserve"> </w:t>
+      </w:r>
+      <w:r>
+        <w:rPr>
+          <w:rFonts w:ascii="Calibri" w:hAnsi="Calibri" w:cs="Calibri"/>
+          <w:sz w:val="24"/>
+          <w:szCs w:val="24"/>
+        </w:rPr>
+        <w:t xml:space="preserve">Although it had a slightly lower recall, logistic regression also did well. Near-perfect AUCs and a strong balance between precision and recall were attained by ensemble models like Random Forest and </w:t>
+      </w:r>
+      <w:proofErr w:type="spellStart"/>
+      <w:r>
+        <w:rPr>
+          <w:rFonts w:ascii="Calibri" w:hAnsi="Calibri" w:cs="Calibri"/>
+          <w:sz w:val="24"/>
+          <w:szCs w:val="24"/>
+        </w:rPr>
+        <w:t>XGBoost</w:t>
+      </w:r>
+      <w:proofErr w:type="spellEnd"/>
+      <w:r>
+        <w:rPr>
+          <w:rFonts w:ascii="Calibri" w:hAnsi="Calibri" w:cs="Calibri"/>
+          <w:sz w:val="24"/>
+          <w:szCs w:val="24"/>
+        </w:rPr>
+        <w:t xml:space="preserve">. Despite their excellent performance, ensemble models were not chosen for final implementation because of their limited interpretability, which conflicted against with project's stakeholder-facing transparency requirements. This choice is in line with Objective 2, which highlighted the need to balance between explainability and predictive power in business-facing applications (Bogaert and Delaere, 2023; Chen and </w:t>
+      </w:r>
+      <w:proofErr w:type="spellStart"/>
+      <w:r>
+        <w:rPr>
+          <w:rFonts w:ascii="Calibri" w:hAnsi="Calibri" w:cs="Calibri"/>
+          <w:sz w:val="24"/>
+          <w:szCs w:val="24"/>
+        </w:rPr>
+        <w:t>Guestrin</w:t>
+      </w:r>
+      <w:proofErr w:type="spellEnd"/>
+      <w:r>
+        <w:rPr>
+          <w:rFonts w:ascii="Calibri" w:hAnsi="Calibri" w:cs="Calibri"/>
+          <w:sz w:val="24"/>
+          <w:szCs w:val="24"/>
+        </w:rPr>
+        <w:t>, 2016).</w:t>
+      </w:r>
+    </w:p>
+    <w:p>
+      <w:pPr>
+        <w:rPr>
+          <w:rFonts w:ascii="Calibri" w:hAnsi="Calibri" w:cs="Calibri"/>
+          <w:sz w:val="24"/>
+          <w:szCs w:val="24"/>
+        </w:rPr>
+      </w:pPr>
+      <w:proofErr w:type="spellStart"/>
+      <w:r>
+        <w:rPr>
+          <w:rFonts w:ascii="Calibri" w:hAnsi="Calibri" w:cs="Calibri"/>
+          <w:sz w:val="24"/>
+          <w:szCs w:val="24"/>
+        </w:rPr>
+        <w:t>GridSearchCV</w:t>
+      </w:r>
+      <w:proofErr w:type="spellEnd"/>
+      <w:r>
+        <w:rPr>
+          <w:rFonts w:ascii="Calibri" w:hAnsi="Calibri" w:cs="Calibri"/>
+          <w:sz w:val="24"/>
+          <w:szCs w:val="24"/>
+        </w:rPr>
+        <w:t xml:space="preserve"> was used using 5-fold cross-validation and F1-score as the scoring metric to optimize model performance. Each model's parameter grids were customised, such as tree-based hyperparameters for ensemble models, maximum depth and splitting criteria for Decision Trees, and regularisation strength for Logistic Regression (</w:t>
+      </w:r>
+      <w:proofErr w:type="spellStart"/>
+      <w:r>
+        <w:rPr>
+          <w:rFonts w:ascii="Calibri" w:hAnsi="Calibri" w:cs="Calibri"/>
+          <w:sz w:val="24"/>
+          <w:szCs w:val="24"/>
+        </w:rPr>
+        <w:t>Bergstra</w:t>
+      </w:r>
+      <w:proofErr w:type="spellEnd"/>
+      <w:r>
+        <w:rPr>
+          <w:rFonts w:ascii="Calibri" w:hAnsi="Calibri" w:cs="Calibri"/>
+          <w:sz w:val="24"/>
+          <w:szCs w:val="24"/>
+        </w:rPr>
+        <w:t xml:space="preserve"> and Bengio, 2012; Pedregosa et al., 2011). To measure generalisation and robustness, tuned models were retrained on the entire training set and re-evaluated on the test set.</w:t>
+      </w:r>
+    </w:p>
+    <w:p>
+      <w:pPr>
+        <w:rPr>
+          <w:rFonts w:ascii="Calibri" w:hAnsi="Calibri" w:cs="Calibri"/>
+          <w:b/>
+          <w:bCs/>
+          <w:sz w:val="28"/>
+          <w:szCs w:val="28"/>
+        </w:rPr>
+      </w:pPr>
+      <w:r>
+        <w:rPr>
+          <w:rFonts w:ascii="Calibri" w:hAnsi="Calibri" w:cs="Calibri"/>
+          <w:b/>
+          <w:bCs/>
+          <w:sz w:val="28"/>
+          <w:szCs w:val="28"/>
+        </w:rPr>
+        <w:t>1</w:t>
+      </w:r>
+      <w:r>
+        <w:rPr>
+          <w:rFonts w:ascii="Calibri" w:hAnsi="Calibri" w:cs="Calibri"/>
+          <w:b/>
+          <w:bCs/>
+          <w:sz w:val="28"/>
+          <w:szCs w:val="28"/>
+        </w:rPr>
+        <w:t>1</w:t>
+      </w:r>
+      <w:r>
+        <w:rPr>
+          <w:rFonts w:ascii="Calibri" w:hAnsi="Calibri" w:cs="Calibri"/>
+          <w:b/>
+          <w:bCs/>
+          <w:sz w:val="28"/>
+          <w:szCs w:val="28"/>
+        </w:rPr>
+        <w:t xml:space="preserve">.2 </w:t>
+      </w:r>
+      <w:r>
+        <w:rPr>
+          <w:rFonts w:ascii="Calibri" w:hAnsi="Calibri" w:cs="Calibri"/>
+          <w:b/>
+          <w:bCs/>
+          <w:sz w:val="28"/>
+          <w:szCs w:val="28"/>
+        </w:rPr>
+        <w:t>Global Interpretability and Behavioural Insights</w:t>
+      </w:r>
+    </w:p>
+    <w:p>
+      <w:pPr>
+        <w:rPr>
+          <w:rFonts w:ascii="Calibri" w:hAnsi="Calibri" w:cs="Calibri"/>
+          <w:sz w:val="24"/>
+          <w:szCs w:val="24"/>
+        </w:rPr>
+      </w:pPr>
+      <w:r>
+        <w:rPr>
+          <w:rFonts w:ascii="Calibri" w:hAnsi="Calibri" w:cs="Calibri"/>
+          <w:sz w:val="24"/>
+          <w:szCs w:val="24"/>
+        </w:rPr>
+        <w:t xml:space="preserve">Both global and local explanations were produced by applying SHAP to the tuned Decision Tree model. The most influential predictor of repeat purchase behaviour was </w:t>
+      </w:r>
+      <w:proofErr w:type="spellStart"/>
+      <w:r>
+        <w:rPr>
+          <w:rFonts w:ascii="Calibri" w:hAnsi="Calibri" w:cs="Calibri"/>
+          <w:sz w:val="24"/>
+          <w:szCs w:val="24"/>
+        </w:rPr>
+        <w:t>avg_days_between_purchases</w:t>
+      </w:r>
+      <w:proofErr w:type="spellEnd"/>
+      <w:r>
+        <w:rPr>
+          <w:rFonts w:ascii="Calibri" w:hAnsi="Calibri" w:cs="Calibri"/>
+          <w:sz w:val="24"/>
+          <w:szCs w:val="24"/>
+        </w:rPr>
+        <w:t xml:space="preserve">, followed by </w:t>
+      </w:r>
+      <w:proofErr w:type="spellStart"/>
+      <w:r>
+        <w:rPr>
+          <w:rFonts w:ascii="Calibri" w:hAnsi="Calibri" w:cs="Calibri"/>
+          <w:sz w:val="24"/>
+          <w:szCs w:val="24"/>
+        </w:rPr>
+        <w:t>total_spend_per_customer</w:t>
+      </w:r>
+      <w:proofErr w:type="spellEnd"/>
+      <w:r>
+        <w:rPr>
+          <w:rFonts w:ascii="Calibri" w:hAnsi="Calibri" w:cs="Calibri"/>
+          <w:sz w:val="24"/>
+          <w:szCs w:val="24"/>
+        </w:rPr>
+        <w:t xml:space="preserve"> and </w:t>
+      </w:r>
+      <w:proofErr w:type="spellStart"/>
+      <w:r>
+        <w:rPr>
+          <w:rFonts w:ascii="Calibri" w:hAnsi="Calibri" w:cs="Calibri"/>
+          <w:sz w:val="24"/>
+          <w:szCs w:val="24"/>
+        </w:rPr>
+        <w:t>category_diversity</w:t>
+      </w:r>
+      <w:proofErr w:type="spellEnd"/>
+      <w:r>
+        <w:rPr>
+          <w:rFonts w:ascii="Calibri" w:hAnsi="Calibri" w:cs="Calibri"/>
+          <w:sz w:val="24"/>
+          <w:szCs w:val="24"/>
+        </w:rPr>
+        <w:t xml:space="preserve">, according to global interpretability obtained from SHAP summary plots and aggregated SHAP values. In both classes, features like </w:t>
+      </w:r>
+      <w:proofErr w:type="spellStart"/>
+      <w:r>
+        <w:rPr>
+          <w:rFonts w:ascii="Calibri" w:hAnsi="Calibri" w:cs="Calibri"/>
+          <w:sz w:val="24"/>
+          <w:szCs w:val="24"/>
+        </w:rPr>
+        <w:t>unique_products_purchased</w:t>
+      </w:r>
+      <w:proofErr w:type="spellEnd"/>
+      <w:r>
+        <w:rPr>
+          <w:rFonts w:ascii="Calibri" w:hAnsi="Calibri" w:cs="Calibri"/>
+          <w:sz w:val="24"/>
+          <w:szCs w:val="24"/>
+        </w:rPr>
+        <w:t xml:space="preserve"> and </w:t>
+      </w:r>
+      <w:proofErr w:type="spellStart"/>
+      <w:r>
+        <w:rPr>
+          <w:rFonts w:ascii="Calibri" w:hAnsi="Calibri" w:cs="Calibri"/>
+          <w:sz w:val="24"/>
+          <w:szCs w:val="24"/>
+        </w:rPr>
+        <w:t>time_since_first_purchase</w:t>
+      </w:r>
+      <w:proofErr w:type="spellEnd"/>
+      <w:r>
+        <w:rPr>
+          <w:rFonts w:ascii="Calibri" w:hAnsi="Calibri" w:cs="Calibri"/>
+          <w:sz w:val="24"/>
+          <w:szCs w:val="24"/>
+        </w:rPr>
+        <w:t xml:space="preserve"> had negligible effect.</w:t>
+      </w:r>
+    </w:p>
+    <w:p>
+      <w:pPr>
+        <w:rPr>
+          <w:rFonts w:ascii="Calibri" w:hAnsi="Calibri" w:cs="Calibri"/>
+          <w:sz w:val="24"/>
+          <w:szCs w:val="24"/>
+        </w:rPr>
+      </w:pPr>
+      <w:r>
+        <w:rPr>
+          <w:rFonts w:ascii="Calibri" w:hAnsi="Calibri" w:cs="Calibri"/>
+          <w:sz w:val="24"/>
+          <w:szCs w:val="24"/>
+        </w:rPr>
+        <w:t xml:space="preserve">Research Question 1, which explored which behavioural features at the customer level were most predictive, is directly addressed by these results. The findings show that the main factors influencing repeat purchases are spending intensity and purchase frequency. These findings address Objective 1, which sought to use transactional data to uncover important behavioural predictors. </w:t>
+      </w:r>
+      <w:proofErr w:type="spellStart"/>
+      <w:r>
+        <w:rPr>
+          <w:rFonts w:ascii="Calibri" w:hAnsi="Calibri" w:cs="Calibri"/>
+          <w:sz w:val="24"/>
+          <w:szCs w:val="24"/>
+        </w:rPr>
+        <w:t>Avg_days_between_purchases</w:t>
+      </w:r>
+      <w:proofErr w:type="spellEnd"/>
+      <w:r>
+        <w:rPr>
+          <w:rFonts w:ascii="Calibri" w:hAnsi="Calibri" w:cs="Calibri"/>
+          <w:sz w:val="24"/>
+          <w:szCs w:val="24"/>
+        </w:rPr>
+        <w:t xml:space="preserve"> consistently had the highest mean absolute SHAP value, according to the SHAP summary plots, confirming its crucial role in the model's decision logic. This is consistent with earlier research on temporal features as powerful indicators of customer retention (</w:t>
+      </w:r>
+      <w:proofErr w:type="spellStart"/>
+      <w:r>
+        <w:rPr>
+          <w:rFonts w:ascii="Calibri" w:hAnsi="Calibri" w:cs="Calibri"/>
+          <w:sz w:val="24"/>
+          <w:szCs w:val="24"/>
+        </w:rPr>
+        <w:t>Mienye</w:t>
+      </w:r>
+      <w:proofErr w:type="spellEnd"/>
+      <w:r>
+        <w:rPr>
+          <w:rFonts w:ascii="Calibri" w:hAnsi="Calibri" w:cs="Calibri"/>
+          <w:sz w:val="24"/>
+          <w:szCs w:val="24"/>
+        </w:rPr>
+        <w:t xml:space="preserve"> and Sun, 2022; Tharwat, 2021).</w:t>
+      </w:r>
+    </w:p>
+    <w:p>
+      <w:pPr>
+        <w:rPr>
+          <w:rFonts w:ascii="Calibri" w:hAnsi="Calibri" w:cs="Calibri"/>
+          <w:b/>
+          <w:bCs/>
+          <w:sz w:val="28"/>
+          <w:szCs w:val="28"/>
+        </w:rPr>
+      </w:pPr>
+      <w:r>
+        <w:rPr>
+          <w:rFonts w:ascii="Calibri" w:hAnsi="Calibri" w:cs="Calibri"/>
+          <w:b/>
+          <w:bCs/>
+          <w:sz w:val="28"/>
+          <w:szCs w:val="28"/>
+        </w:rPr>
+        <w:t>1</w:t>
+      </w:r>
+      <w:r>
+        <w:rPr>
+          <w:rFonts w:ascii="Calibri" w:hAnsi="Calibri" w:cs="Calibri"/>
+          <w:b/>
+          <w:bCs/>
+          <w:sz w:val="28"/>
+          <w:szCs w:val="28"/>
+        </w:rPr>
+        <w:t>1</w:t>
+      </w:r>
+      <w:r>
+        <w:rPr>
+          <w:rFonts w:ascii="Calibri" w:hAnsi="Calibri" w:cs="Calibri"/>
+          <w:b/>
+          <w:bCs/>
+          <w:sz w:val="28"/>
+          <w:szCs w:val="28"/>
+        </w:rPr>
+        <w:t xml:space="preserve">.3 </w:t>
+      </w:r>
+      <w:r>
+        <w:rPr>
+          <w:rFonts w:ascii="Calibri" w:hAnsi="Calibri" w:cs="Calibri"/>
+          <w:b/>
+          <w:bCs/>
+          <w:sz w:val="28"/>
+          <w:szCs w:val="28"/>
+        </w:rPr>
+        <w:t>Local Interpretability and Stakeholder Relevance</w:t>
+      </w:r>
+    </w:p>
+    <w:p>
+      <w:pPr>
+        <w:rPr>
+          <w:rFonts w:ascii="Calibri" w:hAnsi="Calibri" w:cs="Calibri"/>
+          <w:sz w:val="24"/>
+          <w:szCs w:val="24"/>
+        </w:rPr>
+      </w:pPr>
+      <w:r>
+        <w:rPr>
+          <w:rFonts w:ascii="Calibri" w:hAnsi="Calibri" w:cs="Calibri"/>
+          <w:sz w:val="24"/>
+          <w:szCs w:val="24"/>
+        </w:rPr>
+        <w:t>Three strategic test cases</w:t>
+      </w:r>
+      <w:r>
+        <w:rPr>
+          <w:rFonts w:ascii="Calibri" w:hAnsi="Calibri" w:cs="Calibri"/>
+          <w:sz w:val="24"/>
+          <w:szCs w:val="24"/>
+        </w:rPr>
+        <w:t xml:space="preserve"> </w:t>
+      </w:r>
+      <w:r>
+        <w:rPr>
+          <w:rFonts w:ascii="Calibri" w:hAnsi="Calibri" w:cs="Calibri"/>
+          <w:sz w:val="24"/>
+          <w:szCs w:val="24"/>
+        </w:rPr>
+        <w:t>a correctly identified repeat buyer (Index 1), a misclassified repeat buyer (Index 0), and an edge case close to the decision boundary (Index 120)</w:t>
+      </w:r>
+      <w:r>
+        <w:rPr>
+          <w:rFonts w:ascii="Calibri" w:hAnsi="Calibri" w:cs="Calibri"/>
+          <w:sz w:val="24"/>
+          <w:szCs w:val="24"/>
+        </w:rPr>
+        <w:t xml:space="preserve">, </w:t>
+      </w:r>
+      <w:r>
+        <w:rPr>
+          <w:rFonts w:ascii="Calibri" w:hAnsi="Calibri" w:cs="Calibri"/>
+          <w:sz w:val="24"/>
+          <w:szCs w:val="24"/>
+        </w:rPr>
+        <w:t xml:space="preserve">were chosen </w:t>
+      </w:r>
+      <w:r>
+        <w:rPr>
+          <w:rFonts w:ascii="Calibri" w:hAnsi="Calibri" w:cs="Calibri"/>
+          <w:sz w:val="24"/>
+          <w:szCs w:val="24"/>
+        </w:rPr>
+        <w:lastRenderedPageBreak/>
+        <w:t xml:space="preserve">in order to assess the model's decision logic in practical settings. </w:t>
+      </w:r>
+      <w:proofErr w:type="spellStart"/>
+      <w:r>
+        <w:rPr>
+          <w:rFonts w:ascii="Calibri" w:hAnsi="Calibri" w:cs="Calibri"/>
+          <w:sz w:val="24"/>
+          <w:szCs w:val="24"/>
+        </w:rPr>
+        <w:t>Avg_days_between_purchases</w:t>
+      </w:r>
+      <w:proofErr w:type="spellEnd"/>
+      <w:r>
+        <w:rPr>
+          <w:rFonts w:ascii="Calibri" w:hAnsi="Calibri" w:cs="Calibri"/>
+          <w:sz w:val="24"/>
+          <w:szCs w:val="24"/>
+        </w:rPr>
+        <w:t xml:space="preserve"> contributed +0.51 in the correctly classified example, increasing the prediction's confidence level from 0.494 to 1. In the misclassified scenario, the same feature had a negative impact with low total spend, leading to a prediction of 0 even though the actual label was 1.</w:t>
+      </w:r>
+      <w:r>
+        <w:rPr>
+          <w:rFonts w:ascii="Calibri" w:hAnsi="Calibri" w:cs="Calibri"/>
+          <w:sz w:val="24"/>
+          <w:szCs w:val="24"/>
+        </w:rPr>
+        <w:t xml:space="preserve"> </w:t>
+      </w:r>
+      <w:r>
+        <w:rPr>
+          <w:rFonts w:ascii="Calibri" w:hAnsi="Calibri" w:cs="Calibri"/>
+          <w:sz w:val="24"/>
+          <w:szCs w:val="24"/>
+        </w:rPr>
+        <w:t>The edge case's low SHAP values and mixed contributions confirmed that it was close to the decision threshold.</w:t>
+      </w:r>
+    </w:p>
+    <w:p>
+      <w:pPr>
+        <w:rPr>
+          <w:rFonts w:ascii="Calibri" w:hAnsi="Calibri" w:cs="Calibri"/>
+          <w:sz w:val="24"/>
+          <w:szCs w:val="24"/>
+        </w:rPr>
+      </w:pPr>
+      <w:r>
+        <w:rPr>
+          <w:rFonts w:ascii="Calibri" w:hAnsi="Calibri" w:cs="Calibri"/>
+          <w:sz w:val="24"/>
+          <w:szCs w:val="24"/>
+        </w:rPr>
+        <w:t>These examples show that SHAP's local explanations are consistent with behavioural logic and can effectively convey decision rationale to stakeholders who are not technical. This addresses Research Question 3 and achieves Objective 3, demonstrating that SHAP offers CRM and marketing teams valuable and useful insights.</w:t>
+      </w:r>
+    </w:p>
+    <w:p>
+      <w:pPr>
+        <w:rPr>
+          <w:rFonts w:ascii="Calibri" w:hAnsi="Calibri" w:cs="Calibri"/>
+          <w:sz w:val="24"/>
+          <w:szCs w:val="24"/>
+        </w:rPr>
+      </w:pPr>
+    </w:p>
+    <w:p>
+      <w:pPr>
+        <w:rPr>
+          <w:rFonts w:ascii="Calibri" w:hAnsi="Calibri" w:cs="Calibri"/>
+          <w:sz w:val="24"/>
+          <w:szCs w:val="24"/>
+        </w:rPr>
+      </w:pPr>
     </w:p>
     <w:p>
       <w:pPr>
@@ -7009,7 +7611,6 @@
           <w:sz w:val="32"/>
           <w:szCs w:val="32"/>
         </w:rPr>
-        <w:lastRenderedPageBreak/>
         <w:t>References</w:t>
       </w:r>
     </w:p>
@@ -7030,7 +7631,6 @@
         <w:t xml:space="preserve">Fader, P.S. and Hardie, B.G.S. (2010). Customer-Base Valuation in a Contractual Setting: The Perils of Ignoring Heterogeneity. Marketing Science, 29(1), pp.85–93. </w:t>
       </w:r>
       <w:proofErr w:type="spellStart"/>
-      <w:proofErr w:type="gramStart"/>
       <w:r>
         <w:rPr>
           <w:rFonts w:ascii="Calibri" w:hAnsi="Calibri" w:cs="Calibri"/>
@@ -7046,16 +7646,7 @@
           <w:sz w:val="24"/>
           <w:szCs w:val="24"/>
         </w:rPr>
-        <w:t>://doi.org/10.1287/mksc.1080.0482</w:t>
-      </w:r>
-      <w:proofErr w:type="gramEnd"/>
-      <w:r>
-        <w:rPr>
-          <w:rFonts w:ascii="Calibri" w:hAnsi="Calibri" w:cs="Calibri"/>
-          <w:sz w:val="24"/>
-          <w:szCs w:val="24"/>
-        </w:rPr>
-        <w:t>.</w:t>
+        <w:t>://doi.org/10.1287/mksc.1080.0482.</w:t>
       </w:r>
     </w:p>
     <w:p>
@@ -7103,7 +7694,6 @@
         <w:t xml:space="preserve"> Prediction in E-commerce: A Conceptual Framework and Research Agenda. New Frontiers in Mining Complex Patterns, pp.119–136. </w:t>
       </w:r>
       <w:proofErr w:type="spellStart"/>
-      <w:proofErr w:type="gramStart"/>
       <w:r>
         <w:rPr>
           <w:rFonts w:ascii="Calibri" w:hAnsi="Calibri" w:cs="Calibri"/>
@@ -7119,16 +7709,7 @@
           <w:sz w:val="24"/>
           <w:szCs w:val="24"/>
         </w:rPr>
-        <w:t>://doi.org/10.1007/978-3-030-48861-1_8</w:t>
-      </w:r>
-      <w:proofErr w:type="gramEnd"/>
-      <w:r>
-        <w:rPr>
-          <w:rFonts w:ascii="Calibri" w:hAnsi="Calibri" w:cs="Calibri"/>
-          <w:sz w:val="24"/>
-          <w:szCs w:val="24"/>
-        </w:rPr>
-        <w:t>.</w:t>
+        <w:t>://doi.org/10.1007/978-3-030-48861-1_8.</w:t>
       </w:r>
     </w:p>
     <w:p>
@@ -7148,7 +7729,6 @@
         <w:t xml:space="preserve">Jeon, H.G., Kim, C., Lee, J. and Lee, K.C. (2021). Understanding E-Commerce Consumers’ Repeat Purchase Intention: The Role of Trust Transfer and the Moderating Effect of Neuroticism. Frontiers in Psychology, 12. </w:t>
       </w:r>
       <w:proofErr w:type="spellStart"/>
-      <w:proofErr w:type="gramStart"/>
       <w:r>
         <w:rPr>
           <w:rFonts w:ascii="Calibri" w:hAnsi="Calibri" w:cs="Calibri"/>
@@ -7164,16 +7744,7 @@
           <w:sz w:val="24"/>
           <w:szCs w:val="24"/>
         </w:rPr>
-        <w:t>://doi.org/10.3389/fpsyg.2021.690039</w:t>
-      </w:r>
-      <w:proofErr w:type="gramEnd"/>
-      <w:r>
-        <w:rPr>
-          <w:rFonts w:ascii="Calibri" w:hAnsi="Calibri" w:cs="Calibri"/>
-          <w:sz w:val="24"/>
-          <w:szCs w:val="24"/>
-        </w:rPr>
-        <w:t>.</w:t>
+        <w:t>://doi.org/10.3389/fpsyg.2021.690039.</w:t>
       </w:r>
     </w:p>
     <w:p>
@@ -7193,7 +7764,6 @@
         <w:t xml:space="preserve">Lundberg, S. and Lee, S.-I. (2017). A Unified Approach to Interpreting Model Predictions. [online] arXiv.org. </w:t>
       </w:r>
       <w:proofErr w:type="spellStart"/>
-      <w:proofErr w:type="gramStart"/>
       <w:r>
         <w:rPr>
           <w:rFonts w:ascii="Calibri" w:hAnsi="Calibri" w:cs="Calibri"/>
@@ -7209,16 +7779,7 @@
           <w:sz w:val="24"/>
           <w:szCs w:val="24"/>
         </w:rPr>
-        <w:t>://doi.org/10.48550/arXiv.1705.07874</w:t>
-      </w:r>
-      <w:proofErr w:type="gramEnd"/>
-      <w:r>
-        <w:rPr>
-          <w:rFonts w:ascii="Calibri" w:hAnsi="Calibri" w:cs="Calibri"/>
-          <w:sz w:val="24"/>
-          <w:szCs w:val="24"/>
-        </w:rPr>
-        <w:t>.</w:t>
+        <w:t>://doi.org/10.48550/arXiv.1705.07874.</w:t>
       </w:r>
     </w:p>
     <w:p>
@@ -7273,7 +7834,6 @@
         <w:t xml:space="preserve"> in Quick Commerce. Journal of Service Research, [online] 28(2). </w:t>
       </w:r>
       <w:proofErr w:type="spellStart"/>
-      <w:proofErr w:type="gramStart"/>
       <w:r>
         <w:rPr>
           <w:rFonts w:ascii="Calibri" w:hAnsi="Calibri" w:cs="Calibri"/>
@@ -7289,16 +7849,7 @@
           <w:sz w:val="24"/>
           <w:szCs w:val="24"/>
         </w:rPr>
-        <w:t>://doi.org/10.1177/10946705241236961</w:t>
-      </w:r>
-      <w:proofErr w:type="gramEnd"/>
-      <w:r>
-        <w:rPr>
-          <w:rFonts w:ascii="Calibri" w:hAnsi="Calibri" w:cs="Calibri"/>
-          <w:sz w:val="24"/>
-          <w:szCs w:val="24"/>
-        </w:rPr>
-        <w:t>.</w:t>
+        <w:t>://doi.org/10.1177/10946705241236961.</w:t>
       </w:r>
     </w:p>
     <w:p>
@@ -7336,7 +7887,6 @@
         <w:t xml:space="preserve">, 52(1), pp.45–75. </w:t>
       </w:r>
       <w:proofErr w:type="spellStart"/>
-      <w:proofErr w:type="gramStart"/>
       <w:r>
         <w:rPr>
           <w:rFonts w:ascii="Calibri" w:hAnsi="Calibri" w:cs="Calibri"/>
@@ -7352,16 +7902,7 @@
           <w:sz w:val="24"/>
           <w:szCs w:val="24"/>
         </w:rPr>
-        <w:t>://doi.org/10.1007/s41237-024-00253-2</w:t>
-      </w:r>
-      <w:proofErr w:type="gramEnd"/>
-      <w:r>
-        <w:rPr>
-          <w:rFonts w:ascii="Calibri" w:hAnsi="Calibri" w:cs="Calibri"/>
-          <w:sz w:val="24"/>
-          <w:szCs w:val="24"/>
-        </w:rPr>
-        <w:t>.</w:t>
+        <w:t>://doi.org/10.1007/s41237-024-00253-2.</w:t>
       </w:r>
     </w:p>
     <w:p>
@@ -7422,6 +7963,7 @@
           <w:sz w:val="24"/>
           <w:szCs w:val="24"/>
         </w:rPr>
+        <w:lastRenderedPageBreak/>
         <w:t xml:space="preserve">Hosmer Jr., D.W., </w:t>
       </w:r>
       <w:proofErr w:type="spellStart"/>
@@ -7443,7 +7985,6 @@
         <w:t xml:space="preserve">, S. and Sturdivant, R.X. (2013). Applied Logistic Regression. Wiley Series in Probability and Statistics. Hoboken, NJ, USA: John Wiley &amp; Sons, Inc. </w:t>
       </w:r>
       <w:proofErr w:type="spellStart"/>
-      <w:proofErr w:type="gramStart"/>
       <w:r>
         <w:rPr>
           <w:rFonts w:ascii="Calibri" w:hAnsi="Calibri" w:cs="Calibri"/>
@@ -7459,16 +8000,7 @@
           <w:sz w:val="24"/>
           <w:szCs w:val="24"/>
         </w:rPr>
-        <w:t>://doi.org/10.1002/9781118548387</w:t>
-      </w:r>
-      <w:proofErr w:type="gramEnd"/>
-      <w:r>
-        <w:rPr>
-          <w:rFonts w:ascii="Calibri" w:hAnsi="Calibri" w:cs="Calibri"/>
-          <w:sz w:val="24"/>
-          <w:szCs w:val="24"/>
-        </w:rPr>
-        <w:t>.</w:t>
+        <w:t>://doi.org/10.1002/9781118548387.</w:t>
       </w:r>
     </w:p>
     <w:p>
@@ -7560,7 +8092,6 @@
         <w:t xml:space="preserve">: a Scalable Tree Boosting System. Proceedings of the 22nd ACM SIGKDD International Conference on Knowledge Discovery and Data Mining - KDD ’16, 1(1), pp.785–794. </w:t>
       </w:r>
       <w:proofErr w:type="spellStart"/>
-      <w:proofErr w:type="gramStart"/>
       <w:r>
         <w:rPr>
           <w:rFonts w:ascii="Calibri" w:hAnsi="Calibri" w:cs="Calibri"/>
@@ -7576,16 +8107,7 @@
           <w:sz w:val="24"/>
           <w:szCs w:val="24"/>
         </w:rPr>
-        <w:t>://doi.org/10.1145/2939672.2939785</w:t>
-      </w:r>
-      <w:proofErr w:type="gramEnd"/>
-      <w:r>
-        <w:rPr>
-          <w:rFonts w:ascii="Calibri" w:hAnsi="Calibri" w:cs="Calibri"/>
-          <w:sz w:val="24"/>
-          <w:szCs w:val="24"/>
-        </w:rPr>
-        <w:t>.</w:t>
+        <w:t>://doi.org/10.1145/2939672.2939785.</w:t>
       </w:r>
     </w:p>
     <w:p>
@@ -7605,7 +8127,6 @@
         <w:t xml:space="preserve">Bogaert, M. and Delaere, L. (2023). Ensemble Methods in Customer Churn Prediction: A Comparative Analysis of the State-of-the-Art. Mathematics, 11(5), p.1137. </w:t>
       </w:r>
       <w:proofErr w:type="spellStart"/>
-      <w:proofErr w:type="gramStart"/>
       <w:r>
         <w:rPr>
           <w:rFonts w:ascii="Calibri" w:hAnsi="Calibri" w:cs="Calibri"/>
@@ -7621,37 +8142,26 @@
           <w:sz w:val="24"/>
           <w:szCs w:val="24"/>
         </w:rPr>
-        <w:t>://doi.org/10.3390/math11051137</w:t>
-      </w:r>
-      <w:proofErr w:type="gramEnd"/>
-      <w:r>
-        <w:rPr>
-          <w:rFonts w:ascii="Calibri" w:hAnsi="Calibri" w:cs="Calibri"/>
-          <w:sz w:val="24"/>
-          <w:szCs w:val="24"/>
-        </w:rPr>
-        <w:t>.</w:t>
-      </w:r>
-    </w:p>
-    <w:p>
-      <w:pPr>
-        <w:rPr>
-          <w:rFonts w:ascii="Calibri" w:hAnsi="Calibri" w:cs="Calibri"/>
-          <w:sz w:val="24"/>
-          <w:szCs w:val="24"/>
-        </w:rPr>
-      </w:pPr>
-      <w:r>
-        <w:rPr>
-          <w:rFonts w:ascii="Calibri" w:hAnsi="Calibri" w:cs="Calibri"/>
-          <w:sz w:val="24"/>
-          <w:szCs w:val="24"/>
-        </w:rPr>
-        <w:lastRenderedPageBreak/>
+        <w:t>://doi.org/10.3390/math11051137.</w:t>
+      </w:r>
+    </w:p>
+    <w:p>
+      <w:pPr>
+        <w:rPr>
+          <w:rFonts w:ascii="Calibri" w:hAnsi="Calibri" w:cs="Calibri"/>
+          <w:sz w:val="24"/>
+          <w:szCs w:val="24"/>
+        </w:rPr>
+      </w:pPr>
+      <w:r>
+        <w:rPr>
+          <w:rFonts w:ascii="Calibri" w:hAnsi="Calibri" w:cs="Calibri"/>
+          <w:sz w:val="24"/>
+          <w:szCs w:val="24"/>
+        </w:rPr>
         <w:t xml:space="preserve">Fernández, A., García, S., Galar, M., Prati, R.C., Krawczyk, B. and Herrera, F. (2018). Learning from Imbalanced Data Sets. Cham: Springer International Publishing. </w:t>
       </w:r>
       <w:proofErr w:type="spellStart"/>
-      <w:proofErr w:type="gramStart"/>
       <w:r>
         <w:rPr>
           <w:rFonts w:ascii="Calibri" w:hAnsi="Calibri" w:cs="Calibri"/>
@@ -7667,16 +8177,7 @@
           <w:sz w:val="24"/>
           <w:szCs w:val="24"/>
         </w:rPr>
-        <w:t>://doi.org/10.1007/978-3-319-98074-4</w:t>
-      </w:r>
-      <w:proofErr w:type="gramEnd"/>
-      <w:r>
-        <w:rPr>
-          <w:rFonts w:ascii="Calibri" w:hAnsi="Calibri" w:cs="Calibri"/>
-          <w:sz w:val="24"/>
-          <w:szCs w:val="24"/>
-        </w:rPr>
-        <w:t>.</w:t>
+        <w:t>://doi.org/10.1007/978-3-319-98074-4.</w:t>
       </w:r>
     </w:p>
     <w:p>
@@ -7696,7 +8197,6 @@
         <w:t xml:space="preserve">Tharwat, A. (2020). Classification assessment methods. Applied Computing and Informatics, 17(1). </w:t>
       </w:r>
       <w:proofErr w:type="spellStart"/>
-      <w:proofErr w:type="gramStart"/>
       <w:r>
         <w:rPr>
           <w:rFonts w:ascii="Calibri" w:hAnsi="Calibri" w:cs="Calibri"/>
@@ -7712,16 +8212,7 @@
           <w:sz w:val="24"/>
           <w:szCs w:val="24"/>
         </w:rPr>
-        <w:t>://doi.org/10.1016/j.aci.2018.08.003</w:t>
-      </w:r>
-      <w:proofErr w:type="gramEnd"/>
-      <w:r>
-        <w:rPr>
-          <w:rFonts w:ascii="Calibri" w:hAnsi="Calibri" w:cs="Calibri"/>
-          <w:sz w:val="24"/>
-          <w:szCs w:val="24"/>
-        </w:rPr>
-        <w:t>.</w:t>
+        <w:t>://doi.org/10.1016/j.aci.2018.08.003.</w:t>
       </w:r>
     </w:p>
     <w:p>
@@ -7741,7 +8232,6 @@
         <w:t xml:space="preserve">Probst, P., Wright, M.N. and Boulesteix, A. (2019). Hyperparameters and tuning strategies for random forest. Wiley Interdisciplinary Reviews: Data Mining and Knowledge Discovery, 9(3). </w:t>
       </w:r>
       <w:proofErr w:type="spellStart"/>
-      <w:proofErr w:type="gramStart"/>
       <w:r>
         <w:rPr>
           <w:rFonts w:ascii="Calibri" w:hAnsi="Calibri" w:cs="Calibri"/>
@@ -7757,16 +8247,7 @@
           <w:sz w:val="24"/>
           <w:szCs w:val="24"/>
         </w:rPr>
-        <w:t>://doi.org/10.1002/widm.1301</w:t>
-      </w:r>
-      <w:proofErr w:type="gramEnd"/>
-      <w:r>
-        <w:rPr>
-          <w:rFonts w:ascii="Calibri" w:hAnsi="Calibri" w:cs="Calibri"/>
-          <w:sz w:val="24"/>
-          <w:szCs w:val="24"/>
-        </w:rPr>
-        <w:t>.</w:t>
+        <w:t>://doi.org/10.1002/widm.1301.</w:t>
       </w:r>
     </w:p>
     <w:p>
@@ -7876,7 +8357,6 @@
         <w:t xml:space="preserve">, D., Brucher, M., Perrot, M. and Duchesnay, E. (2011). Scikit-learn: Machine Learning in Python. J. Mach. Learn. Res., [online] 12. </w:t>
       </w:r>
       <w:proofErr w:type="spellStart"/>
-      <w:proofErr w:type="gramStart"/>
       <w:r>
         <w:rPr>
           <w:rFonts w:ascii="Calibri" w:hAnsi="Calibri" w:cs="Calibri"/>
@@ -7892,16 +8372,7 @@
           <w:sz w:val="24"/>
           <w:szCs w:val="24"/>
         </w:rPr>
-        <w:t>://doi.org/10.5555/1953048.2078195</w:t>
-      </w:r>
-      <w:proofErr w:type="gramEnd"/>
-      <w:r>
-        <w:rPr>
-          <w:rFonts w:ascii="Calibri" w:hAnsi="Calibri" w:cs="Calibri"/>
-          <w:sz w:val="24"/>
-          <w:szCs w:val="24"/>
-        </w:rPr>
-        <w:t>.</w:t>
+        <w:t>://doi.org/10.5555/1953048.2078195.</w:t>
       </w:r>
     </w:p>
     <w:p>
@@ -7921,7 +8392,6 @@
         <w:t xml:space="preserve">Wedel, M. and Kannan, P.K. (2016). Marketing Analytics for Data-Rich Environments. Journal of Marketing, [online] 80(6), pp.97–121. </w:t>
       </w:r>
       <w:proofErr w:type="spellStart"/>
-      <w:proofErr w:type="gramStart"/>
       <w:r>
         <w:rPr>
           <w:rFonts w:ascii="Calibri" w:hAnsi="Calibri" w:cs="Calibri"/>
@@ -7937,16 +8407,7 @@
           <w:sz w:val="24"/>
           <w:szCs w:val="24"/>
         </w:rPr>
-        <w:t>://doi.org/10.1509/jm.15.0413</w:t>
-      </w:r>
-      <w:proofErr w:type="gramEnd"/>
-      <w:r>
-        <w:rPr>
-          <w:rFonts w:ascii="Calibri" w:hAnsi="Calibri" w:cs="Calibri"/>
-          <w:sz w:val="24"/>
-          <w:szCs w:val="24"/>
-        </w:rPr>
-        <w:t>.</w:t>
+        <w:t>://doi.org/10.1509/jm.15.0413.</w:t>
       </w:r>
     </w:p>
     <w:p>
@@ -7966,7 +8427,6 @@
         <w:t xml:space="preserve">Jordan, M.I. and Mitchell, T.M. (2015). Machine learning: Trends, perspectives, and prospects. Science, 349(6245), pp.255–260. </w:t>
       </w:r>
       <w:proofErr w:type="spellStart"/>
-      <w:proofErr w:type="gramStart"/>
       <w:r>
         <w:rPr>
           <w:rFonts w:ascii="Calibri" w:hAnsi="Calibri" w:cs="Calibri"/>
@@ -7982,16 +8442,7 @@
           <w:sz w:val="24"/>
           <w:szCs w:val="24"/>
         </w:rPr>
-        <w:t>://doi.org/10.1126/science.aaa8415</w:t>
-      </w:r>
-      <w:proofErr w:type="gramEnd"/>
-      <w:r>
-        <w:rPr>
-          <w:rFonts w:ascii="Calibri" w:hAnsi="Calibri" w:cs="Calibri"/>
-          <w:sz w:val="24"/>
-          <w:szCs w:val="24"/>
-        </w:rPr>
-        <w:t>.</w:t>
+        <w:t>://doi.org/10.1126/science.aaa8415.</w:t>
       </w:r>
     </w:p>
     <w:p>
@@ -8065,7 +8516,6 @@
         <w:t xml:space="preserve">, C., Csörgő, A. and Martínez-Muñoz, G. (2020). A Comparative Analysis of Gradient Boosting Algorithms. Artificial Intelligence Review, [online] 54(3). </w:t>
       </w:r>
       <w:proofErr w:type="spellStart"/>
-      <w:proofErr w:type="gramStart"/>
       <w:r>
         <w:rPr>
           <w:rFonts w:ascii="Calibri" w:hAnsi="Calibri" w:cs="Calibri"/>
@@ -8081,16 +8531,7 @@
           <w:sz w:val="24"/>
           <w:szCs w:val="24"/>
         </w:rPr>
-        <w:t>://doi.org/10.1007/s10462-020-09896-5</w:t>
-      </w:r>
-      <w:proofErr w:type="gramEnd"/>
-      <w:r>
-        <w:rPr>
-          <w:rFonts w:ascii="Calibri" w:hAnsi="Calibri" w:cs="Calibri"/>
-          <w:sz w:val="24"/>
-          <w:szCs w:val="24"/>
-        </w:rPr>
-        <w:t>.</w:t>
+        <w:t>://doi.org/10.1007/s10462-020-09896-5.</w:t>
       </w:r>
     </w:p>
     <w:p>
@@ -8155,7 +8596,6 @@
         <w:t xml:space="preserve">, R.A. and Stone, C.J. (2017). Classification And Regression Trees. [online] Routledge. </w:t>
       </w:r>
       <w:proofErr w:type="spellStart"/>
-      <w:proofErr w:type="gramStart"/>
       <w:r>
         <w:rPr>
           <w:rFonts w:ascii="Calibri" w:hAnsi="Calibri" w:cs="Calibri"/>
@@ -8171,17 +8611,89 @@
           <w:sz w:val="24"/>
           <w:szCs w:val="24"/>
         </w:rPr>
-        <w:t>://doi.org/10.1201/9781315139470</w:t>
-      </w:r>
-      <w:proofErr w:type="gramEnd"/>
-      <w:r>
-        <w:rPr>
-          <w:rFonts w:ascii="Calibri" w:hAnsi="Calibri" w:cs="Calibri"/>
-          <w:sz w:val="24"/>
-          <w:szCs w:val="24"/>
-        </w:rPr>
-        <w:t>.</w:t>
-      </w:r>
+        <w:t>://doi.org/10.1201/9781315139470.</w:t>
+      </w:r>
+    </w:p>
+    <w:p>
+      <w:pPr>
+        <w:rPr>
+          <w:rFonts w:ascii="Calibri" w:hAnsi="Calibri" w:cs="Calibri"/>
+          <w:sz w:val="24"/>
+          <w:szCs w:val="24"/>
+        </w:rPr>
+      </w:pPr>
+      <w:proofErr w:type="spellStart"/>
+      <w:r>
+        <w:rPr>
+          <w:rFonts w:ascii="Calibri" w:hAnsi="Calibri" w:cs="Calibri"/>
+          <w:sz w:val="24"/>
+          <w:szCs w:val="24"/>
+        </w:rPr>
+        <w:lastRenderedPageBreak/>
+        <w:t>Bergstra</w:t>
+      </w:r>
+      <w:proofErr w:type="spellEnd"/>
+      <w:r>
+        <w:rPr>
+          <w:rFonts w:ascii="Calibri" w:hAnsi="Calibri" w:cs="Calibri"/>
+          <w:sz w:val="24"/>
+          <w:szCs w:val="24"/>
+        </w:rPr>
+        <w:t xml:space="preserve">, J. and Bengio, Y. (2012). Random search for hyper-parameter optimization. Journal of Machine Learning Research. </w:t>
+      </w:r>
+      <w:proofErr w:type="spellStart"/>
+      <w:r>
+        <w:rPr>
+          <w:rFonts w:ascii="Calibri" w:hAnsi="Calibri" w:cs="Calibri"/>
+          <w:sz w:val="24"/>
+          <w:szCs w:val="24"/>
+        </w:rPr>
+        <w:t>doi:https</w:t>
+      </w:r>
+      <w:proofErr w:type="spellEnd"/>
+      <w:r>
+        <w:rPr>
+          <w:rFonts w:ascii="Calibri" w:hAnsi="Calibri" w:cs="Calibri"/>
+          <w:sz w:val="24"/>
+          <w:szCs w:val="24"/>
+        </w:rPr>
+        <w:t>://doi.org/10.5555/2188385.2188395.</w:t>
+      </w:r>
+    </w:p>
+    <w:p>
+      <w:pPr>
+        <w:rPr>
+          <w:rFonts w:ascii="Calibri" w:hAnsi="Calibri" w:cs="Calibri"/>
+          <w:sz w:val="24"/>
+          <w:szCs w:val="24"/>
+        </w:rPr>
+      </w:pPr>
+      <w:r>
+        <w:rPr>
+          <w:rFonts w:ascii="Calibri" w:hAnsi="Calibri" w:cs="Calibri"/>
+          <w:sz w:val="24"/>
+          <w:szCs w:val="24"/>
+        </w:rPr>
+        <w:t>Mienye, I.D. and Sun, Y. (2022). A Survey of Ensemble Learning: Concepts, Algorithms, Applications, and Prospects. IEEE Access, [online] 10, pp.99129–99149. Available at: https://ieeexplore.ieee.org/abstract/document/9893798.</w:t>
+      </w:r>
+    </w:p>
+    <w:p>
+      <w:pPr>
+        <w:rPr>
+          <w:rFonts w:ascii="Calibri" w:hAnsi="Calibri" w:cs="Calibri"/>
+          <w:sz w:val="24"/>
+          <w:szCs w:val="24"/>
+        </w:rPr>
+      </w:pPr>
+    </w:p>
+    <w:p>
+      <w:pPr>
+        <w:rPr>
+          <w:rFonts w:ascii="Calibri" w:hAnsi="Calibri" w:cs="Calibri"/>
+          <w:sz w:val="24"/>
+          <w:szCs w:val="24"/>
+        </w:rPr>
+      </w:pPr>
     </w:p>
     <w:p>
       <w:pPr>

</xml_diff>